<commit_message>
edit 1 and more file
</commit_message>
<xml_diff>
--- a/บทที่ 1.docx
+++ b/บทที่ 1.docx
@@ -74,7 +74,7 @@
           <w:rFonts w:ascii="TH SarabunPSK" w:hAnsi="TH SarabunPSK" w:cs="TH SarabunPSK"/>
           <w:b/>
           <w:bCs/>
-          <w:color w:val="EE0000"/>
+          <w:color w:val="FFFFFF" w:themeColor="background1"/>
           <w:sz w:val="32"/>
           <w:szCs w:val="32"/>
         </w:rPr>
@@ -146,12 +146,21 @@
       <w:proofErr w:type="spellEnd"/>
       <w:r>
         <w:rPr>
-          <w:rFonts w:ascii="TH SarabunPSK" w:hAnsi="TH SarabunPSK" w:cs="TH SarabunPSK"/>
-          <w:sz w:val="32"/>
-          <w:szCs w:val="32"/>
-          <w:cs/>
-        </w:rPr>
-        <w:t xml:space="preserve"> และการเก็บเอกสารลงโฟลเดอร์ที่ไม่ได้จัดระเบียบร่วมกัน ปัญหาที่ตามมาคือการนัดประชุมคลาดเคลื่อน ลืมแจ้งเตือนเหตุการณ์สำคัญ ข้อมูลซ้ำซ้อนหรือผิดพลาด การสื่อสารไม่ตรงกลุ่มเป้าหมาย และภาระงานจุกจิกที่ใช้เวลาคนจำนวนมาก โดยเฉพาะอย่างยิ่งงานประจำอย่างแจ้งเตือนประชุม แจ้งเกิดพนักงาน แจ้งยอดขายรายบุคคล ติดตามขาด</w:t>
+          <w:rFonts w:ascii="TH SarabunPSK" w:hAnsi="TH SarabunPSK" w:cs="TH SarabunPSK" w:hint="cs"/>
+          <w:sz w:val="32"/>
+          <w:szCs w:val="32"/>
+          <w:cs/>
+        </w:rPr>
+        <w:t xml:space="preserve"> </w:t>
+      </w:r>
+      <w:r>
+        <w:rPr>
+          <w:rFonts w:ascii="TH SarabunPSK" w:hAnsi="TH SarabunPSK" w:cs="TH SarabunPSK"/>
+          <w:sz w:val="32"/>
+          <w:szCs w:val="32"/>
+          <w:cs/>
+        </w:rPr>
+        <w:t>และการเก็บเอกสารลงโฟลเดอร์ที่ไม่ได้จัดระเบียบร่วมกัน ปัญหาที่ตามมาคือการนัดประชุมคลาดเคลื่อน ลืมแจ้งเตือนเหตุการณ์สำคัญ ข้อมูลซ้ำซ้อนหรือผิดพลาด การสื่อสารไม่ตรงกลุ่มเป้าหมาย และภาระงานจุกจิกที่ใช้เวลาคนจำนวนมาก โดยเฉพาะอย่างยิ่งงานประจำอย่างแจ้งเตือนประชุม แจ้งเกิดพนักงาน แจ้งยอดขายรายบุคคล ติดตามขาด</w:t>
       </w:r>
       <w:r>
         <w:rPr>
@@ -223,525 +232,6 @@
           <w:cs/>
         </w:rPr>
         <w:t>ซึ่งล้วนต้องการความถูกต้องและความต่อเนื่อง หากยังทำด้วยมือย่อมเสี่ยงต่อความผิดพลาดและต้นทุนเวลาที่สูง</w:t>
-      </w:r>
-      <w:r>
-        <w:rPr>
-          <w:rFonts w:ascii="TH SarabunPSK" w:hAnsi="TH SarabunPSK" w:cs="TH SarabunPSK"/>
-          <w:sz w:val="32"/>
-          <w:szCs w:val="32"/>
-        </w:rPr>
-        <w:t xml:space="preserve"> </w:t>
-      </w:r>
-      <w:r>
-        <w:rPr>
-          <w:rFonts w:ascii="TH SarabunPSK" w:hAnsi="TH SarabunPSK" w:cs="TH SarabunPSK"/>
-          <w:sz w:val="32"/>
-          <w:szCs w:val="32"/>
-          <w:cs/>
-        </w:rPr>
-        <w:t xml:space="preserve">จากโจทย์ดังกล่าวจึงเกิดแนวคิดพัฒนา </w:t>
-      </w:r>
-      <w:r>
-        <w:rPr>
-          <w:rFonts w:ascii="TH SarabunPSK" w:hAnsi="TH SarabunPSK" w:cs="TH SarabunPSK"/>
-          <w:sz w:val="32"/>
-          <w:szCs w:val="32"/>
-        </w:rPr>
-        <w:t>“</w:t>
-      </w:r>
-      <w:r>
-        <w:rPr>
-          <w:rFonts w:ascii="TH SarabunPSK" w:hAnsi="TH SarabunPSK" w:cs="TH SarabunPSK"/>
-          <w:sz w:val="32"/>
-          <w:szCs w:val="32"/>
-          <w:cs/>
-        </w:rPr>
-        <w:t>ผู้ช่วยอัตโนมัติของบริษัท</w:t>
-      </w:r>
-      <w:r>
-        <w:rPr>
-          <w:rFonts w:ascii="TH SarabunPSK" w:hAnsi="TH SarabunPSK" w:cs="TH SarabunPSK"/>
-          <w:sz w:val="32"/>
-          <w:szCs w:val="32"/>
-        </w:rPr>
-        <w:t xml:space="preserve">” </w:t>
-      </w:r>
-      <w:r>
-        <w:rPr>
-          <w:rFonts w:ascii="TH SarabunPSK" w:hAnsi="TH SarabunPSK" w:cs="TH SarabunPSK"/>
-          <w:sz w:val="32"/>
-          <w:szCs w:val="32"/>
-          <w:cs/>
-        </w:rPr>
-        <w:t xml:space="preserve">ที่ทำหน้าที่เสมือนเลขาในออฟฟิศ โดยใช้แพลตฟอร์ม </w:t>
-      </w:r>
-      <w:r>
-        <w:rPr>
-          <w:rFonts w:ascii="TH SarabunPSK" w:hAnsi="TH SarabunPSK" w:cs="TH SarabunPSK"/>
-          <w:sz w:val="32"/>
-          <w:szCs w:val="32"/>
-        </w:rPr>
-        <w:t>n</w:t>
-      </w:r>
-      <w:r>
-        <w:rPr>
-          <w:rFonts w:ascii="TH SarabunPSK" w:hAnsi="TH SarabunPSK" w:cs="TH SarabunPSK"/>
-          <w:sz w:val="32"/>
-          <w:szCs w:val="32"/>
-          <w:cs/>
-        </w:rPr>
-        <w:t>8</w:t>
-      </w:r>
-      <w:r>
-        <w:rPr>
-          <w:rFonts w:ascii="TH SarabunPSK" w:hAnsi="TH SarabunPSK" w:cs="TH SarabunPSK"/>
-          <w:sz w:val="32"/>
-          <w:szCs w:val="32"/>
-        </w:rPr>
-        <w:t xml:space="preserve">n </w:t>
-      </w:r>
-      <w:r>
-        <w:rPr>
-          <w:rFonts w:ascii="TH SarabunPSK" w:hAnsi="TH SarabunPSK" w:cs="TH SarabunPSK"/>
-          <w:sz w:val="32"/>
-          <w:szCs w:val="32"/>
-          <w:cs/>
-        </w:rPr>
-        <w:t>เป็นต้นทางของ</w:t>
-      </w:r>
-      <w:proofErr w:type="spellStart"/>
-      <w:r>
-        <w:rPr>
-          <w:rFonts w:ascii="TH SarabunPSK" w:hAnsi="TH SarabunPSK" w:cs="TH SarabunPSK"/>
-          <w:sz w:val="32"/>
-          <w:szCs w:val="32"/>
-          <w:cs/>
-        </w:rPr>
-        <w:t>เวิร์กโฟลว์</w:t>
-      </w:r>
-      <w:proofErr w:type="spellEnd"/>
-      <w:r>
-        <w:rPr>
-          <w:rFonts w:ascii="TH SarabunPSK" w:hAnsi="TH SarabunPSK" w:cs="TH SarabunPSK"/>
-          <w:sz w:val="32"/>
-          <w:szCs w:val="32"/>
-          <w:cs/>
-        </w:rPr>
-        <w:t xml:space="preserve">อัตโนมัติ เชื่อมต่อ </w:t>
-      </w:r>
-      <w:r>
-        <w:rPr>
-          <w:rFonts w:ascii="TH SarabunPSK" w:hAnsi="TH SarabunPSK" w:cs="TH SarabunPSK"/>
-          <w:sz w:val="32"/>
-          <w:szCs w:val="32"/>
-        </w:rPr>
-        <w:t xml:space="preserve">LINE Official Account/LIFF, </w:t>
-      </w:r>
-      <w:r>
-        <w:rPr>
-          <w:rFonts w:ascii="TH SarabunPSK" w:hAnsi="TH SarabunPSK" w:cs="TH SarabunPSK"/>
-          <w:sz w:val="32"/>
-          <w:szCs w:val="32"/>
-          <w:cs/>
-        </w:rPr>
-        <w:t>อีเมล</w:t>
-      </w:r>
-      <w:r>
-        <w:rPr>
-          <w:rFonts w:ascii="TH SarabunPSK" w:hAnsi="TH SarabunPSK" w:cs="TH SarabunPSK"/>
-          <w:sz w:val="32"/>
-          <w:szCs w:val="32"/>
-        </w:rPr>
-        <w:t>, Google</w:t>
-      </w:r>
-      <w:r>
-        <w:rPr>
-          <w:rFonts w:ascii="TH SarabunPSK" w:hAnsi="TH SarabunPSK" w:cs="TH SarabunPSK"/>
-          <w:sz w:val="32"/>
-          <w:szCs w:val="32"/>
-        </w:rPr>
-        <w:t xml:space="preserve"> </w:t>
-      </w:r>
-      <w:r>
-        <w:rPr>
-          <w:rFonts w:ascii="TH SarabunPSK" w:hAnsi="TH SarabunPSK" w:cs="TH SarabunPSK"/>
-          <w:sz w:val="32"/>
-          <w:szCs w:val="32"/>
-        </w:rPr>
-        <w:t xml:space="preserve">Sheets/Drive </w:t>
-      </w:r>
-      <w:r>
-        <w:rPr>
-          <w:rFonts w:ascii="TH SarabunPSK" w:hAnsi="TH SarabunPSK" w:cs="TH SarabunPSK"/>
-          <w:sz w:val="32"/>
-          <w:szCs w:val="32"/>
-          <w:cs/>
-        </w:rPr>
-        <w:t>และฐานข้อมูลได้อย่างยืดหยุ่น ระบบตั้งใจแก้ปัญหาเชิงปฏิบัติที่เกิดขึ้นจริง ได้แก่ แจ้งเตือนวันเกิดพนักงาน สร้าง/เพิ่ม/ลบห้องประชุมและส่งการแจ้งเตือนก่อนเริ่มประชุมอัตโนมัติที่ 15</w:t>
-      </w:r>
-      <w:r>
-        <w:rPr>
-          <w:rFonts w:ascii="TH SarabunPSK" w:hAnsi="TH SarabunPSK" w:cs="TH SarabunPSK"/>
-          <w:sz w:val="32"/>
-          <w:szCs w:val="32"/>
-        </w:rPr>
-        <w:t xml:space="preserve">, </w:t>
-      </w:r>
-      <w:r>
-        <w:rPr>
-          <w:rFonts w:ascii="TH SarabunPSK" w:hAnsi="TH SarabunPSK" w:cs="TH SarabunPSK"/>
-          <w:sz w:val="32"/>
-          <w:szCs w:val="32"/>
-          <w:cs/>
-        </w:rPr>
-        <w:t xml:space="preserve">10 และ 5 นาที รวม 3 ครั้ง แจ้งยอดขายรายบุคคลจาก </w:t>
-      </w:r>
-      <w:r>
-        <w:rPr>
-          <w:rFonts w:ascii="TH SarabunPSK" w:hAnsi="TH SarabunPSK" w:cs="TH SarabunPSK"/>
-          <w:sz w:val="32"/>
-          <w:szCs w:val="32"/>
-        </w:rPr>
-        <w:t xml:space="preserve">Google Sheets </w:t>
-      </w:r>
-      <w:r>
-        <w:rPr>
-          <w:rFonts w:ascii="TH SarabunPSK" w:hAnsi="TH SarabunPSK" w:cs="TH SarabunPSK"/>
-          <w:sz w:val="32"/>
-          <w:szCs w:val="32"/>
-          <w:cs/>
-        </w:rPr>
-        <w:t xml:space="preserve">แบบทันเหตุการณ์ ส่งอีเมลรายบุคคลเมื่อต้องสื่อสารเฉพาะเรื่อง ยืนยันตัวตนผู้ใช้ผ่าน </w:t>
-      </w:r>
-      <w:r>
-        <w:rPr>
-          <w:rFonts w:ascii="TH SarabunPSK" w:hAnsi="TH SarabunPSK" w:cs="TH SarabunPSK"/>
-          <w:sz w:val="32"/>
-          <w:szCs w:val="32"/>
-        </w:rPr>
-        <w:t xml:space="preserve">LINE OA/LIFF </w:t>
-      </w:r>
-      <w:r>
-        <w:rPr>
-          <w:rFonts w:ascii="TH SarabunPSK" w:hAnsi="TH SarabunPSK" w:cs="TH SarabunPSK"/>
-          <w:sz w:val="32"/>
-          <w:szCs w:val="32"/>
-          <w:cs/>
-        </w:rPr>
-        <w:t xml:space="preserve">และอีเมล (รองรับ </w:t>
-      </w:r>
-      <w:r>
-        <w:rPr>
-          <w:rFonts w:ascii="TH SarabunPSK" w:hAnsi="TH SarabunPSK" w:cs="TH SarabunPSK"/>
-          <w:sz w:val="32"/>
-          <w:szCs w:val="32"/>
-        </w:rPr>
-        <w:t xml:space="preserve">OTP </w:t>
-      </w:r>
-      <w:r>
-        <w:rPr>
-          <w:rFonts w:ascii="TH SarabunPSK" w:hAnsi="TH SarabunPSK" w:cs="TH SarabunPSK"/>
-          <w:sz w:val="32"/>
-          <w:szCs w:val="32"/>
-          <w:cs/>
-        </w:rPr>
-        <w:t xml:space="preserve">จากผู้ให้บริการภายนอกเมื่อจำเป็น) กำหนดสิทธิ์การเข้าถึงตามบทบาทงาน แจ้งข่าวสารแบบคัดกลุ่มตามบุคคล/แผนก/ตำแหน่ง ใช้ </w:t>
-      </w:r>
-      <w:r>
-        <w:rPr>
-          <w:rFonts w:ascii="TH SarabunPSK" w:hAnsi="TH SarabunPSK" w:cs="TH SarabunPSK"/>
-          <w:sz w:val="32"/>
-          <w:szCs w:val="32"/>
-        </w:rPr>
-        <w:t xml:space="preserve">LINE Flex Message </w:t>
-      </w:r>
-      <w:r>
-        <w:rPr>
-          <w:rFonts w:ascii="TH SarabunPSK" w:hAnsi="TH SarabunPSK" w:cs="TH SarabunPSK"/>
-          <w:sz w:val="32"/>
-          <w:szCs w:val="32"/>
-          <w:cs/>
-        </w:rPr>
-        <w:t xml:space="preserve">เพื่อให้ข้อมูลอ่านง่ายบนมือถือ เก็บเอกสารเข้าสู่ </w:t>
-      </w:r>
-      <w:r>
-        <w:rPr>
-          <w:rFonts w:ascii="TH SarabunPSK" w:hAnsi="TH SarabunPSK" w:cs="TH SarabunPSK"/>
-          <w:sz w:val="32"/>
-          <w:szCs w:val="32"/>
-        </w:rPr>
-        <w:t xml:space="preserve">Google Drive </w:t>
-      </w:r>
-      <w:r>
-        <w:rPr>
-          <w:rFonts w:ascii="TH SarabunPSK" w:hAnsi="TH SarabunPSK" w:cs="TH SarabunPSK"/>
-          <w:sz w:val="32"/>
-          <w:szCs w:val="32"/>
-          <w:cs/>
-        </w:rPr>
-        <w:t>พร้อมคัดแยกภาพ</w:t>
-      </w:r>
-      <w:proofErr w:type="spellStart"/>
-      <w:r>
-        <w:rPr>
-          <w:rFonts w:ascii="TH SarabunPSK" w:hAnsi="TH SarabunPSK" w:cs="TH SarabunPSK"/>
-          <w:sz w:val="32"/>
-          <w:szCs w:val="32"/>
-          <w:cs/>
-        </w:rPr>
-        <w:t>สล</w:t>
-      </w:r>
-      <w:proofErr w:type="spellEnd"/>
-      <w:r>
-        <w:rPr>
-          <w:rFonts w:ascii="TH SarabunPSK" w:hAnsi="TH SarabunPSK" w:cs="TH SarabunPSK"/>
-          <w:sz w:val="32"/>
-          <w:szCs w:val="32"/>
-          <w:cs/>
-        </w:rPr>
-        <w:t xml:space="preserve">ิปโอนเงินออกจากไฟล์ที่ไม่เกี่ยวข้อง ลดภาระการตรวจด้วยคน และต่อยอดเชื่อมฐานข้อมูลสำหรับ </w:t>
-      </w:r>
-      <w:r>
-        <w:rPr>
-          <w:rFonts w:ascii="TH SarabunPSK" w:hAnsi="TH SarabunPSK" w:cs="TH SarabunPSK"/>
-          <w:sz w:val="32"/>
-          <w:szCs w:val="32"/>
-        </w:rPr>
-        <w:t xml:space="preserve">RAG AI </w:t>
-      </w:r>
-      <w:r>
-        <w:rPr>
-          <w:rFonts w:ascii="TH SarabunPSK" w:hAnsi="TH SarabunPSK" w:cs="TH SarabunPSK"/>
-          <w:sz w:val="32"/>
-          <w:szCs w:val="32"/>
-          <w:cs/>
-        </w:rPr>
-        <w:t>เพื่อให้พนักงานถาม</w:t>
-      </w:r>
-      <w:r>
-        <w:rPr>
-          <w:rFonts w:ascii="TH SarabunPSK" w:hAnsi="TH SarabunPSK" w:cs="TH SarabunPSK"/>
-          <w:sz w:val="32"/>
-          <w:szCs w:val="32"/>
-        </w:rPr>
-        <w:t>–</w:t>
-      </w:r>
-      <w:r>
-        <w:rPr>
-          <w:rFonts w:ascii="TH SarabunPSK" w:hAnsi="TH SarabunPSK" w:cs="TH SarabunPSK"/>
-          <w:sz w:val="32"/>
-          <w:szCs w:val="32"/>
-          <w:cs/>
-        </w:rPr>
-        <w:t xml:space="preserve">ตอบความรู้ภายในจากคลังข้อมูลขององค์กรได้อย่างรวดเร็ว นอกจากนี้ยังรองรับการติดตามประเด็น </w:t>
-      </w:r>
-      <w:r>
-        <w:rPr>
-          <w:rFonts w:ascii="TH SarabunPSK" w:hAnsi="TH SarabunPSK" w:cs="TH SarabunPSK"/>
-          <w:sz w:val="32"/>
-          <w:szCs w:val="32"/>
-        </w:rPr>
-        <w:t xml:space="preserve">HR </w:t>
-      </w:r>
-      <w:r>
-        <w:rPr>
-          <w:rFonts w:ascii="TH SarabunPSK" w:hAnsi="TH SarabunPSK" w:cs="TH SarabunPSK"/>
-          <w:sz w:val="32"/>
-          <w:szCs w:val="32"/>
-          <w:cs/>
-        </w:rPr>
-        <w:t>เช่น พฤติกรรมการมาทำงาน ขาด</w:t>
-      </w:r>
-      <w:r>
-        <w:rPr>
-          <w:rFonts w:ascii="TH SarabunPSK" w:hAnsi="TH SarabunPSK" w:cs="TH SarabunPSK"/>
-          <w:sz w:val="32"/>
-          <w:szCs w:val="32"/>
-        </w:rPr>
-        <w:t>–</w:t>
-      </w:r>
-      <w:r>
-        <w:rPr>
-          <w:rFonts w:ascii="TH SarabunPSK" w:hAnsi="TH SarabunPSK" w:cs="TH SarabunPSK"/>
-          <w:sz w:val="32"/>
-          <w:szCs w:val="32"/>
-          <w:cs/>
-        </w:rPr>
-        <w:t>ลา</w:t>
-      </w:r>
-      <w:r>
-        <w:rPr>
-          <w:rFonts w:ascii="TH SarabunPSK" w:hAnsi="TH SarabunPSK" w:cs="TH SarabunPSK"/>
-          <w:sz w:val="32"/>
-          <w:szCs w:val="32"/>
-        </w:rPr>
-        <w:t>–</w:t>
-      </w:r>
-      <w:r>
-        <w:rPr>
-          <w:rFonts w:ascii="TH SarabunPSK" w:hAnsi="TH SarabunPSK" w:cs="TH SarabunPSK"/>
-          <w:sz w:val="32"/>
-          <w:szCs w:val="32"/>
-          <w:cs/>
-        </w:rPr>
-        <w:t>มาสาย และสรุปผลเป็นรายเดือนเพื่อนำไปใช้งานเชิงบริหาร</w:t>
-      </w:r>
-      <w:r>
-        <w:rPr>
-          <w:rFonts w:ascii="TH SarabunPSK" w:hAnsi="TH SarabunPSK" w:cs="TH SarabunPSK"/>
-          <w:sz w:val="32"/>
-          <w:szCs w:val="32"/>
-        </w:rPr>
-        <w:t xml:space="preserve"> </w:t>
-      </w:r>
-      <w:r>
-        <w:rPr>
-          <w:rFonts w:ascii="TH SarabunPSK" w:hAnsi="TH SarabunPSK" w:cs="TH SarabunPSK"/>
-          <w:sz w:val="32"/>
-          <w:szCs w:val="32"/>
-          <w:cs/>
-        </w:rPr>
-        <w:t xml:space="preserve">ความสำคัญของปัญหานี้อยู่ที่ผลกระทบต่อประสิทธิภาพทั้งระบบ หากงานประจำที่ต้อง </w:t>
-      </w:r>
-      <w:r>
-        <w:rPr>
-          <w:rFonts w:ascii="TH SarabunPSK" w:hAnsi="TH SarabunPSK" w:cs="TH SarabunPSK"/>
-          <w:sz w:val="32"/>
-          <w:szCs w:val="32"/>
-        </w:rPr>
-        <w:t>“</w:t>
-      </w:r>
-      <w:r>
-        <w:rPr>
-          <w:rFonts w:ascii="TH SarabunPSK" w:hAnsi="TH SarabunPSK" w:cs="TH SarabunPSK"/>
-          <w:sz w:val="32"/>
-          <w:szCs w:val="32"/>
-          <w:cs/>
-        </w:rPr>
-        <w:t>ถูกต้องและตรงเวลา</w:t>
-      </w:r>
-      <w:r>
-        <w:rPr>
-          <w:rFonts w:ascii="TH SarabunPSK" w:hAnsi="TH SarabunPSK" w:cs="TH SarabunPSK"/>
-          <w:sz w:val="32"/>
-          <w:szCs w:val="32"/>
-        </w:rPr>
-        <w:t xml:space="preserve">” </w:t>
-      </w:r>
-      <w:r>
-        <w:rPr>
-          <w:rFonts w:ascii="TH SarabunPSK" w:hAnsi="TH SarabunPSK" w:cs="TH SarabunPSK"/>
-          <w:sz w:val="32"/>
-          <w:szCs w:val="32"/>
-          <w:cs/>
-        </w:rPr>
-        <w:t xml:space="preserve">ไม่ได้ถูกทำให้เป็นอัตโนมัติ องค์กรจะสูญเสียชั่วโมงการทำงานจำนวนมากไปกับการย้ำเตือน การคีย์ข้อมูลซ้ำ และการแก้ข้อผิดพลาด ขณะเดียวกันผู้บริหารก็ไม่สามารถเข้าถึงข้อมูลที่เป็นปัจจุบันเพื่อการตัดสินใจ ระบบผู้ช่วยอัตโนมัติบน </w:t>
-      </w:r>
-      <w:r>
-        <w:rPr>
-          <w:rFonts w:ascii="TH SarabunPSK" w:hAnsi="TH SarabunPSK" w:cs="TH SarabunPSK"/>
-          <w:sz w:val="32"/>
-          <w:szCs w:val="32"/>
-        </w:rPr>
-        <w:t>n</w:t>
-      </w:r>
-      <w:r>
-        <w:rPr>
-          <w:rFonts w:ascii="TH SarabunPSK" w:hAnsi="TH SarabunPSK" w:cs="TH SarabunPSK"/>
-          <w:sz w:val="32"/>
-          <w:szCs w:val="32"/>
-          <w:cs/>
-        </w:rPr>
-        <w:t>8</w:t>
-      </w:r>
-      <w:r>
-        <w:rPr>
-          <w:rFonts w:ascii="TH SarabunPSK" w:hAnsi="TH SarabunPSK" w:cs="TH SarabunPSK"/>
-          <w:sz w:val="32"/>
-          <w:szCs w:val="32"/>
-        </w:rPr>
-        <w:t xml:space="preserve">n </w:t>
-      </w:r>
-      <w:r>
-        <w:rPr>
-          <w:rFonts w:ascii="TH SarabunPSK" w:hAnsi="TH SarabunPSK" w:cs="TH SarabunPSK"/>
-          <w:sz w:val="32"/>
-          <w:szCs w:val="32"/>
-          <w:cs/>
-        </w:rPr>
-        <w:t>จึงตอบโจทย์ด้วยการทำให้ข้อมูลและการแจ้งเตือนไหลผ่านช่องทางเดียวกันอย่างเป็นระบบ ลดงานซ้ำซ้อน สร้างมาตรฐานการสื่อสารที่ตรวจสอบย้อนหลังได้ เพิ่มความถูกต้อง</w:t>
-      </w:r>
-      <w:r>
-        <w:rPr>
-          <w:rFonts w:ascii="TH SarabunPSK" w:hAnsi="TH SarabunPSK" w:cs="TH SarabunPSK"/>
-          <w:sz w:val="32"/>
-          <w:szCs w:val="32"/>
-          <w:cs/>
-        </w:rPr>
-        <w:lastRenderedPageBreak/>
-        <w:t>ของข้อมูล และยกระดับประสบการณ์ทำงานของพนักงานให้เรียบง่ายขึ้น ที่สำคัญ โครงสร้างแบบ</w:t>
-      </w:r>
-      <w:proofErr w:type="spellStart"/>
-      <w:r>
-        <w:rPr>
-          <w:rFonts w:ascii="TH SarabunPSK" w:hAnsi="TH SarabunPSK" w:cs="TH SarabunPSK"/>
-          <w:sz w:val="32"/>
-          <w:szCs w:val="32"/>
-          <w:cs/>
-        </w:rPr>
-        <w:t>เวิร์กโฟลว์</w:t>
-      </w:r>
-      <w:proofErr w:type="spellEnd"/>
-      <w:r>
-        <w:rPr>
-          <w:rFonts w:ascii="TH SarabunPSK" w:hAnsi="TH SarabunPSK" w:cs="TH SarabunPSK"/>
-          <w:sz w:val="32"/>
-          <w:szCs w:val="32"/>
-          <w:cs/>
-        </w:rPr>
-        <w:t xml:space="preserve">ของ </w:t>
-      </w:r>
-      <w:r>
-        <w:rPr>
-          <w:rFonts w:ascii="TH SarabunPSK" w:hAnsi="TH SarabunPSK" w:cs="TH SarabunPSK"/>
-          <w:sz w:val="32"/>
-          <w:szCs w:val="32"/>
-        </w:rPr>
-        <w:t>n</w:t>
-      </w:r>
-      <w:r>
-        <w:rPr>
-          <w:rFonts w:ascii="TH SarabunPSK" w:hAnsi="TH SarabunPSK" w:cs="TH SarabunPSK"/>
-          <w:sz w:val="32"/>
-          <w:szCs w:val="32"/>
-          <w:cs/>
-        </w:rPr>
-        <w:t>8</w:t>
-      </w:r>
-      <w:r>
-        <w:rPr>
-          <w:rFonts w:ascii="TH SarabunPSK" w:hAnsi="TH SarabunPSK" w:cs="TH SarabunPSK"/>
-          <w:sz w:val="32"/>
-          <w:szCs w:val="32"/>
-        </w:rPr>
-        <w:t xml:space="preserve">n </w:t>
-      </w:r>
-      <w:r>
-        <w:rPr>
-          <w:rFonts w:ascii="TH SarabunPSK" w:hAnsi="TH SarabunPSK" w:cs="TH SarabunPSK"/>
-          <w:sz w:val="32"/>
-          <w:szCs w:val="32"/>
-          <w:cs/>
-        </w:rPr>
-        <w:t>ทำให้ระบบสามารถเริ่มจากหลายงานย่อยและค่อยๆ บูรณาการเป็นแพลตฟอร์มเดียวในอนาคตได้โดยไม่ต้องรื้อทั้งหมด ช่วยควบคุมต้นทุนและรองรับการเติบโตขององค์กรมากขึ้น</w:t>
-      </w:r>
-      <w:r>
-        <w:rPr>
-          <w:rFonts w:ascii="TH SarabunPSK" w:hAnsi="TH SarabunPSK" w:cs="TH SarabunPSK"/>
-          <w:sz w:val="32"/>
-          <w:szCs w:val="32"/>
-        </w:rPr>
-        <w:t xml:space="preserve"> </w:t>
       </w:r>
     </w:p>
     <w:p>
@@ -761,7 +251,7 @@
           <w:szCs w:val="32"/>
           <w:cs/>
         </w:rPr>
-        <w:t xml:space="preserve">กล่าวโดยสรุป โครงการนี้มีที่มาจากความต้องการแก้ </w:t>
+        <w:t xml:space="preserve">จากดังกล่าวจึงเกิดแนวคิดพัฒนา </w:t>
       </w:r>
       <w:r>
         <w:rPr>
@@ -778,7 +268,7 @@
           <w:szCs w:val="32"/>
           <w:cs/>
         </w:rPr>
-        <w:t>งานประจำที่สำคัญแต่สิ้นเปลืองเวลา</w:t>
+        <w:t>ผู้ช่วยอัตโนมัติของบริษัท</w:t>
       </w:r>
       <w:r>
         <w:rPr>
@@ -795,7 +285,7 @@
           <w:szCs w:val="32"/>
           <w:cs/>
         </w:rPr>
-        <w:t xml:space="preserve">ให้เป็นอัตโนมัติและเชื่อมต่อกันทั้งเส้นทาง ด้วย </w:t>
+        <w:t xml:space="preserve">ที่ทำหน้าที่เสมือนเลขาในออฟฟิศ โดยใช้แพลตฟอร์ม </w:t>
       </w:r>
       <w:r>
         <w:rPr>
@@ -829,61 +319,432 @@
           <w:szCs w:val="32"/>
           <w:cs/>
         </w:rPr>
-        <w:t>ในบทบาทเลขาออฟฟิศดิจิทัล องค์กรจะได้ทั้งความแม่นยำ ความรวดเร็ว ความโปร่งใสในการทำงาน และความพร้อมต่อการขยายตัวในระยะยาว</w:t>
-      </w:r>
-    </w:p>
-    <w:p>
-      <w:pPr>
-        <w:rPr>
-          <w:rFonts w:ascii="TH SarabunPSK" w:hAnsi="TH SarabunPSK" w:cs="TH SarabunPSK"/>
-          <w:b/>
-          <w:bCs/>
-          <w:sz w:val="32"/>
-          <w:szCs w:val="32"/>
-        </w:rPr>
-      </w:pPr>
-      <w:r>
-        <w:rPr>
-          <w:rFonts w:ascii="TH SarabunPSK" w:hAnsi="TH SarabunPSK" w:cs="TH SarabunPSK"/>
-          <w:b/>
-          <w:bCs/>
-          <w:sz w:val="32"/>
-          <w:szCs w:val="32"/>
-          <w:cs/>
-        </w:rPr>
-        <w:t>1.2</w:t>
-      </w:r>
-      <w:r>
-        <w:rPr>
-          <w:rFonts w:ascii="TH SarabunPSK" w:hAnsi="TH SarabunPSK" w:cs="TH SarabunPSK"/>
-          <w:b/>
-          <w:bCs/>
-          <w:color w:val="EE0000"/>
-          <w:sz w:val="32"/>
-          <w:szCs w:val="32"/>
-        </w:rPr>
-        <w:t>**</w:t>
-      </w:r>
-      <w:r>
-        <w:rPr>
-          <w:rFonts w:ascii="TH SarabunPSK" w:hAnsi="TH SarabunPSK" w:cs="TH SarabunPSK"/>
-          <w:b/>
-          <w:bCs/>
-          <w:sz w:val="32"/>
-          <w:szCs w:val="32"/>
-          <w:cs/>
-        </w:rPr>
-        <w:t>วัตถุประสงค์</w:t>
+        <w:t>เป็นต้นทางของ</w:t>
+      </w:r>
+      <w:proofErr w:type="spellStart"/>
+      <w:r>
+        <w:rPr>
+          <w:rFonts w:ascii="TH SarabunPSK" w:hAnsi="TH SarabunPSK" w:cs="TH SarabunPSK"/>
+          <w:sz w:val="32"/>
+          <w:szCs w:val="32"/>
+          <w:cs/>
+        </w:rPr>
+        <w:t>เวิร์กโฟลว์</w:t>
+      </w:r>
+      <w:proofErr w:type="spellEnd"/>
+      <w:r>
+        <w:rPr>
+          <w:rFonts w:ascii="TH SarabunPSK" w:hAnsi="TH SarabunPSK" w:cs="TH SarabunPSK"/>
+          <w:sz w:val="32"/>
+          <w:szCs w:val="32"/>
+          <w:cs/>
+        </w:rPr>
+        <w:t xml:space="preserve">อัตโนมัติ เชื่อมต่อ </w:t>
+      </w:r>
+      <w:r>
+        <w:rPr>
+          <w:rFonts w:ascii="TH SarabunPSK" w:hAnsi="TH SarabunPSK" w:cs="TH SarabunPSK"/>
+          <w:sz w:val="32"/>
+          <w:szCs w:val="32"/>
+        </w:rPr>
+        <w:t xml:space="preserve">LINE Official Account/LIFF, </w:t>
+      </w:r>
+      <w:r>
+        <w:rPr>
+          <w:rFonts w:ascii="TH SarabunPSK" w:hAnsi="TH SarabunPSK" w:cs="TH SarabunPSK"/>
+          <w:sz w:val="32"/>
+          <w:szCs w:val="32"/>
+          <w:cs/>
+        </w:rPr>
+        <w:t>อีเมล</w:t>
+      </w:r>
+      <w:r>
+        <w:rPr>
+          <w:rFonts w:ascii="TH SarabunPSK" w:hAnsi="TH SarabunPSK" w:cs="TH SarabunPSK"/>
+          <w:sz w:val="32"/>
+          <w:szCs w:val="32"/>
+        </w:rPr>
+        <w:t>, Google</w:t>
+      </w:r>
+      <w:r>
+        <w:rPr>
+          <w:rFonts w:ascii="TH SarabunPSK" w:hAnsi="TH SarabunPSK" w:cs="TH SarabunPSK"/>
+          <w:sz w:val="32"/>
+          <w:szCs w:val="32"/>
+        </w:rPr>
+        <w:t xml:space="preserve"> </w:t>
+      </w:r>
+      <w:r>
+        <w:rPr>
+          <w:rFonts w:ascii="TH SarabunPSK" w:hAnsi="TH SarabunPSK" w:cs="TH SarabunPSK"/>
+          <w:sz w:val="32"/>
+          <w:szCs w:val="32"/>
+        </w:rPr>
+        <w:t xml:space="preserve">Sheets/Drive </w:t>
+      </w:r>
+      <w:r>
+        <w:rPr>
+          <w:rFonts w:ascii="TH SarabunPSK" w:hAnsi="TH SarabunPSK" w:cs="TH SarabunPSK"/>
+          <w:sz w:val="32"/>
+          <w:szCs w:val="32"/>
+          <w:cs/>
+        </w:rPr>
+        <w:t>และฐานข้อมูลได้อย่างยืดหยุ่น ระบบตั้งใจแก้ปัญหาเชิงปฏิบัติที่เกิดขึ้นจริง ได้แก่ แจ้งเตือนวันเกิดพนักงาน สร้าง/เพิ่ม/ลบห้องประชุมและส่งการแจ้งเตือนก่อนเริ่มประชุมอัตโนมัติที่ 15</w:t>
+      </w:r>
+      <w:r>
+        <w:rPr>
+          <w:rFonts w:ascii="TH SarabunPSK" w:hAnsi="TH SarabunPSK" w:cs="TH SarabunPSK"/>
+          <w:sz w:val="32"/>
+          <w:szCs w:val="32"/>
+        </w:rPr>
+        <w:t xml:space="preserve">, </w:t>
+      </w:r>
+      <w:r>
+        <w:rPr>
+          <w:rFonts w:ascii="TH SarabunPSK" w:hAnsi="TH SarabunPSK" w:cs="TH SarabunPSK"/>
+          <w:sz w:val="32"/>
+          <w:szCs w:val="32"/>
+          <w:cs/>
+        </w:rPr>
+        <w:t xml:space="preserve">10 และ 5 นาที รวม 3 ครั้ง แจ้งยอดขายรายบุคคลจาก </w:t>
+      </w:r>
+      <w:r>
+        <w:rPr>
+          <w:rFonts w:ascii="TH SarabunPSK" w:hAnsi="TH SarabunPSK" w:cs="TH SarabunPSK"/>
+          <w:sz w:val="32"/>
+          <w:szCs w:val="32"/>
+        </w:rPr>
+        <w:t xml:space="preserve">Google Sheets </w:t>
+      </w:r>
+      <w:r>
+        <w:rPr>
+          <w:rFonts w:ascii="TH SarabunPSK" w:hAnsi="TH SarabunPSK" w:cs="TH SarabunPSK"/>
+          <w:sz w:val="32"/>
+          <w:szCs w:val="32"/>
+          <w:cs/>
+        </w:rPr>
+        <w:t xml:space="preserve">แบบทันเหตุการณ์ ส่งอีเมลรายบุคคลเมื่อต้องสื่อสารเฉพาะเรื่อง ยืนยันตัวตนผู้ใช้ผ่าน </w:t>
+      </w:r>
+      <w:r>
+        <w:rPr>
+          <w:rFonts w:ascii="TH SarabunPSK" w:hAnsi="TH SarabunPSK" w:cs="TH SarabunPSK"/>
+          <w:sz w:val="32"/>
+          <w:szCs w:val="32"/>
+        </w:rPr>
+        <w:t xml:space="preserve">LINE OA/LIFF </w:t>
+      </w:r>
+      <w:r>
+        <w:rPr>
+          <w:rFonts w:ascii="TH SarabunPSK" w:hAnsi="TH SarabunPSK" w:cs="TH SarabunPSK"/>
+          <w:sz w:val="32"/>
+          <w:szCs w:val="32"/>
+          <w:cs/>
+        </w:rPr>
+        <w:t xml:space="preserve">และอีเมล (รองรับ </w:t>
+      </w:r>
+      <w:r>
+        <w:rPr>
+          <w:rFonts w:ascii="TH SarabunPSK" w:hAnsi="TH SarabunPSK" w:cs="TH SarabunPSK"/>
+          <w:sz w:val="32"/>
+          <w:szCs w:val="32"/>
+        </w:rPr>
+        <w:t xml:space="preserve">OTP </w:t>
+      </w:r>
+      <w:r>
+        <w:rPr>
+          <w:rFonts w:ascii="TH SarabunPSK" w:hAnsi="TH SarabunPSK" w:cs="TH SarabunPSK"/>
+          <w:sz w:val="32"/>
+          <w:szCs w:val="32"/>
+          <w:cs/>
+        </w:rPr>
+        <w:t xml:space="preserve">จากผู้ให้บริการภายนอกเมื่อจำเป็น) กำหนดสิทธิ์การเข้าถึงตามบทบาทงาน แจ้งข่าวสารแบบคัดกลุ่มตามบุคคล/แผนก/ตำแหน่ง ใช้ </w:t>
+      </w:r>
+      <w:r>
+        <w:rPr>
+          <w:rFonts w:ascii="TH SarabunPSK" w:hAnsi="TH SarabunPSK" w:cs="TH SarabunPSK"/>
+          <w:sz w:val="32"/>
+          <w:szCs w:val="32"/>
+        </w:rPr>
+        <w:t xml:space="preserve">LINE Flex Message </w:t>
+      </w:r>
+      <w:r>
+        <w:rPr>
+          <w:rFonts w:ascii="TH SarabunPSK" w:hAnsi="TH SarabunPSK" w:cs="TH SarabunPSK"/>
+          <w:sz w:val="32"/>
+          <w:szCs w:val="32"/>
+          <w:cs/>
+        </w:rPr>
+        <w:t>เพื่อให้ข้อมูลอ่านง่ายบนมือถือ</w:t>
+      </w:r>
+      <w:r>
+        <w:rPr>
+          <w:rFonts w:ascii="TH SarabunPSK" w:hAnsi="TH SarabunPSK" w:cs="TH SarabunPSK" w:hint="cs"/>
+          <w:sz w:val="32"/>
+          <w:szCs w:val="32"/>
+          <w:cs/>
+        </w:rPr>
+        <w:t xml:space="preserve"> และ</w:t>
+      </w:r>
+      <w:r>
+        <w:rPr>
+          <w:rFonts w:ascii="TH SarabunPSK" w:hAnsi="TH SarabunPSK" w:cs="TH SarabunPSK"/>
+          <w:sz w:val="32"/>
+          <w:szCs w:val="32"/>
+          <w:cs/>
+        </w:rPr>
+        <w:t xml:space="preserve">ต่อยอดเชื่อมฐานข้อมูลสำหรับ </w:t>
+      </w:r>
+      <w:r>
+        <w:rPr>
+          <w:rFonts w:ascii="TH SarabunPSK" w:hAnsi="TH SarabunPSK" w:cs="TH SarabunPSK"/>
+          <w:sz w:val="32"/>
+          <w:szCs w:val="32"/>
+        </w:rPr>
+        <w:t xml:space="preserve">RAG AI </w:t>
+      </w:r>
+      <w:r>
+        <w:rPr>
+          <w:rFonts w:ascii="TH SarabunPSK" w:hAnsi="TH SarabunPSK" w:cs="TH SarabunPSK"/>
+          <w:sz w:val="32"/>
+          <w:szCs w:val="32"/>
+          <w:cs/>
+        </w:rPr>
+        <w:t>เพื่อให้พนักงานถาม</w:t>
+      </w:r>
+      <w:r>
+        <w:rPr>
+          <w:rFonts w:ascii="TH SarabunPSK" w:hAnsi="TH SarabunPSK" w:cs="TH SarabunPSK"/>
+          <w:sz w:val="32"/>
+          <w:szCs w:val="32"/>
+        </w:rPr>
+        <w:t>–</w:t>
+      </w:r>
+      <w:r>
+        <w:rPr>
+          <w:rFonts w:ascii="TH SarabunPSK" w:hAnsi="TH SarabunPSK" w:cs="TH SarabunPSK"/>
+          <w:sz w:val="32"/>
+          <w:szCs w:val="32"/>
+          <w:cs/>
+        </w:rPr>
+        <w:t xml:space="preserve">ตอบความรู้ภายในจากคลังข้อมูลขององค์กรได้อย่างรวดเร็ว นอกจากนี้ยังรองรับการติดตามประเด็น </w:t>
+      </w:r>
+      <w:r>
+        <w:rPr>
+          <w:rFonts w:ascii="TH SarabunPSK" w:hAnsi="TH SarabunPSK" w:cs="TH SarabunPSK"/>
+          <w:sz w:val="32"/>
+          <w:szCs w:val="32"/>
+        </w:rPr>
+        <w:t xml:space="preserve">HR </w:t>
+      </w:r>
+      <w:r>
+        <w:rPr>
+          <w:rFonts w:ascii="TH SarabunPSK" w:hAnsi="TH SarabunPSK" w:cs="TH SarabunPSK"/>
+          <w:sz w:val="32"/>
+          <w:szCs w:val="32"/>
+          <w:cs/>
+        </w:rPr>
+        <w:t>เช่น พฤติกรรมการมาทำงาน ขาด</w:t>
+      </w:r>
+      <w:r>
+        <w:rPr>
+          <w:rFonts w:ascii="TH SarabunPSK" w:hAnsi="TH SarabunPSK" w:cs="TH SarabunPSK"/>
+          <w:sz w:val="32"/>
+          <w:szCs w:val="32"/>
+        </w:rPr>
+        <w:t>–</w:t>
+      </w:r>
+      <w:r>
+        <w:rPr>
+          <w:rFonts w:ascii="TH SarabunPSK" w:hAnsi="TH SarabunPSK" w:cs="TH SarabunPSK"/>
+          <w:sz w:val="32"/>
+          <w:szCs w:val="32"/>
+          <w:cs/>
+        </w:rPr>
+        <w:t>ลา</w:t>
+      </w:r>
+      <w:r>
+        <w:rPr>
+          <w:rFonts w:ascii="TH SarabunPSK" w:hAnsi="TH SarabunPSK" w:cs="TH SarabunPSK"/>
+          <w:sz w:val="32"/>
+          <w:szCs w:val="32"/>
+        </w:rPr>
+        <w:t>–</w:t>
+      </w:r>
+      <w:r>
+        <w:rPr>
+          <w:rFonts w:ascii="TH SarabunPSK" w:hAnsi="TH SarabunPSK" w:cs="TH SarabunPSK"/>
+          <w:sz w:val="32"/>
+          <w:szCs w:val="32"/>
+          <w:cs/>
+        </w:rPr>
+        <w:t>มาสาย และสรุปผลเป็นรายเดือนเพื่อนำไปใช้งานเชิงบริหาร</w:t>
+      </w:r>
+      <w:r>
+        <w:rPr>
+          <w:rFonts w:ascii="TH SarabunPSK" w:hAnsi="TH SarabunPSK" w:cs="TH SarabunPSK"/>
+          <w:sz w:val="32"/>
+          <w:szCs w:val="32"/>
+        </w:rPr>
+        <w:t xml:space="preserve"> </w:t>
+      </w:r>
+      <w:r>
+        <w:rPr>
+          <w:rFonts w:ascii="TH SarabunPSK" w:hAnsi="TH SarabunPSK" w:cs="TH SarabunPSK"/>
+          <w:sz w:val="32"/>
+          <w:szCs w:val="32"/>
+          <w:cs/>
+        </w:rPr>
+        <w:t xml:space="preserve">ความสำคัญของปัญหานี้อยู่ที่ผลกระทบต่อประสิทธิภาพทั้งระบบ หากงานประจำที่ต้อง </w:t>
+      </w:r>
+      <w:r>
+        <w:rPr>
+          <w:rFonts w:ascii="TH SarabunPSK" w:hAnsi="TH SarabunPSK" w:cs="TH SarabunPSK"/>
+          <w:sz w:val="32"/>
+          <w:szCs w:val="32"/>
+        </w:rPr>
+        <w:t>“</w:t>
+      </w:r>
+      <w:r>
+        <w:rPr>
+          <w:rFonts w:ascii="TH SarabunPSK" w:hAnsi="TH SarabunPSK" w:cs="TH SarabunPSK"/>
+          <w:sz w:val="32"/>
+          <w:szCs w:val="32"/>
+          <w:cs/>
+        </w:rPr>
+        <w:t>ถูกต้องและตรงเวลา</w:t>
+      </w:r>
+      <w:r>
+        <w:rPr>
+          <w:rFonts w:ascii="TH SarabunPSK" w:hAnsi="TH SarabunPSK" w:cs="TH SarabunPSK"/>
+          <w:sz w:val="32"/>
+          <w:szCs w:val="32"/>
+        </w:rPr>
+        <w:t xml:space="preserve">” </w:t>
+      </w:r>
+      <w:r>
+        <w:rPr>
+          <w:rFonts w:ascii="TH SarabunPSK" w:hAnsi="TH SarabunPSK" w:cs="TH SarabunPSK"/>
+          <w:sz w:val="32"/>
+          <w:szCs w:val="32"/>
+          <w:cs/>
+        </w:rPr>
+        <w:t xml:space="preserve">ไม่ได้ถูกทำให้เป็นอัตโนมัติ องค์กรจะสูญเสียชั่วโมงการทำงานจำนวนมากไปกับการย้ำเตือน การคีย์ข้อมูลซ้ำ และการแก้ข้อผิดพลาด ขณะเดียวกันผู้บริหารก็ไม่สามารถเข้าถึงข้อมูลที่เป็นปัจจุบันเพื่อการตัดสินใจ ระบบผู้ช่วยอัตโนมัติบน </w:t>
+      </w:r>
+      <w:r>
+        <w:rPr>
+          <w:rFonts w:ascii="TH SarabunPSK" w:hAnsi="TH SarabunPSK" w:cs="TH SarabunPSK"/>
+          <w:sz w:val="32"/>
+          <w:szCs w:val="32"/>
+        </w:rPr>
+        <w:t>n</w:t>
+      </w:r>
+      <w:r>
+        <w:rPr>
+          <w:rFonts w:ascii="TH SarabunPSK" w:hAnsi="TH SarabunPSK" w:cs="TH SarabunPSK"/>
+          <w:sz w:val="32"/>
+          <w:szCs w:val="32"/>
+          <w:cs/>
+        </w:rPr>
+        <w:t>8</w:t>
+      </w:r>
+      <w:r>
+        <w:rPr>
+          <w:rFonts w:ascii="TH SarabunPSK" w:hAnsi="TH SarabunPSK" w:cs="TH SarabunPSK"/>
+          <w:sz w:val="32"/>
+          <w:szCs w:val="32"/>
+        </w:rPr>
+        <w:t xml:space="preserve">n </w:t>
+      </w:r>
+      <w:r>
+        <w:rPr>
+          <w:rFonts w:ascii="TH SarabunPSK" w:hAnsi="TH SarabunPSK" w:cs="TH SarabunPSK"/>
+          <w:sz w:val="32"/>
+          <w:szCs w:val="32"/>
+          <w:cs/>
+        </w:rPr>
+        <w:t xml:space="preserve">จึงตอบโจทย์ด้วยการทำให้ข้อมูลและการแจ้งเตือนไหลผ่านช่องทางเดียวกันอย่างเป็นระบบ ลดงานซ้ำซ้อน สร้างมาตรฐานการสื่อสารที่ตรวจสอบย้อนหลังได้ เพิ่มความถูกต้องของข้อมูล และยกระดับประสบการณ์ทำงานของพนักงานให้เรียบง่ายขึ้น </w:t>
+      </w:r>
+      <w:r>
+        <w:rPr>
+          <w:rFonts w:ascii="TH SarabunPSK" w:hAnsi="TH SarabunPSK" w:cs="TH SarabunPSK"/>
+          <w:sz w:val="32"/>
+          <w:szCs w:val="32"/>
+          <w:cs/>
+        </w:rPr>
+        <w:lastRenderedPageBreak/>
+        <w:t>ที่สำคัญ โครงสร้างแบบ</w:t>
+      </w:r>
+      <w:proofErr w:type="spellStart"/>
+      <w:r>
+        <w:rPr>
+          <w:rFonts w:ascii="TH SarabunPSK" w:hAnsi="TH SarabunPSK" w:cs="TH SarabunPSK"/>
+          <w:sz w:val="32"/>
+          <w:szCs w:val="32"/>
+          <w:cs/>
+        </w:rPr>
+        <w:t>เวิร์กโฟลว์</w:t>
+      </w:r>
+      <w:proofErr w:type="spellEnd"/>
+      <w:r>
+        <w:rPr>
+          <w:rFonts w:ascii="TH SarabunPSK" w:hAnsi="TH SarabunPSK" w:cs="TH SarabunPSK"/>
+          <w:sz w:val="32"/>
+          <w:szCs w:val="32"/>
+          <w:cs/>
+        </w:rPr>
+        <w:t xml:space="preserve">ของ </w:t>
+      </w:r>
+      <w:r>
+        <w:rPr>
+          <w:rFonts w:ascii="TH SarabunPSK" w:hAnsi="TH SarabunPSK" w:cs="TH SarabunPSK"/>
+          <w:sz w:val="32"/>
+          <w:szCs w:val="32"/>
+        </w:rPr>
+        <w:t>n</w:t>
+      </w:r>
+      <w:r>
+        <w:rPr>
+          <w:rFonts w:ascii="TH SarabunPSK" w:hAnsi="TH SarabunPSK" w:cs="TH SarabunPSK"/>
+          <w:sz w:val="32"/>
+          <w:szCs w:val="32"/>
+          <w:cs/>
+        </w:rPr>
+        <w:t>8</w:t>
+      </w:r>
+      <w:r>
+        <w:rPr>
+          <w:rFonts w:ascii="TH SarabunPSK" w:hAnsi="TH SarabunPSK" w:cs="TH SarabunPSK"/>
+          <w:sz w:val="32"/>
+          <w:szCs w:val="32"/>
+        </w:rPr>
+        <w:t xml:space="preserve">n </w:t>
+      </w:r>
+      <w:r>
+        <w:rPr>
+          <w:rFonts w:ascii="TH SarabunPSK" w:hAnsi="TH SarabunPSK" w:cs="TH SarabunPSK"/>
+          <w:sz w:val="32"/>
+          <w:szCs w:val="32"/>
+          <w:cs/>
+        </w:rPr>
+        <w:t>ทำให้ระบบสามารถเริ่มจากหลายงานย่อยและค่อยๆ บูรณาการเป็นแพลตฟอร์มเดียวในอนาคตได้โดยไม่ต้องรื้อทั้งหมด ช่วยควบคุมต้นทุนและรองรับการเติบโตขององค์กรมากขึ้น</w:t>
+      </w:r>
+      <w:r>
+        <w:rPr>
+          <w:rFonts w:ascii="TH SarabunPSK" w:hAnsi="TH SarabunPSK" w:cs="TH SarabunPSK"/>
+          <w:sz w:val="32"/>
+          <w:szCs w:val="32"/>
+        </w:rPr>
+        <w:t xml:space="preserve"> </w:t>
       </w:r>
     </w:p>
     <w:p>
       <w:pPr>
         <w:ind w:firstLine="709"/>
-        <w:rPr>
-          <w:rFonts w:ascii="TH SarabunPSK" w:hAnsi="TH SarabunPSK" w:cs="TH SarabunPSK"/>
-          <w:sz w:val="32"/>
-          <w:szCs w:val="32"/>
-          <w:cs/>
+        <w:jc w:val="both"/>
+        <w:rPr>
+          <w:rFonts w:ascii="TH SarabunPSK" w:hAnsi="TH SarabunPSK" w:cs="TH SarabunPSK"/>
+          <w:sz w:val="32"/>
+          <w:szCs w:val="32"/>
         </w:rPr>
       </w:pPr>
       <w:r>
@@ -893,33 +754,41 @@
           <w:szCs w:val="32"/>
           <w:cs/>
         </w:rPr>
-        <w:t>1.2.1</w:t>
-      </w:r>
-      <w:r>
-        <w:rPr>
-          <w:rFonts w:ascii="TH SarabunPSK" w:hAnsi="TH SarabunPSK" w:cs="TH SarabunPSK"/>
-          <w:sz w:val="32"/>
-          <w:szCs w:val="32"/>
-        </w:rPr>
-        <w:t>**</w:t>
-      </w:r>
-      <w:r>
-        <w:rPr>
-          <w:rFonts w:ascii="TH SarabunPSK" w:hAnsi="TH SarabunPSK" w:cs="TH SarabunPSK"/>
-          <w:sz w:val="32"/>
-          <w:szCs w:val="32"/>
-          <w:cs/>
-        </w:rPr>
-        <w:t>เพื่อพัฒนา</w:t>
-      </w:r>
-      <w:r>
-        <w:rPr>
-          <w:rFonts w:ascii="TH SarabunPSK" w:hAnsi="TH SarabunPSK" w:cs="TH SarabunPSK"/>
-          <w:sz w:val="32"/>
-          <w:szCs w:val="32"/>
-          <w:cs/>
-        </w:rPr>
-        <w:t xml:space="preserve">ระบบผู้ช่วยอัตโนมัติ </w:t>
+        <w:t xml:space="preserve">กล่าวโดยสรุป โครงการนี้มีที่มาจากความต้องการแก้ </w:t>
+      </w:r>
+      <w:r>
+        <w:rPr>
+          <w:rFonts w:ascii="TH SarabunPSK" w:hAnsi="TH SarabunPSK" w:cs="TH SarabunPSK"/>
+          <w:sz w:val="32"/>
+          <w:szCs w:val="32"/>
+        </w:rPr>
+        <w:t>“</w:t>
+      </w:r>
+      <w:r>
+        <w:rPr>
+          <w:rFonts w:ascii="TH SarabunPSK" w:hAnsi="TH SarabunPSK" w:cs="TH SarabunPSK"/>
+          <w:sz w:val="32"/>
+          <w:szCs w:val="32"/>
+          <w:cs/>
+        </w:rPr>
+        <w:t>งานประจำที่สำคัญแต่สิ้นเปลืองเวลา</w:t>
+      </w:r>
+      <w:r>
+        <w:rPr>
+          <w:rFonts w:ascii="TH SarabunPSK" w:hAnsi="TH SarabunPSK" w:cs="TH SarabunPSK"/>
+          <w:sz w:val="32"/>
+          <w:szCs w:val="32"/>
+        </w:rPr>
+        <w:t xml:space="preserve">” </w:t>
+      </w:r>
+      <w:r>
+        <w:rPr>
+          <w:rFonts w:ascii="TH SarabunPSK" w:hAnsi="TH SarabunPSK" w:cs="TH SarabunPSK"/>
+          <w:sz w:val="32"/>
+          <w:szCs w:val="32"/>
+          <w:cs/>
+        </w:rPr>
+        <w:t xml:space="preserve">ให้เป็นอัตโนมัติและเชื่อมต่อกันทั้งเส้นทาง ด้วย </w:t>
       </w:r>
       <w:r>
         <w:rPr>
@@ -953,40 +822,15 @@
           <w:szCs w:val="32"/>
           <w:cs/>
         </w:rPr>
-        <w:t xml:space="preserve">ผ่าน </w:t>
-      </w:r>
-      <w:r>
-        <w:rPr>
-          <w:rFonts w:ascii="TH SarabunPSK" w:hAnsi="TH SarabunPSK" w:cs="TH SarabunPSK"/>
-          <w:sz w:val="32"/>
-          <w:szCs w:val="32"/>
-        </w:rPr>
-        <w:t>LINE OA</w:t>
-      </w:r>
-      <w:r>
-        <w:rPr>
-          <w:rFonts w:ascii="TH SarabunPSK" w:hAnsi="TH SarabunPSK" w:cs="TH SarabunPSK" w:hint="cs"/>
-          <w:sz w:val="32"/>
-          <w:szCs w:val="32"/>
-          <w:cs/>
-        </w:rPr>
-        <w:t xml:space="preserve"> </w:t>
-      </w:r>
-      <w:r>
-        <w:rPr>
-          <w:rFonts w:ascii="TH SarabunPSK" w:hAnsi="TH SarabunPSK" w:cs="TH SarabunPSK"/>
-          <w:sz w:val="32"/>
-          <w:szCs w:val="32"/>
-          <w:cs/>
-        </w:rPr>
-        <w:t>สำหรับองค์กร</w:t>
+        <w:t>ในบทบาทเลขาออฟฟิศดิจิทัล องค์กรจะได้ทั้งความแม่นยำ ความรวดเร็ว ความโปร่งใสในการทำงาน และความพร้อมต่อการขยายตัวในระยะยาว</w:t>
       </w:r>
     </w:p>
     <w:p>
       <w:pPr>
-        <w:ind w:firstLine="709"/>
-        <w:rPr>
-          <w:rFonts w:ascii="TH SarabunPSK" w:hAnsi="TH SarabunPSK" w:cs="TH SarabunPSK"/>
+        <w:rPr>
+          <w:rFonts w:ascii="TH SarabunPSK" w:hAnsi="TH SarabunPSK" w:cs="TH SarabunPSK"/>
+          <w:b/>
+          <w:bCs/>
           <w:sz w:val="32"/>
           <w:szCs w:val="32"/>
         </w:rPr>
@@ -994,15 +838,20 @@
       <w:r>
         <w:rPr>
           <w:rFonts w:ascii="TH SarabunPSK" w:hAnsi="TH SarabunPSK" w:cs="TH SarabunPSK"/>
-          <w:sz w:val="32"/>
-          <w:szCs w:val="32"/>
-          <w:cs/>
-        </w:rPr>
-        <w:t>1.2.2</w:t>
-      </w:r>
-      <w:r>
-        <w:rPr>
-          <w:rFonts w:ascii="TH SarabunPSK" w:hAnsi="TH SarabunPSK" w:cs="TH SarabunPSK"/>
+          <w:b/>
+          <w:bCs/>
+          <w:sz w:val="32"/>
+          <w:szCs w:val="32"/>
+          <w:cs/>
+        </w:rPr>
+        <w:t>1.2</w:t>
+      </w:r>
+      <w:r>
+        <w:rPr>
+          <w:rFonts w:ascii="TH SarabunPSK" w:hAnsi="TH SarabunPSK" w:cs="TH SarabunPSK"/>
+          <w:b/>
+          <w:bCs/>
+          <w:color w:val="FFFFFF" w:themeColor="background1"/>
           <w:sz w:val="32"/>
           <w:szCs w:val="32"/>
         </w:rPr>
@@ -1011,208 +860,358 @@
       <w:r>
         <w:rPr>
           <w:rFonts w:ascii="TH SarabunPSK" w:hAnsi="TH SarabunPSK" w:cs="TH SarabunPSK"/>
-          <w:sz w:val="32"/>
-          <w:szCs w:val="32"/>
-          <w:cs/>
-        </w:rPr>
-        <w:t>เพื่อหาประสิทธิภาพของระบบ</w:t>
-      </w:r>
-      <w:r>
-        <w:rPr>
-          <w:rFonts w:ascii="TH SarabunPSK" w:hAnsi="TH SarabunPSK" w:cs="TH SarabunPSK"/>
-          <w:sz w:val="32"/>
-          <w:szCs w:val="32"/>
-          <w:cs/>
-        </w:rPr>
-        <w:t xml:space="preserve">ผู้ช่วยอัตโนมัติ </w:t>
-      </w:r>
-      <w:r>
-        <w:rPr>
-          <w:rFonts w:ascii="TH SarabunPSK" w:hAnsi="TH SarabunPSK" w:cs="TH SarabunPSK"/>
-          <w:sz w:val="32"/>
-          <w:szCs w:val="32"/>
-        </w:rPr>
-        <w:t>n</w:t>
-      </w:r>
-      <w:r>
-        <w:rPr>
-          <w:rFonts w:ascii="TH SarabunPSK" w:hAnsi="TH SarabunPSK" w:cs="TH SarabunPSK"/>
-          <w:sz w:val="32"/>
-          <w:szCs w:val="32"/>
-          <w:cs/>
-        </w:rPr>
-        <w:t>8</w:t>
-      </w:r>
-      <w:r>
-        <w:rPr>
-          <w:rFonts w:ascii="TH SarabunPSK" w:hAnsi="TH SarabunPSK" w:cs="TH SarabunPSK"/>
-          <w:sz w:val="32"/>
-          <w:szCs w:val="32"/>
-        </w:rPr>
-        <w:t xml:space="preserve">n </w:t>
-      </w:r>
-      <w:r>
-        <w:rPr>
-          <w:rFonts w:ascii="TH SarabunPSK" w:hAnsi="TH SarabunPSK" w:cs="TH SarabunPSK"/>
-          <w:sz w:val="32"/>
-          <w:szCs w:val="32"/>
-          <w:cs/>
-        </w:rPr>
-        <w:t xml:space="preserve">ผ่าน </w:t>
-      </w:r>
-      <w:r>
-        <w:rPr>
-          <w:rFonts w:ascii="TH SarabunPSK" w:hAnsi="TH SarabunPSK" w:cs="TH SarabunPSK"/>
-          <w:sz w:val="32"/>
-          <w:szCs w:val="32"/>
-        </w:rPr>
-        <w:t>LINE OA</w:t>
-      </w:r>
-      <w:r>
-        <w:rPr>
-          <w:rFonts w:ascii="TH SarabunPSK" w:hAnsi="TH SarabunPSK" w:cs="TH SarabunPSK" w:hint="cs"/>
-          <w:sz w:val="32"/>
-          <w:szCs w:val="32"/>
-          <w:cs/>
-        </w:rPr>
-        <w:t xml:space="preserve"> </w:t>
-      </w:r>
-      <w:r>
-        <w:rPr>
-          <w:rFonts w:ascii="TH SarabunPSK" w:hAnsi="TH SarabunPSK" w:cs="TH SarabunPSK"/>
-          <w:sz w:val="32"/>
-          <w:szCs w:val="32"/>
-          <w:cs/>
-        </w:rPr>
-        <w:t>สำหรับองค์กร</w:t>
-      </w:r>
-    </w:p>
-    <w:p>
-      <w:pPr>
-        <w:ind w:firstLine="709"/>
-        <w:rPr>
-          <w:rFonts w:ascii="TH SarabunPSK" w:hAnsi="TH SarabunPSK" w:cs="TH SarabunPSK"/>
-          <w:sz w:val="32"/>
-          <w:szCs w:val="32"/>
-        </w:rPr>
-      </w:pPr>
-      <w:r>
-        <w:rPr>
-          <w:rFonts w:ascii="TH SarabunPSK" w:hAnsi="TH SarabunPSK" w:cs="TH SarabunPSK"/>
-          <w:sz w:val="32"/>
-          <w:szCs w:val="32"/>
-          <w:cs/>
-        </w:rPr>
-        <w:t>1.2.3</w:t>
-      </w:r>
-      <w:r>
-        <w:rPr>
-          <w:rFonts w:ascii="TH SarabunPSK" w:hAnsi="TH SarabunPSK" w:cs="TH SarabunPSK"/>
-          <w:sz w:val="32"/>
-          <w:szCs w:val="32"/>
-        </w:rPr>
-        <w:t>**</w:t>
-      </w:r>
-      <w:r>
-        <w:rPr>
-          <w:rFonts w:ascii="TH SarabunPSK" w:hAnsi="TH SarabunPSK" w:cs="TH SarabunPSK"/>
-          <w:sz w:val="32"/>
-          <w:szCs w:val="32"/>
-          <w:cs/>
-        </w:rPr>
-        <w:t>เพื่อหาความพึงพอใจของผู้ใช้ระบบ</w:t>
-      </w:r>
-      <w:r>
-        <w:rPr>
-          <w:rFonts w:ascii="TH SarabunPSK" w:hAnsi="TH SarabunPSK" w:cs="TH SarabunPSK"/>
-          <w:sz w:val="32"/>
-          <w:szCs w:val="32"/>
-          <w:cs/>
-        </w:rPr>
-        <w:t xml:space="preserve">ผู้ช่วยอัตโนมัติ </w:t>
-      </w:r>
-      <w:r>
-        <w:rPr>
-          <w:rFonts w:ascii="TH SarabunPSK" w:hAnsi="TH SarabunPSK" w:cs="TH SarabunPSK"/>
-          <w:sz w:val="32"/>
-          <w:szCs w:val="32"/>
-        </w:rPr>
-        <w:t>n</w:t>
-      </w:r>
-      <w:r>
-        <w:rPr>
-          <w:rFonts w:ascii="TH SarabunPSK" w:hAnsi="TH SarabunPSK" w:cs="TH SarabunPSK"/>
-          <w:sz w:val="32"/>
-          <w:szCs w:val="32"/>
-          <w:cs/>
-        </w:rPr>
-        <w:t>8</w:t>
-      </w:r>
-      <w:r>
-        <w:rPr>
-          <w:rFonts w:ascii="TH SarabunPSK" w:hAnsi="TH SarabunPSK" w:cs="TH SarabunPSK"/>
-          <w:sz w:val="32"/>
-          <w:szCs w:val="32"/>
-        </w:rPr>
-        <w:t xml:space="preserve">n </w:t>
-      </w:r>
-      <w:r>
-        <w:rPr>
-          <w:rFonts w:ascii="TH SarabunPSK" w:hAnsi="TH SarabunPSK" w:cs="TH SarabunPSK"/>
-          <w:sz w:val="32"/>
-          <w:szCs w:val="32"/>
-          <w:cs/>
-        </w:rPr>
-        <w:t xml:space="preserve">ผ่าน </w:t>
-      </w:r>
-      <w:r>
-        <w:rPr>
-          <w:rFonts w:ascii="TH SarabunPSK" w:hAnsi="TH SarabunPSK" w:cs="TH SarabunPSK"/>
-          <w:sz w:val="32"/>
-          <w:szCs w:val="32"/>
-        </w:rPr>
-        <w:t>LINE OA</w:t>
-      </w:r>
-      <w:r>
-        <w:rPr>
-          <w:rFonts w:ascii="TH SarabunPSK" w:hAnsi="TH SarabunPSK" w:cs="TH SarabunPSK" w:hint="cs"/>
-          <w:sz w:val="32"/>
-          <w:szCs w:val="32"/>
-          <w:cs/>
-        </w:rPr>
-        <w:t xml:space="preserve"> </w:t>
-      </w:r>
-      <w:r>
-        <w:rPr>
-          <w:rFonts w:ascii="TH SarabunPSK" w:hAnsi="TH SarabunPSK" w:cs="TH SarabunPSK"/>
-          <w:sz w:val="32"/>
-          <w:szCs w:val="32"/>
-          <w:cs/>
-        </w:rPr>
-        <w:t>สำหรับองค์กร</w:t>
-      </w:r>
-      <w:r>
-        <w:rPr>
-          <w:rFonts w:ascii="TH SarabunPSK" w:hAnsi="TH SarabunPSK" w:cs="TH SarabunPSK" w:hint="cs"/>
-          <w:sz w:val="32"/>
-          <w:szCs w:val="32"/>
-          <w:cs/>
-        </w:rPr>
-        <w:t xml:space="preserve"> </w:t>
-      </w:r>
-      <w:r>
-        <w:rPr>
-          <w:rFonts w:ascii="TH SarabunPSK" w:hAnsi="TH SarabunPSK" w:cs="TH SarabunPSK"/>
-          <w:sz w:val="32"/>
-          <w:szCs w:val="32"/>
-          <w:cs/>
-        </w:rPr>
-        <w:t>ภายหลังการทดลองใช้ระบบที่พัฒนาขึ้น</w:t>
+          <w:b/>
+          <w:bCs/>
+          <w:sz w:val="32"/>
+          <w:szCs w:val="32"/>
+          <w:cs/>
+        </w:rPr>
+        <w:t>วัตถุประสงค์</w:t>
       </w:r>
     </w:p>
     <w:p>
       <w:pPr>
         <w:spacing w:after="0"/>
+        <w:ind w:firstLine="709"/>
+        <w:rPr>
+          <w:rFonts w:ascii="TH SarabunPSK" w:hAnsi="TH SarabunPSK" w:cs="TH SarabunPSK"/>
+          <w:sz w:val="32"/>
+          <w:szCs w:val="32"/>
+          <w:cs/>
+        </w:rPr>
+      </w:pPr>
+      <w:r>
+        <w:rPr>
+          <w:rFonts w:ascii="TH SarabunPSK" w:hAnsi="TH SarabunPSK" w:cs="TH SarabunPSK"/>
+          <w:sz w:val="32"/>
+          <w:szCs w:val="32"/>
+          <w:cs/>
+        </w:rPr>
+        <w:t>1.2.1</w:t>
+      </w:r>
+      <w:r>
+        <w:rPr>
+          <w:rFonts w:ascii="TH SarabunPSK" w:hAnsi="TH SarabunPSK" w:cs="TH SarabunPSK"/>
+          <w:color w:val="FFFFFF" w:themeColor="background1"/>
+          <w:sz w:val="32"/>
+          <w:szCs w:val="32"/>
+        </w:rPr>
+        <w:t>**</w:t>
+      </w:r>
+      <w:r>
+        <w:rPr>
+          <w:rFonts w:ascii="TH SarabunPSK" w:hAnsi="TH SarabunPSK" w:cs="TH SarabunPSK"/>
+          <w:sz w:val="32"/>
+          <w:szCs w:val="32"/>
+          <w:cs/>
+        </w:rPr>
+        <w:t>เพื่อพัฒนา</w:t>
+      </w:r>
+      <w:r>
+        <w:rPr>
+          <w:rFonts w:ascii="TH SarabunPSK" w:hAnsi="TH SarabunPSK" w:cs="TH SarabunPSK"/>
+          <w:sz w:val="32"/>
+          <w:szCs w:val="32"/>
+          <w:cs/>
+        </w:rPr>
+        <w:t xml:space="preserve">ระบบผู้ช่วยอัตโนมัติ </w:t>
+      </w:r>
+      <w:r>
+        <w:rPr>
+          <w:rFonts w:ascii="TH SarabunPSK" w:hAnsi="TH SarabunPSK" w:cs="TH SarabunPSK"/>
+          <w:sz w:val="32"/>
+          <w:szCs w:val="32"/>
+        </w:rPr>
+        <w:t>n</w:t>
+      </w:r>
+      <w:r>
+        <w:rPr>
+          <w:rFonts w:ascii="TH SarabunPSK" w:hAnsi="TH SarabunPSK" w:cs="TH SarabunPSK"/>
+          <w:sz w:val="32"/>
+          <w:szCs w:val="32"/>
+          <w:cs/>
+        </w:rPr>
+        <w:t>8</w:t>
+      </w:r>
+      <w:r>
+        <w:rPr>
+          <w:rFonts w:ascii="TH SarabunPSK" w:hAnsi="TH SarabunPSK" w:cs="TH SarabunPSK"/>
+          <w:sz w:val="32"/>
+          <w:szCs w:val="32"/>
+        </w:rPr>
+        <w:t xml:space="preserve">n </w:t>
+      </w:r>
+      <w:r>
+        <w:rPr>
+          <w:rFonts w:ascii="TH SarabunPSK" w:hAnsi="TH SarabunPSK" w:cs="TH SarabunPSK"/>
+          <w:sz w:val="32"/>
+          <w:szCs w:val="32"/>
+          <w:cs/>
+        </w:rPr>
+        <w:t xml:space="preserve">ผ่าน </w:t>
+      </w:r>
+      <w:r>
+        <w:rPr>
+          <w:rFonts w:ascii="TH SarabunPSK" w:hAnsi="TH SarabunPSK" w:cs="TH SarabunPSK"/>
+          <w:sz w:val="32"/>
+          <w:szCs w:val="32"/>
+        </w:rPr>
+        <w:t>LINE OA</w:t>
+      </w:r>
+      <w:r>
+        <w:rPr>
+          <w:rFonts w:ascii="TH SarabunPSK" w:hAnsi="TH SarabunPSK" w:cs="TH SarabunPSK" w:hint="cs"/>
+          <w:sz w:val="32"/>
+          <w:szCs w:val="32"/>
+          <w:cs/>
+        </w:rPr>
+        <w:t xml:space="preserve"> </w:t>
+      </w:r>
+      <w:r>
+        <w:rPr>
+          <w:rFonts w:ascii="TH SarabunPSK" w:hAnsi="TH SarabunPSK" w:cs="TH SarabunPSK"/>
+          <w:sz w:val="32"/>
+          <w:szCs w:val="32"/>
+          <w:cs/>
+        </w:rPr>
+        <w:t>สำหรับองค์กร</w:t>
+      </w:r>
+    </w:p>
+    <w:p>
+      <w:pPr>
+        <w:spacing w:after="0"/>
+        <w:ind w:firstLine="709"/>
+        <w:rPr>
+          <w:rFonts w:ascii="TH SarabunPSK" w:hAnsi="TH SarabunPSK" w:cs="TH SarabunPSK"/>
+          <w:sz w:val="32"/>
+          <w:szCs w:val="32"/>
+        </w:rPr>
+      </w:pPr>
+      <w:r>
+        <w:rPr>
+          <w:rFonts w:ascii="TH SarabunPSK" w:hAnsi="TH SarabunPSK" w:cs="TH SarabunPSK"/>
+          <w:sz w:val="32"/>
+          <w:szCs w:val="32"/>
+          <w:cs/>
+        </w:rPr>
+        <w:t>1.2.2</w:t>
+      </w:r>
+      <w:r>
+        <w:rPr>
+          <w:rFonts w:ascii="TH SarabunPSK" w:hAnsi="TH SarabunPSK" w:cs="TH SarabunPSK"/>
+          <w:color w:val="FFFFFF" w:themeColor="background1"/>
+          <w:sz w:val="32"/>
+          <w:szCs w:val="32"/>
+        </w:rPr>
+        <w:t>**</w:t>
+      </w:r>
+      <w:r>
+        <w:rPr>
+          <w:rFonts w:ascii="TH SarabunPSK" w:hAnsi="TH SarabunPSK" w:cs="TH SarabunPSK"/>
+          <w:sz w:val="32"/>
+          <w:szCs w:val="32"/>
+          <w:cs/>
+        </w:rPr>
+        <w:t>เพื่อหาประสิทธิภาพของระบบ</w:t>
+      </w:r>
+      <w:r>
+        <w:rPr>
+          <w:rFonts w:ascii="TH SarabunPSK" w:hAnsi="TH SarabunPSK" w:cs="TH SarabunPSK"/>
+          <w:sz w:val="32"/>
+          <w:szCs w:val="32"/>
+          <w:cs/>
+        </w:rPr>
+        <w:t xml:space="preserve">ผู้ช่วยอัตโนมัติ </w:t>
+      </w:r>
+      <w:r>
+        <w:rPr>
+          <w:rFonts w:ascii="TH SarabunPSK" w:hAnsi="TH SarabunPSK" w:cs="TH SarabunPSK"/>
+          <w:sz w:val="32"/>
+          <w:szCs w:val="32"/>
+        </w:rPr>
+        <w:t>n</w:t>
+      </w:r>
+      <w:r>
+        <w:rPr>
+          <w:rFonts w:ascii="TH SarabunPSK" w:hAnsi="TH SarabunPSK" w:cs="TH SarabunPSK"/>
+          <w:sz w:val="32"/>
+          <w:szCs w:val="32"/>
+          <w:cs/>
+        </w:rPr>
+        <w:t>8</w:t>
+      </w:r>
+      <w:r>
+        <w:rPr>
+          <w:rFonts w:ascii="TH SarabunPSK" w:hAnsi="TH SarabunPSK" w:cs="TH SarabunPSK"/>
+          <w:sz w:val="32"/>
+          <w:szCs w:val="32"/>
+        </w:rPr>
+        <w:t xml:space="preserve">n </w:t>
+      </w:r>
+      <w:r>
+        <w:rPr>
+          <w:rFonts w:ascii="TH SarabunPSK" w:hAnsi="TH SarabunPSK" w:cs="TH SarabunPSK"/>
+          <w:sz w:val="32"/>
+          <w:szCs w:val="32"/>
+          <w:cs/>
+        </w:rPr>
+        <w:t xml:space="preserve">ผ่าน </w:t>
+      </w:r>
+      <w:r>
+        <w:rPr>
+          <w:rFonts w:ascii="TH SarabunPSK" w:hAnsi="TH SarabunPSK" w:cs="TH SarabunPSK"/>
+          <w:sz w:val="32"/>
+          <w:szCs w:val="32"/>
+        </w:rPr>
+        <w:t>LINE OA</w:t>
+      </w:r>
+      <w:r>
+        <w:rPr>
+          <w:rFonts w:ascii="TH SarabunPSK" w:hAnsi="TH SarabunPSK" w:cs="TH SarabunPSK" w:hint="cs"/>
+          <w:sz w:val="32"/>
+          <w:szCs w:val="32"/>
+          <w:cs/>
+        </w:rPr>
+        <w:t xml:space="preserve"> </w:t>
+      </w:r>
+      <w:r>
+        <w:rPr>
+          <w:rFonts w:ascii="TH SarabunPSK" w:hAnsi="TH SarabunPSK" w:cs="TH SarabunPSK"/>
+          <w:sz w:val="32"/>
+          <w:szCs w:val="32"/>
+          <w:cs/>
+        </w:rPr>
+        <w:t>สำหรับองค์กร</w:t>
+      </w:r>
+    </w:p>
+    <w:p>
+      <w:pPr>
+        <w:spacing w:after="0"/>
+        <w:ind w:firstLine="709"/>
+        <w:rPr>
+          <w:rFonts w:ascii="TH SarabunPSK" w:hAnsi="TH SarabunPSK" w:cs="TH SarabunPSK"/>
+          <w:sz w:val="32"/>
+          <w:szCs w:val="32"/>
+        </w:rPr>
+      </w:pPr>
+      <w:r>
+        <w:rPr>
+          <w:rFonts w:ascii="TH SarabunPSK" w:hAnsi="TH SarabunPSK" w:cs="TH SarabunPSK"/>
+          <w:sz w:val="32"/>
+          <w:szCs w:val="32"/>
+          <w:cs/>
+        </w:rPr>
+        <w:t>1.2.3</w:t>
+      </w:r>
+      <w:r>
+        <w:rPr>
+          <w:rFonts w:ascii="TH SarabunPSK" w:hAnsi="TH SarabunPSK" w:cs="TH SarabunPSK"/>
+          <w:color w:val="FFFFFF" w:themeColor="background1"/>
+          <w:sz w:val="32"/>
+          <w:szCs w:val="32"/>
+        </w:rPr>
+        <w:t>**</w:t>
+      </w:r>
+      <w:r>
+        <w:rPr>
+          <w:rFonts w:ascii="TH SarabunPSK" w:hAnsi="TH SarabunPSK" w:cs="TH SarabunPSK"/>
+          <w:sz w:val="32"/>
+          <w:szCs w:val="32"/>
+          <w:cs/>
+        </w:rPr>
+        <w:t>เพื่อหาความพึงพอใจของผู้ใช้ระบบ</w:t>
+      </w:r>
+      <w:r>
+        <w:rPr>
+          <w:rFonts w:ascii="TH SarabunPSK" w:hAnsi="TH SarabunPSK" w:cs="TH SarabunPSK"/>
+          <w:sz w:val="32"/>
+          <w:szCs w:val="32"/>
+          <w:cs/>
+        </w:rPr>
+        <w:t xml:space="preserve">ผู้ช่วยอัตโนมัติ </w:t>
+      </w:r>
+      <w:r>
+        <w:rPr>
+          <w:rFonts w:ascii="TH SarabunPSK" w:hAnsi="TH SarabunPSK" w:cs="TH SarabunPSK"/>
+          <w:sz w:val="32"/>
+          <w:szCs w:val="32"/>
+        </w:rPr>
+        <w:t>n</w:t>
+      </w:r>
+      <w:r>
+        <w:rPr>
+          <w:rFonts w:ascii="TH SarabunPSK" w:hAnsi="TH SarabunPSK" w:cs="TH SarabunPSK"/>
+          <w:sz w:val="32"/>
+          <w:szCs w:val="32"/>
+          <w:cs/>
+        </w:rPr>
+        <w:t>8</w:t>
+      </w:r>
+      <w:r>
+        <w:rPr>
+          <w:rFonts w:ascii="TH SarabunPSK" w:hAnsi="TH SarabunPSK" w:cs="TH SarabunPSK"/>
+          <w:sz w:val="32"/>
+          <w:szCs w:val="32"/>
+        </w:rPr>
+        <w:t xml:space="preserve">n </w:t>
+      </w:r>
+      <w:r>
+        <w:rPr>
+          <w:rFonts w:ascii="TH SarabunPSK" w:hAnsi="TH SarabunPSK" w:cs="TH SarabunPSK"/>
+          <w:sz w:val="32"/>
+          <w:szCs w:val="32"/>
+          <w:cs/>
+        </w:rPr>
+        <w:t xml:space="preserve">ผ่าน </w:t>
+      </w:r>
+      <w:r>
+        <w:rPr>
+          <w:rFonts w:ascii="TH SarabunPSK" w:hAnsi="TH SarabunPSK" w:cs="TH SarabunPSK"/>
+          <w:sz w:val="32"/>
+          <w:szCs w:val="32"/>
+        </w:rPr>
+        <w:t>LINE OA</w:t>
+      </w:r>
+      <w:r>
+        <w:rPr>
+          <w:rFonts w:ascii="TH SarabunPSK" w:hAnsi="TH SarabunPSK" w:cs="TH SarabunPSK" w:hint="cs"/>
+          <w:sz w:val="32"/>
+          <w:szCs w:val="32"/>
+          <w:cs/>
+        </w:rPr>
+        <w:t xml:space="preserve"> </w:t>
+      </w:r>
+      <w:r>
+        <w:rPr>
+          <w:rFonts w:ascii="TH SarabunPSK" w:hAnsi="TH SarabunPSK" w:cs="TH SarabunPSK"/>
+          <w:sz w:val="32"/>
+          <w:szCs w:val="32"/>
+          <w:cs/>
+        </w:rPr>
+        <w:t>สำหรับองค์กร</w:t>
+      </w:r>
+      <w:r>
+        <w:rPr>
+          <w:rFonts w:ascii="TH SarabunPSK" w:hAnsi="TH SarabunPSK" w:cs="TH SarabunPSK" w:hint="cs"/>
+          <w:sz w:val="32"/>
+          <w:szCs w:val="32"/>
+          <w:cs/>
+        </w:rPr>
+        <w:t xml:space="preserve"> </w:t>
+      </w:r>
+      <w:r>
+        <w:rPr>
+          <w:rFonts w:ascii="TH SarabunPSK" w:hAnsi="TH SarabunPSK" w:cs="TH SarabunPSK"/>
+          <w:sz w:val="32"/>
+          <w:szCs w:val="32"/>
+          <w:cs/>
+        </w:rPr>
+        <w:t>ภายหลังการทดลองใช้ระบบที่พัฒนาขึ้น</w:t>
+      </w:r>
+    </w:p>
+    <w:p>
+      <w:pPr>
+        <w:spacing w:after="0"/>
         <w:rPr>
           <w:rFonts w:ascii="TH SarabunPSK" w:eastAsia="Times New Roman" w:hAnsi="TH SarabunPSK" w:cs="TH SarabunPSK"/>
           <w:kern w:val="0"/>
@@ -1238,7 +1237,7 @@
           <w:rFonts w:ascii="TH SarabunPSK" w:eastAsia="Times New Roman" w:hAnsi="TH SarabunPSK" w:cs="TH SarabunPSK"/>
           <w:b/>
           <w:bCs/>
-          <w:color w:val="000000"/>
+          <w:color w:val="FFFFFF" w:themeColor="background1"/>
           <w:kern w:val="0"/>
           <w:sz w:val="32"/>
           <w:szCs w:val="32"/>
@@ -1287,7 +1286,7 @@
       <w:r>
         <w:rPr>
           <w:rFonts w:ascii="TH SarabunPSK" w:eastAsia="Times New Roman" w:hAnsi="TH SarabunPSK" w:cs="TH SarabunPSK"/>
-          <w:color w:val="000000"/>
+          <w:color w:val="FFFFFF" w:themeColor="background1"/>
           <w:kern w:val="0"/>
           <w:sz w:val="32"/>
           <w:szCs w:val="32"/>
@@ -1410,7 +1409,19 @@
           <w:cs/>
           <w14:ligatures w14:val="none"/>
         </w:rPr>
-        <w:t>น อยู่ในระดับดีมาก</w:t>
+        <w:t>น อยู่ในระดับ</w:t>
+      </w:r>
+      <w:r>
+        <w:rPr>
+          <w:rFonts w:ascii="TH SarabunPSK" w:eastAsia="Times New Roman" w:hAnsi="TH SarabunPSK" w:cs="TH SarabunPSK" w:hint="cs"/>
+          <w:color w:val="000000"/>
+          <w:kern w:val="0"/>
+          <w:sz w:val="32"/>
+          <w:szCs w:val="32"/>
+          <w:cs/>
+          <w14:ligatures w14:val="none"/>
+        </w:rPr>
+        <w:t>พอใช้</w:t>
       </w:r>
     </w:p>
     <w:p>
@@ -1436,7 +1447,7 @@
       <w:r>
         <w:rPr>
           <w:rFonts w:ascii="TH SarabunPSK" w:eastAsia="Times New Roman" w:hAnsi="TH SarabunPSK" w:cs="TH SarabunPSK"/>
-          <w:color w:val="000000"/>
+          <w:color w:val="FFFFFF" w:themeColor="background1"/>
           <w:kern w:val="0"/>
           <w:sz w:val="32"/>
           <w:szCs w:val="32"/>
@@ -1547,7 +1558,19 @@
           <w:cs/>
           <w14:ligatures w14:val="none"/>
         </w:rPr>
-        <w:t>อยู่ในระดับดีมาก</w:t>
+        <w:t>อยู่ในระดับ</w:t>
+      </w:r>
+      <w:r>
+        <w:rPr>
+          <w:rFonts w:ascii="TH SarabunPSK" w:eastAsia="Times New Roman" w:hAnsi="TH SarabunPSK" w:cs="TH SarabunPSK" w:hint="cs"/>
+          <w:color w:val="000000"/>
+          <w:kern w:val="0"/>
+          <w:sz w:val="32"/>
+          <w:szCs w:val="32"/>
+          <w:cs/>
+          <w14:ligatures w14:val="none"/>
+        </w:rPr>
+        <w:t>พอใช้</w:t>
       </w:r>
     </w:p>
     <w:p>
@@ -1578,7 +1601,7 @@
           <w:rFonts w:ascii="TH SarabunPSK" w:eastAsia="Times New Roman" w:hAnsi="TH SarabunPSK" w:cs="TH SarabunPSK"/>
           <w:b/>
           <w:bCs/>
-          <w:color w:val="000000"/>
+          <w:color w:val="FFFFFF" w:themeColor="background1"/>
           <w:kern w:val="0"/>
           <w:sz w:val="32"/>
           <w:szCs w:val="32"/>
@@ -1626,7 +1649,7 @@
       <w:r>
         <w:rPr>
           <w:rFonts w:ascii="TH SarabunPSK" w:eastAsia="Times New Roman" w:hAnsi="TH SarabunPSK" w:cs="TH SarabunPSK"/>
-          <w:color w:val="000000"/>
+          <w:color w:val="FFFFFF" w:themeColor="background1"/>
           <w:kern w:val="0"/>
           <w:sz w:val="32"/>
           <w:szCs w:val="32"/>
@@ -1674,7 +1697,7 @@
       <w:r>
         <w:rPr>
           <w:rFonts w:ascii="TH SarabunPSK" w:eastAsia="Times New Roman" w:hAnsi="TH SarabunPSK" w:cs="TH SarabunPSK"/>
-          <w:color w:val="000000"/>
+          <w:color w:val="FFFFFF" w:themeColor="background1"/>
           <w:kern w:val="0"/>
           <w:sz w:val="32"/>
           <w:szCs w:val="32"/>
@@ -1887,7 +1910,7 @@
       <w:r>
         <w:rPr>
           <w:rFonts w:ascii="TH SarabunPSK" w:eastAsia="Times New Roman" w:hAnsi="TH SarabunPSK" w:cs="TH SarabunPSK"/>
-          <w:color w:val="000000"/>
+          <w:color w:val="FFFFFF" w:themeColor="background1"/>
           <w:kern w:val="0"/>
           <w:sz w:val="32"/>
           <w:szCs w:val="32"/>
@@ -1898,7 +1921,7 @@
       <w:r>
         <w:rPr>
           <w:rFonts w:ascii="TH SarabunPSK" w:eastAsia="Times New Roman" w:hAnsi="TH SarabunPSK" w:cs="TH SarabunPSK"/>
-          <w:color w:val="000000"/>
+          <w:color w:val="FFFFFF" w:themeColor="background1"/>
           <w:kern w:val="0"/>
           <w:sz w:val="32"/>
           <w:szCs w:val="32"/>
@@ -1915,7 +1938,18 @@
           <w:cs/>
           <w14:ligatures w14:val="none"/>
         </w:rPr>
-        <w:t>ส่วนของพนักงานทั่วไป</w:t>
+        <w:t>ส่วนของ</w:t>
+      </w:r>
+      <w:r>
+        <w:rPr>
+          <w:rFonts w:ascii="TH SarabunPSK" w:eastAsia="Times New Roman" w:hAnsi="TH SarabunPSK" w:cs="TH SarabunPSK" w:hint="cs"/>
+          <w:kern w:val="0"/>
+          <w:sz w:val="32"/>
+          <w:szCs w:val="32"/>
+          <w:cs/>
+          <w14:ligatures w14:val="none"/>
+        </w:rPr>
+        <w:t>ระบบ</w:t>
       </w:r>
     </w:p>
     <w:p>
@@ -1941,7 +1975,30 @@
           <w:cs/>
           <w14:ligatures w14:val="none"/>
         </w:rPr>
-        <w:t xml:space="preserve">1)**สามารถยืนยันตัวตนและเข้าสู่ระบบผ่าน </w:t>
+        <w:t>1)</w:t>
+      </w:r>
+      <w:r>
+        <w:rPr>
+          <w:rFonts w:ascii="TH SarabunPSK" w:eastAsia="Times New Roman" w:hAnsi="TH SarabunPSK" w:cs="TH SarabunPSK"/>
+          <w:color w:val="FFFFFF" w:themeColor="background1"/>
+          <w:kern w:val="0"/>
+          <w:sz w:val="32"/>
+          <w:szCs w:val="32"/>
+          <w:cs/>
+          <w14:ligatures w14:val="none"/>
+        </w:rPr>
+        <w:t>**</w:t>
+      </w:r>
+      <w:r>
+        <w:rPr>
+          <w:rFonts w:ascii="TH SarabunPSK" w:eastAsia="Times New Roman" w:hAnsi="TH SarabunPSK" w:cs="TH SarabunPSK"/>
+          <w:kern w:val="0"/>
+          <w:sz w:val="32"/>
+          <w:szCs w:val="32"/>
+          <w:cs/>
+          <w14:ligatures w14:val="none"/>
+        </w:rPr>
+        <w:t xml:space="preserve">สามารถยืนยันตัวตนและเข้าสู่ระบบผ่าน </w:t>
       </w:r>
       <w:r>
         <w:rPr>
@@ -2050,6 +2107,7 @@
           <w:kern w:val="0"/>
           <w:sz w:val="32"/>
           <w:szCs w:val="32"/>
+          <w:cs/>
           <w14:ligatures w14:val="none"/>
         </w:rPr>
       </w:pPr>
@@ -2062,17 +2120,30 @@
           <w:cs/>
           <w14:ligatures w14:val="none"/>
         </w:rPr>
-        <w:t>2)**สามารถรับการแจ้งเตือนวันเกิดการประชุมและข่าวสารผ่าน</w:t>
-      </w:r>
-      <w:r>
-        <w:rPr>
-          <w:rFonts w:ascii="TH SarabunPSK" w:eastAsia="Times New Roman" w:hAnsi="TH SarabunPSK" w:cs="TH SarabunPSK"/>
-          <w:kern w:val="0"/>
-          <w:sz w:val="32"/>
-          <w:szCs w:val="32"/>
-          <w14:ligatures w14:val="none"/>
-        </w:rPr>
-        <w:t>LINE OA</w:t>
+        <w:t>2)</w:t>
+      </w:r>
+      <w:r>
+        <w:rPr>
+          <w:rFonts w:ascii="TH SarabunPSK" w:eastAsia="Times New Roman" w:hAnsi="TH SarabunPSK" w:cs="TH SarabunPSK"/>
+          <w:color w:val="FFFFFF" w:themeColor="background1"/>
+          <w:kern w:val="0"/>
+          <w:sz w:val="32"/>
+          <w:szCs w:val="32"/>
+          <w:cs/>
+          <w14:ligatures w14:val="none"/>
+        </w:rPr>
+        <w:t>**</w:t>
+      </w:r>
+      <w:r>
+        <w:rPr>
+          <w:rFonts w:ascii="TH SarabunPSK" w:eastAsia="Times New Roman" w:hAnsi="TH SarabunPSK" w:cs="TH SarabunPSK"/>
+          <w:kern w:val="0"/>
+          <w:sz w:val="32"/>
+          <w:szCs w:val="32"/>
+          <w:cs/>
+          <w14:ligatures w14:val="none"/>
+        </w:rPr>
+        <w:t>สามารถรับการแจ้งเตือนวันเกิด</w:t>
       </w:r>
     </w:p>
     <w:p>
@@ -2081,10 +2152,11 @@
         <w:ind w:firstLine="2268"/>
         <w:jc w:val="both"/>
         <w:rPr>
-          <w:rFonts w:ascii="TH SarabunPSK" w:eastAsia="Times New Roman" w:hAnsi="TH SarabunPSK" w:cs="TH SarabunPSK"/>
-          <w:kern w:val="0"/>
-          <w:sz w:val="32"/>
-          <w:szCs w:val="32"/>
+          <w:rFonts w:ascii="TH SarabunPSK" w:eastAsia="Times New Roman" w:hAnsi="TH SarabunPSK" w:cs="TH SarabunPSK" w:hint="cs"/>
+          <w:kern w:val="0"/>
+          <w:sz w:val="32"/>
+          <w:szCs w:val="32"/>
+          <w:cs/>
           <w14:ligatures w14:val="none"/>
         </w:rPr>
       </w:pPr>
@@ -2097,7 +2169,63 @@
           <w:cs/>
           <w14:ligatures w14:val="none"/>
         </w:rPr>
-        <w:t>3)**สามารถรับการแจ้งเตือนการประชุมแบบหลายช่วงเวลา (15</w:t>
+        <w:t>3)</w:t>
+      </w:r>
+      <w:r>
+        <w:rPr>
+          <w:rFonts w:ascii="TH SarabunPSK" w:eastAsia="Times New Roman" w:hAnsi="TH SarabunPSK" w:cs="TH SarabunPSK"/>
+          <w:color w:val="FFFFFF" w:themeColor="background1"/>
+          <w:kern w:val="0"/>
+          <w:sz w:val="32"/>
+          <w:szCs w:val="32"/>
+          <w:cs/>
+          <w14:ligatures w14:val="none"/>
+        </w:rPr>
+        <w:t>**</w:t>
+      </w:r>
+      <w:r>
+        <w:rPr>
+          <w:rFonts w:ascii="TH SarabunPSK" w:eastAsia="Times New Roman" w:hAnsi="TH SarabunPSK" w:cs="TH SarabunPSK"/>
+          <w:kern w:val="0"/>
+          <w:sz w:val="32"/>
+          <w:szCs w:val="32"/>
+          <w:cs/>
+          <w14:ligatures w14:val="none"/>
+        </w:rPr>
+        <w:t>สามารถ</w:t>
+      </w:r>
+      <w:r>
+        <w:rPr>
+          <w:rFonts w:ascii="TH SarabunPSK" w:eastAsia="Times New Roman" w:hAnsi="TH SarabunPSK" w:cs="TH SarabunPSK" w:hint="cs"/>
+          <w:kern w:val="0"/>
+          <w:sz w:val="32"/>
+          <w:szCs w:val="32"/>
+          <w:cs/>
+          <w14:ligatures w14:val="none"/>
+        </w:rPr>
+        <w:t>สร้าง</w:t>
+      </w:r>
+      <w:r>
+        <w:rPr>
+          <w:rFonts w:ascii="TH SarabunPSK" w:eastAsia="Times New Roman" w:hAnsi="TH SarabunPSK" w:cs="TH SarabunPSK" w:hint="cs"/>
+          <w:kern w:val="0"/>
+          <w:sz w:val="32"/>
+          <w:szCs w:val="32"/>
+          <w:cs/>
+          <w14:ligatures w14:val="none"/>
+        </w:rPr>
+        <w:t xml:space="preserve"> ลบ แก้ไข และ </w:t>
+      </w:r>
+      <w:r>
+        <w:rPr>
+          <w:rFonts w:ascii="TH SarabunPSK" w:eastAsia="Times New Roman" w:hAnsi="TH SarabunPSK" w:cs="TH SarabunPSK"/>
+          <w:kern w:val="0"/>
+          <w:sz w:val="32"/>
+          <w:szCs w:val="32"/>
+          <w:cs/>
+          <w14:ligatures w14:val="none"/>
+        </w:rPr>
+        <w:t>รับการแจ้งเตือนการประชุมแบบหลายช่วงเวลา (15</w:t>
       </w:r>
       <w:r>
         <w:rPr>
@@ -2140,6 +2268,102 @@
           <w14:ligatures w14:val="none"/>
         </w:rPr>
         <w:t>5 นาทีล่วงหน้า)</w:t>
+      </w:r>
+      <w:r>
+        <w:rPr>
+          <w:rFonts w:ascii="TH SarabunPSK" w:eastAsia="Times New Roman" w:hAnsi="TH SarabunPSK" w:cs="TH SarabunPSK" w:hint="cs"/>
+          <w:kern w:val="0"/>
+          <w:sz w:val="32"/>
+          <w:szCs w:val="32"/>
+          <w:cs/>
+          <w14:ligatures w14:val="none"/>
+        </w:rPr>
+        <w:t xml:space="preserve"> </w:t>
+      </w:r>
+      <w:r>
+        <w:rPr>
+          <w:rFonts w:ascii="TH SarabunPSK" w:eastAsia="Times New Roman" w:hAnsi="TH SarabunPSK" w:cs="TH SarabunPSK"/>
+          <w:kern w:val="0"/>
+          <w:sz w:val="32"/>
+          <w:szCs w:val="32"/>
+          <w14:ligatures w14:val="none"/>
+        </w:rPr>
+        <w:t>/</w:t>
+      </w:r>
+      <w:r>
+        <w:rPr>
+          <w:rFonts w:ascii="TH SarabunPSK" w:eastAsia="Times New Roman" w:hAnsi="TH SarabunPSK" w:cs="TH SarabunPSK" w:hint="cs"/>
+          <w:kern w:val="0"/>
+          <w:sz w:val="32"/>
+          <w:szCs w:val="32"/>
+          <w:cs/>
+          <w14:ligatures w14:val="none"/>
+        </w:rPr>
+        <w:t xml:space="preserve"> </w:t>
+      </w:r>
+      <w:r>
+        <w:rPr>
+          <w:rFonts w:ascii="TH SarabunPSK" w:eastAsia="Times New Roman" w:hAnsi="TH SarabunPSK" w:cs="TH SarabunPSK" w:hint="cs"/>
+          <w:kern w:val="0"/>
+          <w:sz w:val="32"/>
+          <w:szCs w:val="32"/>
+          <w:cs/>
+          <w14:ligatures w14:val="none"/>
+        </w:rPr>
+        <w:t>หรือ สร้างการประชุมในกลุ่มไลน์</w:t>
+      </w:r>
+      <w:r>
+        <w:rPr>
+          <w:rFonts w:ascii="TH SarabunPSK" w:eastAsia="Times New Roman" w:hAnsi="TH SarabunPSK" w:cs="TH SarabunPSK" w:hint="cs"/>
+          <w:kern w:val="0"/>
+          <w:sz w:val="32"/>
+          <w:szCs w:val="32"/>
+          <w:cs/>
+          <w14:ligatures w14:val="none"/>
+        </w:rPr>
+        <w:t xml:space="preserve"> </w:t>
+      </w:r>
+      <w:r>
+        <w:rPr>
+          <w:rFonts w:ascii="TH SarabunPSK" w:eastAsia="Times New Roman" w:hAnsi="TH SarabunPSK" w:cs="TH SarabunPSK"/>
+          <w:kern w:val="0"/>
+          <w:sz w:val="32"/>
+          <w:szCs w:val="32"/>
+          <w14:ligatures w14:val="none"/>
+        </w:rPr>
+        <w:t>(</w:t>
+      </w:r>
+      <w:r>
+        <w:rPr>
+          <w:rFonts w:ascii="TH SarabunPSK" w:eastAsia="Times New Roman" w:hAnsi="TH SarabunPSK" w:cs="TH SarabunPSK" w:hint="cs"/>
+          <w:kern w:val="0"/>
+          <w:sz w:val="32"/>
+          <w:szCs w:val="32"/>
+          <w:cs/>
+          <w14:ligatures w14:val="none"/>
+        </w:rPr>
+        <w:t>เจ้าขุนทอง</w:t>
+      </w:r>
+      <w:r>
+        <w:rPr>
+          <w:rFonts w:ascii="TH SarabunPSK" w:eastAsia="Times New Roman" w:hAnsi="TH SarabunPSK" w:cs="TH SarabunPSK"/>
+          <w:kern w:val="0"/>
+          <w:sz w:val="32"/>
+          <w:szCs w:val="32"/>
+          <w14:ligatures w14:val="none"/>
+        </w:rPr>
+        <w:t>)</w:t>
+      </w:r>
+      <w:r>
+        <w:rPr>
+          <w:rFonts w:ascii="TH SarabunPSK" w:eastAsia="Times New Roman" w:hAnsi="TH SarabunPSK" w:cs="TH SarabunPSK" w:hint="cs"/>
+          <w:kern w:val="0"/>
+          <w:sz w:val="32"/>
+          <w:szCs w:val="32"/>
+          <w:cs/>
+          <w14:ligatures w14:val="none"/>
+        </w:rPr>
+        <w:t xml:space="preserve"> </w:t>
       </w:r>
     </w:p>
     <w:p>
@@ -2165,7 +2389,52 @@
           <w14:ligatures w14:val="none"/>
         </w:rPr>
         <w:lastRenderedPageBreak/>
-        <w:t>4)**สามารถลงเวลา เข้างาน</w:t>
+        <w:t>4)</w:t>
+      </w:r>
+      <w:r>
+        <w:rPr>
+          <w:rFonts w:ascii="TH SarabunPSK" w:eastAsia="Times New Roman" w:hAnsi="TH SarabunPSK" w:cs="TH SarabunPSK"/>
+          <w:color w:val="FFFFFF" w:themeColor="background1"/>
+          <w:kern w:val="0"/>
+          <w:sz w:val="32"/>
+          <w:szCs w:val="32"/>
+          <w:cs/>
+          <w14:ligatures w14:val="none"/>
+        </w:rPr>
+        <w:t>**</w:t>
+      </w:r>
+      <w:r>
+        <w:rPr>
+          <w:rFonts w:ascii="TH SarabunPSK" w:eastAsia="Times New Roman" w:hAnsi="TH SarabunPSK" w:cs="TH SarabunPSK"/>
+          <w:kern w:val="0"/>
+          <w:sz w:val="32"/>
+          <w:szCs w:val="32"/>
+          <w:cs/>
+          <w14:ligatures w14:val="none"/>
+        </w:rPr>
+        <w:t>สามารถลงเวลา</w:t>
+      </w:r>
+      <w:r>
+        <w:rPr>
+          <w:rFonts w:ascii="TH SarabunPSK" w:eastAsia="Times New Roman" w:hAnsi="TH SarabunPSK" w:cs="TH SarabunPSK" w:hint="cs"/>
+          <w:kern w:val="0"/>
+          <w:sz w:val="32"/>
+          <w:szCs w:val="32"/>
+          <w:cs/>
+          <w14:ligatures w14:val="none"/>
+        </w:rPr>
+        <w:t xml:space="preserve"> </w:t>
+      </w:r>
+      <w:r>
+        <w:rPr>
+          <w:rFonts w:ascii="TH SarabunPSK" w:eastAsia="Times New Roman" w:hAnsi="TH SarabunPSK" w:cs="TH SarabunPSK"/>
+          <w:kern w:val="0"/>
+          <w:sz w:val="32"/>
+          <w:szCs w:val="32"/>
+          <w:cs/>
+          <w14:ligatures w14:val="none"/>
+        </w:rPr>
+        <w:t>เข้างาน</w:t>
       </w:r>
       <w:r>
         <w:rPr>
@@ -2260,7 +2529,17 @@
           <w:cs/>
           <w14:ligatures w14:val="none"/>
         </w:rPr>
-        <w:t>กำหนด</w:t>
+        <w:t xml:space="preserve"> </w:t>
+      </w:r>
+      <w:r>
+        <w:rPr>
+          <w:rFonts w:ascii="TH SarabunPSK" w:eastAsia="Times New Roman" w:hAnsi="TH SarabunPSK" w:cs="TH SarabunPSK"/>
+          <w:kern w:val="0"/>
+          <w:sz w:val="32"/>
+          <w:szCs w:val="32"/>
+          <w14:ligatures w14:val="none"/>
+        </w:rPr>
+        <w:t>Line OA</w:t>
       </w:r>
     </w:p>
     <w:p>
@@ -2269,6 +2548,90 @@
         <w:ind w:firstLine="2268"/>
         <w:jc w:val="both"/>
         <w:rPr>
+          <w:rFonts w:ascii="TH SarabunPSK" w:eastAsia="Times New Roman" w:hAnsi="TH SarabunPSK" w:cs="TH SarabunPSK"/>
+          <w:kern w:val="0"/>
+          <w:sz w:val="32"/>
+          <w:szCs w:val="32"/>
+          <w14:ligatures w14:val="none"/>
+        </w:rPr>
+      </w:pPr>
+      <w:r>
+        <w:rPr>
+          <w:rFonts w:ascii="TH SarabunPSK" w:eastAsia="Times New Roman" w:hAnsi="TH SarabunPSK" w:cs="TH SarabunPSK"/>
+          <w:kern w:val="0"/>
+          <w:sz w:val="32"/>
+          <w:szCs w:val="32"/>
+          <w14:ligatures w14:val="none"/>
+        </w:rPr>
+        <w:t>5</w:t>
+      </w:r>
+      <w:r>
+        <w:rPr>
+          <w:rFonts w:ascii="TH SarabunPSK" w:eastAsia="Times New Roman" w:hAnsi="TH SarabunPSK" w:cs="TH SarabunPSK"/>
+          <w:kern w:val="0"/>
+          <w:sz w:val="32"/>
+          <w:szCs w:val="32"/>
+          <w:cs/>
+          <w14:ligatures w14:val="none"/>
+        </w:rPr>
+        <w:t>)</w:t>
+      </w:r>
+      <w:r>
+        <w:rPr>
+          <w:rFonts w:ascii="TH SarabunPSK" w:eastAsia="Times New Roman" w:hAnsi="TH SarabunPSK" w:cs="TH SarabunPSK"/>
+          <w:color w:val="FFFFFF" w:themeColor="background1"/>
+          <w:kern w:val="0"/>
+          <w:sz w:val="32"/>
+          <w:szCs w:val="32"/>
+          <w:cs/>
+          <w14:ligatures w14:val="none"/>
+        </w:rPr>
+        <w:t>**</w:t>
+      </w:r>
+      <w:r>
+        <w:rPr>
+          <w:rFonts w:ascii="TH SarabunPSK" w:eastAsia="Times New Roman" w:hAnsi="TH SarabunPSK" w:cs="TH SarabunPSK"/>
+          <w:kern w:val="0"/>
+          <w:sz w:val="32"/>
+          <w:szCs w:val="32"/>
+          <w:cs/>
+          <w14:ligatures w14:val="none"/>
+        </w:rPr>
+        <w:t xml:space="preserve">สามารถดูข้อความแบบ </w:t>
+      </w:r>
+      <w:r>
+        <w:rPr>
+          <w:rFonts w:ascii="TH SarabunPSK" w:eastAsia="Times New Roman" w:hAnsi="TH SarabunPSK" w:cs="TH SarabunPSK"/>
+          <w:kern w:val="0"/>
+          <w:sz w:val="32"/>
+          <w:szCs w:val="32"/>
+          <w14:ligatures w14:val="none"/>
+        </w:rPr>
+        <w:t xml:space="preserve">LINE Flex Message </w:t>
+      </w:r>
+      <w:r>
+        <w:rPr>
+          <w:rFonts w:ascii="TH SarabunPSK" w:eastAsia="Times New Roman" w:hAnsi="TH SarabunPSK" w:cs="TH SarabunPSK"/>
+          <w:kern w:val="0"/>
+          <w:sz w:val="32"/>
+          <w:szCs w:val="32"/>
+          <w:cs/>
+          <w14:ligatures w14:val="none"/>
+        </w:rPr>
+        <w:t>เพื่อความอ่านง่ายบน</w:t>
+      </w:r>
+      <w:r>
+        <w:rPr>
+          <w:rFonts w:ascii="TH SarabunPSK" w:eastAsia="Times New Roman" w:hAnsi="TH SarabunPSK" w:cs="TH SarabunPSK"/>
+          <w:kern w:val="0"/>
+          <w:sz w:val="32"/>
+          <w:szCs w:val="32"/>
+          <w14:ligatures w14:val="none"/>
+        </w:rPr>
+        <w:t xml:space="preserve">Mobile </w:t>
+      </w:r>
+      <w:r>
+        <w:rPr>
           <w:rFonts w:ascii="TH SarabunPSK" w:eastAsia="Times New Roman" w:hAnsi="TH SarabunPSK" w:cs="TH SarabunPSK" w:hint="cs"/>
           <w:kern w:val="0"/>
           <w:sz w:val="32"/>
@@ -2276,27 +2639,17 @@
           <w:cs/>
           <w14:ligatures w14:val="none"/>
         </w:rPr>
-      </w:pPr>
-      <w:r>
-        <w:rPr>
-          <w:rFonts w:ascii="TH SarabunPSK" w:eastAsia="Times New Roman" w:hAnsi="TH SarabunPSK" w:cs="TH SarabunPSK"/>
-          <w:kern w:val="0"/>
-          <w:sz w:val="32"/>
-          <w:szCs w:val="32"/>
-          <w:cs/>
-          <w14:ligatures w14:val="none"/>
-        </w:rPr>
-        <w:t xml:space="preserve">5)**สามารถรับการแจ้งเตือน/สรุปยอดขายส่วนบุคคล (กรณีเกี่ยวข้อง) ที่ดึงจาก </w:t>
-      </w:r>
-      <w:r>
-        <w:rPr>
-          <w:rFonts w:ascii="TH SarabunPSK" w:eastAsia="Times New Roman" w:hAnsi="TH SarabunPSK" w:cs="TH SarabunPSK"/>
-          <w:kern w:val="0"/>
-          <w:sz w:val="32"/>
-          <w:szCs w:val="32"/>
-          <w14:ligatures w14:val="none"/>
-        </w:rPr>
-        <w:t>Google Sheets</w:t>
+        <w:t>และบน</w:t>
+      </w:r>
+      <w:r>
+        <w:rPr>
+          <w:rFonts w:ascii="TH SarabunPSK" w:eastAsia="Times New Roman" w:hAnsi="TH SarabunPSK" w:cs="TH SarabunPSK"/>
+          <w:kern w:val="0"/>
+          <w:sz w:val="32"/>
+          <w:szCs w:val="32"/>
+          <w14:ligatures w14:val="none"/>
+        </w:rPr>
+        <w:t xml:space="preserve"> Desktop</w:t>
       </w:r>
     </w:p>
     <w:p>
@@ -2318,41 +2671,32 @@
           <w:kern w:val="0"/>
           <w:sz w:val="32"/>
           <w:szCs w:val="32"/>
-          <w:cs/>
-          <w14:ligatures w14:val="none"/>
-        </w:rPr>
-        <w:t xml:space="preserve">6)**สามารถดูข้อความแบบ </w:t>
-      </w:r>
-      <w:r>
-        <w:rPr>
-          <w:rFonts w:ascii="TH SarabunPSK" w:eastAsia="Times New Roman" w:hAnsi="TH SarabunPSK" w:cs="TH SarabunPSK"/>
-          <w:kern w:val="0"/>
-          <w:sz w:val="32"/>
-          <w:szCs w:val="32"/>
-          <w14:ligatures w14:val="none"/>
-        </w:rPr>
-        <w:t xml:space="preserve">LINE Flex Message </w:t>
-      </w:r>
-      <w:r>
-        <w:rPr>
-          <w:rFonts w:ascii="TH SarabunPSK" w:eastAsia="Times New Roman" w:hAnsi="TH SarabunPSK" w:cs="TH SarabunPSK"/>
-          <w:kern w:val="0"/>
-          <w:sz w:val="32"/>
-          <w:szCs w:val="32"/>
-          <w:cs/>
-          <w14:ligatures w14:val="none"/>
-        </w:rPr>
-        <w:t>เพื่อความอ่านง่ายบน</w:t>
-      </w:r>
-      <w:r>
-        <w:rPr>
-          <w:rFonts w:ascii="TH SarabunPSK" w:eastAsia="Times New Roman" w:hAnsi="TH SarabunPSK" w:cs="TH SarabunPSK"/>
-          <w:kern w:val="0"/>
-          <w:sz w:val="32"/>
-          <w:szCs w:val="32"/>
-          <w14:ligatures w14:val="none"/>
-        </w:rPr>
-        <w:t xml:space="preserve">Mobile </w:t>
+          <w14:ligatures w14:val="none"/>
+        </w:rPr>
+        <w:t>6</w:t>
+      </w:r>
+      <w:r>
+        <w:rPr>
+          <w:rFonts w:ascii="TH SarabunPSK" w:eastAsia="Times New Roman" w:hAnsi="TH SarabunPSK" w:cs="TH SarabunPSK"/>
+          <w:kern w:val="0"/>
+          <w:sz w:val="32"/>
+          <w:szCs w:val="32"/>
+          <w:cs/>
+          <w14:ligatures w14:val="none"/>
+        </w:rPr>
+        <w:t>)</w:t>
+      </w:r>
+      <w:r>
+        <w:rPr>
+          <w:rFonts w:ascii="TH SarabunPSK" w:eastAsia="Times New Roman" w:hAnsi="TH SarabunPSK" w:cs="TH SarabunPSK"/>
+          <w:color w:val="FFFFFF" w:themeColor="background1"/>
+          <w:kern w:val="0"/>
+          <w:sz w:val="32"/>
+          <w:szCs w:val="32"/>
+          <w:cs/>
+          <w14:ligatures w14:val="none"/>
+        </w:rPr>
+        <w:t>**</w:t>
       </w:r>
       <w:r>
         <w:rPr>
@@ -2363,30 +2707,29 @@
           <w:cs/>
           <w14:ligatures w14:val="none"/>
         </w:rPr>
-        <w:t>และบน</w:t>
-      </w:r>
-      <w:r>
-        <w:rPr>
-          <w:rFonts w:ascii="TH SarabunPSK" w:eastAsia="Times New Roman" w:hAnsi="TH SarabunPSK" w:cs="TH SarabunPSK"/>
-          <w:kern w:val="0"/>
-          <w:sz w:val="32"/>
-          <w:szCs w:val="32"/>
-          <w14:ligatures w14:val="none"/>
-        </w:rPr>
-        <w:t xml:space="preserve"> Desktop</w:t>
+        <w:t>สามารถรับการแจ้งเตือนสรุปเงินเดือน และโหลดใบเงินเดือน ทวิ</w:t>
+      </w:r>
+      <w:r>
+        <w:rPr>
+          <w:rFonts w:ascii="TH SarabunPSK" w:eastAsia="Times New Roman" w:hAnsi="TH SarabunPSK" w:cs="TH SarabunPSK"/>
+          <w:kern w:val="0"/>
+          <w:sz w:val="32"/>
+          <w:szCs w:val="32"/>
+          <w14:ligatures w14:val="none"/>
+        </w:rPr>
+        <w:t xml:space="preserve"> 50 </w:t>
       </w:r>
     </w:p>
     <w:p>
       <w:pPr>
         <w:spacing w:after="0"/>
-        <w:ind w:firstLine="2268"/>
+        <w:ind w:left="1548" w:firstLine="720"/>
         <w:jc w:val="both"/>
         <w:rPr>
           <w:rFonts w:ascii="TH SarabunPSK" w:eastAsia="Times New Roman" w:hAnsi="TH SarabunPSK" w:cs="TH SarabunPSK"/>
           <w:kern w:val="0"/>
           <w:sz w:val="32"/>
           <w:szCs w:val="32"/>
-          <w:cs/>
           <w14:ligatures w14:val="none"/>
         </w:rPr>
       </w:pPr>
@@ -2396,10 +2739,30 @@
           <w:kern w:val="0"/>
           <w:sz w:val="32"/>
           <w:szCs w:val="32"/>
-          <w:cs/>
-          <w14:ligatures w14:val="none"/>
-        </w:rPr>
-        <w:t>7)**สามารถส่ง</w:t>
+          <w14:ligatures w14:val="none"/>
+        </w:rPr>
+        <w:t>7</w:t>
+      </w:r>
+      <w:r>
+        <w:rPr>
+          <w:rFonts w:ascii="TH SarabunPSK" w:eastAsia="Times New Roman" w:hAnsi="TH SarabunPSK" w:cs="TH SarabunPSK"/>
+          <w:kern w:val="0"/>
+          <w:sz w:val="32"/>
+          <w:szCs w:val="32"/>
+          <w14:ligatures w14:val="none"/>
+        </w:rPr>
+        <w:t>)</w:t>
+      </w:r>
+      <w:r>
+        <w:rPr>
+          <w:rFonts w:ascii="TH SarabunPSK" w:eastAsia="Times New Roman" w:hAnsi="TH SarabunPSK" w:cs="TH SarabunPSK"/>
+          <w:color w:val="FFFFFF" w:themeColor="background1"/>
+          <w:kern w:val="0"/>
+          <w:sz w:val="32"/>
+          <w:szCs w:val="32"/>
+          <w14:ligatures w14:val="none"/>
+        </w:rPr>
+        <w:t>**</w:t>
       </w:r>
       <w:r>
         <w:rPr>
@@ -2410,54 +2773,1256 @@
           <w:cs/>
           <w14:ligatures w14:val="none"/>
         </w:rPr>
-        <w:t>รูป</w:t>
-      </w:r>
-      <w:r>
-        <w:rPr>
-          <w:rFonts w:ascii="TH SarabunPSK" w:eastAsia="Times New Roman" w:hAnsi="TH SarabunPSK" w:cs="TH SarabunPSK"/>
-          <w:kern w:val="0"/>
-          <w:sz w:val="32"/>
-          <w:szCs w:val="32"/>
-          <w:cs/>
-          <w14:ligatures w14:val="none"/>
-        </w:rPr>
-        <w:t>ส</w:t>
-      </w:r>
-      <w:proofErr w:type="spellStart"/>
-      <w:r>
-        <w:rPr>
-          <w:rFonts w:ascii="TH SarabunPSK" w:eastAsia="Times New Roman" w:hAnsi="TH SarabunPSK" w:cs="TH SarabunPSK"/>
-          <w:kern w:val="0"/>
-          <w:sz w:val="32"/>
-          <w:szCs w:val="32"/>
-          <w:cs/>
-          <w14:ligatures w14:val="none"/>
-        </w:rPr>
-        <w:t>ลิป</w:t>
-      </w:r>
-      <w:proofErr w:type="spellEnd"/>
-      <w:r>
-        <w:rPr>
-          <w:rFonts w:ascii="TH SarabunPSK" w:eastAsia="Times New Roman" w:hAnsi="TH SarabunPSK" w:cs="TH SarabunPSK"/>
-          <w:kern w:val="0"/>
-          <w:sz w:val="32"/>
-          <w:szCs w:val="32"/>
-          <w:cs/>
-          <w14:ligatures w14:val="none"/>
-        </w:rPr>
-        <w:t>หรือเอกสารที่เกี่ยวข้องตามช่องทางที่กำหนด (เพื่อให้ระบบคัดแยกและจัดเก็บ)</w:t>
+        <w:t>สามารถ</w:t>
+      </w:r>
+      <w:r>
+        <w:rPr>
+          <w:rFonts w:ascii="TH SarabunPSK" w:eastAsia="Times New Roman" w:hAnsi="TH SarabunPSK" w:cs="TH SarabunPSK" w:hint="cs"/>
+          <w:kern w:val="0"/>
+          <w:sz w:val="32"/>
+          <w:szCs w:val="32"/>
+          <w:cs/>
+          <w14:ligatures w14:val="none"/>
+        </w:rPr>
+        <w:t>สร้างการประชุมได้ผ่าน</w:t>
+      </w:r>
+      <w:r>
+        <w:rPr>
+          <w:rFonts w:ascii="TH SarabunPSK" w:eastAsia="Times New Roman" w:hAnsi="TH SarabunPSK" w:cs="TH SarabunPSK" w:hint="cs"/>
+          <w:kern w:val="0"/>
+          <w:sz w:val="32"/>
+          <w:szCs w:val="32"/>
+          <w:cs/>
+          <w14:ligatures w14:val="none"/>
+        </w:rPr>
+        <w:t>กลุ่ม</w:t>
       </w:r>
     </w:p>
     <w:p>
       <w:pPr>
-        <w:ind w:firstLine="720"/>
-        <w:rPr>
-          <w:rFonts w:ascii="TH SarabunPSK" w:hAnsi="TH SarabunPSK" w:cs="TH SarabunPSK" w:hint="cs"/>
-          <w:sz w:val="32"/>
-          <w:szCs w:val="32"/>
-          <w:cs/>
+        <w:spacing w:after="0"/>
+        <w:ind w:left="1548" w:firstLine="720"/>
+        <w:jc w:val="both"/>
+        <w:rPr>
+          <w:rFonts w:ascii="TH SarabunPSK" w:eastAsia="Times New Roman" w:hAnsi="TH SarabunPSK" w:cs="TH SarabunPSK"/>
+          <w:kern w:val="0"/>
+          <w:sz w:val="32"/>
+          <w:szCs w:val="32"/>
+          <w14:ligatures w14:val="none"/>
         </w:rPr>
       </w:pPr>
+      <w:r>
+        <w:rPr>
+          <w:rFonts w:ascii="TH SarabunPSK" w:eastAsia="Times New Roman" w:hAnsi="TH SarabunPSK" w:cs="TH SarabunPSK"/>
+          <w:kern w:val="0"/>
+          <w:sz w:val="32"/>
+          <w:szCs w:val="32"/>
+          <w14:ligatures w14:val="none"/>
+        </w:rPr>
+        <w:t>8)</w:t>
+      </w:r>
+      <w:r>
+        <w:rPr>
+          <w:rFonts w:ascii="TH SarabunPSK" w:eastAsia="Times New Roman" w:hAnsi="TH SarabunPSK" w:cs="TH SarabunPSK"/>
+          <w:color w:val="FFFFFF" w:themeColor="background1"/>
+          <w:kern w:val="0"/>
+          <w:sz w:val="32"/>
+          <w:szCs w:val="32"/>
+          <w14:ligatures w14:val="none"/>
+        </w:rPr>
+        <w:t>**</w:t>
+      </w:r>
+      <w:r>
+        <w:rPr>
+          <w:rFonts w:ascii="TH SarabunPSK" w:eastAsia="Times New Roman" w:hAnsi="TH SarabunPSK" w:cs="TH SarabunPSK" w:hint="cs"/>
+          <w:kern w:val="0"/>
+          <w:sz w:val="32"/>
+          <w:szCs w:val="32"/>
+          <w:cs/>
+          <w14:ligatures w14:val="none"/>
+        </w:rPr>
+        <w:t xml:space="preserve">สามารถพูดคุยกับ </w:t>
+      </w:r>
+      <w:r>
+        <w:rPr>
+          <w:rFonts w:ascii="TH SarabunPSK" w:eastAsia="Times New Roman" w:hAnsi="TH SarabunPSK" w:cs="TH SarabunPSK"/>
+          <w:kern w:val="0"/>
+          <w:sz w:val="32"/>
+          <w:szCs w:val="32"/>
+          <w14:ligatures w14:val="none"/>
+        </w:rPr>
+        <w:t xml:space="preserve">AI agent </w:t>
+      </w:r>
+      <w:r>
+        <w:rPr>
+          <w:rFonts w:ascii="TH SarabunPSK" w:eastAsia="Times New Roman" w:hAnsi="TH SarabunPSK" w:cs="TH SarabunPSK" w:hint="cs"/>
+          <w:kern w:val="0"/>
+          <w:sz w:val="32"/>
+          <w:szCs w:val="32"/>
+          <w:cs/>
+          <w14:ligatures w14:val="none"/>
+        </w:rPr>
+        <w:t>ได้เพื่อถามข้อมูลบริษัท</w:t>
+      </w:r>
+      <w:r>
+        <w:rPr>
+          <w:rFonts w:ascii="TH SarabunPSK" w:eastAsia="Times New Roman" w:hAnsi="TH SarabunPSK" w:cs="TH SarabunPSK" w:hint="cs"/>
+          <w:kern w:val="0"/>
+          <w:sz w:val="32"/>
+          <w:szCs w:val="32"/>
+          <w:cs/>
+          <w14:ligatures w14:val="none"/>
+        </w:rPr>
+        <w:t xml:space="preserve"> </w:t>
+      </w:r>
+      <w:r>
+        <w:rPr>
+          <w:rFonts w:ascii="TH SarabunPSK" w:eastAsia="Times New Roman" w:hAnsi="TH SarabunPSK" w:cs="TH SarabunPSK"/>
+          <w:kern w:val="0"/>
+          <w:sz w:val="32"/>
+          <w:szCs w:val="32"/>
+          <w14:ligatures w14:val="none"/>
+        </w:rPr>
+        <w:t>(RAG AI)</w:t>
+      </w:r>
+    </w:p>
+    <w:p>
+      <w:pPr>
+        <w:spacing w:after="0"/>
+        <w:ind w:left="1548" w:firstLine="720"/>
+        <w:jc w:val="both"/>
+        <w:rPr>
+          <w:rFonts w:ascii="TH SarabunPSK" w:eastAsia="Times New Roman" w:hAnsi="TH SarabunPSK" w:cs="TH SarabunPSK"/>
+          <w:kern w:val="0"/>
+          <w:sz w:val="32"/>
+          <w:szCs w:val="32"/>
+          <w:cs/>
+          <w14:ligatures w14:val="none"/>
+        </w:rPr>
+      </w:pPr>
+      <w:r>
+        <w:rPr>
+          <w:rFonts w:ascii="TH SarabunPSK" w:eastAsia="Times New Roman" w:hAnsi="TH SarabunPSK" w:cs="TH SarabunPSK"/>
+          <w:kern w:val="0"/>
+          <w:sz w:val="32"/>
+          <w:szCs w:val="32"/>
+          <w14:ligatures w14:val="none"/>
+        </w:rPr>
+        <w:t>9)</w:t>
+      </w:r>
+      <w:r>
+        <w:rPr>
+          <w:rFonts w:ascii="TH SarabunPSK" w:eastAsia="Times New Roman" w:hAnsi="TH SarabunPSK" w:cs="TH SarabunPSK"/>
+          <w:color w:val="FFFFFF" w:themeColor="background1"/>
+          <w:kern w:val="0"/>
+          <w:sz w:val="32"/>
+          <w:szCs w:val="32"/>
+          <w14:ligatures w14:val="none"/>
+        </w:rPr>
+        <w:t>**</w:t>
+      </w:r>
+      <w:r>
+        <w:rPr>
+          <w:rFonts w:ascii="TH SarabunPSK" w:eastAsia="Times New Roman" w:hAnsi="TH SarabunPSK" w:cs="TH SarabunPSK" w:hint="cs"/>
+          <w:kern w:val="0"/>
+          <w:sz w:val="32"/>
+          <w:szCs w:val="32"/>
+          <w:cs/>
+          <w14:ligatures w14:val="none"/>
+        </w:rPr>
+        <w:t>สามารถรับข่าวสาร</w:t>
+      </w:r>
+      <w:r>
+        <w:rPr>
+          <w:rFonts w:ascii="TH SarabunPSK" w:eastAsia="Times New Roman" w:hAnsi="TH SarabunPSK" w:cs="TH SarabunPSK" w:hint="cs"/>
+          <w:kern w:val="0"/>
+          <w:sz w:val="32"/>
+          <w:szCs w:val="32"/>
+          <w:cs/>
+          <w14:ligatures w14:val="none"/>
+        </w:rPr>
+        <w:t>แยกตามแผนกแต่ละตำแหน่ง</w:t>
+      </w:r>
+    </w:p>
+    <w:p>
+      <w:pPr>
+        <w:spacing w:after="0"/>
+        <w:jc w:val="both"/>
+        <w:rPr>
+          <w:rFonts w:ascii="TH SarabunPSK" w:eastAsia="Times New Roman" w:hAnsi="TH SarabunPSK" w:cs="TH SarabunPSK"/>
+          <w:kern w:val="0"/>
+          <w:sz w:val="32"/>
+          <w:szCs w:val="32"/>
+          <w14:ligatures w14:val="none"/>
+        </w:rPr>
+      </w:pPr>
+    </w:p>
+    <w:p>
+      <w:pPr>
+        <w:spacing w:after="0"/>
+        <w:rPr>
+          <w:rFonts w:ascii="TH SarabunPSK" w:eastAsia="Times New Roman" w:hAnsi="TH SarabunPSK" w:cs="TH SarabunPSK"/>
+          <w:b/>
+          <w:bCs/>
+          <w:color w:val="000000"/>
+          <w:kern w:val="0"/>
+          <w:sz w:val="32"/>
+          <w:szCs w:val="32"/>
+          <w14:ligatures w14:val="none"/>
+        </w:rPr>
+      </w:pPr>
+      <w:r>
+        <w:rPr>
+          <w:rFonts w:ascii="TH SarabunPSK" w:eastAsia="Times New Roman" w:hAnsi="TH SarabunPSK" w:cs="TH SarabunPSK" w:hint="cs"/>
+          <w:b/>
+          <w:bCs/>
+          <w:color w:val="000000"/>
+          <w:kern w:val="0"/>
+          <w:sz w:val="32"/>
+          <w:szCs w:val="32"/>
+          <w14:ligatures w14:val="none"/>
+        </w:rPr>
+        <w:t>1.</w:t>
+      </w:r>
+      <w:r>
+        <w:rPr>
+          <w:rFonts w:ascii="TH SarabunPSK" w:eastAsia="Times New Roman" w:hAnsi="TH SarabunPSK" w:cs="TH SarabunPSK"/>
+          <w:b/>
+          <w:bCs/>
+          <w:color w:val="000000"/>
+          <w:kern w:val="0"/>
+          <w:sz w:val="32"/>
+          <w:szCs w:val="32"/>
+          <w14:ligatures w14:val="none"/>
+        </w:rPr>
+        <w:t>5</w:t>
+      </w:r>
+      <w:r>
+        <w:rPr>
+          <w:rFonts w:ascii="TH SarabunPSK" w:eastAsia="Times New Roman" w:hAnsi="TH SarabunPSK" w:cs="TH SarabunPSK"/>
+          <w:b/>
+          <w:bCs/>
+          <w:color w:val="FFFFFF" w:themeColor="background1"/>
+          <w:kern w:val="0"/>
+          <w:sz w:val="32"/>
+          <w:szCs w:val="32"/>
+          <w14:ligatures w14:val="none"/>
+        </w:rPr>
+        <w:t>**</w:t>
+      </w:r>
+      <w:r>
+        <w:rPr>
+          <w:rFonts w:ascii="TH SarabunPSK" w:eastAsia="Times New Roman" w:hAnsi="TH SarabunPSK" w:cs="TH SarabunPSK" w:hint="cs"/>
+          <w:b/>
+          <w:bCs/>
+          <w:color w:val="000000"/>
+          <w:kern w:val="0"/>
+          <w:sz w:val="32"/>
+          <w:szCs w:val="32"/>
+          <w:cs/>
+          <w14:ligatures w14:val="none"/>
+        </w:rPr>
+        <w:t>คำนิยามศัพท์</w:t>
+      </w:r>
+    </w:p>
+    <w:p>
+      <w:pPr>
+        <w:spacing w:after="0"/>
+        <w:rPr>
+          <w:rFonts w:ascii="TH SarabunPSK" w:eastAsia="Times New Roman" w:hAnsi="TH SarabunPSK" w:cs="TH SarabunPSK"/>
+          <w:kern w:val="0"/>
+          <w:sz w:val="32"/>
+          <w:szCs w:val="32"/>
+          <w14:ligatures w14:val="none"/>
+        </w:rPr>
+      </w:pPr>
+      <w:r>
+        <w:rPr>
+          <w:rFonts w:ascii="TH SarabunPSK" w:eastAsia="Times New Roman" w:hAnsi="TH SarabunPSK" w:cs="TH SarabunPSK"/>
+          <w:b/>
+          <w:bCs/>
+          <w:color w:val="000000"/>
+          <w:kern w:val="0"/>
+          <w:sz w:val="32"/>
+          <w:szCs w:val="32"/>
+          <w:cs/>
+          <w14:ligatures w14:val="none"/>
+        </w:rPr>
+        <w:tab/>
+      </w:r>
+      <w:r>
+        <w:rPr>
+          <w:rFonts w:ascii="TH SarabunPSK" w:eastAsia="Times New Roman" w:hAnsi="TH SarabunPSK" w:cs="TH SarabunPSK"/>
+          <w:kern w:val="0"/>
+          <w:sz w:val="32"/>
+          <w:szCs w:val="32"/>
+          <w:cs/>
+          <w14:ligatures w14:val="none"/>
+        </w:rPr>
+        <w:t>คํา</w:t>
+      </w:r>
+      <w:r>
+        <w:rPr>
+          <w:rFonts w:ascii="TH SarabunPSK" w:eastAsia="Times New Roman" w:hAnsi="TH SarabunPSK" w:cs="TH SarabunPSK" w:hint="cs"/>
+          <w:kern w:val="0"/>
+          <w:sz w:val="32"/>
+          <w:szCs w:val="32"/>
+          <w:cs/>
+          <w14:ligatures w14:val="none"/>
+        </w:rPr>
+        <w:t>จำ</w:t>
+      </w:r>
+      <w:r>
+        <w:rPr>
+          <w:rFonts w:ascii="TH SarabunPSK" w:eastAsia="Times New Roman" w:hAnsi="TH SarabunPSK" w:cs="TH SarabunPSK"/>
+          <w:kern w:val="0"/>
+          <w:sz w:val="32"/>
+          <w:szCs w:val="32"/>
+          <w:cs/>
+          <w14:ligatures w14:val="none"/>
+        </w:rPr>
+        <w:t>กัดความที่เกี่ยวข้องกับโครงงานสหกิจศึกษานี้</w:t>
+      </w:r>
+    </w:p>
+    <w:p>
+      <w:pPr>
+        <w:spacing w:after="0"/>
+        <w:ind w:firstLine="567"/>
+        <w:jc w:val="both"/>
+        <w:rPr>
+          <w:rFonts w:ascii="TH SarabunPSK" w:eastAsia="Times New Roman" w:hAnsi="TH SarabunPSK" w:cs="TH SarabunPSK"/>
+          <w:kern w:val="0"/>
+          <w:sz w:val="32"/>
+          <w:szCs w:val="32"/>
+          <w14:ligatures w14:val="none"/>
+        </w:rPr>
+      </w:pPr>
+      <w:r>
+        <w:rPr>
+          <w:rFonts w:ascii="TH SarabunPSK" w:eastAsia="Times New Roman" w:hAnsi="TH SarabunPSK" w:cs="TH SarabunPSK"/>
+          <w:kern w:val="0"/>
+          <w:sz w:val="32"/>
+          <w:szCs w:val="32"/>
+          <w14:ligatures w14:val="none"/>
+        </w:rPr>
+        <w:t>1.</w:t>
+      </w:r>
+      <w:r>
+        <w:rPr>
+          <w:rFonts w:ascii="TH SarabunPSK" w:eastAsia="Times New Roman" w:hAnsi="TH SarabunPSK" w:cs="TH SarabunPSK"/>
+          <w:kern w:val="0"/>
+          <w:sz w:val="32"/>
+          <w:szCs w:val="32"/>
+          <w14:ligatures w14:val="none"/>
+        </w:rPr>
+        <w:t>5.1</w:t>
+      </w:r>
+      <w:r>
+        <w:rPr>
+          <w:rFonts w:ascii="TH SarabunPSK" w:eastAsia="Times New Roman" w:hAnsi="TH SarabunPSK" w:cs="TH SarabunPSK"/>
+          <w:color w:val="FFFFFF" w:themeColor="background1"/>
+          <w:kern w:val="0"/>
+          <w:sz w:val="32"/>
+          <w:szCs w:val="32"/>
+          <w14:ligatures w14:val="none"/>
+        </w:rPr>
+        <w:t>**</w:t>
+      </w:r>
+      <w:r>
+        <w:rPr>
+          <w:rFonts w:ascii="TH SarabunPSK" w:hAnsi="TH SarabunPSK" w:cs="TH SarabunPSK"/>
+          <w:kern w:val="0"/>
+          <w:sz w:val="32"/>
+          <w:szCs w:val="32"/>
+        </w:rPr>
+        <w:t xml:space="preserve">n8n </w:t>
+      </w:r>
+      <w:r>
+        <w:rPr>
+          <w:rFonts w:ascii="TH SarabunPSK" w:hAnsi="TH SarabunPSK" w:cs="TH SarabunPSK" w:hint="cs"/>
+          <w:kern w:val="0"/>
+          <w:sz w:val="32"/>
+          <w:szCs w:val="32"/>
+          <w:cs/>
+        </w:rPr>
+        <w:t xml:space="preserve">คือ </w:t>
+      </w:r>
+      <w:r>
+        <w:rPr>
+          <w:rFonts w:ascii="TH SarabunPSK" w:hAnsi="TH SarabunPSK" w:cs="TH SarabunPSK" w:hint="cs"/>
+          <w:kern w:val="0"/>
+          <w:sz w:val="32"/>
+          <w:szCs w:val="32"/>
+          <w:cs/>
+        </w:rPr>
+        <w:t xml:space="preserve">เครื่องมือ </w:t>
+      </w:r>
+      <w:r>
+        <w:rPr>
+          <w:rFonts w:ascii="TH SarabunPSK" w:hAnsi="TH SarabunPSK" w:cs="TH SarabunPSK" w:hint="cs"/>
+          <w:kern w:val="0"/>
+          <w:sz w:val="32"/>
+          <w:szCs w:val="32"/>
+        </w:rPr>
+        <w:t xml:space="preserve">workflow Automation </w:t>
+      </w:r>
+      <w:r>
+        <w:rPr>
+          <w:rFonts w:ascii="TH SarabunPSK" w:hAnsi="TH SarabunPSK" w:cs="TH SarabunPSK" w:hint="cs"/>
+          <w:kern w:val="0"/>
+          <w:sz w:val="32"/>
+          <w:szCs w:val="32"/>
+          <w:cs/>
+        </w:rPr>
+        <w:t xml:space="preserve">แบบโอเพนซอร์ส ที่สามารถออกแบบระบบต่างๆที่เชื่อมกับหลายๆแพลตฟอร์มได้ โดยเป็นการสร้างระบบอัตโนมัติการทำงาน ที่ผสมความสามารถด้าน </w:t>
+      </w:r>
+      <w:r>
+        <w:rPr>
+          <w:rFonts w:ascii="TH SarabunPSK" w:hAnsi="TH SarabunPSK" w:cs="TH SarabunPSK" w:hint="cs"/>
+          <w:kern w:val="0"/>
+          <w:sz w:val="32"/>
+          <w:szCs w:val="32"/>
+        </w:rPr>
+        <w:t xml:space="preserve">AI </w:t>
+      </w:r>
+      <w:r>
+        <w:rPr>
+          <w:rFonts w:ascii="TH SarabunPSK" w:hAnsi="TH SarabunPSK" w:cs="TH SarabunPSK" w:hint="cs"/>
+          <w:kern w:val="0"/>
+          <w:sz w:val="32"/>
+          <w:szCs w:val="32"/>
+          <w:cs/>
+        </w:rPr>
+        <w:t xml:space="preserve">เข้าไปได้ ทั้งแบบ </w:t>
+      </w:r>
+      <w:r>
+        <w:rPr>
+          <w:rFonts w:ascii="TH SarabunPSK" w:hAnsi="TH SarabunPSK" w:cs="TH SarabunPSK" w:hint="cs"/>
+          <w:kern w:val="0"/>
+          <w:sz w:val="32"/>
+          <w:szCs w:val="32"/>
+        </w:rPr>
+        <w:t xml:space="preserve">Code </w:t>
+      </w:r>
+      <w:r>
+        <w:rPr>
+          <w:rFonts w:ascii="TH SarabunPSK" w:hAnsi="TH SarabunPSK" w:cs="TH SarabunPSK" w:hint="cs"/>
+          <w:kern w:val="0"/>
+          <w:sz w:val="32"/>
+          <w:szCs w:val="32"/>
+          <w:cs/>
+        </w:rPr>
+        <w:t xml:space="preserve">และ </w:t>
+      </w:r>
+      <w:r>
+        <w:rPr>
+          <w:rFonts w:ascii="TH SarabunPSK" w:hAnsi="TH SarabunPSK" w:cs="TH SarabunPSK" w:hint="cs"/>
+          <w:kern w:val="0"/>
+          <w:sz w:val="32"/>
+          <w:szCs w:val="32"/>
+        </w:rPr>
+        <w:t>Low Code</w:t>
+      </w:r>
+    </w:p>
+    <w:p>
+      <w:pPr>
+        <w:spacing w:after="0"/>
+        <w:ind w:firstLine="567"/>
+        <w:jc w:val="both"/>
+        <w:rPr>
+          <w:rFonts w:ascii="TH SarabunPSK" w:eastAsia="Times New Roman" w:hAnsi="TH SarabunPSK" w:cs="TH SarabunPSK"/>
+          <w:kern w:val="0"/>
+          <w:sz w:val="32"/>
+          <w:szCs w:val="32"/>
+          <w14:ligatures w14:val="none"/>
+        </w:rPr>
+      </w:pPr>
+      <w:r>
+        <w:rPr>
+          <w:rFonts w:ascii="TH SarabunPSK" w:eastAsia="Times New Roman" w:hAnsi="TH SarabunPSK" w:cs="TH SarabunPSK"/>
+          <w:kern w:val="0"/>
+          <w:sz w:val="32"/>
+          <w:szCs w:val="32"/>
+          <w14:ligatures w14:val="none"/>
+        </w:rPr>
+        <w:t>1.5.2</w:t>
+      </w:r>
+      <w:r>
+        <w:rPr>
+          <w:rFonts w:ascii="TH SarabunPSK" w:eastAsia="Times New Roman" w:hAnsi="TH SarabunPSK" w:cs="TH SarabunPSK"/>
+          <w:color w:val="FFFFFF" w:themeColor="background1"/>
+          <w:kern w:val="0"/>
+          <w:sz w:val="32"/>
+          <w:szCs w:val="32"/>
+          <w14:ligatures w14:val="none"/>
+        </w:rPr>
+        <w:t>**</w:t>
+      </w:r>
+      <w:r>
+        <w:rPr>
+          <w:rFonts w:ascii="TH SarabunPSK" w:eastAsia="Times New Roman" w:hAnsi="TH SarabunPSK" w:cs="TH SarabunPSK"/>
+          <w:kern w:val="0"/>
+          <w:sz w:val="32"/>
+          <w:szCs w:val="32"/>
+          <w14:ligatures w14:val="none"/>
+        </w:rPr>
+        <w:t xml:space="preserve"> Workflow </w:t>
+      </w:r>
+      <w:r>
+        <w:rPr>
+          <w:rFonts w:ascii="TH SarabunPSK" w:eastAsia="Times New Roman" w:hAnsi="TH SarabunPSK" w:cs="TH SarabunPSK" w:hint="cs"/>
+          <w:kern w:val="0"/>
+          <w:sz w:val="32"/>
+          <w:szCs w:val="32"/>
+          <w:cs/>
+          <w14:ligatures w14:val="none"/>
+        </w:rPr>
+        <w:t xml:space="preserve">คือ </w:t>
+      </w:r>
+      <w:r>
+        <w:rPr>
+          <w:rFonts w:ascii="TH SarabunPSK" w:hAnsi="TH SarabunPSK" w:cs="TH SarabunPSK" w:hint="cs"/>
+          <w:color w:val="000000" w:themeColor="text1"/>
+          <w:sz w:val="32"/>
+          <w:szCs w:val="32"/>
+          <w:shd w:val="clear" w:color="auto" w:fill="FFFFFF"/>
+          <w:cs/>
+        </w:rPr>
+        <w:t xml:space="preserve">ระบบ </w:t>
+      </w:r>
+      <w:r>
+        <w:rPr>
+          <w:rFonts w:ascii="TH SarabunPSK" w:hAnsi="TH SarabunPSK" w:cs="TH SarabunPSK" w:hint="cs"/>
+          <w:color w:val="000000" w:themeColor="text1"/>
+          <w:sz w:val="32"/>
+          <w:szCs w:val="32"/>
+          <w:shd w:val="clear" w:color="auto" w:fill="FFFFFF"/>
+        </w:rPr>
+        <w:t>Workflow </w:t>
+      </w:r>
+      <w:r>
+        <w:rPr>
+          <w:rFonts w:ascii="TH SarabunPSK" w:hAnsi="TH SarabunPSK" w:cs="TH SarabunPSK" w:hint="cs"/>
+          <w:color w:val="000000" w:themeColor="text1"/>
+          <w:sz w:val="32"/>
+          <w:szCs w:val="32"/>
+          <w:shd w:val="clear" w:color="auto" w:fill="FFFFFF"/>
+          <w:cs/>
+        </w:rPr>
+        <w:t>คือ ระบบที่เป็นเหมือนตัวช่วยในกระบวนการจัดการเอกสารที่รวมถึงการอนุมัติและตรวจสอบต่าง ๆ ภายในบริษัท ทำให้พนักงานในองค์กรสามารถทำงานได้อย่างมีแบบแผน มีระเบียบ เป็นขั้นเป็นตอนมากขึ้น ลดขั้นตอนหรือเวลาการทำงานที่ไม่จำเป็นออกไป เพราะเรื่องของการจัดการเอกสารนั้นไม่ใช่เรื่องเล็ก ๆ ถึงแม้จะอยู่ภายในองค์กรเดียวกัน แต่รายละเอียดการจัดการเอกสารในแต่ละแผนกอาจแตกต่างกันออกไป แต่ละทีมอาจมีขั้นตอนการดำเนินงานที่เจาะจงรายละเอียดมากขึ้นไปอีก</w:t>
+      </w:r>
+      <w:r>
+        <w:rPr>
+          <w:rFonts w:ascii="TH SarabunPSK" w:eastAsia="Times New Roman" w:hAnsi="TH SarabunPSK" w:cs="TH SarabunPSK"/>
+          <w:color w:val="000000" w:themeColor="text1"/>
+          <w:kern w:val="0"/>
+          <w:sz w:val="32"/>
+          <w:szCs w:val="32"/>
+          <w14:ligatures w14:val="none"/>
+        </w:rPr>
+        <w:t xml:space="preserve"> (</w:t>
+      </w:r>
+      <w:r>
+        <w:rPr>
+          <w:rFonts w:ascii="TH SarabunPSK" w:eastAsia="Times New Roman" w:hAnsi="TH SarabunPSK" w:cs="TH SarabunPSK"/>
+          <w:color w:val="000000" w:themeColor="text1"/>
+          <w:kern w:val="0"/>
+          <w:sz w:val="32"/>
+          <w:szCs w:val="32"/>
+          <w14:ligatures w14:val="none"/>
+        </w:rPr>
+        <w:t>dittothailand</w:t>
+      </w:r>
+      <w:r>
+        <w:rPr>
+          <w:rFonts w:ascii="TH SarabunPSK" w:eastAsia="Times New Roman" w:hAnsi="TH SarabunPSK" w:cs="TH SarabunPSK"/>
+          <w:color w:val="000000" w:themeColor="text1"/>
+          <w:kern w:val="0"/>
+          <w:sz w:val="32"/>
+          <w:szCs w:val="32"/>
+          <w14:ligatures w14:val="none"/>
+        </w:rPr>
+        <w:t>,</w:t>
+      </w:r>
+      <w:r>
+        <w:rPr>
+          <w:rFonts w:ascii="TH SarabunPSK" w:eastAsia="Times New Roman" w:hAnsi="TH SarabunPSK" w:cs="TH SarabunPSK"/>
+          <w:color w:val="000000" w:themeColor="text1"/>
+          <w:kern w:val="0"/>
+          <w:sz w:val="32"/>
+          <w:szCs w:val="32"/>
+          <w14:ligatures w14:val="none"/>
+        </w:rPr>
+        <w:t>2</w:t>
+      </w:r>
+      <w:r>
+        <w:rPr>
+          <w:rFonts w:ascii="TH SarabunPSK" w:eastAsia="Times New Roman" w:hAnsi="TH SarabunPSK" w:cs="TH SarabunPSK"/>
+          <w:color w:val="000000" w:themeColor="text1"/>
+          <w:kern w:val="0"/>
+          <w:sz w:val="32"/>
+          <w:szCs w:val="32"/>
+          <w14:ligatures w14:val="none"/>
+        </w:rPr>
+        <w:t>564)</w:t>
+      </w:r>
+    </w:p>
+    <w:p>
+      <w:pPr>
+        <w:spacing w:after="0"/>
+        <w:ind w:firstLine="567"/>
+        <w:jc w:val="both"/>
+        <w:rPr>
+          <w:rFonts w:ascii="TH SarabunPSK" w:eastAsia="Times New Roman" w:hAnsi="TH SarabunPSK" w:cs="TH SarabunPSK"/>
+          <w:kern w:val="0"/>
+          <w:sz w:val="32"/>
+          <w:szCs w:val="32"/>
+          <w:cs/>
+          <w14:ligatures w14:val="none"/>
+        </w:rPr>
+      </w:pPr>
+      <w:r>
+        <w:rPr>
+          <w:rFonts w:ascii="TH SarabunPSK" w:eastAsia="Times New Roman" w:hAnsi="TH SarabunPSK" w:cs="TH SarabunPSK"/>
+          <w:kern w:val="0"/>
+          <w:sz w:val="32"/>
+          <w:szCs w:val="32"/>
+          <w14:ligatures w14:val="none"/>
+        </w:rPr>
+        <w:t>1.5.3</w:t>
+      </w:r>
+      <w:r>
+        <w:rPr>
+          <w:rFonts w:ascii="TH SarabunPSK" w:eastAsia="Times New Roman" w:hAnsi="TH SarabunPSK" w:cs="TH SarabunPSK"/>
+          <w:color w:val="FFFFFF" w:themeColor="background1"/>
+          <w:kern w:val="0"/>
+          <w:sz w:val="32"/>
+          <w:szCs w:val="32"/>
+          <w14:ligatures w14:val="none"/>
+        </w:rPr>
+        <w:t>**</w:t>
+      </w:r>
+      <w:r>
+        <w:rPr>
+          <w:rFonts w:ascii="TH SarabunPSK" w:hAnsi="TH SarabunPSK" w:cs="TH SarabunPSK" w:hint="cs"/>
+          <w:color w:val="000000" w:themeColor="text1"/>
+          <w:kern w:val="0"/>
+          <w:sz w:val="32"/>
+          <w:szCs w:val="32"/>
+        </w:rPr>
+        <w:t xml:space="preserve">Automation </w:t>
+      </w:r>
+      <w:r>
+        <w:rPr>
+          <w:rFonts w:ascii="TH SarabunPSK" w:hAnsi="TH SarabunPSK" w:cs="TH SarabunPSK" w:hint="cs"/>
+          <w:color w:val="000000" w:themeColor="text1"/>
+          <w:kern w:val="0"/>
+          <w:sz w:val="32"/>
+          <w:szCs w:val="32"/>
+          <w:cs/>
+        </w:rPr>
+        <w:t>เทคนิค/สถาวะ ที่ทำให้อุปกรณ์ กระบวนการ หรือ ระบบ ทำงานเองโดยอัตโนมัติ ผ่านกลไก อิเล็กทรอนิกส์ หรือซอฟต์แวร์ เพื่อลดงานที่ทำซ้ำๆ หรือต้องเพิ่งแรงคน</w:t>
+      </w:r>
+    </w:p>
+    <w:p>
+      <w:pPr>
+        <w:spacing w:after="0"/>
+        <w:ind w:firstLine="567"/>
+        <w:jc w:val="both"/>
+        <w:rPr>
+          <w:rFonts w:ascii="TH SarabunPSK" w:eastAsia="Times New Roman" w:hAnsi="TH SarabunPSK" w:cs="TH SarabunPSK"/>
+          <w:kern w:val="0"/>
+          <w:sz w:val="32"/>
+          <w:szCs w:val="32"/>
+          <w14:ligatures w14:val="none"/>
+        </w:rPr>
+      </w:pPr>
+      <w:r>
+        <w:rPr>
+          <w:rFonts w:ascii="TH SarabunPSK" w:eastAsia="Times New Roman" w:hAnsi="TH SarabunPSK" w:cs="TH SarabunPSK"/>
+          <w:kern w:val="0"/>
+          <w:sz w:val="32"/>
+          <w:szCs w:val="32"/>
+          <w14:ligatures w14:val="none"/>
+        </w:rPr>
+        <w:t>1.5.4</w:t>
+      </w:r>
+      <w:r>
+        <w:rPr>
+          <w:rFonts w:ascii="TH SarabunPSK" w:eastAsia="Times New Roman" w:hAnsi="TH SarabunPSK" w:cs="TH SarabunPSK"/>
+          <w:color w:val="FFFFFF" w:themeColor="background1"/>
+          <w:kern w:val="0"/>
+          <w:sz w:val="32"/>
+          <w:szCs w:val="32"/>
+          <w14:ligatures w14:val="none"/>
+        </w:rPr>
+        <w:t>**</w:t>
+      </w:r>
+      <w:r>
+        <w:rPr>
+          <w:rFonts w:ascii="TH SarabunPSK" w:hAnsi="TH SarabunPSK" w:cs="TH SarabunPSK" w:hint="cs"/>
+          <w:kern w:val="0"/>
+          <w:sz w:val="32"/>
+          <w:szCs w:val="32"/>
+        </w:rPr>
+        <w:t>AI</w:t>
+      </w:r>
+      <w:r>
+        <w:rPr>
+          <w:rFonts w:ascii="TH SarabunPSK" w:hAnsi="TH SarabunPSK" w:cs="TH SarabunPSK"/>
+          <w:kern w:val="0"/>
+          <w:sz w:val="32"/>
+          <w:szCs w:val="32"/>
+        </w:rPr>
+        <w:t xml:space="preserve"> </w:t>
+      </w:r>
+      <w:r>
+        <w:rPr>
+          <w:rFonts w:ascii="TH SarabunPSK" w:hAnsi="TH SarabunPSK" w:cs="TH SarabunPSK" w:hint="cs"/>
+          <w:kern w:val="0"/>
+          <w:sz w:val="32"/>
+          <w:szCs w:val="32"/>
+        </w:rPr>
+        <w:t xml:space="preserve">Agent </w:t>
+      </w:r>
+      <w:r>
+        <w:rPr>
+          <w:rFonts w:ascii="TH SarabunPSK" w:hAnsi="TH SarabunPSK" w:cs="TH SarabunPSK" w:hint="cs"/>
+          <w:kern w:val="0"/>
+          <w:sz w:val="32"/>
+          <w:szCs w:val="32"/>
+          <w:cs/>
+        </w:rPr>
+        <w:t xml:space="preserve">คือโปรแกรมคอมพิวเตอร์หรือระบบปัญญาประดิษฐ์ที่สามารถดำเนินการหรือตัดสินใจแทนมนุษย์ได้โดยอัตโนมัติ โดย </w:t>
+      </w:r>
+      <w:r>
+        <w:rPr>
+          <w:rFonts w:ascii="TH SarabunPSK" w:hAnsi="TH SarabunPSK" w:cs="TH SarabunPSK" w:hint="cs"/>
+          <w:kern w:val="0"/>
+          <w:sz w:val="32"/>
+          <w:szCs w:val="32"/>
+        </w:rPr>
+        <w:t xml:space="preserve">AI Agent </w:t>
+      </w:r>
+      <w:r>
+        <w:rPr>
+          <w:rFonts w:ascii="TH SarabunPSK" w:hAnsi="TH SarabunPSK" w:cs="TH SarabunPSK" w:hint="cs"/>
+          <w:kern w:val="0"/>
+          <w:sz w:val="32"/>
+          <w:szCs w:val="32"/>
+          <w:cs/>
+        </w:rPr>
+        <w:t xml:space="preserve">ที่มีความสามารถด้าน </w:t>
+      </w:r>
+      <w:r>
+        <w:rPr>
+          <w:rFonts w:ascii="TH SarabunPSK" w:hAnsi="TH SarabunPSK" w:cs="TH SarabunPSK" w:hint="cs"/>
+          <w:kern w:val="0"/>
+          <w:sz w:val="32"/>
+          <w:szCs w:val="32"/>
+        </w:rPr>
+        <w:t xml:space="preserve">AI </w:t>
+      </w:r>
+      <w:r>
+        <w:rPr>
+          <w:rFonts w:ascii="TH SarabunPSK" w:hAnsi="TH SarabunPSK" w:cs="TH SarabunPSK" w:hint="cs"/>
+          <w:kern w:val="0"/>
+          <w:sz w:val="32"/>
+          <w:szCs w:val="32"/>
+          <w:cs/>
+        </w:rPr>
+        <w:t xml:space="preserve">จะวิเคราะห์ข้อมูล ประมวลผล ตัดสินใจ และโต้ตอบกับระบบหรือผู้ใช้งานตามกฎหรือโมเดลที่ </w:t>
+      </w:r>
+      <w:r>
+        <w:rPr>
+          <w:rFonts w:ascii="TH SarabunPSK" w:hAnsi="TH SarabunPSK" w:cs="TH SarabunPSK" w:hint="cs"/>
+          <w:kern w:val="0"/>
+          <w:sz w:val="32"/>
+          <w:szCs w:val="32"/>
+        </w:rPr>
+        <w:t xml:space="preserve">AI </w:t>
+      </w:r>
+      <w:r>
+        <w:rPr>
+          <w:rFonts w:ascii="TH SarabunPSK" w:hAnsi="TH SarabunPSK" w:cs="TH SarabunPSK" w:hint="cs"/>
+          <w:kern w:val="0"/>
+          <w:sz w:val="32"/>
+          <w:szCs w:val="32"/>
+          <w:cs/>
+        </w:rPr>
+        <w:t xml:space="preserve">ที่ได้กำหนดไว้ การมี </w:t>
+      </w:r>
+      <w:r>
+        <w:rPr>
+          <w:rFonts w:ascii="TH SarabunPSK" w:hAnsi="TH SarabunPSK" w:cs="TH SarabunPSK" w:hint="cs"/>
+          <w:kern w:val="0"/>
+          <w:sz w:val="32"/>
+          <w:szCs w:val="32"/>
+        </w:rPr>
+        <w:t xml:space="preserve">“Agent” </w:t>
+      </w:r>
+      <w:r>
+        <w:rPr>
+          <w:rFonts w:ascii="TH SarabunPSK" w:hAnsi="TH SarabunPSK" w:cs="TH SarabunPSK" w:hint="cs"/>
+          <w:kern w:val="0"/>
+          <w:sz w:val="32"/>
+          <w:szCs w:val="32"/>
+          <w:cs/>
+        </w:rPr>
+        <w:t>ที่สามารถทำงานแทนเราได้อัตโนมัติ ช่วยให้การทำงานขององค์กรสะดวก รวดเร็ว และมีประสิทธิภาพมากขึ้น</w:t>
+      </w:r>
+      <w:r>
+        <w:rPr>
+          <w:rFonts w:ascii="TH SarabunPSK" w:eastAsia="Times New Roman" w:hAnsi="TH SarabunPSK" w:cs="TH SarabunPSK"/>
+          <w:kern w:val="0"/>
+          <w:sz w:val="32"/>
+          <w:szCs w:val="32"/>
+          <w14:ligatures w14:val="none"/>
+        </w:rPr>
+        <w:t>(</w:t>
+      </w:r>
+      <w:r>
+        <w:rPr>
+          <w:rFonts w:ascii="TH SarabunPSK" w:eastAsia="Times New Roman" w:hAnsi="TH SarabunPSK" w:cs="TH SarabunPSK"/>
+          <w:kern w:val="0"/>
+          <w:sz w:val="32"/>
+          <w:szCs w:val="32"/>
+          <w14:ligatures w14:val="none"/>
+        </w:rPr>
+        <w:t>9expert</w:t>
+      </w:r>
+      <w:r>
+        <w:rPr>
+          <w:rFonts w:ascii="TH SarabunPSK" w:eastAsia="Times New Roman" w:hAnsi="TH SarabunPSK" w:cs="TH SarabunPSK"/>
+          <w:kern w:val="0"/>
+          <w:sz w:val="32"/>
+          <w:szCs w:val="32"/>
+          <w14:ligatures w14:val="none"/>
+        </w:rPr>
+        <w:t>,2568)</w:t>
+      </w:r>
+    </w:p>
+    <w:p>
+      <w:pPr>
+        <w:spacing w:after="0"/>
+        <w:ind w:firstLine="567"/>
+        <w:jc w:val="both"/>
+        <w:rPr>
+          <w:rFonts w:ascii="TH SarabunPSK" w:eastAsia="Times New Roman" w:hAnsi="TH SarabunPSK" w:cs="TH SarabunPSK"/>
+          <w:kern w:val="0"/>
+          <w:sz w:val="32"/>
+          <w:szCs w:val="32"/>
+          <w14:ligatures w14:val="none"/>
+        </w:rPr>
+      </w:pPr>
+      <w:r>
+        <w:rPr>
+          <w:rFonts w:ascii="TH SarabunPSK" w:eastAsia="Times New Roman" w:hAnsi="TH SarabunPSK" w:cs="TH SarabunPSK"/>
+          <w:kern w:val="0"/>
+          <w:sz w:val="32"/>
+          <w:szCs w:val="32"/>
+          <w14:ligatures w14:val="none"/>
+        </w:rPr>
+        <w:lastRenderedPageBreak/>
+        <w:t xml:space="preserve"> 1.5.5</w:t>
+      </w:r>
+      <w:r>
+        <w:rPr>
+          <w:rFonts w:ascii="TH SarabunPSK" w:eastAsia="Times New Roman" w:hAnsi="TH SarabunPSK" w:cs="TH SarabunPSK"/>
+          <w:color w:val="FFFFFF" w:themeColor="background1"/>
+          <w:kern w:val="0"/>
+          <w:sz w:val="32"/>
+          <w:szCs w:val="32"/>
+          <w14:ligatures w14:val="none"/>
+        </w:rPr>
+        <w:t>**</w:t>
+      </w:r>
+      <w:r>
+        <w:rPr>
+          <w:rStyle w:val="af3"/>
+          <w:rFonts w:ascii="TH SarabunPSK" w:hAnsi="TH SarabunPSK" w:cs="TH SarabunPSK" w:hint="cs"/>
+          <w:b w:val="0"/>
+          <w:bCs w:val="0"/>
+          <w:sz w:val="32"/>
+          <w:szCs w:val="32"/>
+        </w:rPr>
+        <w:t>Vector Database (</w:t>
+      </w:r>
+      <w:r>
+        <w:rPr>
+          <w:rStyle w:val="af3"/>
+          <w:rFonts w:ascii="TH SarabunPSK" w:hAnsi="TH SarabunPSK" w:cs="TH SarabunPSK" w:hint="cs"/>
+          <w:b w:val="0"/>
+          <w:bCs w:val="0"/>
+          <w:sz w:val="32"/>
+          <w:szCs w:val="32"/>
+          <w:cs/>
+        </w:rPr>
+        <w:t>ฐานข้อมูลเวกเตอร์)</w:t>
+      </w:r>
+      <w:r>
+        <w:rPr>
+          <w:rFonts w:ascii="TH SarabunPSK" w:hAnsi="TH SarabunPSK" w:cs="TH SarabunPSK" w:hint="cs"/>
+          <w:sz w:val="32"/>
+          <w:szCs w:val="32"/>
+        </w:rPr>
+        <w:t xml:space="preserve"> — </w:t>
+      </w:r>
+      <w:r>
+        <w:rPr>
+          <w:rFonts w:ascii="TH SarabunPSK" w:hAnsi="TH SarabunPSK" w:cs="TH SarabunPSK" w:hint="cs"/>
+          <w:sz w:val="32"/>
+          <w:szCs w:val="32"/>
+          <w:cs/>
+        </w:rPr>
+        <w:t xml:space="preserve">ฐานข้อมูลเฉพาะทางสำหรับเก็บ-ทำดัชนีเวกเตอร์มิติสูง (เช่น </w:t>
+      </w:r>
+      <w:r>
+        <w:rPr>
+          <w:rFonts w:ascii="TH SarabunPSK" w:hAnsi="TH SarabunPSK" w:cs="TH SarabunPSK" w:hint="cs"/>
+          <w:sz w:val="32"/>
+          <w:szCs w:val="32"/>
+        </w:rPr>
+        <w:t xml:space="preserve">embeddings) </w:t>
+      </w:r>
+      <w:r>
+        <w:rPr>
+          <w:rFonts w:ascii="TH SarabunPSK" w:hAnsi="TH SarabunPSK" w:cs="TH SarabunPSK" w:hint="cs"/>
+          <w:sz w:val="32"/>
+          <w:szCs w:val="32"/>
+          <w:cs/>
+        </w:rPr>
+        <w:t>เพื่อค้นหาความคล้ายใกล้เคียง (</w:t>
+      </w:r>
+      <w:r>
+        <w:rPr>
+          <w:rStyle w:val="af4"/>
+          <w:rFonts w:ascii="TH SarabunPSK" w:hAnsi="TH SarabunPSK" w:cs="TH SarabunPSK" w:hint="cs"/>
+          <w:sz w:val="32"/>
+          <w:szCs w:val="32"/>
+        </w:rPr>
+        <w:t>nearest-neighbor similarity search</w:t>
+      </w:r>
+      <w:r>
+        <w:rPr>
+          <w:rFonts w:ascii="TH SarabunPSK" w:hAnsi="TH SarabunPSK" w:cs="TH SarabunPSK" w:hint="cs"/>
+          <w:sz w:val="32"/>
+          <w:szCs w:val="32"/>
+        </w:rPr>
+        <w:t xml:space="preserve">) </w:t>
+      </w:r>
+      <w:r>
+        <w:rPr>
+          <w:rFonts w:ascii="TH SarabunPSK" w:hAnsi="TH SarabunPSK" w:cs="TH SarabunPSK" w:hint="cs"/>
+          <w:sz w:val="32"/>
+          <w:szCs w:val="32"/>
+          <w:cs/>
+        </w:rPr>
+        <w:t xml:space="preserve">หน่วงต่ำ รองรับงาน </w:t>
+      </w:r>
+      <w:r>
+        <w:rPr>
+          <w:rFonts w:ascii="TH SarabunPSK" w:hAnsi="TH SarabunPSK" w:cs="TH SarabunPSK" w:hint="cs"/>
+          <w:sz w:val="32"/>
+          <w:szCs w:val="32"/>
+        </w:rPr>
+        <w:t xml:space="preserve">AI/RAG </w:t>
+      </w:r>
+      <w:r>
+        <w:rPr>
+          <w:rFonts w:ascii="TH SarabunPSK" w:hAnsi="TH SarabunPSK" w:cs="TH SarabunPSK" w:hint="cs"/>
+          <w:sz w:val="32"/>
+          <w:szCs w:val="32"/>
+          <w:cs/>
+        </w:rPr>
+        <w:t>และการค้นหาหลายสื่อ.</w:t>
+      </w:r>
+      <w:r>
+        <w:rPr>
+          <w:rFonts w:ascii="TH SarabunPSK" w:eastAsia="Times New Roman" w:hAnsi="TH SarabunPSK" w:cs="TH SarabunPSK"/>
+          <w:kern w:val="0"/>
+          <w:sz w:val="32"/>
+          <w:szCs w:val="32"/>
+          <w14:ligatures w14:val="none"/>
+        </w:rPr>
+        <w:t xml:space="preserve"> (</w:t>
+      </w:r>
+      <w:r>
+        <w:rPr>
+          <w:rFonts w:ascii="TH SarabunPSK" w:eastAsia="Times New Roman" w:hAnsi="TH SarabunPSK" w:cs="TH SarabunPSK"/>
+          <w:kern w:val="0"/>
+          <w:sz w:val="32"/>
+          <w:szCs w:val="32"/>
+          <w14:ligatures w14:val="none"/>
+        </w:rPr>
+        <w:t>amazon.com</w:t>
+      </w:r>
+      <w:r>
+        <w:rPr>
+          <w:rFonts w:ascii="TH SarabunPSK" w:eastAsia="Times New Roman" w:hAnsi="TH SarabunPSK" w:cs="TH SarabunPSK"/>
+          <w:kern w:val="0"/>
+          <w:sz w:val="32"/>
+          <w:szCs w:val="32"/>
+          <w14:ligatures w14:val="none"/>
+        </w:rPr>
+        <w:t>,2567)</w:t>
+      </w:r>
+    </w:p>
+    <w:p>
+      <w:pPr>
+        <w:spacing w:after="0"/>
+        <w:ind w:firstLine="567"/>
+        <w:jc w:val="both"/>
+        <w:rPr>
+          <w:rFonts w:ascii="TH SarabunPSK" w:eastAsia="Times New Roman" w:hAnsi="TH SarabunPSK" w:cs="TH SarabunPSK"/>
+          <w:kern w:val="0"/>
+          <w:sz w:val="32"/>
+          <w:szCs w:val="32"/>
+          <w14:ligatures w14:val="none"/>
+        </w:rPr>
+      </w:pPr>
+    </w:p>
+    <w:p>
+      <w:pPr>
+        <w:spacing w:after="0"/>
+        <w:rPr>
+          <w:rFonts w:ascii="TH SarabunPSK" w:eastAsia="Times New Roman" w:hAnsi="TH SarabunPSK" w:cs="TH SarabunPSK"/>
+          <w:b/>
+          <w:bCs/>
+          <w:color w:val="000000"/>
+          <w:kern w:val="0"/>
+          <w:sz w:val="32"/>
+          <w:szCs w:val="32"/>
+          <w14:ligatures w14:val="none"/>
+        </w:rPr>
+      </w:pPr>
+      <w:r>
+        <w:rPr>
+          <w:rFonts w:ascii="TH SarabunPSK" w:eastAsia="Times New Roman" w:hAnsi="TH SarabunPSK" w:cs="TH SarabunPSK" w:hint="cs"/>
+          <w:b/>
+          <w:bCs/>
+          <w:color w:val="000000"/>
+          <w:kern w:val="0"/>
+          <w:sz w:val="32"/>
+          <w:szCs w:val="32"/>
+          <w14:ligatures w14:val="none"/>
+        </w:rPr>
+        <w:t>1.</w:t>
+      </w:r>
+      <w:r>
+        <w:rPr>
+          <w:rFonts w:ascii="TH SarabunPSK" w:eastAsia="Times New Roman" w:hAnsi="TH SarabunPSK" w:cs="TH SarabunPSK"/>
+          <w:b/>
+          <w:bCs/>
+          <w:color w:val="000000"/>
+          <w:kern w:val="0"/>
+          <w:sz w:val="32"/>
+          <w:szCs w:val="32"/>
+          <w14:ligatures w14:val="none"/>
+        </w:rPr>
+        <w:t>6</w:t>
+      </w:r>
+      <w:r>
+        <w:rPr>
+          <w:rFonts w:ascii="TH SarabunPSK" w:eastAsia="Times New Roman" w:hAnsi="TH SarabunPSK" w:cs="TH SarabunPSK"/>
+          <w:b/>
+          <w:bCs/>
+          <w:color w:val="FFFFFF" w:themeColor="background1"/>
+          <w:kern w:val="0"/>
+          <w:sz w:val="32"/>
+          <w:szCs w:val="32"/>
+          <w14:ligatures w14:val="none"/>
+        </w:rPr>
+        <w:t>**</w:t>
+      </w:r>
+      <w:r>
+        <w:rPr>
+          <w:rFonts w:ascii="TH SarabunPSK" w:eastAsia="Times New Roman" w:hAnsi="TH SarabunPSK" w:cs="TH SarabunPSK" w:hint="cs"/>
+          <w:b/>
+          <w:bCs/>
+          <w:color w:val="000000"/>
+          <w:kern w:val="0"/>
+          <w:sz w:val="32"/>
+          <w:szCs w:val="32"/>
+          <w:cs/>
+          <w14:ligatures w14:val="none"/>
+        </w:rPr>
+        <w:t>ประโยชน์ที่คาดว่าจะได้รับ</w:t>
+      </w:r>
+    </w:p>
+    <w:p>
+      <w:pPr>
+        <w:spacing w:after="0"/>
+        <w:ind w:left="709"/>
+        <w:rPr>
+          <w:rFonts w:ascii="TH SarabunPSK" w:eastAsia="Times New Roman" w:hAnsi="TH SarabunPSK" w:cs="TH SarabunPSK"/>
+          <w:color w:val="000000"/>
+          <w:kern w:val="0"/>
+          <w:sz w:val="32"/>
+          <w:szCs w:val="32"/>
+          <w14:ligatures w14:val="none"/>
+        </w:rPr>
+      </w:pPr>
+      <w:r>
+        <w:rPr>
+          <w:rStyle w:val="af3"/>
+          <w:rFonts w:ascii="TH SarabunPSK" w:hAnsi="TH SarabunPSK" w:cs="TH SarabunPSK" w:hint="cs"/>
+          <w:b w:val="0"/>
+          <w:bCs w:val="0"/>
+          <w:sz w:val="32"/>
+          <w:szCs w:val="32"/>
+        </w:rPr>
+        <w:t>1.6.1</w:t>
+      </w:r>
+      <w:r>
+        <w:rPr>
+          <w:rFonts w:ascii="TH SarabunPSK" w:hAnsi="TH SarabunPSK" w:cs="TH SarabunPSK"/>
+          <w:color w:val="FFFFFF" w:themeColor="background1"/>
+          <w:sz w:val="32"/>
+          <w:szCs w:val="32"/>
+        </w:rPr>
+        <w:t>**</w:t>
+      </w:r>
+      <w:r>
+        <w:rPr>
+          <w:rFonts w:ascii="TH SarabunPSK" w:hAnsi="TH SarabunPSK" w:cs="TH SarabunPSK" w:hint="cs"/>
+          <w:sz w:val="32"/>
+          <w:szCs w:val="32"/>
+          <w:cs/>
+        </w:rPr>
+        <w:t>ลดงานซ้ำซ้อนและเวลาทำงานด้วยกระบวนการอัตโนมัติ</w:t>
+      </w:r>
+      <w:r>
+        <w:rPr>
+          <w:rFonts w:ascii="TH SarabunPSK" w:hAnsi="TH SarabunPSK" w:cs="TH SarabunPSK" w:hint="cs"/>
+          <w:sz w:val="32"/>
+          <w:szCs w:val="32"/>
+        </w:rPr>
+        <w:br/>
+      </w:r>
+      <w:r>
+        <w:rPr>
+          <w:rStyle w:val="af3"/>
+          <w:rFonts w:ascii="TH SarabunPSK" w:hAnsi="TH SarabunPSK" w:cs="TH SarabunPSK" w:hint="cs"/>
+          <w:b w:val="0"/>
+          <w:bCs w:val="0"/>
+          <w:sz w:val="32"/>
+          <w:szCs w:val="32"/>
+        </w:rPr>
+        <w:t>1.6.2</w:t>
+      </w:r>
+      <w:r>
+        <w:rPr>
+          <w:rFonts w:ascii="TH SarabunPSK" w:hAnsi="TH SarabunPSK" w:cs="TH SarabunPSK"/>
+          <w:color w:val="FFFFFF" w:themeColor="background1"/>
+          <w:sz w:val="32"/>
+          <w:szCs w:val="32"/>
+        </w:rPr>
+        <w:t>**</w:t>
+      </w:r>
+      <w:r>
+        <w:rPr>
+          <w:rFonts w:ascii="TH SarabunPSK" w:hAnsi="TH SarabunPSK" w:cs="TH SarabunPSK" w:hint="cs"/>
+          <w:sz w:val="32"/>
+          <w:szCs w:val="32"/>
+          <w:cs/>
+        </w:rPr>
+        <w:t>เพิ่มความถูกต้องและความโปร่งใสของข้อมูล พร้อมกำหนดสิทธิ์การเข้าถึง</w:t>
+      </w:r>
+      <w:r>
+        <w:rPr>
+          <w:rFonts w:ascii="TH SarabunPSK" w:hAnsi="TH SarabunPSK" w:cs="TH SarabunPSK" w:hint="cs"/>
+          <w:sz w:val="32"/>
+          <w:szCs w:val="32"/>
+        </w:rPr>
+        <w:br/>
+      </w:r>
+      <w:r>
+        <w:rPr>
+          <w:rStyle w:val="af3"/>
+          <w:rFonts w:ascii="TH SarabunPSK" w:hAnsi="TH SarabunPSK" w:cs="TH SarabunPSK" w:hint="cs"/>
+          <w:b w:val="0"/>
+          <w:bCs w:val="0"/>
+          <w:sz w:val="32"/>
+          <w:szCs w:val="32"/>
+        </w:rPr>
+        <w:t>1.6.3</w:t>
+      </w:r>
+      <w:r>
+        <w:rPr>
+          <w:rStyle w:val="af3"/>
+          <w:rFonts w:ascii="TH SarabunPSK" w:hAnsi="TH SarabunPSK" w:cs="TH SarabunPSK"/>
+          <w:b w:val="0"/>
+          <w:bCs w:val="0"/>
+          <w:color w:val="FFFFFF" w:themeColor="background1"/>
+          <w:sz w:val="32"/>
+          <w:szCs w:val="32"/>
+        </w:rPr>
+        <w:t>**</w:t>
+      </w:r>
+      <w:r>
+        <w:rPr>
+          <w:rFonts w:ascii="TH SarabunPSK" w:hAnsi="TH SarabunPSK" w:cs="TH SarabunPSK" w:hint="cs"/>
+          <w:sz w:val="32"/>
+          <w:szCs w:val="32"/>
+          <w:cs/>
+        </w:rPr>
+        <w:t>สื่อสารได้ตรงกลุ่มและจัดการได้จากช่องทางเดียว รองรับการขยายระบบ</w:t>
+      </w:r>
+      <w:r>
+        <w:rPr>
+          <w:rFonts w:ascii="TH SarabunPSK" w:hAnsi="TH SarabunPSK" w:cs="TH SarabunPSK" w:hint="cs"/>
+          <w:sz w:val="32"/>
+          <w:szCs w:val="32"/>
+        </w:rPr>
+        <w:br/>
+      </w:r>
+      <w:r>
+        <w:rPr>
+          <w:rStyle w:val="af3"/>
+          <w:rFonts w:ascii="TH SarabunPSK" w:hAnsi="TH SarabunPSK" w:cs="TH SarabunPSK" w:hint="cs"/>
+          <w:b w:val="0"/>
+          <w:bCs w:val="0"/>
+          <w:sz w:val="32"/>
+          <w:szCs w:val="32"/>
+        </w:rPr>
+        <w:t>1.6.4</w:t>
+      </w:r>
+      <w:r>
+        <w:rPr>
+          <w:rFonts w:ascii="TH SarabunPSK" w:hAnsi="TH SarabunPSK" w:cs="TH SarabunPSK"/>
+          <w:color w:val="FFFFFF" w:themeColor="background1"/>
+          <w:sz w:val="32"/>
+          <w:szCs w:val="32"/>
+        </w:rPr>
+        <w:t>**</w:t>
+      </w:r>
+      <w:r>
+        <w:rPr>
+          <w:rFonts w:ascii="TH SarabunPSK" w:hAnsi="TH SarabunPSK" w:cs="TH SarabunPSK" w:hint="cs"/>
+          <w:sz w:val="32"/>
+          <w:szCs w:val="32"/>
+          <w:cs/>
+        </w:rPr>
+        <w:t xml:space="preserve">ได้เรียนรู้การใช้งานและออกแบบ </w:t>
+      </w:r>
+      <w:r>
+        <w:rPr>
+          <w:rFonts w:ascii="TH SarabunPSK" w:hAnsi="TH SarabunPSK" w:cs="TH SarabunPSK" w:hint="cs"/>
+          <w:sz w:val="32"/>
+          <w:szCs w:val="32"/>
+        </w:rPr>
+        <w:t xml:space="preserve">AI Agent </w:t>
+      </w:r>
+      <w:r>
+        <w:rPr>
+          <w:rFonts w:ascii="TH SarabunPSK" w:hAnsi="TH SarabunPSK" w:cs="TH SarabunPSK" w:hint="cs"/>
+          <w:sz w:val="32"/>
+          <w:szCs w:val="32"/>
+          <w:cs/>
+        </w:rPr>
+        <w:t>ในงานองค์กร</w:t>
+      </w:r>
     </w:p>
     <w:sectPr>
       <w:headerReference w:type="even" r:id="rId6"/>
@@ -3580,6 +5145,28 @@
     <w:basedOn w:val="a0"/>
     <w:rsid w:val="00313926"/>
   </w:style>
+  <w:style w:type="character" w:styleId="af3">
+    <w:name w:val="Strong"/>
+    <w:basedOn w:val="a0"/>
+    <w:uiPriority w:val="22"/>
+    <w:qFormat/>
+    <w:rsid w:val="006E588F"/>
+    <w:rPr>
+      <w:b/>
+      <w:bCs/>
+    </w:rPr>
+  </w:style>
+  <w:style w:type="character" w:styleId="af4">
+    <w:name w:val="Emphasis"/>
+    <w:basedOn w:val="a0"/>
+    <w:uiPriority w:val="20"/>
+    <w:qFormat/>
+    <w:rsid w:val="006E588F"/>
+    <w:rPr>
+      <w:i/>
+      <w:iCs/>
+    </w:rPr>
+  </w:style>
 </w:styles>
 </file>
 

</xml_diff>

<commit_message>
chnge font size title and change format top paper
</commit_message>
<xml_diff>
--- a/บทที่ 1.docx
+++ b/บทที่ 1.docx
@@ -1,16 +1,17 @@
 
 <file path=word/document.xml><?xml version="1.0" encoding="utf-8"?>
-<w:document xmlns:wpc="http://schemas.microsoft.com/office/word/2010/wordprocessingCanvas" xmlns:cx="http://schemas.microsoft.com/office/drawing/2014/chartex" xmlns:cx1="http://schemas.microsoft.com/office/drawing/2015/9/8/chartex" xmlns:cx2="http://schemas.microsoft.com/office/drawing/2015/10/21/chartex" xmlns:cx3="http://schemas.microsoft.com/office/drawing/2016/5/9/chartex" xmlns:cx4="http://schemas.microsoft.com/office/drawing/2016/5/10/chartex" xmlns:cx5="http://schemas.microsoft.com/office/drawing/2016/5/11/chartex" xmlns:cx6="http://schemas.microsoft.com/office/drawing/2016/5/12/chartex" xmlns:cx7="http://schemas.microsoft.com/office/drawing/2016/5/13/chartex" xmlns:cx8="http://schemas.microsoft.com/office/drawing/2016/5/14/chartex" xmlns:mc="http://schemas.openxmlformats.org/markup-compatibility/2006" xmlns:aink="http://schemas.microsoft.com/office/drawing/2016/ink" xmlns:am3d="http://schemas.microsoft.com/office/drawing/2017/model3d" xmlns:o="urn:schemas-microsoft-com:office:office" xmlns:oel="http://schemas.microsoft.com/office/2019/extlst" xmlns:r="http://schemas.openxmlformats.org/officeDocument/2006/relationships" xmlns:m="http://schemas.openxmlformats.org/officeDocument/2006/math" xmlns:v="urn:schemas-microsoft-com:vml" xmlns:wp14="http://schemas.microsoft.com/office/word/2010/wordprocessingDrawing" xmlns:wp="http://schemas.openxmlformats.org/drawingml/2006/wordprocessingDrawing" xmlns:w10="urn:schemas-microsoft-com:office:word" xmlns:w="http://schemas.openxmlformats.org/wordprocessingml/2006/main" xmlns:w14="http://schemas.microsoft.com/office/word/2010/wordml" xmlns:w15="http://schemas.microsoft.com/office/word/2012/wordml" xmlns:w16cex="http://schemas.microsoft.com/office/word/2018/wordml/cex" xmlns:w16cid="http://schemas.microsoft.com/office/word/2016/wordml/cid" xmlns:w16="http://schemas.microsoft.com/office/word/2018/wordml" xmlns:w16du="http://schemas.microsoft.com/office/word/2023/wordml/word16du" xmlns:w16sdtdh="http://schemas.microsoft.com/office/word/2020/wordml/sdtdatahash" xmlns:w16sdtfl="http://schemas.microsoft.com/office/word/2024/wordml/sdtformatlock" xmlns:w16se="http://schemas.microsoft.com/office/word/2015/wordml/symex" xmlns:wpg="http://schemas.microsoft.com/office/word/2010/wordprocessingGroup" xmlns:wpi="http://schemas.microsoft.com/office/word/2010/wordprocessingInk" xmlns:wne="http://schemas.microsoft.com/office/word/2006/wordml" xmlns:wps="http://schemas.microsoft.com/office/word/2010/wordprocessingShape" mc:Ignorable="w14 w15 w16se w16cid w16 w16cex w16sdtdh w16sdtfl w16du wp14">
+<w:document xmlns:wpc="http://schemas.microsoft.com/office/word/2010/wordprocessingCanvas" xmlns:cx="http://schemas.microsoft.com/office/drawing/2014/chartex" xmlns:cx1="http://schemas.microsoft.com/office/drawing/2015/9/8/chartex" xmlns:cx2="http://schemas.microsoft.com/office/drawing/2015/10/21/chartex" xmlns:cx3="http://schemas.microsoft.com/office/drawing/2016/5/9/chartex" xmlns:cx4="http://schemas.microsoft.com/office/drawing/2016/5/10/chartex" xmlns:cx5="http://schemas.microsoft.com/office/drawing/2016/5/11/chartex" xmlns:cx6="http://schemas.microsoft.com/office/drawing/2016/5/12/chartex" xmlns:cx7="http://schemas.microsoft.com/office/drawing/2016/5/13/chartex" xmlns:cx8="http://schemas.microsoft.com/office/drawing/2016/5/14/chartex" xmlns:mc="http://schemas.openxmlformats.org/markup-compatibility/2006" xmlns:aink="http://schemas.microsoft.com/office/drawing/2016/ink" xmlns:am3d="http://schemas.microsoft.com/office/drawing/2017/model3d" xmlns:o="urn:schemas-microsoft-com:office:office" xmlns:r="http://schemas.openxmlformats.org/officeDocument/2006/relationships" xmlns:m="http://schemas.openxmlformats.org/officeDocument/2006/math" xmlns:v="urn:schemas-microsoft-com:vml" xmlns:wp14="http://schemas.microsoft.com/office/word/2010/wordprocessingDrawing" xmlns:wp="http://schemas.openxmlformats.org/drawingml/2006/wordprocessingDrawing" xmlns:w10="urn:schemas-microsoft-com:office:word" xmlns:w="http://schemas.openxmlformats.org/wordprocessingml/2006/main" xmlns:w14="http://schemas.microsoft.com/office/word/2010/wordml" xmlns:w15="http://schemas.microsoft.com/office/word/2012/wordml" xmlns:w16cex="http://schemas.microsoft.com/office/word/2018/wordml/cex" xmlns:w16cid="http://schemas.microsoft.com/office/word/2016/wordml/cid" xmlns:w16="http://schemas.microsoft.com/office/word/2018/wordml" xmlns:w16sdtdh="http://schemas.microsoft.com/office/word/2020/wordml/sdtdatahash" xmlns:w16se="http://schemas.microsoft.com/office/word/2015/wordml/symex" xmlns:wpg="http://schemas.microsoft.com/office/word/2010/wordprocessingGroup" xmlns:wpi="http://schemas.microsoft.com/office/word/2010/wordprocessingInk" xmlns:wne="http://schemas.microsoft.com/office/word/2006/wordml" xmlns:wps="http://schemas.microsoft.com/office/word/2010/wordprocessingShape" mc:Ignorable="w14 w15 w16se w16cid w16 w16cex w16sdtdh wp14">
   <w:body>
     <w:p>
       <w:pPr>
+        <w:spacing w:after="0"/>
         <w:jc w:val="center"/>
         <w:rPr>
           <w:rFonts w:ascii="TH SarabunPSK" w:hAnsi="TH SarabunPSK" w:cs="TH SarabunPSK"/>
           <w:b/>
           <w:bCs/>
-          <w:sz w:val="32"/>
-          <w:szCs w:val="32"/>
+          <w:sz w:val="40"/>
+          <w:szCs w:val="40"/>
         </w:rPr>
       </w:pPr>
       <w:r>
@@ -18,8 +19,8 @@
           <w:rFonts w:ascii="TH SarabunPSK" w:hAnsi="TH SarabunPSK" w:cs="TH SarabunPSK" w:hint="cs"/>
           <w:b/>
           <w:bCs/>
-          <w:sz w:val="32"/>
-          <w:szCs w:val="32"/>
+          <w:sz w:val="40"/>
+          <w:szCs w:val="40"/>
           <w:cs/>
         </w:rPr>
         <w:t>บทที่ 1</w:t>
@@ -27,13 +28,14 @@
     </w:p>
     <w:p>
       <w:pPr>
+        <w:spacing w:after="0"/>
         <w:jc w:val="center"/>
         <w:rPr>
           <w:rFonts w:ascii="TH SarabunPSK" w:hAnsi="TH SarabunPSK" w:cs="TH SarabunPSK"/>
           <w:b/>
           <w:bCs/>
-          <w:sz w:val="32"/>
-          <w:szCs w:val="32"/>
+          <w:sz w:val="40"/>
+          <w:szCs w:val="40"/>
         </w:rPr>
       </w:pPr>
       <w:r>
@@ -41,8 +43,8 @@
           <w:rFonts w:ascii="TH SarabunPSK" w:hAnsi="TH SarabunPSK" w:cs="TH SarabunPSK" w:hint="cs"/>
           <w:b/>
           <w:bCs/>
-          <w:sz w:val="32"/>
-          <w:szCs w:val="32"/>
+          <w:sz w:val="40"/>
+          <w:szCs w:val="40"/>
           <w:cs/>
         </w:rPr>
         <w:t>บทนํา</w:t>
@@ -50,6 +52,20 @@
     </w:p>
     <w:p>
       <w:pPr>
+        <w:spacing w:after="0"/>
+        <w:jc w:val="center"/>
+        <w:rPr>
+          <w:rFonts w:ascii="TH SarabunPSK" w:hAnsi="TH SarabunPSK" w:cs="TH SarabunPSK"/>
+          <w:b/>
+          <w:bCs/>
+          <w:sz w:val="32"/>
+          <w:szCs w:val="32"/>
+        </w:rPr>
+      </w:pPr>
+    </w:p>
+    <w:p>
+      <w:pPr>
+        <w:spacing w:after="0"/>
         <w:rPr>
           <w:rFonts w:ascii="TH SarabunPSK" w:hAnsi="TH SarabunPSK" w:cs="TH SarabunPSK"/>
           <w:b/>
@@ -112,772 +128,17 @@
           <w:cs/>
         </w:rPr>
         <w:t>คัญของปัญหา</w:t>
-      </w:r>
-    </w:p>
-    <w:p>
-      <w:pPr>
-        <w:ind w:firstLine="709"/>
-        <w:jc w:val="both"/>
-        <w:rPr>
-          <w:rFonts w:ascii="TH SarabunPSK" w:hAnsi="TH SarabunPSK" w:cs="TH SarabunPSK"/>
-          <w:sz w:val="32"/>
-          <w:szCs w:val="32"/>
-        </w:rPr>
-      </w:pPr>
-      <w:r>
-        <w:rPr>
-          <w:rFonts w:ascii="TH SarabunPSK" w:hAnsi="TH SarabunPSK" w:cs="TH SarabunPSK"/>
-          <w:sz w:val="32"/>
-          <w:szCs w:val="32"/>
-          <w:cs/>
-        </w:rPr>
-        <w:t>ปัจจุบันงานธุรการและการสื่อสารภายในองค์กรจำนวนมากยังดำเนินไปบนเครื่องมือที่กระจัดกระจาย เช่น การส่งข้อความบอกต่อกัน การจดนัดหมายในหลายปฏิทิน การติดตามยอดขายด้วยไฟล์สเปรดชีตหลาย</w:t>
-      </w:r>
-      <w:proofErr w:type="spellStart"/>
-      <w:r>
-        <w:rPr>
-          <w:rFonts w:ascii="TH SarabunPSK" w:hAnsi="TH SarabunPSK" w:cs="TH SarabunPSK"/>
-          <w:sz w:val="32"/>
-          <w:szCs w:val="32"/>
-          <w:cs/>
-        </w:rPr>
-        <w:t>เวอร์ชัน</w:t>
-      </w:r>
-      <w:proofErr w:type="spellEnd"/>
-      <w:r>
-        <w:rPr>
-          <w:rFonts w:ascii="TH SarabunPSK" w:hAnsi="TH SarabunPSK" w:cs="TH SarabunPSK" w:hint="cs"/>
-          <w:sz w:val="32"/>
-          <w:szCs w:val="32"/>
-          <w:cs/>
-        </w:rPr>
-        <w:t xml:space="preserve"> </w:t>
-      </w:r>
-      <w:r>
-        <w:rPr>
-          <w:rFonts w:ascii="TH SarabunPSK" w:hAnsi="TH SarabunPSK" w:cs="TH SarabunPSK"/>
-          <w:sz w:val="32"/>
-          <w:szCs w:val="32"/>
-          <w:cs/>
-        </w:rPr>
-        <w:t>และการเก็บเอกสารลงโฟลเดอร์ที่ไม่ได้จัดระเบียบร่วมกัน ปัญหาที่ตามมาคือการนัดประชุมคลาดเคลื่อน ลืมแจ้งเตือนเหตุการณ์สำคัญ ข้อมูลซ้ำซ้อนหรือผิดพลาด การสื่อสารไม่ตรงกลุ่มเป้าหมาย และภาระงานจุกจิกที่ใช้เวลาคนจำนวนมาก โดยเฉพาะอย่างยิ่งงานประจำอย่างแจ้งเตือนประชุม แจ้งเกิดพนักงาน แจ้งยอดขายรายบุคคล ติดตามขาด</w:t>
-      </w:r>
-      <w:r>
-        <w:rPr>
-          <w:rFonts w:ascii="TH SarabunPSK" w:hAnsi="TH SarabunPSK" w:cs="TH SarabunPSK"/>
-          <w:sz w:val="32"/>
-          <w:szCs w:val="32"/>
-        </w:rPr>
-        <w:t>–</w:t>
-      </w:r>
-      <w:r>
-        <w:rPr>
-          <w:rFonts w:ascii="TH SarabunPSK" w:hAnsi="TH SarabunPSK" w:cs="TH SarabunPSK"/>
-          <w:sz w:val="32"/>
-          <w:szCs w:val="32"/>
-          <w:cs/>
-        </w:rPr>
-        <w:t>ลา</w:t>
-      </w:r>
-      <w:r>
-        <w:rPr>
-          <w:rFonts w:ascii="TH SarabunPSK" w:hAnsi="TH SarabunPSK" w:cs="TH SarabunPSK"/>
-          <w:sz w:val="32"/>
-          <w:szCs w:val="32"/>
-        </w:rPr>
-        <w:t>–</w:t>
-      </w:r>
-      <w:r>
-        <w:rPr>
-          <w:rFonts w:ascii="TH SarabunPSK" w:hAnsi="TH SarabunPSK" w:cs="TH SarabunPSK"/>
-          <w:sz w:val="32"/>
-          <w:szCs w:val="32"/>
-          <w:cs/>
-        </w:rPr>
-        <w:t>มาสาย หรือการคัดแยก</w:t>
-      </w:r>
-      <w:proofErr w:type="spellStart"/>
-      <w:r>
-        <w:rPr>
-          <w:rFonts w:ascii="TH SarabunPSK" w:hAnsi="TH SarabunPSK" w:cs="TH SarabunPSK"/>
-          <w:sz w:val="32"/>
-          <w:szCs w:val="32"/>
-          <w:cs/>
-        </w:rPr>
-        <w:t>สล</w:t>
-      </w:r>
-      <w:proofErr w:type="spellEnd"/>
-      <w:r>
-        <w:rPr>
-          <w:rFonts w:ascii="TH SarabunPSK" w:hAnsi="TH SarabunPSK" w:cs="TH SarabunPSK"/>
-          <w:sz w:val="32"/>
-          <w:szCs w:val="32"/>
-          <w:cs/>
-        </w:rPr>
-        <w:t xml:space="preserve">ิปโอนเงินเพื่อเก็บลง </w:t>
-      </w:r>
-      <w:r>
-        <w:rPr>
-          <w:rFonts w:ascii="TH SarabunPSK" w:hAnsi="TH SarabunPSK" w:cs="TH SarabunPSK"/>
-          <w:sz w:val="32"/>
-          <w:szCs w:val="32"/>
-        </w:rPr>
-        <w:t xml:space="preserve">Google Drive </w:t>
-      </w:r>
-      <w:r>
-        <w:rPr>
-          <w:rFonts w:ascii="TH SarabunPSK" w:hAnsi="TH SarabunPSK" w:cs="TH SarabunPSK"/>
-          <w:sz w:val="32"/>
-          <w:szCs w:val="32"/>
-          <w:cs/>
-        </w:rPr>
-        <w:t>ซึ่งล้วนต้องการความถูกต้องและความต่อเนื่อง หากยังทำด้วยมือย่อมเสี่ยงต่อความผิดพลาดและต้นทุนเวลาที่สูง</w:t>
-      </w:r>
-    </w:p>
-    <w:p>
-      <w:pPr>
-        <w:ind w:firstLine="709"/>
-        <w:jc w:val="both"/>
-        <w:rPr>
-          <w:rFonts w:ascii="TH SarabunPSK" w:hAnsi="TH SarabunPSK" w:cs="TH SarabunPSK"/>
-          <w:sz w:val="32"/>
-          <w:szCs w:val="32"/>
-        </w:rPr>
-      </w:pPr>
-      <w:r>
-        <w:rPr>
-          <w:rFonts w:ascii="TH SarabunPSK" w:hAnsi="TH SarabunPSK" w:cs="TH SarabunPSK"/>
-          <w:sz w:val="32"/>
-          <w:szCs w:val="32"/>
-          <w:cs/>
-        </w:rPr>
-        <w:t xml:space="preserve">จากดังกล่าวจึงเกิดแนวคิดพัฒนา </w:t>
-      </w:r>
-      <w:r>
-        <w:rPr>
-          <w:rFonts w:ascii="TH SarabunPSK" w:hAnsi="TH SarabunPSK" w:cs="TH SarabunPSK"/>
-          <w:sz w:val="32"/>
-          <w:szCs w:val="32"/>
-        </w:rPr>
-        <w:t>“</w:t>
-      </w:r>
-      <w:r>
-        <w:rPr>
-          <w:rFonts w:ascii="TH SarabunPSK" w:hAnsi="TH SarabunPSK" w:cs="TH SarabunPSK"/>
-          <w:sz w:val="32"/>
-          <w:szCs w:val="32"/>
-          <w:cs/>
-        </w:rPr>
-        <w:t>ผู้ช่วยอัตโนมัติของบริษัท</w:t>
-      </w:r>
-      <w:r>
-        <w:rPr>
-          <w:rFonts w:ascii="TH SarabunPSK" w:hAnsi="TH SarabunPSK" w:cs="TH SarabunPSK"/>
-          <w:sz w:val="32"/>
-          <w:szCs w:val="32"/>
-        </w:rPr>
-        <w:t xml:space="preserve">” </w:t>
-      </w:r>
-      <w:r>
-        <w:rPr>
-          <w:rFonts w:ascii="TH SarabunPSK" w:hAnsi="TH SarabunPSK" w:cs="TH SarabunPSK"/>
-          <w:sz w:val="32"/>
-          <w:szCs w:val="32"/>
-          <w:cs/>
-        </w:rPr>
-        <w:t xml:space="preserve">ที่ทำหน้าที่เสมือนเลขาในออฟฟิศ โดยใช้แพลตฟอร์ม </w:t>
-      </w:r>
-      <w:r>
-        <w:rPr>
-          <w:rFonts w:ascii="TH SarabunPSK" w:hAnsi="TH SarabunPSK" w:cs="TH SarabunPSK"/>
-          <w:sz w:val="32"/>
-          <w:szCs w:val="32"/>
-        </w:rPr>
-        <w:t>n</w:t>
-      </w:r>
-      <w:r>
-        <w:rPr>
-          <w:rFonts w:ascii="TH SarabunPSK" w:hAnsi="TH SarabunPSK" w:cs="TH SarabunPSK"/>
-          <w:sz w:val="32"/>
-          <w:szCs w:val="32"/>
-          <w:cs/>
-        </w:rPr>
-        <w:t>8</w:t>
-      </w:r>
-      <w:r>
-        <w:rPr>
-          <w:rFonts w:ascii="TH SarabunPSK" w:hAnsi="TH SarabunPSK" w:cs="TH SarabunPSK"/>
-          <w:sz w:val="32"/>
-          <w:szCs w:val="32"/>
-        </w:rPr>
-        <w:t xml:space="preserve">n </w:t>
-      </w:r>
-      <w:r>
-        <w:rPr>
-          <w:rFonts w:ascii="TH SarabunPSK" w:hAnsi="TH SarabunPSK" w:cs="TH SarabunPSK"/>
-          <w:sz w:val="32"/>
-          <w:szCs w:val="32"/>
-          <w:cs/>
-        </w:rPr>
-        <w:t>เป็นต้นทางของ</w:t>
-      </w:r>
-      <w:proofErr w:type="spellStart"/>
-      <w:r>
-        <w:rPr>
-          <w:rFonts w:ascii="TH SarabunPSK" w:hAnsi="TH SarabunPSK" w:cs="TH SarabunPSK"/>
-          <w:sz w:val="32"/>
-          <w:szCs w:val="32"/>
-          <w:cs/>
-        </w:rPr>
-        <w:t>เวิร์กโฟลว์</w:t>
-      </w:r>
-      <w:proofErr w:type="spellEnd"/>
-      <w:r>
-        <w:rPr>
-          <w:rFonts w:ascii="TH SarabunPSK" w:hAnsi="TH SarabunPSK" w:cs="TH SarabunPSK"/>
-          <w:sz w:val="32"/>
-          <w:szCs w:val="32"/>
-          <w:cs/>
-        </w:rPr>
-        <w:t xml:space="preserve">อัตโนมัติ เชื่อมต่อ </w:t>
-      </w:r>
-      <w:r>
-        <w:rPr>
-          <w:rFonts w:ascii="TH SarabunPSK" w:hAnsi="TH SarabunPSK" w:cs="TH SarabunPSK"/>
-          <w:sz w:val="32"/>
-          <w:szCs w:val="32"/>
-        </w:rPr>
-        <w:t xml:space="preserve">LINE Official Account/LIFF, </w:t>
-      </w:r>
-      <w:r>
-        <w:rPr>
-          <w:rFonts w:ascii="TH SarabunPSK" w:hAnsi="TH SarabunPSK" w:cs="TH SarabunPSK"/>
-          <w:sz w:val="32"/>
-          <w:szCs w:val="32"/>
-          <w:cs/>
-        </w:rPr>
-        <w:t>อีเมล</w:t>
-      </w:r>
-      <w:r>
-        <w:rPr>
-          <w:rFonts w:ascii="TH SarabunPSK" w:hAnsi="TH SarabunPSK" w:cs="TH SarabunPSK"/>
-          <w:sz w:val="32"/>
-          <w:szCs w:val="32"/>
-        </w:rPr>
-        <w:t>, Google</w:t>
-      </w:r>
-      <w:r>
-        <w:rPr>
-          <w:rFonts w:ascii="TH SarabunPSK" w:hAnsi="TH SarabunPSK" w:cs="TH SarabunPSK"/>
-          <w:sz w:val="32"/>
-          <w:szCs w:val="32"/>
-        </w:rPr>
-        <w:t xml:space="preserve"> </w:t>
-      </w:r>
-      <w:r>
-        <w:rPr>
-          <w:rFonts w:ascii="TH SarabunPSK" w:hAnsi="TH SarabunPSK" w:cs="TH SarabunPSK"/>
-          <w:sz w:val="32"/>
-          <w:szCs w:val="32"/>
-        </w:rPr>
-        <w:t xml:space="preserve">Sheets/Drive </w:t>
-      </w:r>
-      <w:r>
-        <w:rPr>
-          <w:rFonts w:ascii="TH SarabunPSK" w:hAnsi="TH SarabunPSK" w:cs="TH SarabunPSK"/>
-          <w:sz w:val="32"/>
-          <w:szCs w:val="32"/>
-          <w:cs/>
-        </w:rPr>
-        <w:t>และฐานข้อมูลได้อย่างยืดหยุ่น ระบบตั้งใจแก้ปัญหาเชิงปฏิบัติที่เกิดขึ้นจริง ได้แก่ แจ้งเตือนวันเกิดพนักงาน สร้าง/เพิ่ม/ลบห้องประชุมและส่งการแจ้งเตือนก่อนเริ่มประชุมอัตโนมัติที่ 15</w:t>
-      </w:r>
-      <w:r>
-        <w:rPr>
-          <w:rFonts w:ascii="TH SarabunPSK" w:hAnsi="TH SarabunPSK" w:cs="TH SarabunPSK"/>
-          <w:sz w:val="32"/>
-          <w:szCs w:val="32"/>
-        </w:rPr>
-        <w:t xml:space="preserve">, </w:t>
-      </w:r>
-      <w:r>
-        <w:rPr>
-          <w:rFonts w:ascii="TH SarabunPSK" w:hAnsi="TH SarabunPSK" w:cs="TH SarabunPSK"/>
-          <w:sz w:val="32"/>
-          <w:szCs w:val="32"/>
-          <w:cs/>
-        </w:rPr>
-        <w:t xml:space="preserve">10 และ 5 นาที รวม 3 ครั้ง แจ้งยอดขายรายบุคคลจาก </w:t>
-      </w:r>
-      <w:r>
-        <w:rPr>
-          <w:rFonts w:ascii="TH SarabunPSK" w:hAnsi="TH SarabunPSK" w:cs="TH SarabunPSK"/>
-          <w:sz w:val="32"/>
-          <w:szCs w:val="32"/>
-        </w:rPr>
-        <w:t xml:space="preserve">Google Sheets </w:t>
-      </w:r>
-      <w:r>
-        <w:rPr>
-          <w:rFonts w:ascii="TH SarabunPSK" w:hAnsi="TH SarabunPSK" w:cs="TH SarabunPSK"/>
-          <w:sz w:val="32"/>
-          <w:szCs w:val="32"/>
-          <w:cs/>
-        </w:rPr>
-        <w:t xml:space="preserve">แบบทันเหตุการณ์ ส่งอีเมลรายบุคคลเมื่อต้องสื่อสารเฉพาะเรื่อง ยืนยันตัวตนผู้ใช้ผ่าน </w:t>
-      </w:r>
-      <w:r>
-        <w:rPr>
-          <w:rFonts w:ascii="TH SarabunPSK" w:hAnsi="TH SarabunPSK" w:cs="TH SarabunPSK"/>
-          <w:sz w:val="32"/>
-          <w:szCs w:val="32"/>
-        </w:rPr>
-        <w:t xml:space="preserve">LINE OA/LIFF </w:t>
-      </w:r>
-      <w:r>
-        <w:rPr>
-          <w:rFonts w:ascii="TH SarabunPSK" w:hAnsi="TH SarabunPSK" w:cs="TH SarabunPSK"/>
-          <w:sz w:val="32"/>
-          <w:szCs w:val="32"/>
-          <w:cs/>
-        </w:rPr>
-        <w:t xml:space="preserve">และอีเมล (รองรับ </w:t>
-      </w:r>
-      <w:r>
-        <w:rPr>
-          <w:rFonts w:ascii="TH SarabunPSK" w:hAnsi="TH SarabunPSK" w:cs="TH SarabunPSK"/>
-          <w:sz w:val="32"/>
-          <w:szCs w:val="32"/>
-        </w:rPr>
-        <w:t xml:space="preserve">OTP </w:t>
-      </w:r>
-      <w:r>
-        <w:rPr>
-          <w:rFonts w:ascii="TH SarabunPSK" w:hAnsi="TH SarabunPSK" w:cs="TH SarabunPSK"/>
-          <w:sz w:val="32"/>
-          <w:szCs w:val="32"/>
-          <w:cs/>
-        </w:rPr>
-        <w:t xml:space="preserve">จากผู้ให้บริการภายนอกเมื่อจำเป็น) กำหนดสิทธิ์การเข้าถึงตามบทบาทงาน แจ้งข่าวสารแบบคัดกลุ่มตามบุคคล/แผนก/ตำแหน่ง ใช้ </w:t>
-      </w:r>
-      <w:r>
-        <w:rPr>
-          <w:rFonts w:ascii="TH SarabunPSK" w:hAnsi="TH SarabunPSK" w:cs="TH SarabunPSK"/>
-          <w:sz w:val="32"/>
-          <w:szCs w:val="32"/>
-        </w:rPr>
-        <w:t xml:space="preserve">LINE Flex Message </w:t>
-      </w:r>
-      <w:r>
-        <w:rPr>
-          <w:rFonts w:ascii="TH SarabunPSK" w:hAnsi="TH SarabunPSK" w:cs="TH SarabunPSK"/>
-          <w:sz w:val="32"/>
-          <w:szCs w:val="32"/>
-          <w:cs/>
-        </w:rPr>
-        <w:t>เพื่อให้ข้อมูลอ่านง่ายบนมือถือ</w:t>
-      </w:r>
-      <w:r>
-        <w:rPr>
-          <w:rFonts w:ascii="TH SarabunPSK" w:hAnsi="TH SarabunPSK" w:cs="TH SarabunPSK" w:hint="cs"/>
-          <w:sz w:val="32"/>
-          <w:szCs w:val="32"/>
-          <w:cs/>
-        </w:rPr>
-        <w:t xml:space="preserve"> และ</w:t>
-      </w:r>
-      <w:r>
-        <w:rPr>
-          <w:rFonts w:ascii="TH SarabunPSK" w:hAnsi="TH SarabunPSK" w:cs="TH SarabunPSK"/>
-          <w:sz w:val="32"/>
-          <w:szCs w:val="32"/>
-          <w:cs/>
-        </w:rPr>
-        <w:t xml:space="preserve">ต่อยอดเชื่อมฐานข้อมูลสำหรับ </w:t>
-      </w:r>
-      <w:r>
-        <w:rPr>
-          <w:rFonts w:ascii="TH SarabunPSK" w:hAnsi="TH SarabunPSK" w:cs="TH SarabunPSK"/>
-          <w:sz w:val="32"/>
-          <w:szCs w:val="32"/>
-        </w:rPr>
-        <w:t xml:space="preserve">RAG AI </w:t>
-      </w:r>
-      <w:r>
-        <w:rPr>
-          <w:rFonts w:ascii="TH SarabunPSK" w:hAnsi="TH SarabunPSK" w:cs="TH SarabunPSK"/>
-          <w:sz w:val="32"/>
-          <w:szCs w:val="32"/>
-          <w:cs/>
-        </w:rPr>
-        <w:t>เพื่อให้พนักงานถาม</w:t>
-      </w:r>
-      <w:r>
-        <w:rPr>
-          <w:rFonts w:ascii="TH SarabunPSK" w:hAnsi="TH SarabunPSK" w:cs="TH SarabunPSK"/>
-          <w:sz w:val="32"/>
-          <w:szCs w:val="32"/>
-        </w:rPr>
-        <w:t>–</w:t>
-      </w:r>
-      <w:r>
-        <w:rPr>
-          <w:rFonts w:ascii="TH SarabunPSK" w:hAnsi="TH SarabunPSK" w:cs="TH SarabunPSK"/>
-          <w:sz w:val="32"/>
-          <w:szCs w:val="32"/>
-          <w:cs/>
-        </w:rPr>
-        <w:t xml:space="preserve">ตอบความรู้ภายในจากคลังข้อมูลขององค์กรได้อย่างรวดเร็ว นอกจากนี้ยังรองรับการติดตามประเด็น </w:t>
-      </w:r>
-      <w:r>
-        <w:rPr>
-          <w:rFonts w:ascii="TH SarabunPSK" w:hAnsi="TH SarabunPSK" w:cs="TH SarabunPSK"/>
-          <w:sz w:val="32"/>
-          <w:szCs w:val="32"/>
-        </w:rPr>
-        <w:t xml:space="preserve">HR </w:t>
-      </w:r>
-      <w:r>
-        <w:rPr>
-          <w:rFonts w:ascii="TH SarabunPSK" w:hAnsi="TH SarabunPSK" w:cs="TH SarabunPSK"/>
-          <w:sz w:val="32"/>
-          <w:szCs w:val="32"/>
-          <w:cs/>
-        </w:rPr>
-        <w:t>เช่น พฤติกรรมการมาทำงาน ขาด</w:t>
-      </w:r>
-      <w:r>
-        <w:rPr>
-          <w:rFonts w:ascii="TH SarabunPSK" w:hAnsi="TH SarabunPSK" w:cs="TH SarabunPSK"/>
-          <w:sz w:val="32"/>
-          <w:szCs w:val="32"/>
-        </w:rPr>
-        <w:t>–</w:t>
-      </w:r>
-      <w:r>
-        <w:rPr>
-          <w:rFonts w:ascii="TH SarabunPSK" w:hAnsi="TH SarabunPSK" w:cs="TH SarabunPSK"/>
-          <w:sz w:val="32"/>
-          <w:szCs w:val="32"/>
-          <w:cs/>
-        </w:rPr>
-        <w:t>ลา</w:t>
-      </w:r>
-      <w:r>
-        <w:rPr>
-          <w:rFonts w:ascii="TH SarabunPSK" w:hAnsi="TH SarabunPSK" w:cs="TH SarabunPSK"/>
-          <w:sz w:val="32"/>
-          <w:szCs w:val="32"/>
-        </w:rPr>
-        <w:t>–</w:t>
-      </w:r>
-      <w:r>
-        <w:rPr>
-          <w:rFonts w:ascii="TH SarabunPSK" w:hAnsi="TH SarabunPSK" w:cs="TH SarabunPSK"/>
-          <w:sz w:val="32"/>
-          <w:szCs w:val="32"/>
-          <w:cs/>
-        </w:rPr>
-        <w:t>มาสาย และสรุปผลเป็นรายเดือนเพื่อนำไปใช้งานเชิงบริหาร</w:t>
-      </w:r>
-      <w:r>
-        <w:rPr>
-          <w:rFonts w:ascii="TH SarabunPSK" w:hAnsi="TH SarabunPSK" w:cs="TH SarabunPSK"/>
-          <w:sz w:val="32"/>
-          <w:szCs w:val="32"/>
-        </w:rPr>
-        <w:t xml:space="preserve"> </w:t>
-      </w:r>
-      <w:r>
-        <w:rPr>
-          <w:rFonts w:ascii="TH SarabunPSK" w:hAnsi="TH SarabunPSK" w:cs="TH SarabunPSK"/>
-          <w:sz w:val="32"/>
-          <w:szCs w:val="32"/>
-          <w:cs/>
-        </w:rPr>
-        <w:t xml:space="preserve">ความสำคัญของปัญหานี้อยู่ที่ผลกระทบต่อประสิทธิภาพทั้งระบบ หากงานประจำที่ต้อง </w:t>
-      </w:r>
-      <w:r>
-        <w:rPr>
-          <w:rFonts w:ascii="TH SarabunPSK" w:hAnsi="TH SarabunPSK" w:cs="TH SarabunPSK"/>
-          <w:sz w:val="32"/>
-          <w:szCs w:val="32"/>
-        </w:rPr>
-        <w:t>“</w:t>
-      </w:r>
-      <w:r>
-        <w:rPr>
-          <w:rFonts w:ascii="TH SarabunPSK" w:hAnsi="TH SarabunPSK" w:cs="TH SarabunPSK"/>
-          <w:sz w:val="32"/>
-          <w:szCs w:val="32"/>
-          <w:cs/>
-        </w:rPr>
-        <w:t>ถูกต้องและตรงเวลา</w:t>
-      </w:r>
-      <w:r>
-        <w:rPr>
-          <w:rFonts w:ascii="TH SarabunPSK" w:hAnsi="TH SarabunPSK" w:cs="TH SarabunPSK"/>
-          <w:sz w:val="32"/>
-          <w:szCs w:val="32"/>
-        </w:rPr>
-        <w:t xml:space="preserve">” </w:t>
-      </w:r>
-      <w:r>
-        <w:rPr>
-          <w:rFonts w:ascii="TH SarabunPSK" w:hAnsi="TH SarabunPSK" w:cs="TH SarabunPSK"/>
-          <w:sz w:val="32"/>
-          <w:szCs w:val="32"/>
-          <w:cs/>
-        </w:rPr>
-        <w:t xml:space="preserve">ไม่ได้ถูกทำให้เป็นอัตโนมัติ องค์กรจะสูญเสียชั่วโมงการทำงานจำนวนมากไปกับการย้ำเตือน การคีย์ข้อมูลซ้ำ และการแก้ข้อผิดพลาด ขณะเดียวกันผู้บริหารก็ไม่สามารถเข้าถึงข้อมูลที่เป็นปัจจุบันเพื่อการตัดสินใจ ระบบผู้ช่วยอัตโนมัติบน </w:t>
-      </w:r>
-      <w:r>
-        <w:rPr>
-          <w:rFonts w:ascii="TH SarabunPSK" w:hAnsi="TH SarabunPSK" w:cs="TH SarabunPSK"/>
-          <w:sz w:val="32"/>
-          <w:szCs w:val="32"/>
-        </w:rPr>
-        <w:t>n</w:t>
-      </w:r>
-      <w:r>
-        <w:rPr>
-          <w:rFonts w:ascii="TH SarabunPSK" w:hAnsi="TH SarabunPSK" w:cs="TH SarabunPSK"/>
-          <w:sz w:val="32"/>
-          <w:szCs w:val="32"/>
-          <w:cs/>
-        </w:rPr>
-        <w:t>8</w:t>
-      </w:r>
-      <w:r>
-        <w:rPr>
-          <w:rFonts w:ascii="TH SarabunPSK" w:hAnsi="TH SarabunPSK" w:cs="TH SarabunPSK"/>
-          <w:sz w:val="32"/>
-          <w:szCs w:val="32"/>
-        </w:rPr>
-        <w:t xml:space="preserve">n </w:t>
-      </w:r>
-      <w:r>
-        <w:rPr>
-          <w:rFonts w:ascii="TH SarabunPSK" w:hAnsi="TH SarabunPSK" w:cs="TH SarabunPSK"/>
-          <w:sz w:val="32"/>
-          <w:szCs w:val="32"/>
-          <w:cs/>
-        </w:rPr>
-        <w:t xml:space="preserve">จึงตอบโจทย์ด้วยการทำให้ข้อมูลและการแจ้งเตือนไหลผ่านช่องทางเดียวกันอย่างเป็นระบบ ลดงานซ้ำซ้อน สร้างมาตรฐานการสื่อสารที่ตรวจสอบย้อนหลังได้ เพิ่มความถูกต้องของข้อมูล และยกระดับประสบการณ์ทำงานของพนักงานให้เรียบง่ายขึ้น </w:t>
-      </w:r>
-      <w:r>
-        <w:rPr>
-          <w:rFonts w:ascii="TH SarabunPSK" w:hAnsi="TH SarabunPSK" w:cs="TH SarabunPSK"/>
-          <w:sz w:val="32"/>
-          <w:szCs w:val="32"/>
-          <w:cs/>
-        </w:rPr>
-        <w:lastRenderedPageBreak/>
-        <w:t>ที่สำคัญ โครงสร้างแบบ</w:t>
-      </w:r>
-      <w:proofErr w:type="spellStart"/>
-      <w:r>
-        <w:rPr>
-          <w:rFonts w:ascii="TH SarabunPSK" w:hAnsi="TH SarabunPSK" w:cs="TH SarabunPSK"/>
-          <w:sz w:val="32"/>
-          <w:szCs w:val="32"/>
-          <w:cs/>
-        </w:rPr>
-        <w:t>เวิร์กโฟลว์</w:t>
-      </w:r>
-      <w:proofErr w:type="spellEnd"/>
-      <w:r>
-        <w:rPr>
-          <w:rFonts w:ascii="TH SarabunPSK" w:hAnsi="TH SarabunPSK" w:cs="TH SarabunPSK"/>
-          <w:sz w:val="32"/>
-          <w:szCs w:val="32"/>
-          <w:cs/>
-        </w:rPr>
-        <w:t xml:space="preserve">ของ </w:t>
-      </w:r>
-      <w:r>
-        <w:rPr>
-          <w:rFonts w:ascii="TH SarabunPSK" w:hAnsi="TH SarabunPSK" w:cs="TH SarabunPSK"/>
-          <w:sz w:val="32"/>
-          <w:szCs w:val="32"/>
-        </w:rPr>
-        <w:t>n</w:t>
-      </w:r>
-      <w:r>
-        <w:rPr>
-          <w:rFonts w:ascii="TH SarabunPSK" w:hAnsi="TH SarabunPSK" w:cs="TH SarabunPSK"/>
-          <w:sz w:val="32"/>
-          <w:szCs w:val="32"/>
-          <w:cs/>
-        </w:rPr>
-        <w:t>8</w:t>
-      </w:r>
-      <w:r>
-        <w:rPr>
-          <w:rFonts w:ascii="TH SarabunPSK" w:hAnsi="TH SarabunPSK" w:cs="TH SarabunPSK"/>
-          <w:sz w:val="32"/>
-          <w:szCs w:val="32"/>
-        </w:rPr>
-        <w:t xml:space="preserve">n </w:t>
-      </w:r>
-      <w:r>
-        <w:rPr>
-          <w:rFonts w:ascii="TH SarabunPSK" w:hAnsi="TH SarabunPSK" w:cs="TH SarabunPSK"/>
-          <w:sz w:val="32"/>
-          <w:szCs w:val="32"/>
-          <w:cs/>
-        </w:rPr>
-        <w:t>ทำให้ระบบสามารถเริ่มจากหลายงานย่อยและค่อยๆ บูรณาการเป็นแพลตฟอร์มเดียวในอนาคตได้โดยไม่ต้องรื้อทั้งหมด ช่วยควบคุมต้นทุนและรองรับการเติบโตขององค์กรมากขึ้น</w:t>
-      </w:r>
-      <w:r>
-        <w:rPr>
-          <w:rFonts w:ascii="TH SarabunPSK" w:hAnsi="TH SarabunPSK" w:cs="TH SarabunPSK"/>
-          <w:sz w:val="32"/>
-          <w:szCs w:val="32"/>
-        </w:rPr>
-        <w:t xml:space="preserve"> </w:t>
-      </w:r>
-    </w:p>
-    <w:p>
-      <w:pPr>
-        <w:ind w:firstLine="709"/>
-        <w:jc w:val="both"/>
-        <w:rPr>
-          <w:rFonts w:ascii="TH SarabunPSK" w:hAnsi="TH SarabunPSK" w:cs="TH SarabunPSK"/>
-          <w:sz w:val="32"/>
-          <w:szCs w:val="32"/>
-        </w:rPr>
-      </w:pPr>
-      <w:r>
-        <w:rPr>
-          <w:rFonts w:ascii="TH SarabunPSK" w:hAnsi="TH SarabunPSK" w:cs="TH SarabunPSK"/>
-          <w:sz w:val="32"/>
-          <w:szCs w:val="32"/>
-          <w:cs/>
-        </w:rPr>
-        <w:t xml:space="preserve">กล่าวโดยสรุป โครงการนี้มีที่มาจากความต้องการแก้ </w:t>
-      </w:r>
-      <w:r>
-        <w:rPr>
-          <w:rFonts w:ascii="TH SarabunPSK" w:hAnsi="TH SarabunPSK" w:cs="TH SarabunPSK"/>
-          <w:sz w:val="32"/>
-          <w:szCs w:val="32"/>
-        </w:rPr>
-        <w:t>“</w:t>
-      </w:r>
-      <w:r>
-        <w:rPr>
-          <w:rFonts w:ascii="TH SarabunPSK" w:hAnsi="TH SarabunPSK" w:cs="TH SarabunPSK"/>
-          <w:sz w:val="32"/>
-          <w:szCs w:val="32"/>
-          <w:cs/>
-        </w:rPr>
-        <w:t>งานประจำที่สำคัญแต่สิ้นเปลืองเวลา</w:t>
-      </w:r>
-      <w:r>
-        <w:rPr>
-          <w:rFonts w:ascii="TH SarabunPSK" w:hAnsi="TH SarabunPSK" w:cs="TH SarabunPSK"/>
-          <w:sz w:val="32"/>
-          <w:szCs w:val="32"/>
-        </w:rPr>
-        <w:t xml:space="preserve">” </w:t>
-      </w:r>
-      <w:r>
-        <w:rPr>
-          <w:rFonts w:ascii="TH SarabunPSK" w:hAnsi="TH SarabunPSK" w:cs="TH SarabunPSK"/>
-          <w:sz w:val="32"/>
-          <w:szCs w:val="32"/>
-          <w:cs/>
-        </w:rPr>
-        <w:t xml:space="preserve">ให้เป็นอัตโนมัติและเชื่อมต่อกันทั้งเส้นทาง ด้วย </w:t>
-      </w:r>
-      <w:r>
-        <w:rPr>
-          <w:rFonts w:ascii="TH SarabunPSK" w:hAnsi="TH SarabunPSK" w:cs="TH SarabunPSK"/>
-          <w:sz w:val="32"/>
-          <w:szCs w:val="32"/>
-        </w:rPr>
-        <w:t>n</w:t>
-      </w:r>
-      <w:r>
-        <w:rPr>
-          <w:rFonts w:ascii="TH SarabunPSK" w:hAnsi="TH SarabunPSK" w:cs="TH SarabunPSK"/>
-          <w:sz w:val="32"/>
-          <w:szCs w:val="32"/>
-          <w:cs/>
-        </w:rPr>
-        <w:t>8</w:t>
-      </w:r>
-      <w:r>
-        <w:rPr>
-          <w:rFonts w:ascii="TH SarabunPSK" w:hAnsi="TH SarabunPSK" w:cs="TH SarabunPSK"/>
-          <w:sz w:val="32"/>
-          <w:szCs w:val="32"/>
-        </w:rPr>
-        <w:t xml:space="preserve">n </w:t>
-      </w:r>
-      <w:r>
-        <w:rPr>
-          <w:rFonts w:ascii="TH SarabunPSK" w:hAnsi="TH SarabunPSK" w:cs="TH SarabunPSK"/>
-          <w:sz w:val="32"/>
-          <w:szCs w:val="32"/>
-          <w:cs/>
-        </w:rPr>
-        <w:t>ในบทบาทเลขาออฟฟิศดิจิทัล องค์กรจะได้ทั้งความแม่นยำ ความรวดเร็ว ความโปร่งใสในการทำงาน และความพร้อมต่อการขยายตัวในระยะยาว</w:t>
-      </w:r>
-    </w:p>
-    <w:p>
-      <w:pPr>
-        <w:rPr>
-          <w:rFonts w:ascii="TH SarabunPSK" w:hAnsi="TH SarabunPSK" w:cs="TH SarabunPSK"/>
-          <w:b/>
-          <w:bCs/>
-          <w:sz w:val="32"/>
-          <w:szCs w:val="32"/>
-        </w:rPr>
-      </w:pPr>
-      <w:r>
-        <w:rPr>
-          <w:rFonts w:ascii="TH SarabunPSK" w:hAnsi="TH SarabunPSK" w:cs="TH SarabunPSK"/>
-          <w:b/>
-          <w:bCs/>
-          <w:sz w:val="32"/>
-          <w:szCs w:val="32"/>
-          <w:cs/>
-        </w:rPr>
-        <w:t>1.2</w:t>
-      </w:r>
-      <w:r>
-        <w:rPr>
-          <w:rFonts w:ascii="TH SarabunPSK" w:hAnsi="TH SarabunPSK" w:cs="TH SarabunPSK"/>
-          <w:b/>
-          <w:bCs/>
-          <w:color w:val="FFFFFF" w:themeColor="background1"/>
-          <w:sz w:val="32"/>
-          <w:szCs w:val="32"/>
-        </w:rPr>
-        <w:t>**</w:t>
-      </w:r>
-      <w:r>
-        <w:rPr>
-          <w:rFonts w:ascii="TH SarabunPSK" w:hAnsi="TH SarabunPSK" w:cs="TH SarabunPSK"/>
-          <w:b/>
-          <w:bCs/>
-          <w:sz w:val="32"/>
-          <w:szCs w:val="32"/>
-          <w:cs/>
-        </w:rPr>
-        <w:t>วัตถุประสงค์</w:t>
       </w:r>
     </w:p>
     <w:p>
       <w:pPr>
         <w:spacing w:after="0"/>
         <w:ind w:firstLine="709"/>
-        <w:rPr>
-          <w:rFonts w:ascii="TH SarabunPSK" w:hAnsi="TH SarabunPSK" w:cs="TH SarabunPSK"/>
-          <w:sz w:val="32"/>
-          <w:szCs w:val="32"/>
-          <w:cs/>
+        <w:jc w:val="both"/>
+        <w:rPr>
+          <w:rFonts w:ascii="TH SarabunPSK" w:hAnsi="TH SarabunPSK" w:cs="TH SarabunPSK"/>
+          <w:sz w:val="32"/>
+          <w:szCs w:val="32"/>
         </w:rPr>
       </w:pPr>
       <w:r>
@@ -887,77 +148,19 @@
           <w:szCs w:val="32"/>
           <w:cs/>
         </w:rPr>
-        <w:t>1.2.1</w:t>
-      </w:r>
-      <w:r>
-        <w:rPr>
-          <w:rFonts w:ascii="TH SarabunPSK" w:hAnsi="TH SarabunPSK" w:cs="TH SarabunPSK"/>
-          <w:color w:val="FFFFFF" w:themeColor="background1"/>
-          <w:sz w:val="32"/>
-          <w:szCs w:val="32"/>
-        </w:rPr>
-        <w:t>**</w:t>
-      </w:r>
-      <w:r>
-        <w:rPr>
-          <w:rFonts w:ascii="TH SarabunPSK" w:hAnsi="TH SarabunPSK" w:cs="TH SarabunPSK"/>
-          <w:sz w:val="32"/>
-          <w:szCs w:val="32"/>
-          <w:cs/>
-        </w:rPr>
-        <w:t>เพื่อพัฒนา</w:t>
-      </w:r>
-      <w:r>
-        <w:rPr>
-          <w:rFonts w:ascii="TH SarabunPSK" w:hAnsi="TH SarabunPSK" w:cs="TH SarabunPSK"/>
-          <w:sz w:val="32"/>
-          <w:szCs w:val="32"/>
-          <w:cs/>
-        </w:rPr>
-        <w:t xml:space="preserve">ระบบผู้ช่วยอัตโนมัติ </w:t>
-      </w:r>
-      <w:r>
-        <w:rPr>
-          <w:rFonts w:ascii="TH SarabunPSK" w:hAnsi="TH SarabunPSK" w:cs="TH SarabunPSK"/>
-          <w:sz w:val="32"/>
-          <w:szCs w:val="32"/>
-        </w:rPr>
-        <w:t>n</w:t>
-      </w:r>
-      <w:r>
-        <w:rPr>
-          <w:rFonts w:ascii="TH SarabunPSK" w:hAnsi="TH SarabunPSK" w:cs="TH SarabunPSK"/>
-          <w:sz w:val="32"/>
-          <w:szCs w:val="32"/>
-          <w:cs/>
-        </w:rPr>
-        <w:t>8</w:t>
-      </w:r>
-      <w:r>
-        <w:rPr>
-          <w:rFonts w:ascii="TH SarabunPSK" w:hAnsi="TH SarabunPSK" w:cs="TH SarabunPSK"/>
-          <w:sz w:val="32"/>
-          <w:szCs w:val="32"/>
-        </w:rPr>
-        <w:t xml:space="preserve">n </w:t>
-      </w:r>
-      <w:r>
-        <w:rPr>
-          <w:rFonts w:ascii="TH SarabunPSK" w:hAnsi="TH SarabunPSK" w:cs="TH SarabunPSK"/>
-          <w:sz w:val="32"/>
-          <w:szCs w:val="32"/>
-          <w:cs/>
-        </w:rPr>
-        <w:t xml:space="preserve">ผ่าน </w:t>
-      </w:r>
-      <w:r>
-        <w:rPr>
-          <w:rFonts w:ascii="TH SarabunPSK" w:hAnsi="TH SarabunPSK" w:cs="TH SarabunPSK"/>
-          <w:sz w:val="32"/>
-          <w:szCs w:val="32"/>
-        </w:rPr>
-        <w:t>LINE OA</w:t>
-      </w:r>
+        <w:t>ปัจจุบันงานธุรการและการสื่อสารภายในองค์กรจำนวนมากยังดำเนินไปบนเครื่องมือที่กระจัดกระจาย เช่น การส่งข้อความบอกต่อกัน การจดนัดหมายในหลายปฏิทิน การติดตามยอดขายด้วยไฟล์สเปรดชีตหลาย</w:t>
+      </w:r>
+      <w:proofErr w:type="spellStart"/>
+      <w:r>
+        <w:rPr>
+          <w:rFonts w:ascii="TH SarabunPSK" w:hAnsi="TH SarabunPSK" w:cs="TH SarabunPSK"/>
+          <w:sz w:val="32"/>
+          <w:szCs w:val="32"/>
+          <w:cs/>
+        </w:rPr>
+        <w:t>เวอร์ชัน</w:t>
+      </w:r>
+      <w:proofErr w:type="spellEnd"/>
       <w:r>
         <w:rPr>
           <w:rFonts w:ascii="TH SarabunPSK" w:hAnsi="TH SarabunPSK" w:cs="TH SarabunPSK" w:hint="cs"/>
@@ -974,18 +177,98 @@
           <w:szCs w:val="32"/>
           <w:cs/>
         </w:rPr>
-        <w:t>สำหรับองค์กร</w:t>
+        <w:t>และการเก็บเอกสารลงโฟลเดอร์ที่ไม่ได้จัดระเบียบร่วมกัน ปัญหาที่ตามมาคือการนัดประชุมคลาดเคลื่อน ลืมแจ้งเตือนเหตุการณ์สำคัญ ข้อมูลซ้ำซ้อนหรือผิดพลาด การสื่อสารไม่ตรงกลุ่มเป้าหมาย และภาระงานจุกจิกที่ใช้เวลาคนจำนวนมาก โดยเฉพาะอย่างยิ่งงานประจำอย่างแจ้งเตือนประชุม แจ้งเกิดพนักงาน แจ้งยอดขายรายบุคคล ติดตามขาด</w:t>
+      </w:r>
+      <w:r>
+        <w:rPr>
+          <w:rFonts w:ascii="TH SarabunPSK" w:hAnsi="TH SarabunPSK" w:cs="TH SarabunPSK"/>
+          <w:sz w:val="32"/>
+          <w:szCs w:val="32"/>
+        </w:rPr>
+        <w:t>–</w:t>
+      </w:r>
+      <w:r>
+        <w:rPr>
+          <w:rFonts w:ascii="TH SarabunPSK" w:hAnsi="TH SarabunPSK" w:cs="TH SarabunPSK"/>
+          <w:sz w:val="32"/>
+          <w:szCs w:val="32"/>
+          <w:cs/>
+        </w:rPr>
+        <w:t>ลา</w:t>
+      </w:r>
+      <w:r>
+        <w:rPr>
+          <w:rFonts w:ascii="TH SarabunPSK" w:hAnsi="TH SarabunPSK" w:cs="TH SarabunPSK"/>
+          <w:sz w:val="32"/>
+          <w:szCs w:val="32"/>
+        </w:rPr>
+        <w:t>–</w:t>
+      </w:r>
+      <w:r>
+        <w:rPr>
+          <w:rFonts w:ascii="TH SarabunPSK" w:hAnsi="TH SarabunPSK" w:cs="TH SarabunPSK"/>
+          <w:sz w:val="32"/>
+          <w:szCs w:val="32"/>
+          <w:cs/>
+        </w:rPr>
+        <w:t>มาสาย หรือการคัดแยก</w:t>
+      </w:r>
+      <w:proofErr w:type="spellStart"/>
+      <w:r>
+        <w:rPr>
+          <w:rFonts w:ascii="TH SarabunPSK" w:hAnsi="TH SarabunPSK" w:cs="TH SarabunPSK"/>
+          <w:sz w:val="32"/>
+          <w:szCs w:val="32"/>
+          <w:cs/>
+        </w:rPr>
+        <w:t>สล</w:t>
+      </w:r>
+      <w:proofErr w:type="spellEnd"/>
+      <w:r>
+        <w:rPr>
+          <w:rFonts w:ascii="TH SarabunPSK" w:hAnsi="TH SarabunPSK" w:cs="TH SarabunPSK"/>
+          <w:sz w:val="32"/>
+          <w:szCs w:val="32"/>
+          <w:cs/>
+        </w:rPr>
+        <w:t xml:space="preserve">ิปโอนเงินเพื่อเก็บลง </w:t>
+      </w:r>
+      <w:r>
+        <w:rPr>
+          <w:rFonts w:ascii="TH SarabunPSK" w:hAnsi="TH SarabunPSK" w:cs="TH SarabunPSK"/>
+          <w:sz w:val="32"/>
+          <w:szCs w:val="32"/>
+        </w:rPr>
+        <w:t xml:space="preserve">Google Drive </w:t>
+      </w:r>
+      <w:r>
+        <w:rPr>
+          <w:rFonts w:ascii="TH SarabunPSK" w:hAnsi="TH SarabunPSK" w:cs="TH SarabunPSK"/>
+          <w:sz w:val="32"/>
+          <w:szCs w:val="32"/>
+          <w:cs/>
+        </w:rPr>
+        <w:t>ซึ่งล้วนต้องการความถูกต้องและความต่อเนื่อง หากยังทำด้วยมือย่อมเสี่ยงต่อความผิดพลาดและต้นทุนเวลาที่สูง</w:t>
       </w:r>
     </w:p>
     <w:p>
       <w:pPr>
         <w:spacing w:after="0"/>
         <w:ind w:firstLine="709"/>
-        <w:rPr>
-          <w:rFonts w:ascii="TH SarabunPSK" w:hAnsi="TH SarabunPSK" w:cs="TH SarabunPSK"/>
-          <w:sz w:val="32"/>
-          <w:szCs w:val="32"/>
-        </w:rPr>
+        <w:jc w:val="both"/>
+        <w:rPr>
+          <w:rFonts w:ascii="TH SarabunPSK" w:hAnsi="TH SarabunPSK" w:cs="TH SarabunPSK"/>
+          <w:sz w:val="32"/>
+          <w:szCs w:val="32"/>
+          <w:cs/>
+        </w:rPr>
+        <w:sectPr>
+          <w:headerReference w:type="default" r:id="rId6"/>
+          <w:pgSz w:w="11906" w:h="16838"/>
+          <w:pgMar w:top="2880" w:right="1440" w:bottom="1440" w:left="2160" w:header="709" w:footer="709" w:gutter="0"/>
+          <w:cols w:space="708"/>
+          <w:docGrid w:linePitch="360"/>
+        </w:sectPr>
       </w:pPr>
       <w:r>
         <w:rPr>
@@ -994,34 +277,41 @@
           <w:szCs w:val="32"/>
           <w:cs/>
         </w:rPr>
-        <w:t>1.2.2</w:t>
-      </w:r>
-      <w:r>
-        <w:rPr>
-          <w:rFonts w:ascii="TH SarabunPSK" w:hAnsi="TH SarabunPSK" w:cs="TH SarabunPSK"/>
-          <w:color w:val="FFFFFF" w:themeColor="background1"/>
-          <w:sz w:val="32"/>
-          <w:szCs w:val="32"/>
-        </w:rPr>
-        <w:t>**</w:t>
-      </w:r>
-      <w:r>
-        <w:rPr>
-          <w:rFonts w:ascii="TH SarabunPSK" w:hAnsi="TH SarabunPSK" w:cs="TH SarabunPSK"/>
-          <w:sz w:val="32"/>
-          <w:szCs w:val="32"/>
-          <w:cs/>
-        </w:rPr>
-        <w:t>เพื่อหาประสิทธิภาพของระบบ</w:t>
-      </w:r>
-      <w:r>
-        <w:rPr>
-          <w:rFonts w:ascii="TH SarabunPSK" w:hAnsi="TH SarabunPSK" w:cs="TH SarabunPSK"/>
-          <w:sz w:val="32"/>
-          <w:szCs w:val="32"/>
-          <w:cs/>
-        </w:rPr>
-        <w:t xml:space="preserve">ผู้ช่วยอัตโนมัติ </w:t>
+        <w:t xml:space="preserve">จากดังกล่าวจึงเกิดแนวคิดพัฒนา </w:t>
+      </w:r>
+      <w:r>
+        <w:rPr>
+          <w:rFonts w:ascii="TH SarabunPSK" w:hAnsi="TH SarabunPSK" w:cs="TH SarabunPSK"/>
+          <w:sz w:val="32"/>
+          <w:szCs w:val="32"/>
+        </w:rPr>
+        <w:t>“</w:t>
+      </w:r>
+      <w:r>
+        <w:rPr>
+          <w:rFonts w:ascii="TH SarabunPSK" w:hAnsi="TH SarabunPSK" w:cs="TH SarabunPSK"/>
+          <w:sz w:val="32"/>
+          <w:szCs w:val="32"/>
+          <w:cs/>
+        </w:rPr>
+        <w:t>ผู้ช่วยอัตโนมัติของบริษัท</w:t>
+      </w:r>
+      <w:r>
+        <w:rPr>
+          <w:rFonts w:ascii="TH SarabunPSK" w:hAnsi="TH SarabunPSK" w:cs="TH SarabunPSK"/>
+          <w:sz w:val="32"/>
+          <w:szCs w:val="32"/>
+        </w:rPr>
+        <w:t xml:space="preserve">” </w:t>
+      </w:r>
+      <w:r>
+        <w:rPr>
+          <w:rFonts w:ascii="TH SarabunPSK" w:hAnsi="TH SarabunPSK" w:cs="TH SarabunPSK"/>
+          <w:sz w:val="32"/>
+          <w:szCs w:val="32"/>
+          <w:cs/>
+        </w:rPr>
+        <w:t xml:space="preserve">ที่ทำหน้าที่เสมือนเลขาในออฟฟิศ โดยใช้แพลตฟอร์ม </w:t>
       </w:r>
       <w:r>
         <w:rPr>
@@ -1055,22 +345,58 @@
           <w:szCs w:val="32"/>
           <w:cs/>
         </w:rPr>
-        <w:t xml:space="preserve">ผ่าน </w:t>
-      </w:r>
-      <w:r>
-        <w:rPr>
-          <w:rFonts w:ascii="TH SarabunPSK" w:hAnsi="TH SarabunPSK" w:cs="TH SarabunPSK"/>
-          <w:sz w:val="32"/>
-          <w:szCs w:val="32"/>
-        </w:rPr>
-        <w:t>LINE OA</w:t>
-      </w:r>
-      <w:r>
-        <w:rPr>
-          <w:rFonts w:ascii="TH SarabunPSK" w:hAnsi="TH SarabunPSK" w:cs="TH SarabunPSK" w:hint="cs"/>
-          <w:sz w:val="32"/>
-          <w:szCs w:val="32"/>
-          <w:cs/>
+        <w:t>เป็นต้นทางของ</w:t>
+      </w:r>
+      <w:proofErr w:type="spellStart"/>
+      <w:r>
+        <w:rPr>
+          <w:rFonts w:ascii="TH SarabunPSK" w:hAnsi="TH SarabunPSK" w:cs="TH SarabunPSK"/>
+          <w:sz w:val="32"/>
+          <w:szCs w:val="32"/>
+          <w:cs/>
+        </w:rPr>
+        <w:t>เวิร์กโฟลว์</w:t>
+      </w:r>
+      <w:proofErr w:type="spellEnd"/>
+      <w:r>
+        <w:rPr>
+          <w:rFonts w:ascii="TH SarabunPSK" w:hAnsi="TH SarabunPSK" w:cs="TH SarabunPSK"/>
+          <w:sz w:val="32"/>
+          <w:szCs w:val="32"/>
+          <w:cs/>
+        </w:rPr>
+        <w:t xml:space="preserve">อัตโนมัติ เชื่อมต่อ </w:t>
+      </w:r>
+      <w:r>
+        <w:rPr>
+          <w:rFonts w:ascii="TH SarabunPSK" w:hAnsi="TH SarabunPSK" w:cs="TH SarabunPSK"/>
+          <w:sz w:val="32"/>
+          <w:szCs w:val="32"/>
+        </w:rPr>
+        <w:t xml:space="preserve">LINE Official Account/LIFF, </w:t>
+      </w:r>
+      <w:r>
+        <w:rPr>
+          <w:rFonts w:ascii="TH SarabunPSK" w:hAnsi="TH SarabunPSK" w:cs="TH SarabunPSK"/>
+          <w:sz w:val="32"/>
+          <w:szCs w:val="32"/>
+          <w:cs/>
+        </w:rPr>
+        <w:t>อีเมล</w:t>
+      </w:r>
+      <w:r>
+        <w:rPr>
+          <w:rFonts w:ascii="TH SarabunPSK" w:hAnsi="TH SarabunPSK" w:cs="TH SarabunPSK"/>
+          <w:sz w:val="32"/>
+          <w:szCs w:val="32"/>
+        </w:rPr>
+        <w:t>, Google</w:t>
+      </w:r>
+      <w:r>
+        <w:rPr>
+          <w:rFonts w:ascii="TH SarabunPSK" w:hAnsi="TH SarabunPSK" w:cs="TH SarabunPSK"/>
+          <w:sz w:val="32"/>
+          <w:szCs w:val="32"/>
         </w:rPr>
         <w:t xml:space="preserve"> </w:t>
       </w:r>
@@ -1079,241 +405,443 @@
           <w:rFonts w:ascii="TH SarabunPSK" w:hAnsi="TH SarabunPSK" w:cs="TH SarabunPSK"/>
           <w:sz w:val="32"/>
           <w:szCs w:val="32"/>
-          <w:cs/>
-        </w:rPr>
-        <w:t>สำหรับองค์กร</w:t>
+        </w:rPr>
+        <w:t xml:space="preserve">Sheets/Drive </w:t>
+      </w:r>
+      <w:r>
+        <w:rPr>
+          <w:rFonts w:ascii="TH SarabunPSK" w:hAnsi="TH SarabunPSK" w:cs="TH SarabunPSK"/>
+          <w:sz w:val="32"/>
+          <w:szCs w:val="32"/>
+          <w:cs/>
+        </w:rPr>
+        <w:t>และฐานข้อมูลได้อย่างยืดหยุ่น ระบบตั้งใจแก้ปัญหาเชิงปฏิบัติที่เกิดขึ้นจริง ได้แก่ แจ้งเตือนวันเกิดพนักงาน สร้าง/เพิ่ม/ลบห้องประชุมและส่งการแจ้งเตือนก่อนเริ่มประชุมอัตโนมัติที่ 15</w:t>
+      </w:r>
+      <w:r>
+        <w:rPr>
+          <w:rFonts w:ascii="TH SarabunPSK" w:hAnsi="TH SarabunPSK" w:cs="TH SarabunPSK"/>
+          <w:sz w:val="32"/>
+          <w:szCs w:val="32"/>
+        </w:rPr>
+        <w:t xml:space="preserve">, </w:t>
+      </w:r>
+      <w:r>
+        <w:rPr>
+          <w:rFonts w:ascii="TH SarabunPSK" w:hAnsi="TH SarabunPSK" w:cs="TH SarabunPSK"/>
+          <w:sz w:val="32"/>
+          <w:szCs w:val="32"/>
+          <w:cs/>
+        </w:rPr>
+        <w:t xml:space="preserve">10 และ 5 นาที รวม 3 ครั้ง แจ้งยอดขายรายบุคคลจาก </w:t>
+      </w:r>
+      <w:r>
+        <w:rPr>
+          <w:rFonts w:ascii="TH SarabunPSK" w:hAnsi="TH SarabunPSK" w:cs="TH SarabunPSK"/>
+          <w:sz w:val="32"/>
+          <w:szCs w:val="32"/>
+        </w:rPr>
+        <w:t xml:space="preserve">Google Sheets </w:t>
+      </w:r>
+      <w:r>
+        <w:rPr>
+          <w:rFonts w:ascii="TH SarabunPSK" w:hAnsi="TH SarabunPSK" w:cs="TH SarabunPSK"/>
+          <w:sz w:val="32"/>
+          <w:szCs w:val="32"/>
+          <w:cs/>
+        </w:rPr>
+        <w:t xml:space="preserve">แบบทันเหตุการณ์ ส่งอีเมลรายบุคคลเมื่อต้องสื่อสารเฉพาะเรื่อง ยืนยันตัวตนผู้ใช้ผ่าน </w:t>
+      </w:r>
+      <w:r>
+        <w:rPr>
+          <w:rFonts w:ascii="TH SarabunPSK" w:hAnsi="TH SarabunPSK" w:cs="TH SarabunPSK"/>
+          <w:sz w:val="32"/>
+          <w:szCs w:val="32"/>
+        </w:rPr>
+        <w:t xml:space="preserve">LINE OA/LIFF </w:t>
+      </w:r>
+      <w:r>
+        <w:rPr>
+          <w:rFonts w:ascii="TH SarabunPSK" w:hAnsi="TH SarabunPSK" w:cs="TH SarabunPSK"/>
+          <w:sz w:val="32"/>
+          <w:szCs w:val="32"/>
+          <w:cs/>
+        </w:rPr>
+        <w:t xml:space="preserve">และอีเมล (รองรับ </w:t>
+      </w:r>
+      <w:r>
+        <w:rPr>
+          <w:rFonts w:ascii="TH SarabunPSK" w:hAnsi="TH SarabunPSK" w:cs="TH SarabunPSK"/>
+          <w:sz w:val="32"/>
+          <w:szCs w:val="32"/>
+        </w:rPr>
+        <w:t xml:space="preserve">OTP </w:t>
+      </w:r>
+      <w:r>
+        <w:rPr>
+          <w:rFonts w:ascii="TH SarabunPSK" w:hAnsi="TH SarabunPSK" w:cs="TH SarabunPSK"/>
+          <w:sz w:val="32"/>
+          <w:szCs w:val="32"/>
+          <w:cs/>
+        </w:rPr>
+        <w:t xml:space="preserve">จากผู้ให้บริการภายนอกเมื่อจำเป็น) กำหนดสิทธิ์การเข้าถึงตามบทบาทงาน แจ้งข่าวสารแบบคัดกลุ่มตามบุคคล/แผนก/ตำแหน่ง ใช้ </w:t>
+      </w:r>
+      <w:r>
+        <w:rPr>
+          <w:rFonts w:ascii="TH SarabunPSK" w:hAnsi="TH SarabunPSK" w:cs="TH SarabunPSK"/>
+          <w:sz w:val="32"/>
+          <w:szCs w:val="32"/>
+        </w:rPr>
+        <w:t xml:space="preserve">LINE Flex Message </w:t>
+      </w:r>
+      <w:r>
+        <w:rPr>
+          <w:rFonts w:ascii="TH SarabunPSK" w:hAnsi="TH SarabunPSK" w:cs="TH SarabunPSK"/>
+          <w:sz w:val="32"/>
+          <w:szCs w:val="32"/>
+          <w:cs/>
+        </w:rPr>
+        <w:t>เพื่อให้ข้อมูลอ่านง่ายบนมือถือ</w:t>
+      </w:r>
+      <w:r>
+        <w:rPr>
+          <w:rFonts w:ascii="TH SarabunPSK" w:hAnsi="TH SarabunPSK" w:cs="TH SarabunPSK" w:hint="cs"/>
+          <w:sz w:val="32"/>
+          <w:szCs w:val="32"/>
+          <w:cs/>
+        </w:rPr>
+        <w:t xml:space="preserve"> และ</w:t>
+      </w:r>
+      <w:r>
+        <w:rPr>
+          <w:rFonts w:ascii="TH SarabunPSK" w:hAnsi="TH SarabunPSK" w:cs="TH SarabunPSK"/>
+          <w:sz w:val="32"/>
+          <w:szCs w:val="32"/>
+          <w:cs/>
+        </w:rPr>
+        <w:t xml:space="preserve">ต่อยอดเชื่อมฐานข้อมูลสำหรับ </w:t>
+      </w:r>
+      <w:r>
+        <w:rPr>
+          <w:rFonts w:ascii="TH SarabunPSK" w:hAnsi="TH SarabunPSK" w:cs="TH SarabunPSK"/>
+          <w:sz w:val="32"/>
+          <w:szCs w:val="32"/>
+        </w:rPr>
+        <w:t xml:space="preserve">RAG AI </w:t>
+      </w:r>
+      <w:r>
+        <w:rPr>
+          <w:rFonts w:ascii="TH SarabunPSK" w:hAnsi="TH SarabunPSK" w:cs="TH SarabunPSK"/>
+          <w:sz w:val="32"/>
+          <w:szCs w:val="32"/>
+          <w:cs/>
+        </w:rPr>
+        <w:t>เพื่อให้พนักงานถาม</w:t>
+      </w:r>
+      <w:r>
+        <w:rPr>
+          <w:rFonts w:ascii="TH SarabunPSK" w:hAnsi="TH SarabunPSK" w:cs="TH SarabunPSK"/>
+          <w:sz w:val="32"/>
+          <w:szCs w:val="32"/>
+        </w:rPr>
+        <w:t>–</w:t>
+      </w:r>
+      <w:r>
+        <w:rPr>
+          <w:rFonts w:ascii="TH SarabunPSK" w:hAnsi="TH SarabunPSK" w:cs="TH SarabunPSK"/>
+          <w:sz w:val="32"/>
+          <w:szCs w:val="32"/>
+          <w:cs/>
+        </w:rPr>
+        <w:t xml:space="preserve">ตอบความรู้ภายในจากคลังข้อมูลขององค์กรได้อย่างรวดเร็ว นอกจากนี้ยังรองรับการติดตามประเด็น </w:t>
+      </w:r>
+      <w:r>
+        <w:rPr>
+          <w:rFonts w:ascii="TH SarabunPSK" w:hAnsi="TH SarabunPSK" w:cs="TH SarabunPSK"/>
+          <w:sz w:val="32"/>
+          <w:szCs w:val="32"/>
+        </w:rPr>
+        <w:t xml:space="preserve">HR </w:t>
+      </w:r>
+      <w:r>
+        <w:rPr>
+          <w:rFonts w:ascii="TH SarabunPSK" w:hAnsi="TH SarabunPSK" w:cs="TH SarabunPSK"/>
+          <w:sz w:val="32"/>
+          <w:szCs w:val="32"/>
+          <w:cs/>
+        </w:rPr>
+        <w:t>เช่น พฤติกรรมการมาทำงาน ขาด</w:t>
+      </w:r>
+      <w:r>
+        <w:rPr>
+          <w:rFonts w:ascii="TH SarabunPSK" w:hAnsi="TH SarabunPSK" w:cs="TH SarabunPSK"/>
+          <w:sz w:val="32"/>
+          <w:szCs w:val="32"/>
+        </w:rPr>
+        <w:t>–</w:t>
+      </w:r>
+      <w:r>
+        <w:rPr>
+          <w:rFonts w:ascii="TH SarabunPSK" w:hAnsi="TH SarabunPSK" w:cs="TH SarabunPSK"/>
+          <w:sz w:val="32"/>
+          <w:szCs w:val="32"/>
+          <w:cs/>
+        </w:rPr>
+        <w:t>ลา</w:t>
+      </w:r>
+      <w:r>
+        <w:rPr>
+          <w:rFonts w:ascii="TH SarabunPSK" w:hAnsi="TH SarabunPSK" w:cs="TH SarabunPSK"/>
+          <w:sz w:val="32"/>
+          <w:szCs w:val="32"/>
+        </w:rPr>
+        <w:t>–</w:t>
+      </w:r>
+      <w:r>
+        <w:rPr>
+          <w:rFonts w:ascii="TH SarabunPSK" w:hAnsi="TH SarabunPSK" w:cs="TH SarabunPSK"/>
+          <w:sz w:val="32"/>
+          <w:szCs w:val="32"/>
+          <w:cs/>
+        </w:rPr>
+        <w:t>มาสาย และสรุปผลเป็นรายเดือนเพื่อนำไปใช้งานเชิงบริหาร</w:t>
+      </w:r>
+      <w:r>
+        <w:rPr>
+          <w:rFonts w:ascii="TH SarabunPSK" w:hAnsi="TH SarabunPSK" w:cs="TH SarabunPSK"/>
+          <w:sz w:val="32"/>
+          <w:szCs w:val="32"/>
+        </w:rPr>
+        <w:t xml:space="preserve"> </w:t>
+      </w:r>
+      <w:r>
+        <w:rPr>
+          <w:rFonts w:ascii="TH SarabunPSK" w:hAnsi="TH SarabunPSK" w:cs="TH SarabunPSK"/>
+          <w:sz w:val="32"/>
+          <w:szCs w:val="32"/>
+          <w:cs/>
+        </w:rPr>
+        <w:t xml:space="preserve">ความสำคัญของปัญหานี้อยู่ที่ผลกระทบต่อประสิทธิภาพทั้งระบบ หากงานประจำที่ต้อง </w:t>
+      </w:r>
+      <w:r>
+        <w:rPr>
+          <w:rFonts w:ascii="TH SarabunPSK" w:hAnsi="TH SarabunPSK" w:cs="TH SarabunPSK"/>
+          <w:sz w:val="32"/>
+          <w:szCs w:val="32"/>
+        </w:rPr>
+        <w:t>“</w:t>
+      </w:r>
+      <w:r>
+        <w:rPr>
+          <w:rFonts w:ascii="TH SarabunPSK" w:hAnsi="TH SarabunPSK" w:cs="TH SarabunPSK"/>
+          <w:sz w:val="32"/>
+          <w:szCs w:val="32"/>
+          <w:cs/>
+        </w:rPr>
+        <w:t>ถูกต้องและตรงเวลา</w:t>
+      </w:r>
+      <w:r>
+        <w:rPr>
+          <w:rFonts w:ascii="TH SarabunPSK" w:hAnsi="TH SarabunPSK" w:cs="TH SarabunPSK"/>
+          <w:sz w:val="32"/>
+          <w:szCs w:val="32"/>
+        </w:rPr>
+        <w:t xml:space="preserve">” </w:t>
+      </w:r>
+      <w:r>
+        <w:rPr>
+          <w:rFonts w:ascii="TH SarabunPSK" w:hAnsi="TH SarabunPSK" w:cs="TH SarabunPSK"/>
+          <w:sz w:val="32"/>
+          <w:szCs w:val="32"/>
+          <w:cs/>
+        </w:rPr>
+        <w:t xml:space="preserve">ไม่ได้ถูกทำให้เป็นอัตโนมัติ องค์กรจะสูญเสียชั่วโมงการทำงานจำนวนมากไปกับการย้ำเตือน การคีย์ข้อมูลซ้ำ และการแก้ข้อผิดพลาด ขณะเดียวกันผู้บริหารก็ไม่สามารถเข้าถึงข้อมูลที่เป็นปัจจุบันเพื่อการตัดสินใจ ระบบผู้ช่วยอัตโนมัติบน </w:t>
+      </w:r>
+      <w:r>
+        <w:rPr>
+          <w:rFonts w:ascii="TH SarabunPSK" w:hAnsi="TH SarabunPSK" w:cs="TH SarabunPSK"/>
+          <w:sz w:val="32"/>
+          <w:szCs w:val="32"/>
+        </w:rPr>
+        <w:t>n</w:t>
+      </w:r>
+      <w:r>
+        <w:rPr>
+          <w:rFonts w:ascii="TH SarabunPSK" w:hAnsi="TH SarabunPSK" w:cs="TH SarabunPSK"/>
+          <w:sz w:val="32"/>
+          <w:szCs w:val="32"/>
+          <w:cs/>
+        </w:rPr>
+        <w:t>8</w:t>
+      </w:r>
+      <w:r>
+        <w:rPr>
+          <w:rFonts w:ascii="TH SarabunPSK" w:hAnsi="TH SarabunPSK" w:cs="TH SarabunPSK"/>
+          <w:sz w:val="32"/>
+          <w:szCs w:val="32"/>
+        </w:rPr>
+        <w:t xml:space="preserve">n </w:t>
+      </w:r>
+      <w:r>
+        <w:rPr>
+          <w:rFonts w:ascii="TH SarabunPSK" w:hAnsi="TH SarabunPSK" w:cs="TH SarabunPSK"/>
+          <w:sz w:val="32"/>
+          <w:szCs w:val="32"/>
+          <w:cs/>
+        </w:rPr>
+        <w:t>จึงตอบโจทย์ด้วยการทำให้ข้อมูลและการแจ้งเตือนไหลผ่านช่องทางเดียวกันอย่างเป็นระบบ ลดงานซ้ำซ้อน สร้างมาตรฐานการสื่อสารที่ตรวจสอบย้อนหลังได้ เพิ่มความถูกต้องของข้อมูล และยกระดับประสบการณ์ทำงานของพนักงานให้เรียบง่ายขึ้น ที่สำคัญ โครงสร้างแบบ</w:t>
+      </w:r>
+      <w:proofErr w:type="spellStart"/>
+      <w:r>
+        <w:rPr>
+          <w:rFonts w:ascii="TH SarabunPSK" w:hAnsi="TH SarabunPSK" w:cs="TH SarabunPSK"/>
+          <w:sz w:val="32"/>
+          <w:szCs w:val="32"/>
+          <w:cs/>
+        </w:rPr>
+        <w:t>เวิร์กโฟลว์</w:t>
+      </w:r>
+      <w:proofErr w:type="spellEnd"/>
+      <w:r>
+        <w:rPr>
+          <w:rFonts w:ascii="TH SarabunPSK" w:hAnsi="TH SarabunPSK" w:cs="TH SarabunPSK"/>
+          <w:sz w:val="32"/>
+          <w:szCs w:val="32"/>
+          <w:cs/>
+        </w:rPr>
+        <w:t xml:space="preserve">ของ </w:t>
+      </w:r>
+      <w:r>
+        <w:rPr>
+          <w:rFonts w:ascii="TH SarabunPSK" w:hAnsi="TH SarabunPSK" w:cs="TH SarabunPSK"/>
+          <w:sz w:val="32"/>
+          <w:szCs w:val="32"/>
+        </w:rPr>
+        <w:t>n</w:t>
+      </w:r>
+      <w:r>
+        <w:rPr>
+          <w:rFonts w:ascii="TH SarabunPSK" w:hAnsi="TH SarabunPSK" w:cs="TH SarabunPSK"/>
+          <w:sz w:val="32"/>
+          <w:szCs w:val="32"/>
+          <w:cs/>
+        </w:rPr>
+        <w:t>8</w:t>
+      </w:r>
+      <w:r>
+        <w:rPr>
+          <w:rFonts w:ascii="TH SarabunPSK" w:hAnsi="TH SarabunPSK" w:cs="TH SarabunPSK"/>
+          <w:sz w:val="32"/>
+          <w:szCs w:val="32"/>
+        </w:rPr>
+        <w:t xml:space="preserve">n </w:t>
+      </w:r>
+      <w:r>
+        <w:rPr>
+          <w:rFonts w:ascii="TH SarabunPSK" w:hAnsi="TH SarabunPSK" w:cs="TH SarabunPSK"/>
+          <w:sz w:val="32"/>
+          <w:szCs w:val="32"/>
+          <w:cs/>
+        </w:rPr>
+        <w:t>ทำให้ระบบสามารถเริ่มจากหลายงานย่อยและค่อยๆ บูรณาการเป็นแพลตฟอร์มเดียวในอนาคตได้โดยไม่ต้องรื้อทั้งหมด ช่วยควบคุมต้นทุนและรองรับการเติบโตขององค์กรมากขึ้</w:t>
+      </w:r>
+      <w:r>
+        <w:rPr>
+          <w:rFonts w:ascii="TH SarabunPSK" w:hAnsi="TH SarabunPSK" w:cs="TH SarabunPSK" w:hint="cs"/>
+          <w:sz w:val="32"/>
+          <w:szCs w:val="32"/>
+          <w:cs/>
+        </w:rPr>
+        <w:t>น</w:t>
       </w:r>
     </w:p>
     <w:p>
       <w:pPr>
         <w:spacing w:after="0"/>
         <w:ind w:firstLine="709"/>
+        <w:jc w:val="both"/>
         <w:rPr>
           <w:rFonts w:ascii="TH SarabunPSK" w:hAnsi="TH SarabunPSK" w:cs="TH SarabunPSK"/>
           <w:sz w:val="32"/>
           <w:szCs w:val="32"/>
         </w:rPr>
       </w:pPr>
-      <w:r>
-        <w:rPr>
-          <w:rFonts w:ascii="TH SarabunPSK" w:hAnsi="TH SarabunPSK" w:cs="TH SarabunPSK"/>
-          <w:sz w:val="32"/>
-          <w:szCs w:val="32"/>
-          <w:cs/>
-        </w:rPr>
-        <w:t>1.2.3</w:t>
-      </w:r>
-      <w:r>
-        <w:rPr>
-          <w:rFonts w:ascii="TH SarabunPSK" w:hAnsi="TH SarabunPSK" w:cs="TH SarabunPSK"/>
-          <w:color w:val="FFFFFF" w:themeColor="background1"/>
-          <w:sz w:val="32"/>
-          <w:szCs w:val="32"/>
-        </w:rPr>
-        <w:t>**</w:t>
-      </w:r>
-      <w:r>
-        <w:rPr>
-          <w:rFonts w:ascii="TH SarabunPSK" w:hAnsi="TH SarabunPSK" w:cs="TH SarabunPSK"/>
-          <w:sz w:val="32"/>
-          <w:szCs w:val="32"/>
-          <w:cs/>
-        </w:rPr>
-        <w:t>เพื่อหาความพึงพอใจของผู้ใช้ระบบ</w:t>
-      </w:r>
-      <w:r>
-        <w:rPr>
-          <w:rFonts w:ascii="TH SarabunPSK" w:hAnsi="TH SarabunPSK" w:cs="TH SarabunPSK"/>
-          <w:sz w:val="32"/>
-          <w:szCs w:val="32"/>
-          <w:cs/>
-        </w:rPr>
-        <w:t xml:space="preserve">ผู้ช่วยอัตโนมัติ </w:t>
-      </w:r>
-      <w:r>
-        <w:rPr>
-          <w:rFonts w:ascii="TH SarabunPSK" w:hAnsi="TH SarabunPSK" w:cs="TH SarabunPSK"/>
-          <w:sz w:val="32"/>
-          <w:szCs w:val="32"/>
-        </w:rPr>
-        <w:t>n</w:t>
-      </w:r>
-      <w:r>
-        <w:rPr>
-          <w:rFonts w:ascii="TH SarabunPSK" w:hAnsi="TH SarabunPSK" w:cs="TH SarabunPSK"/>
-          <w:sz w:val="32"/>
-          <w:szCs w:val="32"/>
-          <w:cs/>
-        </w:rPr>
-        <w:t>8</w:t>
-      </w:r>
-      <w:r>
-        <w:rPr>
-          <w:rFonts w:ascii="TH SarabunPSK" w:hAnsi="TH SarabunPSK" w:cs="TH SarabunPSK"/>
-          <w:sz w:val="32"/>
-          <w:szCs w:val="32"/>
-        </w:rPr>
-        <w:t xml:space="preserve">n </w:t>
-      </w:r>
-      <w:r>
-        <w:rPr>
-          <w:rFonts w:ascii="TH SarabunPSK" w:hAnsi="TH SarabunPSK" w:cs="TH SarabunPSK"/>
-          <w:sz w:val="32"/>
-          <w:szCs w:val="32"/>
-          <w:cs/>
-        </w:rPr>
-        <w:t xml:space="preserve">ผ่าน </w:t>
-      </w:r>
-      <w:r>
-        <w:rPr>
-          <w:rFonts w:ascii="TH SarabunPSK" w:hAnsi="TH SarabunPSK" w:cs="TH SarabunPSK"/>
-          <w:sz w:val="32"/>
-          <w:szCs w:val="32"/>
-        </w:rPr>
-        <w:t>LINE OA</w:t>
-      </w:r>
-      <w:r>
-        <w:rPr>
-          <w:rFonts w:ascii="TH SarabunPSK" w:hAnsi="TH SarabunPSK" w:cs="TH SarabunPSK" w:hint="cs"/>
-          <w:sz w:val="32"/>
-          <w:szCs w:val="32"/>
-          <w:cs/>
-        </w:rPr>
-        <w:t xml:space="preserve"> </w:t>
-      </w:r>
-      <w:r>
-        <w:rPr>
-          <w:rFonts w:ascii="TH SarabunPSK" w:hAnsi="TH SarabunPSK" w:cs="TH SarabunPSK"/>
-          <w:sz w:val="32"/>
-          <w:szCs w:val="32"/>
-          <w:cs/>
-        </w:rPr>
-        <w:t>สำหรับองค์กร</w:t>
-      </w:r>
-      <w:r>
-        <w:rPr>
-          <w:rFonts w:ascii="TH SarabunPSK" w:hAnsi="TH SarabunPSK" w:cs="TH SarabunPSK" w:hint="cs"/>
-          <w:sz w:val="32"/>
-          <w:szCs w:val="32"/>
-          <w:cs/>
-        </w:rPr>
-        <w:t xml:space="preserve"> </w:t>
-      </w:r>
-      <w:r>
-        <w:rPr>
-          <w:rFonts w:ascii="TH SarabunPSK" w:hAnsi="TH SarabunPSK" w:cs="TH SarabunPSK"/>
-          <w:sz w:val="32"/>
-          <w:szCs w:val="32"/>
-          <w:cs/>
-        </w:rPr>
-        <w:t>ภายหลังการทดลองใช้ระบบที่พัฒนาขึ้น</w:t>
-      </w:r>
     </w:p>
     <w:p>
       <w:pPr>
         <w:spacing w:after="0"/>
-        <w:rPr>
-          <w:rFonts w:ascii="TH SarabunPSK" w:eastAsia="Times New Roman" w:hAnsi="TH SarabunPSK" w:cs="TH SarabunPSK"/>
-          <w:kern w:val="0"/>
-          <w:szCs w:val="24"/>
-          <w14:ligatures w14:val="none"/>
+        <w:ind w:firstLine="709"/>
+        <w:jc w:val="both"/>
+        <w:rPr>
+          <w:rFonts w:ascii="TH SarabunPSK" w:hAnsi="TH SarabunPSK" w:cs="TH SarabunPSK"/>
+          <w:sz w:val="32"/>
+          <w:szCs w:val="32"/>
         </w:rPr>
       </w:pPr>
-      <w:r>
-        <w:rPr>
-          <w:rFonts w:ascii="TH SarabunPSK" w:eastAsia="Times New Roman" w:hAnsi="TH SarabunPSK" w:cs="TH SarabunPSK" w:hint="cs"/>
-          <w:b/>
-          <w:bCs/>
-          <w:color w:val="000000"/>
-          <w:kern w:val="0"/>
-          <w:sz w:val="32"/>
-          <w:szCs w:val="32"/>
-          <w14:ligatures w14:val="none"/>
-        </w:rPr>
-        <w:t>1.3</w:t>
-      </w:r>
-      <w:r>
-        <w:rPr>
-          <w:rFonts w:ascii="TH SarabunPSK" w:eastAsia="Times New Roman" w:hAnsi="TH SarabunPSK" w:cs="TH SarabunPSK"/>
-          <w:b/>
-          <w:bCs/>
-          <w:color w:val="FFFFFF" w:themeColor="background1"/>
-          <w:kern w:val="0"/>
-          <w:sz w:val="32"/>
-          <w:szCs w:val="32"/>
-          <w14:ligatures w14:val="none"/>
-        </w:rPr>
-        <w:t>**</w:t>
-      </w:r>
-      <w:r>
-        <w:rPr>
-          <w:rFonts w:ascii="TH SarabunPSK" w:eastAsia="Times New Roman" w:hAnsi="TH SarabunPSK" w:cs="TH SarabunPSK" w:hint="cs"/>
-          <w:b/>
-          <w:bCs/>
-          <w:color w:val="000000"/>
-          <w:kern w:val="0"/>
-          <w:sz w:val="32"/>
-          <w:szCs w:val="32"/>
-          <w:cs/>
-          <w14:ligatures w14:val="none"/>
-        </w:rPr>
-        <w:t>สมมติฐาน</w:t>
-      </w:r>
+    </w:p>
+    <w:p>
+      <w:pPr>
+        <w:spacing w:after="0"/>
+        <w:ind w:firstLine="709"/>
+        <w:jc w:val="both"/>
+        <w:rPr>
+          <w:rFonts w:ascii="TH SarabunPSK" w:hAnsi="TH SarabunPSK" w:cs="TH SarabunPSK"/>
+          <w:sz w:val="32"/>
+          <w:szCs w:val="32"/>
+        </w:rPr>
+      </w:pPr>
     </w:p>
     <w:p>
       <w:pPr>
         <w:spacing w:after="0"/>
         <w:jc w:val="both"/>
         <w:rPr>
-          <w:rFonts w:ascii="TH SarabunPSK" w:eastAsia="Times New Roman" w:hAnsi="TH SarabunPSK" w:cs="TH SarabunPSK"/>
-          <w:kern w:val="0"/>
-          <w:szCs w:val="24"/>
-          <w14:ligatures w14:val="none"/>
+          <w:rFonts w:ascii="TH SarabunPSK" w:hAnsi="TH SarabunPSK" w:cs="TH SarabunPSK"/>
+          <w:sz w:val="32"/>
+          <w:szCs w:val="32"/>
         </w:rPr>
       </w:pPr>
       <w:r>
         <w:rPr>
-          <w:rFonts w:ascii="TH SarabunPSK" w:eastAsia="Times New Roman" w:hAnsi="TH SarabunPSK" w:cs="TH SarabunPSK" w:hint="cs"/>
-          <w:color w:val="000000"/>
-          <w:kern w:val="0"/>
-          <w:sz w:val="32"/>
-          <w:szCs w:val="32"/>
-          <w14:ligatures w14:val="none"/>
-        </w:rPr>
-        <w:tab/>
-        <w:t>1.3.1</w:t>
-      </w:r>
-      <w:r>
-        <w:rPr>
-          <w:rFonts w:ascii="TH SarabunPSK" w:eastAsia="Times New Roman" w:hAnsi="TH SarabunPSK" w:cs="TH SarabunPSK"/>
-          <w:color w:val="FFFFFF" w:themeColor="background1"/>
-          <w:kern w:val="0"/>
-          <w:sz w:val="32"/>
-          <w:szCs w:val="32"/>
-          <w14:ligatures w14:val="none"/>
-        </w:rPr>
-        <w:t>**</w:t>
-      </w:r>
-      <w:r>
-        <w:rPr>
-          <w:rFonts w:ascii="TH SarabunPSK" w:eastAsia="Times New Roman" w:hAnsi="TH SarabunPSK" w:cs="TH SarabunPSK" w:hint="cs"/>
-          <w:color w:val="000000"/>
-          <w:kern w:val="0"/>
-          <w:sz w:val="32"/>
-          <w:szCs w:val="32"/>
-          <w:cs/>
-          <w14:ligatures w14:val="none"/>
-        </w:rPr>
-        <w:t>ความคิดเห็นของผู้เชี่ยวชาญที่มีต่อประสิทธิภาพของระบบ</w:t>
-      </w:r>
-      <w:r>
-        <w:rPr>
-          <w:rFonts w:ascii="TH SarabunPSK" w:hAnsi="TH SarabunPSK" w:cs="TH SarabunPSK"/>
-          <w:sz w:val="32"/>
-          <w:szCs w:val="32"/>
-          <w:cs/>
-        </w:rPr>
-        <w:t xml:space="preserve">ผู้ช่วยอัตโนมัติ </w:t>
+          <w:rFonts w:ascii="TH SarabunPSK" w:hAnsi="TH SarabunPSK" w:cs="TH SarabunPSK"/>
+          <w:sz w:val="32"/>
+          <w:szCs w:val="32"/>
+          <w:cs/>
+        </w:rPr>
+        <w:t xml:space="preserve">กล่าวโดยสรุป โครงการนี้มีที่มาจากความต้องการแก้ </w:t>
+      </w:r>
+      <w:r>
+        <w:rPr>
+          <w:rFonts w:ascii="TH SarabunPSK" w:hAnsi="TH SarabunPSK" w:cs="TH SarabunPSK"/>
+          <w:sz w:val="32"/>
+          <w:szCs w:val="32"/>
+        </w:rPr>
+        <w:t>“</w:t>
+      </w:r>
+      <w:r>
+        <w:rPr>
+          <w:rFonts w:ascii="TH SarabunPSK" w:hAnsi="TH SarabunPSK" w:cs="TH SarabunPSK"/>
+          <w:sz w:val="32"/>
+          <w:szCs w:val="32"/>
+          <w:cs/>
+        </w:rPr>
+        <w:t>งานประจำที่สำคัญแต่สิ้นเปลืองเวลา</w:t>
+      </w:r>
+      <w:r>
+        <w:rPr>
+          <w:rFonts w:ascii="TH SarabunPSK" w:hAnsi="TH SarabunPSK" w:cs="TH SarabunPSK"/>
+          <w:sz w:val="32"/>
+          <w:szCs w:val="32"/>
+        </w:rPr>
+        <w:t xml:space="preserve">” </w:t>
+      </w:r>
+      <w:r>
+        <w:rPr>
+          <w:rFonts w:ascii="TH SarabunPSK" w:hAnsi="TH SarabunPSK" w:cs="TH SarabunPSK"/>
+          <w:sz w:val="32"/>
+          <w:szCs w:val="32"/>
+          <w:cs/>
+        </w:rPr>
+        <w:t xml:space="preserve">ให้เป็นอัตโนมัติและเชื่อมต่อกันทั้งเส้นทาง ด้วย </w:t>
       </w:r>
       <w:r>
         <w:rPr>
@@ -1347,85 +875,612 @@
           <w:szCs w:val="32"/>
           <w:cs/>
         </w:rPr>
-        <w:t xml:space="preserve">ผ่าน </w:t>
-      </w:r>
-      <w:r>
-        <w:rPr>
-          <w:rFonts w:ascii="TH SarabunPSK" w:hAnsi="TH SarabunPSK" w:cs="TH SarabunPSK"/>
-          <w:sz w:val="32"/>
-          <w:szCs w:val="32"/>
-        </w:rPr>
-        <w:t>LINE OA</w:t>
-      </w:r>
-      <w:r>
-        <w:rPr>
-          <w:rFonts w:ascii="TH SarabunPSK" w:hAnsi="TH SarabunPSK" w:cs="TH SarabunPSK" w:hint="cs"/>
-          <w:sz w:val="32"/>
-          <w:szCs w:val="32"/>
-          <w:cs/>
-        </w:rPr>
-        <w:t xml:space="preserve"> </w:t>
-      </w:r>
-      <w:r>
-        <w:rPr>
-          <w:rFonts w:ascii="TH SarabunPSK" w:hAnsi="TH SarabunPSK" w:cs="TH SarabunPSK"/>
-          <w:sz w:val="32"/>
-          <w:szCs w:val="32"/>
-          <w:cs/>
-        </w:rPr>
-        <w:t>สำหรับองค์กร</w:t>
-      </w:r>
-      <w:r>
-        <w:rPr>
-          <w:rFonts w:ascii="TH SarabunPSK" w:eastAsia="Times New Roman" w:hAnsi="TH SarabunPSK" w:cs="TH SarabunPSK" w:hint="cs"/>
-          <w:color w:val="000000"/>
-          <w:kern w:val="0"/>
-          <w:sz w:val="32"/>
-          <w:szCs w:val="32"/>
-          <w:cs/>
-          <w14:ligatures w14:val="none"/>
-        </w:rPr>
-        <w:t xml:space="preserve"> </w:t>
-      </w:r>
-      <w:r>
-        <w:rPr>
-          <w:rFonts w:ascii="TH SarabunPSK" w:eastAsia="Times New Roman" w:hAnsi="TH SarabunPSK" w:cs="TH SarabunPSK" w:hint="cs"/>
-          <w:color w:val="000000"/>
-          <w:kern w:val="0"/>
-          <w:sz w:val="32"/>
-          <w:szCs w:val="32"/>
-          <w:cs/>
-          <w14:ligatures w14:val="none"/>
-        </w:rPr>
-        <w:t>ที่พัฒนาขึ้</w:t>
-      </w:r>
-      <w:r>
-        <w:rPr>
-          <w:rFonts w:ascii="TH SarabunPSK" w:eastAsia="Times New Roman" w:hAnsi="TH SarabunPSK" w:cs="TH SarabunPSK" w:hint="cs"/>
-          <w:color w:val="000000"/>
-          <w:kern w:val="0"/>
-          <w:sz w:val="32"/>
-          <w:szCs w:val="32"/>
-          <w:cs/>
-          <w14:ligatures w14:val="none"/>
-        </w:rPr>
-        <w:t>น อยู่ในระดับ</w:t>
-      </w:r>
-      <w:r>
-        <w:rPr>
-          <w:rFonts w:ascii="TH SarabunPSK" w:eastAsia="Times New Roman" w:hAnsi="TH SarabunPSK" w:cs="TH SarabunPSK" w:hint="cs"/>
-          <w:color w:val="000000"/>
-          <w:kern w:val="0"/>
-          <w:sz w:val="32"/>
-          <w:szCs w:val="32"/>
-          <w:cs/>
-          <w14:ligatures w14:val="none"/>
-        </w:rPr>
-        <w:t>พอใช้</w:t>
+        <w:t>ในบทบาทเลขาออฟฟิศดิจิทัล องค์กรจะได้ทั้งความแม่นยำ ความรวดเร็ว ความโปร่งใสในการทำงาน และความพร้อมต่อการขยายตัวในระยะยาว</w:t>
       </w:r>
     </w:p>
     <w:p>
       <w:pPr>
+        <w:spacing w:after="0"/>
+        <w:rPr>
+          <w:rFonts w:ascii="TH SarabunPSK" w:hAnsi="TH SarabunPSK" w:cs="TH SarabunPSK"/>
+          <w:b/>
+          <w:bCs/>
+          <w:sz w:val="32"/>
+          <w:szCs w:val="32"/>
+        </w:rPr>
+      </w:pPr>
+      <w:r>
+        <w:rPr>
+          <w:rFonts w:ascii="TH SarabunPSK" w:hAnsi="TH SarabunPSK" w:cs="TH SarabunPSK"/>
+          <w:b/>
+          <w:bCs/>
+          <w:sz w:val="32"/>
+          <w:szCs w:val="32"/>
+          <w:cs/>
+        </w:rPr>
+        <w:t>1.2</w:t>
+      </w:r>
+      <w:r>
+        <w:rPr>
+          <w:rFonts w:ascii="TH SarabunPSK" w:hAnsi="TH SarabunPSK" w:cs="TH SarabunPSK"/>
+          <w:b/>
+          <w:bCs/>
+          <w:color w:val="FFFFFF" w:themeColor="background1"/>
+          <w:sz w:val="32"/>
+          <w:szCs w:val="32"/>
+        </w:rPr>
+        <w:t>**</w:t>
+      </w:r>
+      <w:r>
+        <w:rPr>
+          <w:rFonts w:ascii="TH SarabunPSK" w:hAnsi="TH SarabunPSK" w:cs="TH SarabunPSK"/>
+          <w:b/>
+          <w:bCs/>
+          <w:sz w:val="32"/>
+          <w:szCs w:val="32"/>
+          <w:cs/>
+        </w:rPr>
+        <w:t>วัตถุประสงค์</w:t>
+      </w:r>
+    </w:p>
+    <w:p>
+      <w:pPr>
+        <w:spacing w:after="0"/>
+        <w:ind w:firstLine="709"/>
+        <w:rPr>
+          <w:rFonts w:ascii="TH SarabunPSK" w:hAnsi="TH SarabunPSK" w:cs="TH SarabunPSK"/>
+          <w:sz w:val="32"/>
+          <w:szCs w:val="32"/>
+          <w:cs/>
+        </w:rPr>
+      </w:pPr>
+      <w:r>
+        <w:rPr>
+          <w:rFonts w:ascii="TH SarabunPSK" w:hAnsi="TH SarabunPSK" w:cs="TH SarabunPSK"/>
+          <w:sz w:val="32"/>
+          <w:szCs w:val="32"/>
+          <w:cs/>
+        </w:rPr>
+        <w:t>1.2.1</w:t>
+      </w:r>
+      <w:r>
+        <w:rPr>
+          <w:rFonts w:ascii="TH SarabunPSK" w:hAnsi="TH SarabunPSK" w:cs="TH SarabunPSK"/>
+          <w:color w:val="FFFFFF" w:themeColor="background1"/>
+          <w:sz w:val="32"/>
+          <w:szCs w:val="32"/>
+        </w:rPr>
+        <w:t>**</w:t>
+      </w:r>
+      <w:r>
+        <w:rPr>
+          <w:rFonts w:ascii="TH SarabunPSK" w:hAnsi="TH SarabunPSK" w:cs="TH SarabunPSK"/>
+          <w:sz w:val="32"/>
+          <w:szCs w:val="32"/>
+          <w:cs/>
+        </w:rPr>
+        <w:t>เพื่อพัฒนา</w:t>
+      </w:r>
+      <w:r>
+        <w:rPr>
+          <w:rFonts w:ascii="TH SarabunPSK" w:hAnsi="TH SarabunPSK" w:cs="TH SarabunPSK"/>
+          <w:sz w:val="32"/>
+          <w:szCs w:val="32"/>
+          <w:cs/>
+        </w:rPr>
+        <w:t xml:space="preserve">ระบบผู้ช่วยอัตโนมัติ </w:t>
+      </w:r>
+      <w:r>
+        <w:rPr>
+          <w:rFonts w:ascii="TH SarabunPSK" w:hAnsi="TH SarabunPSK" w:cs="TH SarabunPSK"/>
+          <w:sz w:val="32"/>
+          <w:szCs w:val="32"/>
+        </w:rPr>
+        <w:t>n</w:t>
+      </w:r>
+      <w:r>
+        <w:rPr>
+          <w:rFonts w:ascii="TH SarabunPSK" w:hAnsi="TH SarabunPSK" w:cs="TH SarabunPSK"/>
+          <w:sz w:val="32"/>
+          <w:szCs w:val="32"/>
+          <w:cs/>
+        </w:rPr>
+        <w:t>8</w:t>
+      </w:r>
+      <w:r>
+        <w:rPr>
+          <w:rFonts w:ascii="TH SarabunPSK" w:hAnsi="TH SarabunPSK" w:cs="TH SarabunPSK"/>
+          <w:sz w:val="32"/>
+          <w:szCs w:val="32"/>
+        </w:rPr>
+        <w:t xml:space="preserve">n </w:t>
+      </w:r>
+      <w:r>
+        <w:rPr>
+          <w:rFonts w:ascii="TH SarabunPSK" w:hAnsi="TH SarabunPSK" w:cs="TH SarabunPSK"/>
+          <w:sz w:val="32"/>
+          <w:szCs w:val="32"/>
+          <w:cs/>
+        </w:rPr>
+        <w:t xml:space="preserve">ผ่าน </w:t>
+      </w:r>
+      <w:r>
+        <w:rPr>
+          <w:rFonts w:ascii="TH SarabunPSK" w:hAnsi="TH SarabunPSK" w:cs="TH SarabunPSK"/>
+          <w:sz w:val="32"/>
+          <w:szCs w:val="32"/>
+        </w:rPr>
+        <w:t>LINE OA</w:t>
+      </w:r>
+      <w:r>
+        <w:rPr>
+          <w:rFonts w:ascii="TH SarabunPSK" w:hAnsi="TH SarabunPSK" w:cs="TH SarabunPSK" w:hint="cs"/>
+          <w:sz w:val="32"/>
+          <w:szCs w:val="32"/>
+          <w:cs/>
+        </w:rPr>
+        <w:t xml:space="preserve"> </w:t>
+      </w:r>
+      <w:r>
+        <w:rPr>
+          <w:rFonts w:ascii="TH SarabunPSK" w:hAnsi="TH SarabunPSK" w:cs="TH SarabunPSK"/>
+          <w:sz w:val="32"/>
+          <w:szCs w:val="32"/>
+          <w:cs/>
+        </w:rPr>
+        <w:t>สำหรับองค์กร</w:t>
+      </w:r>
+    </w:p>
+    <w:p>
+      <w:pPr>
+        <w:spacing w:after="0"/>
+        <w:ind w:firstLine="709"/>
+        <w:rPr>
+          <w:rFonts w:ascii="TH SarabunPSK" w:hAnsi="TH SarabunPSK" w:cs="TH SarabunPSK"/>
+          <w:sz w:val="32"/>
+          <w:szCs w:val="32"/>
+        </w:rPr>
+      </w:pPr>
+      <w:r>
+        <w:rPr>
+          <w:rFonts w:ascii="TH SarabunPSK" w:hAnsi="TH SarabunPSK" w:cs="TH SarabunPSK"/>
+          <w:sz w:val="32"/>
+          <w:szCs w:val="32"/>
+          <w:cs/>
+        </w:rPr>
+        <w:t>1.2.2</w:t>
+      </w:r>
+      <w:r>
+        <w:rPr>
+          <w:rFonts w:ascii="TH SarabunPSK" w:hAnsi="TH SarabunPSK" w:cs="TH SarabunPSK"/>
+          <w:color w:val="FFFFFF" w:themeColor="background1"/>
+          <w:sz w:val="32"/>
+          <w:szCs w:val="32"/>
+        </w:rPr>
+        <w:t>**</w:t>
+      </w:r>
+      <w:r>
+        <w:rPr>
+          <w:rFonts w:ascii="TH SarabunPSK" w:hAnsi="TH SarabunPSK" w:cs="TH SarabunPSK"/>
+          <w:sz w:val="32"/>
+          <w:szCs w:val="32"/>
+          <w:cs/>
+        </w:rPr>
+        <w:t>เพื่อหาประสิทธิภาพของระบบ</w:t>
+      </w:r>
+      <w:r>
+        <w:rPr>
+          <w:rFonts w:ascii="TH SarabunPSK" w:hAnsi="TH SarabunPSK" w:cs="TH SarabunPSK"/>
+          <w:sz w:val="32"/>
+          <w:szCs w:val="32"/>
+          <w:cs/>
+        </w:rPr>
+        <w:t xml:space="preserve">ผู้ช่วยอัตโนมัติ </w:t>
+      </w:r>
+      <w:r>
+        <w:rPr>
+          <w:rFonts w:ascii="TH SarabunPSK" w:hAnsi="TH SarabunPSK" w:cs="TH SarabunPSK"/>
+          <w:sz w:val="32"/>
+          <w:szCs w:val="32"/>
+        </w:rPr>
+        <w:t>n</w:t>
+      </w:r>
+      <w:r>
+        <w:rPr>
+          <w:rFonts w:ascii="TH SarabunPSK" w:hAnsi="TH SarabunPSK" w:cs="TH SarabunPSK"/>
+          <w:sz w:val="32"/>
+          <w:szCs w:val="32"/>
+          <w:cs/>
+        </w:rPr>
+        <w:t>8</w:t>
+      </w:r>
+      <w:r>
+        <w:rPr>
+          <w:rFonts w:ascii="TH SarabunPSK" w:hAnsi="TH SarabunPSK" w:cs="TH SarabunPSK"/>
+          <w:sz w:val="32"/>
+          <w:szCs w:val="32"/>
+        </w:rPr>
+        <w:t xml:space="preserve">n </w:t>
+      </w:r>
+      <w:r>
+        <w:rPr>
+          <w:rFonts w:ascii="TH SarabunPSK" w:hAnsi="TH SarabunPSK" w:cs="TH SarabunPSK"/>
+          <w:sz w:val="32"/>
+          <w:szCs w:val="32"/>
+          <w:cs/>
+        </w:rPr>
+        <w:t xml:space="preserve">ผ่าน </w:t>
+      </w:r>
+      <w:r>
+        <w:rPr>
+          <w:rFonts w:ascii="TH SarabunPSK" w:hAnsi="TH SarabunPSK" w:cs="TH SarabunPSK"/>
+          <w:sz w:val="32"/>
+          <w:szCs w:val="32"/>
+        </w:rPr>
+        <w:t>LINE OA</w:t>
+      </w:r>
+      <w:r>
+        <w:rPr>
+          <w:rFonts w:ascii="TH SarabunPSK" w:hAnsi="TH SarabunPSK" w:cs="TH SarabunPSK" w:hint="cs"/>
+          <w:sz w:val="32"/>
+          <w:szCs w:val="32"/>
+          <w:cs/>
+        </w:rPr>
+        <w:t xml:space="preserve"> </w:t>
+      </w:r>
+      <w:r>
+        <w:rPr>
+          <w:rFonts w:ascii="TH SarabunPSK" w:hAnsi="TH SarabunPSK" w:cs="TH SarabunPSK"/>
+          <w:sz w:val="32"/>
+          <w:szCs w:val="32"/>
+          <w:cs/>
+        </w:rPr>
+        <w:t>สำหรับองค์กร</w:t>
+      </w:r>
+    </w:p>
+    <w:p>
+      <w:pPr>
+        <w:spacing w:after="0"/>
+        <w:ind w:firstLine="709"/>
+        <w:rPr>
+          <w:rFonts w:ascii="TH SarabunPSK" w:hAnsi="TH SarabunPSK" w:cs="TH SarabunPSK"/>
+          <w:sz w:val="32"/>
+          <w:szCs w:val="32"/>
+        </w:rPr>
+      </w:pPr>
+      <w:r>
+        <w:rPr>
+          <w:rFonts w:ascii="TH SarabunPSK" w:hAnsi="TH SarabunPSK" w:cs="TH SarabunPSK"/>
+          <w:sz w:val="32"/>
+          <w:szCs w:val="32"/>
+          <w:cs/>
+        </w:rPr>
+        <w:t>1.2.3</w:t>
+      </w:r>
+      <w:r>
+        <w:rPr>
+          <w:rFonts w:ascii="TH SarabunPSK" w:hAnsi="TH SarabunPSK" w:cs="TH SarabunPSK"/>
+          <w:color w:val="FFFFFF" w:themeColor="background1"/>
+          <w:sz w:val="32"/>
+          <w:szCs w:val="32"/>
+        </w:rPr>
+        <w:t>**</w:t>
+      </w:r>
+      <w:r>
+        <w:rPr>
+          <w:rFonts w:ascii="TH SarabunPSK" w:hAnsi="TH SarabunPSK" w:cs="TH SarabunPSK"/>
+          <w:sz w:val="32"/>
+          <w:szCs w:val="32"/>
+          <w:cs/>
+        </w:rPr>
+        <w:t>เพื่อหาความพึงพอใจของผู้ใช้ระบบ</w:t>
+      </w:r>
+      <w:r>
+        <w:rPr>
+          <w:rFonts w:ascii="TH SarabunPSK" w:hAnsi="TH SarabunPSK" w:cs="TH SarabunPSK"/>
+          <w:sz w:val="32"/>
+          <w:szCs w:val="32"/>
+          <w:cs/>
+        </w:rPr>
+        <w:t xml:space="preserve">ผู้ช่วยอัตโนมัติ </w:t>
+      </w:r>
+      <w:r>
+        <w:rPr>
+          <w:rFonts w:ascii="TH SarabunPSK" w:hAnsi="TH SarabunPSK" w:cs="TH SarabunPSK"/>
+          <w:sz w:val="32"/>
+          <w:szCs w:val="32"/>
+        </w:rPr>
+        <w:t>n</w:t>
+      </w:r>
+      <w:r>
+        <w:rPr>
+          <w:rFonts w:ascii="TH SarabunPSK" w:hAnsi="TH SarabunPSK" w:cs="TH SarabunPSK"/>
+          <w:sz w:val="32"/>
+          <w:szCs w:val="32"/>
+          <w:cs/>
+        </w:rPr>
+        <w:t>8</w:t>
+      </w:r>
+      <w:r>
+        <w:rPr>
+          <w:rFonts w:ascii="TH SarabunPSK" w:hAnsi="TH SarabunPSK" w:cs="TH SarabunPSK"/>
+          <w:sz w:val="32"/>
+          <w:szCs w:val="32"/>
+        </w:rPr>
+        <w:t xml:space="preserve">n </w:t>
+      </w:r>
+      <w:r>
+        <w:rPr>
+          <w:rFonts w:ascii="TH SarabunPSK" w:hAnsi="TH SarabunPSK" w:cs="TH SarabunPSK"/>
+          <w:sz w:val="32"/>
+          <w:szCs w:val="32"/>
+          <w:cs/>
+        </w:rPr>
+        <w:t xml:space="preserve">ผ่าน </w:t>
+      </w:r>
+      <w:r>
+        <w:rPr>
+          <w:rFonts w:ascii="TH SarabunPSK" w:hAnsi="TH SarabunPSK" w:cs="TH SarabunPSK"/>
+          <w:sz w:val="32"/>
+          <w:szCs w:val="32"/>
+        </w:rPr>
+        <w:t>LINE OA</w:t>
+      </w:r>
+      <w:r>
+        <w:rPr>
+          <w:rFonts w:ascii="TH SarabunPSK" w:hAnsi="TH SarabunPSK" w:cs="TH SarabunPSK" w:hint="cs"/>
+          <w:sz w:val="32"/>
+          <w:szCs w:val="32"/>
+          <w:cs/>
+        </w:rPr>
+        <w:t xml:space="preserve"> </w:t>
+      </w:r>
+      <w:r>
+        <w:rPr>
+          <w:rFonts w:ascii="TH SarabunPSK" w:hAnsi="TH SarabunPSK" w:cs="TH SarabunPSK"/>
+          <w:sz w:val="32"/>
+          <w:szCs w:val="32"/>
+          <w:cs/>
+        </w:rPr>
+        <w:t>สำหรับองค์กร</w:t>
+      </w:r>
+      <w:r>
+        <w:rPr>
+          <w:rFonts w:ascii="TH SarabunPSK" w:hAnsi="TH SarabunPSK" w:cs="TH SarabunPSK" w:hint="cs"/>
+          <w:sz w:val="32"/>
+          <w:szCs w:val="32"/>
+          <w:cs/>
+        </w:rPr>
+        <w:t xml:space="preserve"> </w:t>
+      </w:r>
+      <w:r>
+        <w:rPr>
+          <w:rFonts w:ascii="TH SarabunPSK" w:hAnsi="TH SarabunPSK" w:cs="TH SarabunPSK"/>
+          <w:sz w:val="32"/>
+          <w:szCs w:val="32"/>
+          <w:cs/>
+        </w:rPr>
+        <w:t>ภายหลังการทดลองใช้ระบบที่พัฒนาขึ้น</w:t>
+      </w:r>
+    </w:p>
+    <w:p>
+      <w:pPr>
+        <w:spacing w:after="0"/>
+        <w:rPr>
+          <w:rFonts w:ascii="TH SarabunPSK" w:eastAsia="Times New Roman" w:hAnsi="TH SarabunPSK" w:cs="TH SarabunPSK"/>
+          <w:kern w:val="0"/>
+          <w:szCs w:val="24"/>
+          <w14:ligatures w14:val="none"/>
+        </w:rPr>
+      </w:pPr>
+      <w:r>
+        <w:rPr>
+          <w:rFonts w:ascii="TH SarabunPSK" w:eastAsia="Times New Roman" w:hAnsi="TH SarabunPSK" w:cs="TH SarabunPSK" w:hint="cs"/>
+          <w:b/>
+          <w:bCs/>
+          <w:color w:val="000000"/>
+          <w:kern w:val="0"/>
+          <w:sz w:val="32"/>
+          <w:szCs w:val="32"/>
+          <w14:ligatures w14:val="none"/>
+        </w:rPr>
+        <w:t>1.3</w:t>
+      </w:r>
+      <w:r>
+        <w:rPr>
+          <w:rFonts w:ascii="TH SarabunPSK" w:eastAsia="Times New Roman" w:hAnsi="TH SarabunPSK" w:cs="TH SarabunPSK"/>
+          <w:b/>
+          <w:bCs/>
+          <w:color w:val="FFFFFF" w:themeColor="background1"/>
+          <w:kern w:val="0"/>
+          <w:sz w:val="32"/>
+          <w:szCs w:val="32"/>
+          <w14:ligatures w14:val="none"/>
+        </w:rPr>
+        <w:t>**</w:t>
+      </w:r>
+      <w:r>
+        <w:rPr>
+          <w:rFonts w:ascii="TH SarabunPSK" w:eastAsia="Times New Roman" w:hAnsi="TH SarabunPSK" w:cs="TH SarabunPSK" w:hint="cs"/>
+          <w:b/>
+          <w:bCs/>
+          <w:color w:val="000000"/>
+          <w:kern w:val="0"/>
+          <w:sz w:val="32"/>
+          <w:szCs w:val="32"/>
+          <w:cs/>
+          <w14:ligatures w14:val="none"/>
+        </w:rPr>
+        <w:t>สมมติฐาน</w:t>
+      </w:r>
+    </w:p>
+    <w:p>
+      <w:pPr>
+        <w:spacing w:after="0"/>
+        <w:jc w:val="both"/>
+        <w:rPr>
+          <w:rFonts w:ascii="TH SarabunPSK" w:eastAsia="Times New Roman" w:hAnsi="TH SarabunPSK" w:cs="TH SarabunPSK"/>
+          <w:kern w:val="0"/>
+          <w:szCs w:val="24"/>
+          <w14:ligatures w14:val="none"/>
+        </w:rPr>
+      </w:pPr>
+      <w:r>
+        <w:rPr>
+          <w:rFonts w:ascii="TH SarabunPSK" w:eastAsia="Times New Roman" w:hAnsi="TH SarabunPSK" w:cs="TH SarabunPSK" w:hint="cs"/>
+          <w:color w:val="000000"/>
+          <w:kern w:val="0"/>
+          <w:sz w:val="32"/>
+          <w:szCs w:val="32"/>
+          <w14:ligatures w14:val="none"/>
+        </w:rPr>
+        <w:tab/>
+        <w:t>1.3.1</w:t>
+      </w:r>
+      <w:r>
+        <w:rPr>
+          <w:rFonts w:ascii="TH SarabunPSK" w:eastAsia="Times New Roman" w:hAnsi="TH SarabunPSK" w:cs="TH SarabunPSK"/>
+          <w:color w:val="FFFFFF" w:themeColor="background1"/>
+          <w:kern w:val="0"/>
+          <w:sz w:val="32"/>
+          <w:szCs w:val="32"/>
+          <w14:ligatures w14:val="none"/>
+        </w:rPr>
+        <w:t>**</w:t>
+      </w:r>
+      <w:r>
+        <w:rPr>
+          <w:rFonts w:ascii="TH SarabunPSK" w:eastAsia="Times New Roman" w:hAnsi="TH SarabunPSK" w:cs="TH SarabunPSK" w:hint="cs"/>
+          <w:color w:val="000000"/>
+          <w:kern w:val="0"/>
+          <w:sz w:val="32"/>
+          <w:szCs w:val="32"/>
+          <w:cs/>
+          <w14:ligatures w14:val="none"/>
+        </w:rPr>
+        <w:t>ความคิดเห็นของผู้เชี่ยวชาญที่มีต่อประสิทธิภาพของระบบ</w:t>
+      </w:r>
+      <w:r>
+        <w:rPr>
+          <w:rFonts w:ascii="TH SarabunPSK" w:hAnsi="TH SarabunPSK" w:cs="TH SarabunPSK"/>
+          <w:sz w:val="32"/>
+          <w:szCs w:val="32"/>
+          <w:cs/>
+        </w:rPr>
+        <w:t xml:space="preserve">ผู้ช่วยอัตโนมัติ </w:t>
+      </w:r>
+      <w:r>
+        <w:rPr>
+          <w:rFonts w:ascii="TH SarabunPSK" w:hAnsi="TH SarabunPSK" w:cs="TH SarabunPSK"/>
+          <w:sz w:val="32"/>
+          <w:szCs w:val="32"/>
+        </w:rPr>
+        <w:t>n</w:t>
+      </w:r>
+      <w:r>
+        <w:rPr>
+          <w:rFonts w:ascii="TH SarabunPSK" w:hAnsi="TH SarabunPSK" w:cs="TH SarabunPSK"/>
+          <w:sz w:val="32"/>
+          <w:szCs w:val="32"/>
+          <w:cs/>
+        </w:rPr>
+        <w:t>8</w:t>
+      </w:r>
+      <w:r>
+        <w:rPr>
+          <w:rFonts w:ascii="TH SarabunPSK" w:hAnsi="TH SarabunPSK" w:cs="TH SarabunPSK"/>
+          <w:sz w:val="32"/>
+          <w:szCs w:val="32"/>
+        </w:rPr>
+        <w:t xml:space="preserve">n </w:t>
+      </w:r>
+      <w:r>
+        <w:rPr>
+          <w:rFonts w:ascii="TH SarabunPSK" w:hAnsi="TH SarabunPSK" w:cs="TH SarabunPSK"/>
+          <w:sz w:val="32"/>
+          <w:szCs w:val="32"/>
+          <w:cs/>
+        </w:rPr>
+        <w:t xml:space="preserve">ผ่าน </w:t>
+      </w:r>
+      <w:r>
+        <w:rPr>
+          <w:rFonts w:ascii="TH SarabunPSK" w:hAnsi="TH SarabunPSK" w:cs="TH SarabunPSK"/>
+          <w:sz w:val="32"/>
+          <w:szCs w:val="32"/>
+        </w:rPr>
+        <w:t>LINE OA</w:t>
+      </w:r>
+      <w:r>
+        <w:rPr>
+          <w:rFonts w:ascii="TH SarabunPSK" w:hAnsi="TH SarabunPSK" w:cs="TH SarabunPSK" w:hint="cs"/>
+          <w:sz w:val="32"/>
+          <w:szCs w:val="32"/>
+          <w:cs/>
+        </w:rPr>
+        <w:t xml:space="preserve"> </w:t>
+      </w:r>
+      <w:r>
+        <w:rPr>
+          <w:rFonts w:ascii="TH SarabunPSK" w:hAnsi="TH SarabunPSK" w:cs="TH SarabunPSK"/>
+          <w:sz w:val="32"/>
+          <w:szCs w:val="32"/>
+          <w:cs/>
+        </w:rPr>
+        <w:t>สำหรับองค์กร</w:t>
+      </w:r>
+      <w:r>
+        <w:rPr>
+          <w:rFonts w:ascii="TH SarabunPSK" w:eastAsia="Times New Roman" w:hAnsi="TH SarabunPSK" w:cs="TH SarabunPSK" w:hint="cs"/>
+          <w:color w:val="000000"/>
+          <w:kern w:val="0"/>
+          <w:sz w:val="32"/>
+          <w:szCs w:val="32"/>
+          <w:cs/>
+          <w14:ligatures w14:val="none"/>
+        </w:rPr>
+        <w:t xml:space="preserve"> </w:t>
+      </w:r>
+      <w:r>
+        <w:rPr>
+          <w:rFonts w:ascii="TH SarabunPSK" w:eastAsia="Times New Roman" w:hAnsi="TH SarabunPSK" w:cs="TH SarabunPSK" w:hint="cs"/>
+          <w:color w:val="000000"/>
+          <w:kern w:val="0"/>
+          <w:sz w:val="32"/>
+          <w:szCs w:val="32"/>
+          <w:cs/>
+          <w14:ligatures w14:val="none"/>
+        </w:rPr>
+        <w:t>ที่พัฒนาขึ้</w:t>
+      </w:r>
+      <w:r>
+        <w:rPr>
+          <w:rFonts w:ascii="TH SarabunPSK" w:eastAsia="Times New Roman" w:hAnsi="TH SarabunPSK" w:cs="TH SarabunPSK" w:hint="cs"/>
+          <w:color w:val="000000"/>
+          <w:kern w:val="0"/>
+          <w:sz w:val="32"/>
+          <w:szCs w:val="32"/>
+          <w:cs/>
+          <w14:ligatures w14:val="none"/>
+        </w:rPr>
+        <w:t>น อยู่ในระดับ</w:t>
+      </w:r>
+      <w:r>
+        <w:rPr>
+          <w:rFonts w:ascii="TH SarabunPSK" w:eastAsia="Times New Roman" w:hAnsi="TH SarabunPSK" w:cs="TH SarabunPSK" w:hint="cs"/>
+          <w:color w:val="000000"/>
+          <w:kern w:val="0"/>
+          <w:sz w:val="32"/>
+          <w:szCs w:val="32"/>
+          <w:cs/>
+          <w14:ligatures w14:val="none"/>
+        </w:rPr>
+        <w:t>พอใช้</w:t>
+      </w:r>
+    </w:p>
+    <w:p>
+      <w:pPr>
+        <w:spacing w:after="0"/>
         <w:ind w:firstLine="720"/>
         <w:rPr>
           <w:rFonts w:ascii="TH SarabunPSK" w:hAnsi="TH SarabunPSK" w:cs="TH SarabunPSK"/>
@@ -2152,7 +2207,7 @@
         <w:ind w:firstLine="2268"/>
         <w:jc w:val="both"/>
         <w:rPr>
-          <w:rFonts w:ascii="TH SarabunPSK" w:eastAsia="Times New Roman" w:hAnsi="TH SarabunPSK" w:cs="TH SarabunPSK" w:hint="cs"/>
+          <w:rFonts w:ascii="TH SarabunPSK" w:eastAsia="Times New Roman" w:hAnsi="TH SarabunPSK" w:cs="TH SarabunPSK"/>
           <w:kern w:val="0"/>
           <w:sz w:val="32"/>
           <w:szCs w:val="32"/>
@@ -2388,7 +2443,6 @@
           <w:cs/>
           <w14:ligatures w14:val="none"/>
         </w:rPr>
-        <w:lastRenderedPageBreak/>
         <w:t>4)</w:t>
       </w:r>
       <w:r>
@@ -2896,7 +2950,6 @@
           <w:kern w:val="0"/>
           <w:sz w:val="32"/>
           <w:szCs w:val="32"/>
-          <w:cs/>
           <w14:ligatures w14:val="none"/>
         </w:rPr>
       </w:pPr>
@@ -2943,6 +2996,21 @@
         </w:rPr>
         <w:t>แยกตามแผนกแต่ละตำแหน่ง</w:t>
       </w:r>
+    </w:p>
+    <w:p>
+      <w:pPr>
+        <w:spacing w:after="0"/>
+        <w:ind w:left="1548" w:firstLine="720"/>
+        <w:jc w:val="both"/>
+        <w:rPr>
+          <w:rFonts w:ascii="TH SarabunPSK" w:eastAsia="Times New Roman" w:hAnsi="TH SarabunPSK" w:cs="TH SarabunPSK"/>
+          <w:kern w:val="0"/>
+          <w:sz w:val="32"/>
+          <w:szCs w:val="32"/>
+          <w:cs/>
+          <w14:ligatures w14:val="none"/>
+        </w:rPr>
+      </w:pPr>
     </w:p>
     <w:p>
       <w:pPr>
@@ -2960,6 +3028,19 @@
     <w:p>
       <w:pPr>
         <w:spacing w:after="0"/>
+        <w:jc w:val="both"/>
+        <w:rPr>
+          <w:rFonts w:ascii="TH SarabunPSK" w:eastAsia="Times New Roman" w:hAnsi="TH SarabunPSK" w:cs="TH SarabunPSK"/>
+          <w:kern w:val="0"/>
+          <w:sz w:val="32"/>
+          <w:szCs w:val="32"/>
+          <w14:ligatures w14:val="none"/>
+        </w:rPr>
+      </w:pPr>
+    </w:p>
+    <w:p>
+      <w:pPr>
+        <w:spacing w:after="0"/>
         <w:rPr>
           <w:rFonts w:ascii="TH SarabunPSK" w:eastAsia="Times New Roman" w:hAnsi="TH SarabunPSK" w:cs="TH SarabunPSK"/>
           <w:b/>
@@ -2982,6 +3063,7 @@
           <w:szCs w:val="32"/>
           <w14:ligatures w14:val="none"/>
         </w:rPr>
+        <w:lastRenderedPageBreak/>
         <w:t>1.</w:t>
       </w:r>
       <w:r>
@@ -3469,10 +3551,11 @@
       </w:r>
       <w:r>
         <w:rPr>
-          <w:rFonts w:ascii="TH SarabunPSK" w:hAnsi="TH SarabunPSK" w:cs="TH SarabunPSK"/>
-          <w:kern w:val="0"/>
-          <w:sz w:val="32"/>
-          <w:szCs w:val="32"/>
+          <w:rFonts w:ascii="TH SarabunPSK" w:hAnsi="TH SarabunPSK" w:cs="TH SarabunPSK" w:hint="cs"/>
+          <w:kern w:val="0"/>
+          <w:sz w:val="32"/>
+          <w:szCs w:val="32"/>
+          <w:cs/>
         </w:rPr>
         <w:t xml:space="preserve"> </w:t>
       </w:r>
@@ -3623,7 +3706,6 @@
           <w:szCs w:val="32"/>
           <w14:ligatures w14:val="none"/>
         </w:rPr>
-        <w:lastRenderedPageBreak/>
         <w:t xml:space="preserve"> 1.5.5</w:t>
       </w:r>
       <w:r>
@@ -3639,7 +3721,7 @@
       </w:r>
       <w:r>
         <w:rPr>
-          <w:rStyle w:val="af3"/>
+          <w:rStyle w:val="Strong"/>
           <w:rFonts w:ascii="TH SarabunPSK" w:hAnsi="TH SarabunPSK" w:cs="TH SarabunPSK" w:hint="cs"/>
           <w:b w:val="0"/>
           <w:bCs w:val="0"/>
@@ -3650,7 +3732,7 @@
       </w:r>
       <w:r>
         <w:rPr>
-          <w:rStyle w:val="af3"/>
+          <w:rStyle w:val="Strong"/>
           <w:rFonts w:ascii="TH SarabunPSK" w:hAnsi="TH SarabunPSK" w:cs="TH SarabunPSK" w:hint="cs"/>
           <w:b w:val="0"/>
           <w:bCs w:val="0"/>
@@ -3696,7 +3778,7 @@
       </w:r>
       <w:r>
         <w:rPr>
-          <w:rStyle w:val="af4"/>
+          <w:rStyle w:val="Emphasis"/>
           <w:rFonts w:ascii="TH SarabunPSK" w:hAnsi="TH SarabunPSK" w:cs="TH SarabunPSK" w:hint="cs"/>
           <w:sz w:val="32"/>
           <w:szCs w:val="32"/>
@@ -3865,7 +3947,7 @@
       </w:pPr>
       <w:r>
         <w:rPr>
-          <w:rStyle w:val="af3"/>
+          <w:rStyle w:val="Strong"/>
           <w:rFonts w:ascii="TH SarabunPSK" w:hAnsi="TH SarabunPSK" w:cs="TH SarabunPSK" w:hint="cs"/>
           <w:b w:val="0"/>
           <w:bCs w:val="0"/>
@@ -3902,7 +3984,7 @@
       </w:r>
       <w:r>
         <w:rPr>
-          <w:rStyle w:val="af3"/>
+          <w:rStyle w:val="Strong"/>
           <w:rFonts w:ascii="TH SarabunPSK" w:hAnsi="TH SarabunPSK" w:cs="TH SarabunPSK" w:hint="cs"/>
           <w:b w:val="0"/>
           <w:bCs w:val="0"/>
@@ -3939,7 +4021,7 @@
       </w:r>
       <w:r>
         <w:rPr>
-          <w:rStyle w:val="af3"/>
+          <w:rStyle w:val="Strong"/>
           <w:rFonts w:ascii="TH SarabunPSK" w:hAnsi="TH SarabunPSK" w:cs="TH SarabunPSK" w:hint="cs"/>
           <w:b w:val="0"/>
           <w:bCs w:val="0"/>
@@ -3950,7 +4032,7 @@
       </w:r>
       <w:r>
         <w:rPr>
-          <w:rStyle w:val="af3"/>
+          <w:rStyle w:val="Strong"/>
           <w:rFonts w:ascii="TH SarabunPSK" w:hAnsi="TH SarabunPSK" w:cs="TH SarabunPSK"/>
           <w:b w:val="0"/>
           <w:bCs w:val="0"/>
@@ -3979,7 +4061,7 @@
       </w:r>
       <w:r>
         <w:rPr>
-          <w:rStyle w:val="af3"/>
+          <w:rStyle w:val="Strong"/>
           <w:rFonts w:ascii="TH SarabunPSK" w:hAnsi="TH SarabunPSK" w:cs="TH SarabunPSK" w:hint="cs"/>
           <w:b w:val="0"/>
           <w:bCs w:val="0"/>
@@ -4025,14 +4107,9 @@
       </w:r>
     </w:p>
     <w:sectPr>
-      <w:headerReference w:type="even" r:id="rId6"/>
-      <w:headerReference w:type="default" r:id="rId7"/>
-      <w:footerReference w:type="even" r:id="rId8"/>
-      <w:footerReference w:type="default" r:id="rId9"/>
-      <w:headerReference w:type="first" r:id="rId10"/>
-      <w:footerReference w:type="first" r:id="rId11"/>
+      <w:type w:val="continuous"/>
       <w:pgSz w:w="11906" w:h="16838"/>
-      <w:pgMar w:top="2880" w:right="1440" w:bottom="1440" w:left="2160" w:header="709" w:footer="709" w:gutter="0"/>
+      <w:pgMar w:top="2160" w:right="1440" w:bottom="1440" w:left="2160" w:header="709" w:footer="709" w:gutter="0"/>
       <w:cols w:space="708"/>
       <w:docGrid w:linePitch="360"/>
     </w:sectPr>
@@ -4041,7 +4118,7 @@
 </file>
 
 <file path=word/endnotes.xml><?xml version="1.0" encoding="utf-8"?>
-<w:endnotes xmlns:wpc="http://schemas.microsoft.com/office/word/2010/wordprocessingCanvas" xmlns:cx="http://schemas.microsoft.com/office/drawing/2014/chartex" xmlns:cx1="http://schemas.microsoft.com/office/drawing/2015/9/8/chartex" xmlns:cx2="http://schemas.microsoft.com/office/drawing/2015/10/21/chartex" xmlns:cx3="http://schemas.microsoft.com/office/drawing/2016/5/9/chartex" xmlns:cx4="http://schemas.microsoft.com/office/drawing/2016/5/10/chartex" xmlns:cx5="http://schemas.microsoft.com/office/drawing/2016/5/11/chartex" xmlns:cx6="http://schemas.microsoft.com/office/drawing/2016/5/12/chartex" xmlns:cx7="http://schemas.microsoft.com/office/drawing/2016/5/13/chartex" xmlns:cx8="http://schemas.microsoft.com/office/drawing/2016/5/14/chartex" xmlns:mc="http://schemas.openxmlformats.org/markup-compatibility/2006" xmlns:aink="http://schemas.microsoft.com/office/drawing/2016/ink" xmlns:am3d="http://schemas.microsoft.com/office/drawing/2017/model3d" xmlns:o="urn:schemas-microsoft-com:office:office" xmlns:oel="http://schemas.microsoft.com/office/2019/extlst" xmlns:r="http://schemas.openxmlformats.org/officeDocument/2006/relationships" xmlns:m="http://schemas.openxmlformats.org/officeDocument/2006/math" xmlns:v="urn:schemas-microsoft-com:vml" xmlns:wp14="http://schemas.microsoft.com/office/word/2010/wordprocessingDrawing" xmlns:wp="http://schemas.openxmlformats.org/drawingml/2006/wordprocessingDrawing" xmlns:w10="urn:schemas-microsoft-com:office:word" xmlns:w="http://schemas.openxmlformats.org/wordprocessingml/2006/main" xmlns:w14="http://schemas.microsoft.com/office/word/2010/wordml" xmlns:w15="http://schemas.microsoft.com/office/word/2012/wordml" xmlns:w16cex="http://schemas.microsoft.com/office/word/2018/wordml/cex" xmlns:w16cid="http://schemas.microsoft.com/office/word/2016/wordml/cid" xmlns:w16="http://schemas.microsoft.com/office/word/2018/wordml" xmlns:w16du="http://schemas.microsoft.com/office/word/2023/wordml/word16du" xmlns:w16sdtdh="http://schemas.microsoft.com/office/word/2020/wordml/sdtdatahash" xmlns:w16sdtfl="http://schemas.microsoft.com/office/word/2024/wordml/sdtformatlock" xmlns:w16se="http://schemas.microsoft.com/office/word/2015/wordml/symex" xmlns:wpg="http://schemas.microsoft.com/office/word/2010/wordprocessingGroup" xmlns:wpi="http://schemas.microsoft.com/office/word/2010/wordprocessingInk" xmlns:wne="http://schemas.microsoft.com/office/word/2006/wordml" xmlns:wps="http://schemas.microsoft.com/office/word/2010/wordprocessingShape" mc:Ignorable="w14 w15 w16se w16cid w16 w16cex w16sdtdh w16sdtfl w16du wp14">
+<w:endnotes xmlns:wpc="http://schemas.microsoft.com/office/word/2010/wordprocessingCanvas" xmlns:cx="http://schemas.microsoft.com/office/drawing/2014/chartex" xmlns:cx1="http://schemas.microsoft.com/office/drawing/2015/9/8/chartex" xmlns:cx2="http://schemas.microsoft.com/office/drawing/2015/10/21/chartex" xmlns:cx3="http://schemas.microsoft.com/office/drawing/2016/5/9/chartex" xmlns:cx4="http://schemas.microsoft.com/office/drawing/2016/5/10/chartex" xmlns:cx5="http://schemas.microsoft.com/office/drawing/2016/5/11/chartex" xmlns:cx6="http://schemas.microsoft.com/office/drawing/2016/5/12/chartex" xmlns:cx7="http://schemas.microsoft.com/office/drawing/2016/5/13/chartex" xmlns:cx8="http://schemas.microsoft.com/office/drawing/2016/5/14/chartex" xmlns:mc="http://schemas.openxmlformats.org/markup-compatibility/2006" xmlns:aink="http://schemas.microsoft.com/office/drawing/2016/ink" xmlns:am3d="http://schemas.microsoft.com/office/drawing/2017/model3d" xmlns:o="urn:schemas-microsoft-com:office:office" xmlns:r="http://schemas.openxmlformats.org/officeDocument/2006/relationships" xmlns:m="http://schemas.openxmlformats.org/officeDocument/2006/math" xmlns:v="urn:schemas-microsoft-com:vml" xmlns:wp14="http://schemas.microsoft.com/office/word/2010/wordprocessingDrawing" xmlns:wp="http://schemas.openxmlformats.org/drawingml/2006/wordprocessingDrawing" xmlns:w10="urn:schemas-microsoft-com:office:word" xmlns:w="http://schemas.openxmlformats.org/wordprocessingml/2006/main" xmlns:w14="http://schemas.microsoft.com/office/word/2010/wordml" xmlns:w15="http://schemas.microsoft.com/office/word/2012/wordml" xmlns:w16cex="http://schemas.microsoft.com/office/word/2018/wordml/cex" xmlns:w16cid="http://schemas.microsoft.com/office/word/2016/wordml/cid" xmlns:w16="http://schemas.microsoft.com/office/word/2018/wordml" xmlns:w16sdtdh="http://schemas.microsoft.com/office/word/2020/wordml/sdtdatahash" xmlns:w16se="http://schemas.microsoft.com/office/word/2015/wordml/symex" xmlns:wpg="http://schemas.microsoft.com/office/word/2010/wordprocessingGroup" xmlns:wpi="http://schemas.microsoft.com/office/word/2010/wordprocessingInk" xmlns:wne="http://schemas.microsoft.com/office/word/2006/wordml" xmlns:wps="http://schemas.microsoft.com/office/word/2010/wordprocessingShape" mc:Ignorable="w14 w15 w16se w16cid w16 w16cex w16sdtdh wp14">
   <w:endnote w:type="separator" w:id="-1">
     <w:p>
       <w:pPr>
@@ -4065,38 +4142,8 @@
 </w:endnotes>
 </file>
 
-<file path=word/footer1.xml><?xml version="1.0" encoding="utf-8"?>
-<w:ftr xmlns:wpc="http://schemas.microsoft.com/office/word/2010/wordprocessingCanvas" xmlns:cx="http://schemas.microsoft.com/office/drawing/2014/chartex" xmlns:cx1="http://schemas.microsoft.com/office/drawing/2015/9/8/chartex" xmlns:cx2="http://schemas.microsoft.com/office/drawing/2015/10/21/chartex" xmlns:cx3="http://schemas.microsoft.com/office/drawing/2016/5/9/chartex" xmlns:cx4="http://schemas.microsoft.com/office/drawing/2016/5/10/chartex" xmlns:cx5="http://schemas.microsoft.com/office/drawing/2016/5/11/chartex" xmlns:cx6="http://schemas.microsoft.com/office/drawing/2016/5/12/chartex" xmlns:cx7="http://schemas.microsoft.com/office/drawing/2016/5/13/chartex" xmlns:cx8="http://schemas.microsoft.com/office/drawing/2016/5/14/chartex" xmlns:mc="http://schemas.openxmlformats.org/markup-compatibility/2006" xmlns:aink="http://schemas.microsoft.com/office/drawing/2016/ink" xmlns:am3d="http://schemas.microsoft.com/office/drawing/2017/model3d" xmlns:o="urn:schemas-microsoft-com:office:office" xmlns:oel="http://schemas.microsoft.com/office/2019/extlst" xmlns:r="http://schemas.openxmlformats.org/officeDocument/2006/relationships" xmlns:m="http://schemas.openxmlformats.org/officeDocument/2006/math" xmlns:v="urn:schemas-microsoft-com:vml" xmlns:wp14="http://schemas.microsoft.com/office/word/2010/wordprocessingDrawing" xmlns:wp="http://schemas.openxmlformats.org/drawingml/2006/wordprocessingDrawing" xmlns:w10="urn:schemas-microsoft-com:office:word" xmlns:w="http://schemas.openxmlformats.org/wordprocessingml/2006/main" xmlns:w14="http://schemas.microsoft.com/office/word/2010/wordml" xmlns:w15="http://schemas.microsoft.com/office/word/2012/wordml" xmlns:w16cex="http://schemas.microsoft.com/office/word/2018/wordml/cex" xmlns:w16cid="http://schemas.microsoft.com/office/word/2016/wordml/cid" xmlns:w16="http://schemas.microsoft.com/office/word/2018/wordml" xmlns:w16du="http://schemas.microsoft.com/office/word/2023/wordml/word16du" xmlns:w16sdtdh="http://schemas.microsoft.com/office/word/2020/wordml/sdtdatahash" xmlns:w16sdtfl="http://schemas.microsoft.com/office/word/2024/wordml/sdtformatlock" xmlns:w16se="http://schemas.microsoft.com/office/word/2015/wordml/symex" xmlns:wpg="http://schemas.microsoft.com/office/word/2010/wordprocessingGroup" xmlns:wpi="http://schemas.microsoft.com/office/word/2010/wordprocessingInk" xmlns:wne="http://schemas.microsoft.com/office/word/2006/wordml" xmlns:wps="http://schemas.microsoft.com/office/word/2010/wordprocessingShape" mc:Ignorable="w14 w15 w16se w16cid w16 w16cex w16sdtdh w16sdtfl w16du wp14">
-  <w:p>
-    <w:pPr>
-      <w:pStyle w:val="af0"/>
-    </w:pPr>
-  </w:p>
-</w:ftr>
-</file>
-
-<file path=word/footer2.xml><?xml version="1.0" encoding="utf-8"?>
-<w:ftr xmlns:wpc="http://schemas.microsoft.com/office/word/2010/wordprocessingCanvas" xmlns:cx="http://schemas.microsoft.com/office/drawing/2014/chartex" xmlns:cx1="http://schemas.microsoft.com/office/drawing/2015/9/8/chartex" xmlns:cx2="http://schemas.microsoft.com/office/drawing/2015/10/21/chartex" xmlns:cx3="http://schemas.microsoft.com/office/drawing/2016/5/9/chartex" xmlns:cx4="http://schemas.microsoft.com/office/drawing/2016/5/10/chartex" xmlns:cx5="http://schemas.microsoft.com/office/drawing/2016/5/11/chartex" xmlns:cx6="http://schemas.microsoft.com/office/drawing/2016/5/12/chartex" xmlns:cx7="http://schemas.microsoft.com/office/drawing/2016/5/13/chartex" xmlns:cx8="http://schemas.microsoft.com/office/drawing/2016/5/14/chartex" xmlns:mc="http://schemas.openxmlformats.org/markup-compatibility/2006" xmlns:aink="http://schemas.microsoft.com/office/drawing/2016/ink" xmlns:am3d="http://schemas.microsoft.com/office/drawing/2017/model3d" xmlns:o="urn:schemas-microsoft-com:office:office" xmlns:oel="http://schemas.microsoft.com/office/2019/extlst" xmlns:r="http://schemas.openxmlformats.org/officeDocument/2006/relationships" xmlns:m="http://schemas.openxmlformats.org/officeDocument/2006/math" xmlns:v="urn:schemas-microsoft-com:vml" xmlns:wp14="http://schemas.microsoft.com/office/word/2010/wordprocessingDrawing" xmlns:wp="http://schemas.openxmlformats.org/drawingml/2006/wordprocessingDrawing" xmlns:w10="urn:schemas-microsoft-com:office:word" xmlns:w="http://schemas.openxmlformats.org/wordprocessingml/2006/main" xmlns:w14="http://schemas.microsoft.com/office/word/2010/wordml" xmlns:w15="http://schemas.microsoft.com/office/word/2012/wordml" xmlns:w16cex="http://schemas.microsoft.com/office/word/2018/wordml/cex" xmlns:w16cid="http://schemas.microsoft.com/office/word/2016/wordml/cid" xmlns:w16="http://schemas.microsoft.com/office/word/2018/wordml" xmlns:w16du="http://schemas.microsoft.com/office/word/2023/wordml/word16du" xmlns:w16sdtdh="http://schemas.microsoft.com/office/word/2020/wordml/sdtdatahash" xmlns:w16sdtfl="http://schemas.microsoft.com/office/word/2024/wordml/sdtformatlock" xmlns:w16se="http://schemas.microsoft.com/office/word/2015/wordml/symex" xmlns:wpg="http://schemas.microsoft.com/office/word/2010/wordprocessingGroup" xmlns:wpi="http://schemas.microsoft.com/office/word/2010/wordprocessingInk" xmlns:wne="http://schemas.microsoft.com/office/word/2006/wordml" xmlns:wps="http://schemas.microsoft.com/office/word/2010/wordprocessingShape" mc:Ignorable="w14 w15 w16se w16cid w16 w16cex w16sdtdh w16sdtfl w16du wp14">
-  <w:p>
-    <w:pPr>
-      <w:pStyle w:val="af0"/>
-    </w:pPr>
-  </w:p>
-</w:ftr>
-</file>
-
-<file path=word/footer3.xml><?xml version="1.0" encoding="utf-8"?>
-<w:ftr xmlns:wpc="http://schemas.microsoft.com/office/word/2010/wordprocessingCanvas" xmlns:cx="http://schemas.microsoft.com/office/drawing/2014/chartex" xmlns:cx1="http://schemas.microsoft.com/office/drawing/2015/9/8/chartex" xmlns:cx2="http://schemas.microsoft.com/office/drawing/2015/10/21/chartex" xmlns:cx3="http://schemas.microsoft.com/office/drawing/2016/5/9/chartex" xmlns:cx4="http://schemas.microsoft.com/office/drawing/2016/5/10/chartex" xmlns:cx5="http://schemas.microsoft.com/office/drawing/2016/5/11/chartex" xmlns:cx6="http://schemas.microsoft.com/office/drawing/2016/5/12/chartex" xmlns:cx7="http://schemas.microsoft.com/office/drawing/2016/5/13/chartex" xmlns:cx8="http://schemas.microsoft.com/office/drawing/2016/5/14/chartex" xmlns:mc="http://schemas.openxmlformats.org/markup-compatibility/2006" xmlns:aink="http://schemas.microsoft.com/office/drawing/2016/ink" xmlns:am3d="http://schemas.microsoft.com/office/drawing/2017/model3d" xmlns:o="urn:schemas-microsoft-com:office:office" xmlns:oel="http://schemas.microsoft.com/office/2019/extlst" xmlns:r="http://schemas.openxmlformats.org/officeDocument/2006/relationships" xmlns:m="http://schemas.openxmlformats.org/officeDocument/2006/math" xmlns:v="urn:schemas-microsoft-com:vml" xmlns:wp14="http://schemas.microsoft.com/office/word/2010/wordprocessingDrawing" xmlns:wp="http://schemas.openxmlformats.org/drawingml/2006/wordprocessingDrawing" xmlns:w10="urn:schemas-microsoft-com:office:word" xmlns:w="http://schemas.openxmlformats.org/wordprocessingml/2006/main" xmlns:w14="http://schemas.microsoft.com/office/word/2010/wordml" xmlns:w15="http://schemas.microsoft.com/office/word/2012/wordml" xmlns:w16cex="http://schemas.microsoft.com/office/word/2018/wordml/cex" xmlns:w16cid="http://schemas.microsoft.com/office/word/2016/wordml/cid" xmlns:w16="http://schemas.microsoft.com/office/word/2018/wordml" xmlns:w16du="http://schemas.microsoft.com/office/word/2023/wordml/word16du" xmlns:w16sdtdh="http://schemas.microsoft.com/office/word/2020/wordml/sdtdatahash" xmlns:w16sdtfl="http://schemas.microsoft.com/office/word/2024/wordml/sdtformatlock" xmlns:w16se="http://schemas.microsoft.com/office/word/2015/wordml/symex" xmlns:wpg="http://schemas.microsoft.com/office/word/2010/wordprocessingGroup" xmlns:wpi="http://schemas.microsoft.com/office/word/2010/wordprocessingInk" xmlns:wne="http://schemas.microsoft.com/office/word/2006/wordml" xmlns:wps="http://schemas.microsoft.com/office/word/2010/wordprocessingShape" mc:Ignorable="w14 w15 w16se w16cid w16 w16cex w16sdtdh w16sdtfl w16du wp14">
-  <w:p>
-    <w:pPr>
-      <w:pStyle w:val="af0"/>
-    </w:pPr>
-  </w:p>
-</w:ftr>
-</file>
-
 <file path=word/footnotes.xml><?xml version="1.0" encoding="utf-8"?>
-<w:footnotes xmlns:wpc="http://schemas.microsoft.com/office/word/2010/wordprocessingCanvas" xmlns:cx="http://schemas.microsoft.com/office/drawing/2014/chartex" xmlns:cx1="http://schemas.microsoft.com/office/drawing/2015/9/8/chartex" xmlns:cx2="http://schemas.microsoft.com/office/drawing/2015/10/21/chartex" xmlns:cx3="http://schemas.microsoft.com/office/drawing/2016/5/9/chartex" xmlns:cx4="http://schemas.microsoft.com/office/drawing/2016/5/10/chartex" xmlns:cx5="http://schemas.microsoft.com/office/drawing/2016/5/11/chartex" xmlns:cx6="http://schemas.microsoft.com/office/drawing/2016/5/12/chartex" xmlns:cx7="http://schemas.microsoft.com/office/drawing/2016/5/13/chartex" xmlns:cx8="http://schemas.microsoft.com/office/drawing/2016/5/14/chartex" xmlns:mc="http://schemas.openxmlformats.org/markup-compatibility/2006" xmlns:aink="http://schemas.microsoft.com/office/drawing/2016/ink" xmlns:am3d="http://schemas.microsoft.com/office/drawing/2017/model3d" xmlns:o="urn:schemas-microsoft-com:office:office" xmlns:oel="http://schemas.microsoft.com/office/2019/extlst" xmlns:r="http://schemas.openxmlformats.org/officeDocument/2006/relationships" xmlns:m="http://schemas.openxmlformats.org/officeDocument/2006/math" xmlns:v="urn:schemas-microsoft-com:vml" xmlns:wp14="http://schemas.microsoft.com/office/word/2010/wordprocessingDrawing" xmlns:wp="http://schemas.openxmlformats.org/drawingml/2006/wordprocessingDrawing" xmlns:w10="urn:schemas-microsoft-com:office:word" xmlns:w="http://schemas.openxmlformats.org/wordprocessingml/2006/main" xmlns:w14="http://schemas.microsoft.com/office/word/2010/wordml" xmlns:w15="http://schemas.microsoft.com/office/word/2012/wordml" xmlns:w16cex="http://schemas.microsoft.com/office/word/2018/wordml/cex" xmlns:w16cid="http://schemas.microsoft.com/office/word/2016/wordml/cid" xmlns:w16="http://schemas.microsoft.com/office/word/2018/wordml" xmlns:w16du="http://schemas.microsoft.com/office/word/2023/wordml/word16du" xmlns:w16sdtdh="http://schemas.microsoft.com/office/word/2020/wordml/sdtdatahash" xmlns:w16sdtfl="http://schemas.microsoft.com/office/word/2024/wordml/sdtformatlock" xmlns:w16se="http://schemas.microsoft.com/office/word/2015/wordml/symex" xmlns:wpg="http://schemas.microsoft.com/office/word/2010/wordprocessingGroup" xmlns:wpi="http://schemas.microsoft.com/office/word/2010/wordprocessingInk" xmlns:wne="http://schemas.microsoft.com/office/word/2006/wordml" xmlns:wps="http://schemas.microsoft.com/office/word/2010/wordprocessingShape" mc:Ignorable="w14 w15 w16se w16cid w16 w16cex w16sdtdh w16sdtfl w16du wp14">
+<w:footnotes xmlns:wpc="http://schemas.microsoft.com/office/word/2010/wordprocessingCanvas" xmlns:cx="http://schemas.microsoft.com/office/drawing/2014/chartex" xmlns:cx1="http://schemas.microsoft.com/office/drawing/2015/9/8/chartex" xmlns:cx2="http://schemas.microsoft.com/office/drawing/2015/10/21/chartex" xmlns:cx3="http://schemas.microsoft.com/office/drawing/2016/5/9/chartex" xmlns:cx4="http://schemas.microsoft.com/office/drawing/2016/5/10/chartex" xmlns:cx5="http://schemas.microsoft.com/office/drawing/2016/5/11/chartex" xmlns:cx6="http://schemas.microsoft.com/office/drawing/2016/5/12/chartex" xmlns:cx7="http://schemas.microsoft.com/office/drawing/2016/5/13/chartex" xmlns:cx8="http://schemas.microsoft.com/office/drawing/2016/5/14/chartex" xmlns:mc="http://schemas.openxmlformats.org/markup-compatibility/2006" xmlns:aink="http://schemas.microsoft.com/office/drawing/2016/ink" xmlns:am3d="http://schemas.microsoft.com/office/drawing/2017/model3d" xmlns:o="urn:schemas-microsoft-com:office:office" xmlns:r="http://schemas.openxmlformats.org/officeDocument/2006/relationships" xmlns:m="http://schemas.openxmlformats.org/officeDocument/2006/math" xmlns:v="urn:schemas-microsoft-com:vml" xmlns:wp14="http://schemas.microsoft.com/office/word/2010/wordprocessingDrawing" xmlns:wp="http://schemas.openxmlformats.org/drawingml/2006/wordprocessingDrawing" xmlns:w10="urn:schemas-microsoft-com:office:word" xmlns:w="http://schemas.openxmlformats.org/wordprocessingml/2006/main" xmlns:w14="http://schemas.microsoft.com/office/word/2010/wordml" xmlns:w15="http://schemas.microsoft.com/office/word/2012/wordml" xmlns:w16cex="http://schemas.microsoft.com/office/word/2018/wordml/cex" xmlns:w16cid="http://schemas.microsoft.com/office/word/2016/wordml/cid" xmlns:w16="http://schemas.microsoft.com/office/word/2018/wordml" xmlns:w16sdtdh="http://schemas.microsoft.com/office/word/2020/wordml/sdtdatahash" xmlns:w16se="http://schemas.microsoft.com/office/word/2015/wordml/symex" xmlns:wpg="http://schemas.microsoft.com/office/word/2010/wordprocessingGroup" xmlns:wpi="http://schemas.microsoft.com/office/word/2010/wordprocessingInk" xmlns:wne="http://schemas.microsoft.com/office/word/2006/wordml" xmlns:wps="http://schemas.microsoft.com/office/word/2010/wordprocessingShape" mc:Ignorable="w14 w15 w16se w16cid w16 w16cex w16sdtdh wp14">
   <w:footnote w:type="separator" w:id="-1">
     <w:p>
       <w:pPr>
@@ -4121,38 +4168,18 @@
 </file>
 
 <file path=word/header1.xml><?xml version="1.0" encoding="utf-8"?>
-<w:hdr xmlns:wpc="http://schemas.microsoft.com/office/word/2010/wordprocessingCanvas" xmlns:cx="http://schemas.microsoft.com/office/drawing/2014/chartex" xmlns:cx1="http://schemas.microsoft.com/office/drawing/2015/9/8/chartex" xmlns:cx2="http://schemas.microsoft.com/office/drawing/2015/10/21/chartex" xmlns:cx3="http://schemas.microsoft.com/office/drawing/2016/5/9/chartex" xmlns:cx4="http://schemas.microsoft.com/office/drawing/2016/5/10/chartex" xmlns:cx5="http://schemas.microsoft.com/office/drawing/2016/5/11/chartex" xmlns:cx6="http://schemas.microsoft.com/office/drawing/2016/5/12/chartex" xmlns:cx7="http://schemas.microsoft.com/office/drawing/2016/5/13/chartex" xmlns:cx8="http://schemas.microsoft.com/office/drawing/2016/5/14/chartex" xmlns:mc="http://schemas.openxmlformats.org/markup-compatibility/2006" xmlns:aink="http://schemas.microsoft.com/office/drawing/2016/ink" xmlns:am3d="http://schemas.microsoft.com/office/drawing/2017/model3d" xmlns:o="urn:schemas-microsoft-com:office:office" xmlns:oel="http://schemas.microsoft.com/office/2019/extlst" xmlns:r="http://schemas.openxmlformats.org/officeDocument/2006/relationships" xmlns:m="http://schemas.openxmlformats.org/officeDocument/2006/math" xmlns:v="urn:schemas-microsoft-com:vml" xmlns:wp14="http://schemas.microsoft.com/office/word/2010/wordprocessingDrawing" xmlns:wp="http://schemas.openxmlformats.org/drawingml/2006/wordprocessingDrawing" xmlns:w10="urn:schemas-microsoft-com:office:word" xmlns:w="http://schemas.openxmlformats.org/wordprocessingml/2006/main" xmlns:w14="http://schemas.microsoft.com/office/word/2010/wordml" xmlns:w15="http://schemas.microsoft.com/office/word/2012/wordml" xmlns:w16cex="http://schemas.microsoft.com/office/word/2018/wordml/cex" xmlns:w16cid="http://schemas.microsoft.com/office/word/2016/wordml/cid" xmlns:w16="http://schemas.microsoft.com/office/word/2018/wordml" xmlns:w16du="http://schemas.microsoft.com/office/word/2023/wordml/word16du" xmlns:w16sdtdh="http://schemas.microsoft.com/office/word/2020/wordml/sdtdatahash" xmlns:w16sdtfl="http://schemas.microsoft.com/office/word/2024/wordml/sdtformatlock" xmlns:w16se="http://schemas.microsoft.com/office/word/2015/wordml/symex" xmlns:wpg="http://schemas.microsoft.com/office/word/2010/wordprocessingGroup" xmlns:wpi="http://schemas.microsoft.com/office/word/2010/wordprocessingInk" xmlns:wne="http://schemas.microsoft.com/office/word/2006/wordml" xmlns:wps="http://schemas.microsoft.com/office/word/2010/wordprocessingShape" mc:Ignorable="w14 w15 w16se w16cid w16 w16cex w16sdtdh w16sdtfl w16du wp14">
+<w:hdr xmlns:wpc="http://schemas.microsoft.com/office/word/2010/wordprocessingCanvas" xmlns:cx="http://schemas.microsoft.com/office/drawing/2014/chartex" xmlns:cx1="http://schemas.microsoft.com/office/drawing/2015/9/8/chartex" xmlns:cx2="http://schemas.microsoft.com/office/drawing/2015/10/21/chartex" xmlns:cx3="http://schemas.microsoft.com/office/drawing/2016/5/9/chartex" xmlns:cx4="http://schemas.microsoft.com/office/drawing/2016/5/10/chartex" xmlns:cx5="http://schemas.microsoft.com/office/drawing/2016/5/11/chartex" xmlns:cx6="http://schemas.microsoft.com/office/drawing/2016/5/12/chartex" xmlns:cx7="http://schemas.microsoft.com/office/drawing/2016/5/13/chartex" xmlns:cx8="http://schemas.microsoft.com/office/drawing/2016/5/14/chartex" xmlns:mc="http://schemas.openxmlformats.org/markup-compatibility/2006" xmlns:aink="http://schemas.microsoft.com/office/drawing/2016/ink" xmlns:am3d="http://schemas.microsoft.com/office/drawing/2017/model3d" xmlns:o="urn:schemas-microsoft-com:office:office" xmlns:r="http://schemas.openxmlformats.org/officeDocument/2006/relationships" xmlns:m="http://schemas.openxmlformats.org/officeDocument/2006/math" xmlns:v="urn:schemas-microsoft-com:vml" xmlns:wp14="http://schemas.microsoft.com/office/word/2010/wordprocessingDrawing" xmlns:wp="http://schemas.openxmlformats.org/drawingml/2006/wordprocessingDrawing" xmlns:w10="urn:schemas-microsoft-com:office:word" xmlns:w="http://schemas.openxmlformats.org/wordprocessingml/2006/main" xmlns:w14="http://schemas.microsoft.com/office/word/2010/wordml" xmlns:w15="http://schemas.microsoft.com/office/word/2012/wordml" xmlns:w16cex="http://schemas.microsoft.com/office/word/2018/wordml/cex" xmlns:w16cid="http://schemas.microsoft.com/office/word/2016/wordml/cid" xmlns:w16="http://schemas.microsoft.com/office/word/2018/wordml" xmlns:w16sdtdh="http://schemas.microsoft.com/office/word/2020/wordml/sdtdatahash" xmlns:w16se="http://schemas.microsoft.com/office/word/2015/wordml/symex" xmlns:wpg="http://schemas.microsoft.com/office/word/2010/wordprocessingGroup" xmlns:wpi="http://schemas.microsoft.com/office/word/2010/wordprocessingInk" xmlns:wne="http://schemas.microsoft.com/office/word/2006/wordml" xmlns:wps="http://schemas.microsoft.com/office/word/2010/wordprocessingShape" mc:Ignorable="w14 w15 w16se w16cid w16 w16cex w16sdtdh wp14">
   <w:p>
     <w:pPr>
-      <w:pStyle w:val="ae"/>
-    </w:pPr>
-  </w:p>
-</w:hdr>
-</file>
-
-<file path=word/header2.xml><?xml version="1.0" encoding="utf-8"?>
-<w:hdr xmlns:wpc="http://schemas.microsoft.com/office/word/2010/wordprocessingCanvas" xmlns:cx="http://schemas.microsoft.com/office/drawing/2014/chartex" xmlns:cx1="http://schemas.microsoft.com/office/drawing/2015/9/8/chartex" xmlns:cx2="http://schemas.microsoft.com/office/drawing/2015/10/21/chartex" xmlns:cx3="http://schemas.microsoft.com/office/drawing/2016/5/9/chartex" xmlns:cx4="http://schemas.microsoft.com/office/drawing/2016/5/10/chartex" xmlns:cx5="http://schemas.microsoft.com/office/drawing/2016/5/11/chartex" xmlns:cx6="http://schemas.microsoft.com/office/drawing/2016/5/12/chartex" xmlns:cx7="http://schemas.microsoft.com/office/drawing/2016/5/13/chartex" xmlns:cx8="http://schemas.microsoft.com/office/drawing/2016/5/14/chartex" xmlns:mc="http://schemas.openxmlformats.org/markup-compatibility/2006" xmlns:aink="http://schemas.microsoft.com/office/drawing/2016/ink" xmlns:am3d="http://schemas.microsoft.com/office/drawing/2017/model3d" xmlns:o="urn:schemas-microsoft-com:office:office" xmlns:oel="http://schemas.microsoft.com/office/2019/extlst" xmlns:r="http://schemas.openxmlformats.org/officeDocument/2006/relationships" xmlns:m="http://schemas.openxmlformats.org/officeDocument/2006/math" xmlns:v="urn:schemas-microsoft-com:vml" xmlns:wp14="http://schemas.microsoft.com/office/word/2010/wordprocessingDrawing" xmlns:wp="http://schemas.openxmlformats.org/drawingml/2006/wordprocessingDrawing" xmlns:w10="urn:schemas-microsoft-com:office:word" xmlns:w="http://schemas.openxmlformats.org/wordprocessingml/2006/main" xmlns:w14="http://schemas.microsoft.com/office/word/2010/wordml" xmlns:w15="http://schemas.microsoft.com/office/word/2012/wordml" xmlns:w16cex="http://schemas.microsoft.com/office/word/2018/wordml/cex" xmlns:w16cid="http://schemas.microsoft.com/office/word/2016/wordml/cid" xmlns:w16="http://schemas.microsoft.com/office/word/2018/wordml" xmlns:w16du="http://schemas.microsoft.com/office/word/2023/wordml/word16du" xmlns:w16sdtdh="http://schemas.microsoft.com/office/word/2020/wordml/sdtdatahash" xmlns:w16sdtfl="http://schemas.microsoft.com/office/word/2024/wordml/sdtformatlock" xmlns:w16se="http://schemas.microsoft.com/office/word/2015/wordml/symex" xmlns:wpg="http://schemas.microsoft.com/office/word/2010/wordprocessingGroup" xmlns:wpi="http://schemas.microsoft.com/office/word/2010/wordprocessingInk" xmlns:wne="http://schemas.microsoft.com/office/word/2006/wordml" xmlns:wps="http://schemas.microsoft.com/office/word/2010/wordprocessingShape" mc:Ignorable="w14 w15 w16se w16cid w16 w16cex w16sdtdh w16sdtfl w16du wp14">
-  <w:p>
-    <w:pPr>
-      <w:pStyle w:val="ae"/>
+      <w:pStyle w:val="Header"/>
       <w:ind w:firstLine="720"/>
     </w:pPr>
   </w:p>
 </w:hdr>
 </file>
 
-<file path=word/header3.xml><?xml version="1.0" encoding="utf-8"?>
-<w:hdr xmlns:wpc="http://schemas.microsoft.com/office/word/2010/wordprocessingCanvas" xmlns:cx="http://schemas.microsoft.com/office/drawing/2014/chartex" xmlns:cx1="http://schemas.microsoft.com/office/drawing/2015/9/8/chartex" xmlns:cx2="http://schemas.microsoft.com/office/drawing/2015/10/21/chartex" xmlns:cx3="http://schemas.microsoft.com/office/drawing/2016/5/9/chartex" xmlns:cx4="http://schemas.microsoft.com/office/drawing/2016/5/10/chartex" xmlns:cx5="http://schemas.microsoft.com/office/drawing/2016/5/11/chartex" xmlns:cx6="http://schemas.microsoft.com/office/drawing/2016/5/12/chartex" xmlns:cx7="http://schemas.microsoft.com/office/drawing/2016/5/13/chartex" xmlns:cx8="http://schemas.microsoft.com/office/drawing/2016/5/14/chartex" xmlns:mc="http://schemas.openxmlformats.org/markup-compatibility/2006" xmlns:aink="http://schemas.microsoft.com/office/drawing/2016/ink" xmlns:am3d="http://schemas.microsoft.com/office/drawing/2017/model3d" xmlns:o="urn:schemas-microsoft-com:office:office" xmlns:oel="http://schemas.microsoft.com/office/2019/extlst" xmlns:r="http://schemas.openxmlformats.org/officeDocument/2006/relationships" xmlns:m="http://schemas.openxmlformats.org/officeDocument/2006/math" xmlns:v="urn:schemas-microsoft-com:vml" xmlns:wp14="http://schemas.microsoft.com/office/word/2010/wordprocessingDrawing" xmlns:wp="http://schemas.openxmlformats.org/drawingml/2006/wordprocessingDrawing" xmlns:w10="urn:schemas-microsoft-com:office:word" xmlns:w="http://schemas.openxmlformats.org/wordprocessingml/2006/main" xmlns:w14="http://schemas.microsoft.com/office/word/2010/wordml" xmlns:w15="http://schemas.microsoft.com/office/word/2012/wordml" xmlns:w16cex="http://schemas.microsoft.com/office/word/2018/wordml/cex" xmlns:w16cid="http://schemas.microsoft.com/office/word/2016/wordml/cid" xmlns:w16="http://schemas.microsoft.com/office/word/2018/wordml" xmlns:w16du="http://schemas.microsoft.com/office/word/2023/wordml/word16du" xmlns:w16sdtdh="http://schemas.microsoft.com/office/word/2020/wordml/sdtdatahash" xmlns:w16sdtfl="http://schemas.microsoft.com/office/word/2024/wordml/sdtformatlock" xmlns:w16se="http://schemas.microsoft.com/office/word/2015/wordml/symex" xmlns:wpg="http://schemas.microsoft.com/office/word/2010/wordprocessingGroup" xmlns:wpi="http://schemas.microsoft.com/office/word/2010/wordprocessingInk" xmlns:wne="http://schemas.microsoft.com/office/word/2006/wordml" xmlns:wps="http://schemas.microsoft.com/office/word/2010/wordprocessingShape" mc:Ignorable="w14 w15 w16se w16cid w16 w16cex w16sdtdh w16sdtfl w16du wp14">
-  <w:p>
-    <w:pPr>
-      <w:pStyle w:val="ae"/>
-    </w:pPr>
-  </w:p>
-</w:hdr>
-</file>
-
 <file path=word/styles.xml><?xml version="1.0" encoding="utf-8"?>
-<w:styles xmlns:mc="http://schemas.openxmlformats.org/markup-compatibility/2006" xmlns:r="http://schemas.openxmlformats.org/officeDocument/2006/relationships" xmlns:w="http://schemas.openxmlformats.org/wordprocessingml/2006/main" xmlns:w14="http://schemas.microsoft.com/office/word/2010/wordml" xmlns:w15="http://schemas.microsoft.com/office/word/2012/wordml" xmlns:w16cex="http://schemas.microsoft.com/office/word/2018/wordml/cex" xmlns:w16cid="http://schemas.microsoft.com/office/word/2016/wordml/cid" xmlns:w16="http://schemas.microsoft.com/office/word/2018/wordml" xmlns:w16du="http://schemas.microsoft.com/office/word/2023/wordml/word16du" xmlns:w16sdtdh="http://schemas.microsoft.com/office/word/2020/wordml/sdtdatahash" xmlns:w16sdtfl="http://schemas.microsoft.com/office/word/2024/wordml/sdtformatlock" xmlns:w16se="http://schemas.microsoft.com/office/word/2015/wordml/symex" mc:Ignorable="w14 w15 w16se w16cid w16 w16cex w16sdtdh w16sdtfl w16du">
+<w:styles xmlns:mc="http://schemas.openxmlformats.org/markup-compatibility/2006" xmlns:r="http://schemas.openxmlformats.org/officeDocument/2006/relationships" xmlns:w="http://schemas.openxmlformats.org/wordprocessingml/2006/main" xmlns:w14="http://schemas.microsoft.com/office/word/2010/wordml" xmlns:w15="http://schemas.microsoft.com/office/word/2012/wordml" xmlns:w16cex="http://schemas.microsoft.com/office/word/2018/wordml/cex" xmlns:w16cid="http://schemas.microsoft.com/office/word/2016/wordml/cid" xmlns:w16="http://schemas.microsoft.com/office/word/2018/wordml" xmlns:w16sdtdh="http://schemas.microsoft.com/office/word/2020/wordml/sdtdatahash" xmlns:w16se="http://schemas.microsoft.com/office/word/2015/wordml/symex" mc:Ignorable="w14 w15 w16se w16cid w16 w16cex w16sdtdh">
   <w:docDefaults>
     <w:rPrDefault>
       <w:rPr>
@@ -4548,18 +4575,18 @@
     <w:lsdException w:name="Unresolved Mention" w:semiHidden="1" w:unhideWhenUsed="1"/>
     <w:lsdException w:name="Smart Link" w:semiHidden="1" w:unhideWhenUsed="1"/>
   </w:latentStyles>
-  <w:style w:type="paragraph" w:default="1" w:styleId="a">
+  <w:style w:type="paragraph" w:default="1" w:styleId="Normal">
     <w:name w:val="Normal"/>
     <w:qFormat/>
     <w:rPr>
       <w:rFonts w:cs="Angsana New"/>
     </w:rPr>
   </w:style>
-  <w:style w:type="paragraph" w:styleId="1">
+  <w:style w:type="paragraph" w:styleId="Heading1">
     <w:name w:val="heading 1"/>
-    <w:basedOn w:val="a"/>
-    <w:next w:val="a"/>
-    <w:link w:val="10"/>
+    <w:basedOn w:val="Normal"/>
+    <w:next w:val="Normal"/>
+    <w:link w:val="Heading1Char"/>
     <w:uiPriority w:val="9"/>
     <w:qFormat/>
     <w:rsid w:val="00313926"/>
@@ -4576,11 +4603,11 @@
       <w:szCs w:val="50"/>
     </w:rPr>
   </w:style>
-  <w:style w:type="paragraph" w:styleId="2">
+  <w:style w:type="paragraph" w:styleId="Heading2">
     <w:name w:val="heading 2"/>
-    <w:basedOn w:val="a"/>
-    <w:next w:val="a"/>
-    <w:link w:val="20"/>
+    <w:basedOn w:val="Normal"/>
+    <w:next w:val="Normal"/>
+    <w:link w:val="Heading2Char"/>
     <w:uiPriority w:val="9"/>
     <w:semiHidden/>
     <w:unhideWhenUsed/>
@@ -4599,11 +4626,11 @@
       <w:szCs w:val="40"/>
     </w:rPr>
   </w:style>
-  <w:style w:type="paragraph" w:styleId="3">
+  <w:style w:type="paragraph" w:styleId="Heading3">
     <w:name w:val="heading 3"/>
-    <w:basedOn w:val="a"/>
-    <w:next w:val="a"/>
-    <w:link w:val="30"/>
+    <w:basedOn w:val="Normal"/>
+    <w:next w:val="Normal"/>
+    <w:link w:val="Heading3Char"/>
     <w:uiPriority w:val="9"/>
     <w:semiHidden/>
     <w:unhideWhenUsed/>
@@ -4622,11 +4649,11 @@
       <w:szCs w:val="35"/>
     </w:rPr>
   </w:style>
-  <w:style w:type="paragraph" w:styleId="4">
+  <w:style w:type="paragraph" w:styleId="Heading4">
     <w:name w:val="heading 4"/>
-    <w:basedOn w:val="a"/>
-    <w:next w:val="a"/>
-    <w:link w:val="40"/>
+    <w:basedOn w:val="Normal"/>
+    <w:next w:val="Normal"/>
+    <w:link w:val="Heading4Char"/>
     <w:uiPriority w:val="9"/>
     <w:semiHidden/>
     <w:unhideWhenUsed/>
@@ -4645,11 +4672,11 @@
       <w:color w:val="2F5496" w:themeColor="accent1" w:themeShade="BF"/>
     </w:rPr>
   </w:style>
-  <w:style w:type="paragraph" w:styleId="5">
+  <w:style w:type="paragraph" w:styleId="Heading5">
     <w:name w:val="heading 5"/>
-    <w:basedOn w:val="a"/>
-    <w:next w:val="a"/>
-    <w:link w:val="50"/>
+    <w:basedOn w:val="Normal"/>
+    <w:next w:val="Normal"/>
+    <w:link w:val="Heading5Char"/>
     <w:uiPriority w:val="9"/>
     <w:semiHidden/>
     <w:unhideWhenUsed/>
@@ -4666,11 +4693,11 @@
       <w:color w:val="2F5496" w:themeColor="accent1" w:themeShade="BF"/>
     </w:rPr>
   </w:style>
-  <w:style w:type="paragraph" w:styleId="6">
+  <w:style w:type="paragraph" w:styleId="Heading6">
     <w:name w:val="heading 6"/>
-    <w:basedOn w:val="a"/>
-    <w:next w:val="a"/>
-    <w:link w:val="60"/>
+    <w:basedOn w:val="Normal"/>
+    <w:next w:val="Normal"/>
+    <w:link w:val="Heading6Char"/>
     <w:uiPriority w:val="9"/>
     <w:semiHidden/>
     <w:unhideWhenUsed/>
@@ -4689,11 +4716,11 @@
       <w:color w:val="595959" w:themeColor="text1" w:themeTint="A6"/>
     </w:rPr>
   </w:style>
-  <w:style w:type="paragraph" w:styleId="7">
+  <w:style w:type="paragraph" w:styleId="Heading7">
     <w:name w:val="heading 7"/>
-    <w:basedOn w:val="a"/>
-    <w:next w:val="a"/>
-    <w:link w:val="70"/>
+    <w:basedOn w:val="Normal"/>
+    <w:next w:val="Normal"/>
+    <w:link w:val="Heading7Char"/>
     <w:uiPriority w:val="9"/>
     <w:semiHidden/>
     <w:unhideWhenUsed/>
@@ -4710,11 +4737,11 @@
       <w:color w:val="595959" w:themeColor="text1" w:themeTint="A6"/>
     </w:rPr>
   </w:style>
-  <w:style w:type="paragraph" w:styleId="8">
+  <w:style w:type="paragraph" w:styleId="Heading8">
     <w:name w:val="heading 8"/>
-    <w:basedOn w:val="a"/>
-    <w:next w:val="a"/>
-    <w:link w:val="80"/>
+    <w:basedOn w:val="Normal"/>
+    <w:next w:val="Normal"/>
+    <w:link w:val="Heading8Char"/>
     <w:uiPriority w:val="9"/>
     <w:semiHidden/>
     <w:unhideWhenUsed/>
@@ -4733,11 +4760,11 @@
       <w:color w:val="272727" w:themeColor="text1" w:themeTint="D8"/>
     </w:rPr>
   </w:style>
-  <w:style w:type="paragraph" w:styleId="9">
+  <w:style w:type="paragraph" w:styleId="Heading9">
     <w:name w:val="heading 9"/>
-    <w:basedOn w:val="a"/>
-    <w:next w:val="a"/>
-    <w:link w:val="90"/>
+    <w:basedOn w:val="Normal"/>
+    <w:next w:val="Normal"/>
+    <w:link w:val="Heading9Char"/>
     <w:uiPriority w:val="9"/>
     <w:semiHidden/>
     <w:unhideWhenUsed/>
@@ -4754,13 +4781,13 @@
       <w:color w:val="272727" w:themeColor="text1" w:themeTint="D8"/>
     </w:rPr>
   </w:style>
-  <w:style w:type="character" w:default="1" w:styleId="a0">
+  <w:style w:type="character" w:default="1" w:styleId="DefaultParagraphFont">
     <w:name w:val="Default Paragraph Font"/>
     <w:uiPriority w:val="1"/>
     <w:semiHidden/>
     <w:unhideWhenUsed/>
   </w:style>
-  <w:style w:type="table" w:default="1" w:styleId="a1">
+  <w:style w:type="table" w:default="1" w:styleId="TableNormal">
     <w:name w:val="Normal Table"/>
     <w:uiPriority w:val="99"/>
     <w:semiHidden/>
@@ -4775,16 +4802,16 @@
       </w:tblCellMar>
     </w:tblPr>
   </w:style>
-  <w:style w:type="numbering" w:default="1" w:styleId="a2">
+  <w:style w:type="numbering" w:default="1" w:styleId="NoList">
     <w:name w:val="No List"/>
     <w:uiPriority w:val="99"/>
     <w:semiHidden/>
     <w:unhideWhenUsed/>
   </w:style>
-  <w:style w:type="character" w:customStyle="1" w:styleId="10">
-    <w:name w:val="หัวเรื่อง 1 อักขระ"/>
-    <w:basedOn w:val="a0"/>
-    <w:link w:val="1"/>
+  <w:style w:type="character" w:customStyle="1" w:styleId="Heading1Char">
+    <w:name w:val="Heading 1 Char"/>
+    <w:basedOn w:val="DefaultParagraphFont"/>
+    <w:link w:val="Heading1"/>
     <w:uiPriority w:val="9"/>
     <w:rsid w:val="00313926"/>
     <w:rPr>
@@ -4794,10 +4821,10 @@
       <w:szCs w:val="50"/>
     </w:rPr>
   </w:style>
-  <w:style w:type="character" w:customStyle="1" w:styleId="20">
-    <w:name w:val="หัวเรื่อง 2 อักขระ"/>
-    <w:basedOn w:val="a0"/>
-    <w:link w:val="2"/>
+  <w:style w:type="character" w:customStyle="1" w:styleId="Heading2Char">
+    <w:name w:val="Heading 2 Char"/>
+    <w:basedOn w:val="DefaultParagraphFont"/>
+    <w:link w:val="Heading2"/>
     <w:uiPriority w:val="9"/>
     <w:semiHidden/>
     <w:rsid w:val="00313926"/>
@@ -4808,10 +4835,10 @@
       <w:szCs w:val="40"/>
     </w:rPr>
   </w:style>
-  <w:style w:type="character" w:customStyle="1" w:styleId="30">
-    <w:name w:val="หัวเรื่อง 3 อักขระ"/>
-    <w:basedOn w:val="a0"/>
-    <w:link w:val="3"/>
+  <w:style w:type="character" w:customStyle="1" w:styleId="Heading3Char">
+    <w:name w:val="Heading 3 Char"/>
+    <w:basedOn w:val="DefaultParagraphFont"/>
+    <w:link w:val="Heading3"/>
     <w:uiPriority w:val="9"/>
     <w:semiHidden/>
     <w:rsid w:val="00313926"/>
@@ -4822,10 +4849,10 @@
       <w:szCs w:val="35"/>
     </w:rPr>
   </w:style>
-  <w:style w:type="character" w:customStyle="1" w:styleId="40">
-    <w:name w:val="หัวเรื่อง 4 อักขระ"/>
-    <w:basedOn w:val="a0"/>
-    <w:link w:val="4"/>
+  <w:style w:type="character" w:customStyle="1" w:styleId="Heading4Char">
+    <w:name w:val="Heading 4 Char"/>
+    <w:basedOn w:val="DefaultParagraphFont"/>
+    <w:link w:val="Heading4"/>
     <w:uiPriority w:val="9"/>
     <w:semiHidden/>
     <w:rsid w:val="00313926"/>
@@ -4836,10 +4863,10 @@
       <w:color w:val="2F5496" w:themeColor="accent1" w:themeShade="BF"/>
     </w:rPr>
   </w:style>
-  <w:style w:type="character" w:customStyle="1" w:styleId="50">
-    <w:name w:val="หัวเรื่อง 5 อักขระ"/>
-    <w:basedOn w:val="a0"/>
-    <w:link w:val="5"/>
+  <w:style w:type="character" w:customStyle="1" w:styleId="Heading5Char">
+    <w:name w:val="Heading 5 Char"/>
+    <w:basedOn w:val="DefaultParagraphFont"/>
+    <w:link w:val="Heading5"/>
     <w:uiPriority w:val="9"/>
     <w:semiHidden/>
     <w:rsid w:val="00313926"/>
@@ -4848,10 +4875,10 @@
       <w:color w:val="2F5496" w:themeColor="accent1" w:themeShade="BF"/>
     </w:rPr>
   </w:style>
-  <w:style w:type="character" w:customStyle="1" w:styleId="60">
-    <w:name w:val="หัวเรื่อง 6 อักขระ"/>
-    <w:basedOn w:val="a0"/>
-    <w:link w:val="6"/>
+  <w:style w:type="character" w:customStyle="1" w:styleId="Heading6Char">
+    <w:name w:val="Heading 6 Char"/>
+    <w:basedOn w:val="DefaultParagraphFont"/>
+    <w:link w:val="Heading6"/>
     <w:uiPriority w:val="9"/>
     <w:semiHidden/>
     <w:rsid w:val="00313926"/>
@@ -4862,10 +4889,10 @@
       <w:color w:val="595959" w:themeColor="text1" w:themeTint="A6"/>
     </w:rPr>
   </w:style>
-  <w:style w:type="character" w:customStyle="1" w:styleId="70">
-    <w:name w:val="หัวเรื่อง 7 อักขระ"/>
-    <w:basedOn w:val="a0"/>
-    <w:link w:val="7"/>
+  <w:style w:type="character" w:customStyle="1" w:styleId="Heading7Char">
+    <w:name w:val="Heading 7 Char"/>
+    <w:basedOn w:val="DefaultParagraphFont"/>
+    <w:link w:val="Heading7"/>
     <w:uiPriority w:val="9"/>
     <w:semiHidden/>
     <w:rsid w:val="00313926"/>
@@ -4874,10 +4901,10 @@
       <w:color w:val="595959" w:themeColor="text1" w:themeTint="A6"/>
     </w:rPr>
   </w:style>
-  <w:style w:type="character" w:customStyle="1" w:styleId="80">
-    <w:name w:val="หัวเรื่อง 8 อักขระ"/>
-    <w:basedOn w:val="a0"/>
-    <w:link w:val="8"/>
+  <w:style w:type="character" w:customStyle="1" w:styleId="Heading8Char">
+    <w:name w:val="Heading 8 Char"/>
+    <w:basedOn w:val="DefaultParagraphFont"/>
+    <w:link w:val="Heading8"/>
     <w:uiPriority w:val="9"/>
     <w:semiHidden/>
     <w:rsid w:val="00313926"/>
@@ -4888,10 +4915,10 @@
       <w:color w:val="272727" w:themeColor="text1" w:themeTint="D8"/>
     </w:rPr>
   </w:style>
-  <w:style w:type="character" w:customStyle="1" w:styleId="90">
-    <w:name w:val="หัวเรื่อง 9 อักขระ"/>
-    <w:basedOn w:val="a0"/>
-    <w:link w:val="9"/>
+  <w:style w:type="character" w:customStyle="1" w:styleId="Heading9Char">
+    <w:name w:val="Heading 9 Char"/>
+    <w:basedOn w:val="DefaultParagraphFont"/>
+    <w:link w:val="Heading9"/>
     <w:uiPriority w:val="9"/>
     <w:semiHidden/>
     <w:rsid w:val="00313926"/>
@@ -4900,11 +4927,11 @@
       <w:color w:val="272727" w:themeColor="text1" w:themeTint="D8"/>
     </w:rPr>
   </w:style>
-  <w:style w:type="paragraph" w:styleId="a3">
+  <w:style w:type="paragraph" w:styleId="Title">
     <w:name w:val="Title"/>
-    <w:basedOn w:val="a"/>
-    <w:next w:val="a"/>
-    <w:link w:val="a4"/>
+    <w:basedOn w:val="Normal"/>
+    <w:next w:val="Normal"/>
+    <w:link w:val="TitleChar"/>
     <w:uiPriority w:val="10"/>
     <w:qFormat/>
     <w:rsid w:val="00313926"/>
@@ -4920,10 +4947,10 @@
       <w:szCs w:val="71"/>
     </w:rPr>
   </w:style>
-  <w:style w:type="character" w:customStyle="1" w:styleId="a4">
-    <w:name w:val="ชื่อเรื่อง อักขระ"/>
-    <w:basedOn w:val="a0"/>
-    <w:link w:val="a3"/>
+  <w:style w:type="character" w:customStyle="1" w:styleId="TitleChar">
+    <w:name w:val="Title Char"/>
+    <w:basedOn w:val="DefaultParagraphFont"/>
+    <w:link w:val="Title"/>
     <w:uiPriority w:val="10"/>
     <w:rsid w:val="00313926"/>
     <w:rPr>
@@ -4934,11 +4961,11 @@
       <w:szCs w:val="71"/>
     </w:rPr>
   </w:style>
-  <w:style w:type="paragraph" w:styleId="a5">
+  <w:style w:type="paragraph" w:styleId="Subtitle">
     <w:name w:val="Subtitle"/>
-    <w:basedOn w:val="a"/>
-    <w:next w:val="a"/>
-    <w:link w:val="a6"/>
+    <w:basedOn w:val="Normal"/>
+    <w:next w:val="Normal"/>
+    <w:link w:val="SubtitleChar"/>
     <w:uiPriority w:val="11"/>
     <w:qFormat/>
     <w:rsid w:val="00313926"/>
@@ -4955,10 +4982,10 @@
       <w:szCs w:val="35"/>
     </w:rPr>
   </w:style>
-  <w:style w:type="character" w:customStyle="1" w:styleId="a6">
-    <w:name w:val="ชื่อเรื่องรอง อักขระ"/>
-    <w:basedOn w:val="a0"/>
-    <w:link w:val="a5"/>
+  <w:style w:type="character" w:customStyle="1" w:styleId="SubtitleChar">
+    <w:name w:val="Subtitle Char"/>
+    <w:basedOn w:val="DefaultParagraphFont"/>
+    <w:link w:val="Subtitle"/>
     <w:uiPriority w:val="11"/>
     <w:rsid w:val="00313926"/>
     <w:rPr>
@@ -4969,11 +4996,11 @@
       <w:szCs w:val="35"/>
     </w:rPr>
   </w:style>
-  <w:style w:type="paragraph" w:styleId="a7">
+  <w:style w:type="paragraph" w:styleId="Quote">
     <w:name w:val="Quote"/>
-    <w:basedOn w:val="a"/>
-    <w:next w:val="a"/>
-    <w:link w:val="a8"/>
+    <w:basedOn w:val="Normal"/>
+    <w:next w:val="Normal"/>
+    <w:link w:val="QuoteChar"/>
     <w:uiPriority w:val="29"/>
     <w:qFormat/>
     <w:rsid w:val="00313926"/>
@@ -4987,10 +5014,10 @@
       <w:color w:val="404040" w:themeColor="text1" w:themeTint="BF"/>
     </w:rPr>
   </w:style>
-  <w:style w:type="character" w:customStyle="1" w:styleId="a8">
-    <w:name w:val="คำอ้างอิง อักขระ"/>
-    <w:basedOn w:val="a0"/>
-    <w:link w:val="a7"/>
+  <w:style w:type="character" w:customStyle="1" w:styleId="QuoteChar">
+    <w:name w:val="Quote Char"/>
+    <w:basedOn w:val="DefaultParagraphFont"/>
+    <w:link w:val="Quote"/>
     <w:uiPriority w:val="29"/>
     <w:rsid w:val="00313926"/>
     <w:rPr>
@@ -5000,9 +5027,9 @@
       <w:color w:val="404040" w:themeColor="text1" w:themeTint="BF"/>
     </w:rPr>
   </w:style>
-  <w:style w:type="paragraph" w:styleId="a9">
+  <w:style w:type="paragraph" w:styleId="ListParagraph">
     <w:name w:val="List Paragraph"/>
-    <w:basedOn w:val="a"/>
+    <w:basedOn w:val="Normal"/>
     <w:uiPriority w:val="34"/>
     <w:qFormat/>
     <w:rsid w:val="00313926"/>
@@ -5011,9 +5038,9 @@
       <w:contextualSpacing/>
     </w:pPr>
   </w:style>
-  <w:style w:type="character" w:styleId="aa">
+  <w:style w:type="character" w:styleId="IntenseEmphasis">
     <w:name w:val="Intense Emphasis"/>
-    <w:basedOn w:val="a0"/>
+    <w:basedOn w:val="DefaultParagraphFont"/>
     <w:uiPriority w:val="21"/>
     <w:qFormat/>
     <w:rsid w:val="00313926"/>
@@ -5023,11 +5050,11 @@
       <w:color w:val="2F5496" w:themeColor="accent1" w:themeShade="BF"/>
     </w:rPr>
   </w:style>
-  <w:style w:type="paragraph" w:styleId="ab">
+  <w:style w:type="paragraph" w:styleId="IntenseQuote">
     <w:name w:val="Intense Quote"/>
-    <w:basedOn w:val="a"/>
-    <w:next w:val="a"/>
-    <w:link w:val="ac"/>
+    <w:basedOn w:val="Normal"/>
+    <w:next w:val="Normal"/>
+    <w:link w:val="IntenseQuoteChar"/>
     <w:uiPriority w:val="30"/>
     <w:qFormat/>
     <w:rsid w:val="00313926"/>
@@ -5046,10 +5073,10 @@
       <w:color w:val="2F5496" w:themeColor="accent1" w:themeShade="BF"/>
     </w:rPr>
   </w:style>
-  <w:style w:type="character" w:customStyle="1" w:styleId="ac">
-    <w:name w:val="ทำให้คำอ้างอิงเป็นสีเข้มขึ้น อักขระ"/>
-    <w:basedOn w:val="a0"/>
-    <w:link w:val="ab"/>
+  <w:style w:type="character" w:customStyle="1" w:styleId="IntenseQuoteChar">
+    <w:name w:val="Intense Quote Char"/>
+    <w:basedOn w:val="DefaultParagraphFont"/>
+    <w:link w:val="IntenseQuote"/>
     <w:uiPriority w:val="30"/>
     <w:rsid w:val="00313926"/>
     <w:rPr>
@@ -5059,9 +5086,9 @@
       <w:color w:val="2F5496" w:themeColor="accent1" w:themeShade="BF"/>
     </w:rPr>
   </w:style>
-  <w:style w:type="character" w:styleId="ad">
+  <w:style w:type="character" w:styleId="IntenseReference">
     <w:name w:val="Intense Reference"/>
-    <w:basedOn w:val="a0"/>
+    <w:basedOn w:val="DefaultParagraphFont"/>
     <w:uiPriority w:val="32"/>
     <w:qFormat/>
     <w:rsid w:val="00313926"/>
@@ -5073,10 +5100,10 @@
       <w:spacing w:val="5"/>
     </w:rPr>
   </w:style>
-  <w:style w:type="paragraph" w:styleId="ae">
+  <w:style w:type="paragraph" w:styleId="Header">
     <w:name w:val="header"/>
-    <w:basedOn w:val="a"/>
-    <w:link w:val="af"/>
+    <w:basedOn w:val="Normal"/>
+    <w:link w:val="HeaderChar"/>
     <w:uiPriority w:val="99"/>
     <w:unhideWhenUsed/>
     <w:rsid w:val="00313926"/>
@@ -5088,20 +5115,20 @@
       <w:spacing w:after="0"/>
     </w:pPr>
   </w:style>
-  <w:style w:type="character" w:customStyle="1" w:styleId="af">
-    <w:name w:val="หัวกระดาษ อักขระ"/>
-    <w:basedOn w:val="a0"/>
-    <w:link w:val="ae"/>
+  <w:style w:type="character" w:customStyle="1" w:styleId="HeaderChar">
+    <w:name w:val="Header Char"/>
+    <w:basedOn w:val="DefaultParagraphFont"/>
+    <w:link w:val="Header"/>
     <w:uiPriority w:val="99"/>
     <w:rsid w:val="00313926"/>
     <w:rPr>
       <w:rFonts w:cs="Angsana New"/>
     </w:rPr>
   </w:style>
-  <w:style w:type="paragraph" w:styleId="af0">
+  <w:style w:type="paragraph" w:styleId="Footer">
     <w:name w:val="footer"/>
-    <w:basedOn w:val="a"/>
-    <w:link w:val="af1"/>
+    <w:basedOn w:val="Normal"/>
+    <w:link w:val="FooterChar"/>
     <w:uiPriority w:val="99"/>
     <w:unhideWhenUsed/>
     <w:rsid w:val="00313926"/>
@@ -5113,19 +5140,19 @@
       <w:spacing w:after="0"/>
     </w:pPr>
   </w:style>
-  <w:style w:type="character" w:customStyle="1" w:styleId="af1">
-    <w:name w:val="ท้ายกระดาษ อักขระ"/>
-    <w:basedOn w:val="a0"/>
-    <w:link w:val="af0"/>
+  <w:style w:type="character" w:customStyle="1" w:styleId="FooterChar">
+    <w:name w:val="Footer Char"/>
+    <w:basedOn w:val="DefaultParagraphFont"/>
+    <w:link w:val="Footer"/>
     <w:uiPriority w:val="99"/>
     <w:rsid w:val="00313926"/>
     <w:rPr>
       <w:rFonts w:cs="Angsana New"/>
     </w:rPr>
   </w:style>
-  <w:style w:type="paragraph" w:styleId="af2">
+  <w:style w:type="paragraph" w:styleId="NormalWeb">
     <w:name w:val="Normal (Web)"/>
-    <w:basedOn w:val="a"/>
+    <w:basedOn w:val="Normal"/>
     <w:uiPriority w:val="99"/>
     <w:semiHidden/>
     <w:unhideWhenUsed/>
@@ -5142,12 +5169,12 @@
   </w:style>
   <w:style w:type="character" w:customStyle="1" w:styleId="apple-tab-span">
     <w:name w:val="apple-tab-span"/>
-    <w:basedOn w:val="a0"/>
+    <w:basedOn w:val="DefaultParagraphFont"/>
     <w:rsid w:val="00313926"/>
   </w:style>
-  <w:style w:type="character" w:styleId="af3">
+  <w:style w:type="character" w:styleId="Strong">
     <w:name w:val="Strong"/>
-    <w:basedOn w:val="a0"/>
+    <w:basedOn w:val="DefaultParagraphFont"/>
     <w:uiPriority w:val="22"/>
     <w:qFormat/>
     <w:rsid w:val="006E588F"/>
@@ -5156,9 +5183,9 @@
       <w:bCs/>
     </w:rPr>
   </w:style>
-  <w:style w:type="character" w:styleId="af4">
+  <w:style w:type="character" w:styleId="Emphasis">
     <w:name w:val="Emphasis"/>
-    <w:basedOn w:val="a0"/>
+    <w:basedOn w:val="DefaultParagraphFont"/>
     <w:uiPriority w:val="20"/>
     <w:qFormat/>
     <w:rsid w:val="006E588F"/>

</xml_diff>

<commit_message>
change 1-5 new project name
</commit_message>
<xml_diff>
--- a/บทที่ 1.docx
+++ b/บทที่ 1.docx
@@ -931,7 +931,6 @@
           <w:rFonts w:ascii="TH SarabunPSK" w:hAnsi="TH SarabunPSK" w:cs="TH SarabunPSK"/>
           <w:sz w:val="32"/>
           <w:szCs w:val="32"/>
-          <w:cs/>
         </w:rPr>
       </w:pPr>
       <w:r>
@@ -968,67 +967,43 @@
           <w:szCs w:val="32"/>
           <w:cs/>
         </w:rPr>
+        <w:t>ระบบผู้ช่วยแบบตัวแทนเชิงปัญญาประดิษฐ์สำหรับองค์กร</w:t>
+      </w:r>
+      <w:r>
+        <w:rPr>
+          <w:rFonts w:ascii="TH SarabunPSK" w:hAnsi="TH SarabunPSK" w:cs="TH SarabunPSK"/>
+          <w:sz w:val="32"/>
+          <w:szCs w:val="32"/>
+          <w:cs/>
+        </w:rPr>
+        <w:t>1.2.2</w:t>
+      </w:r>
+      <w:r>
+        <w:rPr>
+          <w:rFonts w:ascii="TH SarabunPSK" w:hAnsi="TH SarabunPSK" w:cs="TH SarabunPSK"/>
+          <w:color w:val="FFFFFF" w:themeColor="background1"/>
+          <w:sz w:val="32"/>
+          <w:szCs w:val="32"/>
+        </w:rPr>
+        <w:t>**</w:t>
+      </w:r>
+      <w:r>
+        <w:rPr>
+          <w:rFonts w:ascii="TH SarabunPSK" w:hAnsi="TH SarabunPSK" w:cs="TH SarabunPSK"/>
+          <w:sz w:val="32"/>
+          <w:szCs w:val="32"/>
+          <w:cs/>
+        </w:rPr>
+        <w:t>เพื่อหาประสิทธิภาพของ</w:t>
+      </w:r>
+      <w:r>
+        <w:rPr>
+          <w:rFonts w:ascii="TH SarabunPSK" w:hAnsi="TH SarabunPSK" w:cs="TH SarabunPSK"/>
+          <w:sz w:val="32"/>
+          <w:szCs w:val="32"/>
+          <w:cs/>
+        </w:rPr>
         <w:t xml:space="preserve">ระบบผู้ช่วยอัตโนมัติ </w:t>
-      </w:r>
-      <w:r>
-        <w:rPr>
-          <w:rFonts w:ascii="TH SarabunPSK" w:hAnsi="TH SarabunPSK" w:cs="TH SarabunPSK"/>
-          <w:sz w:val="32"/>
-          <w:szCs w:val="32"/>
-        </w:rPr>
-        <w:t>n</w:t>
-      </w:r>
-      <w:r>
-        <w:rPr>
-          <w:rFonts w:ascii="TH SarabunPSK" w:hAnsi="TH SarabunPSK" w:cs="TH SarabunPSK"/>
-          <w:sz w:val="32"/>
-          <w:szCs w:val="32"/>
-          <w:cs/>
-        </w:rPr>
-        <w:t>8</w:t>
-      </w:r>
-      <w:r>
-        <w:rPr>
-          <w:rFonts w:ascii="TH SarabunPSK" w:hAnsi="TH SarabunPSK" w:cs="TH SarabunPSK"/>
-          <w:sz w:val="32"/>
-          <w:szCs w:val="32"/>
-        </w:rPr>
-        <w:t xml:space="preserve">n </w:t>
-      </w:r>
-      <w:r>
-        <w:rPr>
-          <w:rFonts w:ascii="TH SarabunPSK" w:hAnsi="TH SarabunPSK" w:cs="TH SarabunPSK"/>
-          <w:sz w:val="32"/>
-          <w:szCs w:val="32"/>
-          <w:cs/>
-        </w:rPr>
-        <w:t xml:space="preserve">ผ่าน </w:t>
-      </w:r>
-      <w:r>
-        <w:rPr>
-          <w:rFonts w:ascii="TH SarabunPSK" w:hAnsi="TH SarabunPSK" w:cs="TH SarabunPSK"/>
-          <w:sz w:val="32"/>
-          <w:szCs w:val="32"/>
-        </w:rPr>
-        <w:t>LINE OA</w:t>
-      </w:r>
-      <w:r>
-        <w:rPr>
-          <w:rFonts w:ascii="TH SarabunPSK" w:hAnsi="TH SarabunPSK" w:cs="TH SarabunPSK" w:hint="cs"/>
-          <w:sz w:val="32"/>
-          <w:szCs w:val="32"/>
-          <w:cs/>
-        </w:rPr>
-        <w:t xml:space="preserve"> </w:t>
-      </w:r>
-      <w:r>
-        <w:rPr>
-          <w:rFonts w:ascii="TH SarabunPSK" w:hAnsi="TH SarabunPSK" w:cs="TH SarabunPSK"/>
-          <w:sz w:val="32"/>
-          <w:szCs w:val="32"/>
-          <w:cs/>
-        </w:rPr>
-        <w:t>สำหรับองค์กร</w:t>
       </w:r>
     </w:p>
     <w:p>
@@ -1048,7 +1023,7 @@
           <w:szCs w:val="32"/>
           <w:cs/>
         </w:rPr>
-        <w:t>1.2.2</w:t>
+        <w:t>1.2.3</w:t>
       </w:r>
       <w:r>
         <w:rPr>
@@ -1066,76 +1041,338 @@
           <w:szCs w:val="32"/>
           <w:cs/>
         </w:rPr>
-        <w:t>เพื่อหาประสิทธิภาพของระบบ</w:t>
-      </w:r>
-      <w:r>
-        <w:rPr>
-          <w:rFonts w:ascii="TH SarabunPSK" w:hAnsi="TH SarabunPSK" w:cs="TH SarabunPSK"/>
-          <w:sz w:val="32"/>
-          <w:szCs w:val="32"/>
-          <w:cs/>
-        </w:rPr>
-        <w:t xml:space="preserve">ผู้ช่วยอัตโนมัติ </w:t>
-      </w:r>
-      <w:r>
-        <w:rPr>
-          <w:rFonts w:ascii="TH SarabunPSK" w:hAnsi="TH SarabunPSK" w:cs="TH SarabunPSK"/>
-          <w:sz w:val="32"/>
-          <w:szCs w:val="32"/>
-        </w:rPr>
-        <w:t>n</w:t>
-      </w:r>
-      <w:r>
-        <w:rPr>
-          <w:rFonts w:ascii="TH SarabunPSK" w:hAnsi="TH SarabunPSK" w:cs="TH SarabunPSK"/>
-          <w:sz w:val="32"/>
-          <w:szCs w:val="32"/>
-          <w:cs/>
-        </w:rPr>
-        <w:t>8</w:t>
-      </w:r>
-      <w:r>
-        <w:rPr>
-          <w:rFonts w:ascii="TH SarabunPSK" w:hAnsi="TH SarabunPSK" w:cs="TH SarabunPSK"/>
-          <w:sz w:val="32"/>
-          <w:szCs w:val="32"/>
-        </w:rPr>
-        <w:t xml:space="preserve">n </w:t>
-      </w:r>
-      <w:r>
-        <w:rPr>
-          <w:rFonts w:ascii="TH SarabunPSK" w:hAnsi="TH SarabunPSK" w:cs="TH SarabunPSK"/>
-          <w:sz w:val="32"/>
-          <w:szCs w:val="32"/>
-          <w:cs/>
-        </w:rPr>
-        <w:t xml:space="preserve">ผ่าน </w:t>
-      </w:r>
-      <w:r>
-        <w:rPr>
-          <w:rFonts w:ascii="TH SarabunPSK" w:hAnsi="TH SarabunPSK" w:cs="TH SarabunPSK"/>
-          <w:sz w:val="32"/>
-          <w:szCs w:val="32"/>
-        </w:rPr>
-        <w:t>LINE OA</w:t>
-      </w:r>
-      <w:r>
-        <w:rPr>
-          <w:rFonts w:ascii="TH SarabunPSK" w:hAnsi="TH SarabunPSK" w:cs="TH SarabunPSK" w:hint="cs"/>
-          <w:sz w:val="32"/>
-          <w:szCs w:val="32"/>
-          <w:cs/>
+        <w:t>เพื่อหาความพึงพอใจของผู้ใช้</w:t>
+      </w:r>
+      <w:r>
+        <w:rPr>
+          <w:rFonts w:ascii="TH SarabunPSK" w:hAnsi="TH SarabunPSK" w:cs="TH SarabunPSK"/>
+          <w:sz w:val="32"/>
+          <w:szCs w:val="32"/>
+          <w:cs/>
+        </w:rPr>
+        <w:t>ระบบผู้ช่วยแบบตัวแทนเชิงปัญญาประดิษฐ์สำหรับองค์กร</w:t>
+      </w:r>
+      <w:r>
+        <w:rPr>
+          <w:rFonts w:ascii="TH SarabunPSK" w:hAnsi="TH SarabunPSK" w:cs="TH SarabunPSK"/>
+          <w:sz w:val="32"/>
+          <w:szCs w:val="32"/>
+          <w:cs/>
+        </w:rPr>
+        <w:t>ภายหลังการทดลองใช้ระบบที่พัฒนาขึ้น</w:t>
+      </w:r>
+    </w:p>
+    <w:p>
+      <w:pPr>
+        <w:spacing w:after="0"/>
+        <w:rPr>
+          <w:rFonts w:ascii="TH SarabunPSK" w:eastAsia="Times New Roman" w:hAnsi="TH SarabunPSK" w:cs="TH SarabunPSK"/>
+          <w:kern w:val="0"/>
+          <w:szCs w:val="24"/>
+          <w14:ligatures w14:val="none"/>
+        </w:rPr>
+      </w:pPr>
+      <w:r>
+        <w:rPr>
+          <w:rFonts w:ascii="TH SarabunPSK" w:eastAsia="Times New Roman" w:hAnsi="TH SarabunPSK" w:cs="TH SarabunPSK" w:hint="cs"/>
+          <w:b/>
+          <w:bCs/>
+          <w:color w:val="000000"/>
+          <w:kern w:val="0"/>
+          <w:sz w:val="32"/>
+          <w:szCs w:val="32"/>
+          <w14:ligatures w14:val="none"/>
+        </w:rPr>
+        <w:t>1.3</w:t>
+      </w:r>
+      <w:r>
+        <w:rPr>
+          <w:rFonts w:ascii="TH SarabunPSK" w:eastAsia="Times New Roman" w:hAnsi="TH SarabunPSK" w:cs="TH SarabunPSK"/>
+          <w:b/>
+          <w:bCs/>
+          <w:color w:val="FFFFFF" w:themeColor="background1"/>
+          <w:kern w:val="0"/>
+          <w:sz w:val="32"/>
+          <w:szCs w:val="32"/>
+          <w14:ligatures w14:val="none"/>
+        </w:rPr>
+        <w:t>**</w:t>
+      </w:r>
+      <w:r>
+        <w:rPr>
+          <w:rFonts w:ascii="TH SarabunPSK" w:eastAsia="Times New Roman" w:hAnsi="TH SarabunPSK" w:cs="TH SarabunPSK" w:hint="cs"/>
+          <w:b/>
+          <w:bCs/>
+          <w:color w:val="000000"/>
+          <w:kern w:val="0"/>
+          <w:sz w:val="32"/>
+          <w:szCs w:val="32"/>
+          <w:cs/>
+          <w14:ligatures w14:val="none"/>
+        </w:rPr>
+        <w:t>สมมติฐาน</w:t>
+      </w:r>
+    </w:p>
+    <w:p>
+      <w:pPr>
+        <w:spacing w:after="0"/>
+        <w:jc w:val="both"/>
+        <w:rPr>
+          <w:rFonts w:ascii="TH SarabunPSK" w:eastAsia="Times New Roman" w:hAnsi="TH SarabunPSK" w:cs="TH SarabunPSK"/>
+          <w:kern w:val="0"/>
+          <w:szCs w:val="24"/>
+          <w14:ligatures w14:val="none"/>
+        </w:rPr>
+      </w:pPr>
+      <w:r>
+        <w:rPr>
+          <w:rFonts w:ascii="TH SarabunPSK" w:eastAsia="Times New Roman" w:hAnsi="TH SarabunPSK" w:cs="TH SarabunPSK" w:hint="cs"/>
+          <w:color w:val="000000"/>
+          <w:kern w:val="0"/>
+          <w:sz w:val="32"/>
+          <w:szCs w:val="32"/>
+          <w14:ligatures w14:val="none"/>
+        </w:rPr>
+        <w:tab/>
+        <w:t>1.3.1</w:t>
+      </w:r>
+      <w:r>
+        <w:rPr>
+          <w:rFonts w:ascii="TH SarabunPSK" w:eastAsia="Times New Roman" w:hAnsi="TH SarabunPSK" w:cs="TH SarabunPSK"/>
+          <w:color w:val="FFFFFF" w:themeColor="background1"/>
+          <w:kern w:val="0"/>
+          <w:sz w:val="32"/>
+          <w:szCs w:val="32"/>
+          <w14:ligatures w14:val="none"/>
+        </w:rPr>
+        <w:t>**</w:t>
+      </w:r>
+      <w:r>
+        <w:rPr>
+          <w:rFonts w:ascii="TH SarabunPSK" w:eastAsia="Times New Roman" w:hAnsi="TH SarabunPSK" w:cs="TH SarabunPSK" w:hint="cs"/>
+          <w:color w:val="000000"/>
+          <w:kern w:val="0"/>
+          <w:sz w:val="32"/>
+          <w:szCs w:val="32"/>
+          <w:cs/>
+          <w14:ligatures w14:val="none"/>
+        </w:rPr>
+        <w:t>ความคิดเห็นของผู้เชี่ยวชาญที่มีต่อประสิทธิภาพของ</w:t>
+      </w:r>
+      <w:r>
+        <w:rPr>
+          <w:rFonts w:ascii="TH SarabunPSK" w:eastAsia="Times New Roman" w:hAnsi="TH SarabunPSK" w:cs="TH SarabunPSK"/>
+          <w:color w:val="000000"/>
+          <w:kern w:val="0"/>
+          <w:sz w:val="32"/>
+          <w:szCs w:val="32"/>
+          <w:cs/>
+          <w14:ligatures w14:val="none"/>
+        </w:rPr>
+        <w:t>ระบบผู้ช่วยแบบตัวแทนเชิงปัญญาประดิษฐ์สำหรับองค์กร</w:t>
+      </w:r>
+      <w:r>
+        <w:rPr>
+          <w:rFonts w:ascii="TH SarabunPSK" w:eastAsia="Times New Roman" w:hAnsi="TH SarabunPSK" w:cs="TH SarabunPSK" w:hint="cs"/>
+          <w:color w:val="000000"/>
+          <w:kern w:val="0"/>
+          <w:sz w:val="32"/>
+          <w:szCs w:val="32"/>
+          <w:cs/>
+          <w14:ligatures w14:val="none"/>
         </w:rPr>
         <w:t xml:space="preserve"> </w:t>
       </w:r>
       <w:r>
         <w:rPr>
-          <w:rFonts w:ascii="TH SarabunPSK" w:hAnsi="TH SarabunPSK" w:cs="TH SarabunPSK"/>
-          <w:sz w:val="32"/>
-          <w:szCs w:val="32"/>
-          <w:cs/>
-        </w:rPr>
-        <w:t>สำหรับองค์กร</w:t>
+          <w:rFonts w:ascii="TH SarabunPSK" w:eastAsia="Times New Roman" w:hAnsi="TH SarabunPSK" w:cs="TH SarabunPSK" w:hint="cs"/>
+          <w:color w:val="000000"/>
+          <w:kern w:val="0"/>
+          <w:sz w:val="32"/>
+          <w:szCs w:val="32"/>
+          <w:cs/>
+          <w14:ligatures w14:val="none"/>
+        </w:rPr>
+        <w:t>ที่พัฒนาขึ้</w:t>
+      </w:r>
+      <w:r>
+        <w:rPr>
+          <w:rFonts w:ascii="TH SarabunPSK" w:eastAsia="Times New Roman" w:hAnsi="TH SarabunPSK" w:cs="TH SarabunPSK" w:hint="cs"/>
+          <w:color w:val="000000"/>
+          <w:kern w:val="0"/>
+          <w:sz w:val="32"/>
+          <w:szCs w:val="32"/>
+          <w:cs/>
+          <w14:ligatures w14:val="none"/>
+        </w:rPr>
+        <w:t>น อยู่ในระดับ</w:t>
+      </w:r>
+      <w:r>
+        <w:rPr>
+          <w:rFonts w:ascii="TH SarabunPSK" w:eastAsia="Times New Roman" w:hAnsi="TH SarabunPSK" w:cs="TH SarabunPSK" w:hint="cs"/>
+          <w:color w:val="000000"/>
+          <w:kern w:val="0"/>
+          <w:sz w:val="32"/>
+          <w:szCs w:val="32"/>
+          <w:cs/>
+          <w14:ligatures w14:val="none"/>
+        </w:rPr>
+        <w:t>พอใช้</w:t>
+      </w:r>
+    </w:p>
+    <w:p>
+      <w:pPr>
+        <w:spacing w:after="0"/>
+        <w:ind w:firstLine="720"/>
+        <w:rPr>
+          <w:rFonts w:ascii="TH SarabunPSK" w:hAnsi="TH SarabunPSK" w:cs="TH SarabunPSK"/>
+          <w:sz w:val="32"/>
+          <w:szCs w:val="32"/>
+        </w:rPr>
+      </w:pPr>
+      <w:r>
+        <w:rPr>
+          <w:rFonts w:ascii="TH SarabunPSK" w:eastAsia="Times New Roman" w:hAnsi="TH SarabunPSK" w:cs="TH SarabunPSK" w:hint="cs"/>
+          <w:color w:val="000000"/>
+          <w:kern w:val="0"/>
+          <w:sz w:val="32"/>
+          <w:szCs w:val="32"/>
+          <w14:ligatures w14:val="none"/>
+        </w:rPr>
+        <w:t>1.3.2</w:t>
+      </w:r>
+      <w:r>
+        <w:rPr>
+          <w:rFonts w:ascii="TH SarabunPSK" w:eastAsia="Times New Roman" w:hAnsi="TH SarabunPSK" w:cs="TH SarabunPSK"/>
+          <w:color w:val="FFFFFF" w:themeColor="background1"/>
+          <w:kern w:val="0"/>
+          <w:sz w:val="32"/>
+          <w:szCs w:val="32"/>
+          <w14:ligatures w14:val="none"/>
+        </w:rPr>
+        <w:t>**</w:t>
+      </w:r>
+      <w:r>
+        <w:rPr>
+          <w:rFonts w:ascii="TH SarabunPSK" w:eastAsia="Times New Roman" w:hAnsi="TH SarabunPSK" w:cs="TH SarabunPSK" w:hint="cs"/>
+          <w:color w:val="000000"/>
+          <w:kern w:val="0"/>
+          <w:sz w:val="32"/>
+          <w:szCs w:val="32"/>
+          <w:cs/>
+          <w14:ligatures w14:val="none"/>
+        </w:rPr>
+        <w:t>ความพึงพอใจของผู้ใช้</w:t>
+      </w:r>
+      <w:r>
+        <w:rPr>
+          <w:rFonts w:ascii="TH SarabunPSK" w:eastAsia="Times New Roman" w:hAnsi="TH SarabunPSK" w:cs="TH SarabunPSK"/>
+          <w:color w:val="000000"/>
+          <w:kern w:val="0"/>
+          <w:sz w:val="32"/>
+          <w:szCs w:val="32"/>
+          <w:cs/>
+          <w14:ligatures w14:val="none"/>
+        </w:rPr>
+        <w:t>ระบบผู้ช่วยแบบตัวแทนเชิงปัญญาประดิษฐ์สำหรับองค์กร</w:t>
+      </w:r>
+      <w:r>
+        <w:rPr>
+          <w:rFonts w:ascii="TH SarabunPSK" w:eastAsia="Times New Roman" w:hAnsi="TH SarabunPSK" w:cs="TH SarabunPSK"/>
+          <w:color w:val="000000"/>
+          <w:kern w:val="0"/>
+          <w:sz w:val="32"/>
+          <w:szCs w:val="32"/>
+          <w14:ligatures w14:val="none"/>
+        </w:rPr>
+        <w:t xml:space="preserve"> </w:t>
+      </w:r>
+      <w:r>
+        <w:rPr>
+          <w:rFonts w:ascii="TH SarabunPSK" w:eastAsia="Times New Roman" w:hAnsi="TH SarabunPSK" w:cs="TH SarabunPSK" w:hint="cs"/>
+          <w:color w:val="000000"/>
+          <w:kern w:val="0"/>
+          <w:sz w:val="32"/>
+          <w:szCs w:val="32"/>
+          <w:cs/>
+          <w14:ligatures w14:val="none"/>
+        </w:rPr>
+        <w:t xml:space="preserve">การทดลองใช้ระบบที่พัฒนาขึ้น </w:t>
+      </w:r>
+      <w:r>
+        <w:rPr>
+          <w:rFonts w:ascii="TH SarabunPSK" w:eastAsia="Times New Roman" w:hAnsi="TH SarabunPSK" w:cs="TH SarabunPSK" w:hint="cs"/>
+          <w:color w:val="000000"/>
+          <w:kern w:val="0"/>
+          <w:sz w:val="32"/>
+          <w:szCs w:val="32"/>
+          <w:cs/>
+          <w14:ligatures w14:val="none"/>
+        </w:rPr>
+        <w:t>อยู่ในระดับ</w:t>
+      </w:r>
+      <w:r>
+        <w:rPr>
+          <w:rFonts w:ascii="TH SarabunPSK" w:eastAsia="Times New Roman" w:hAnsi="TH SarabunPSK" w:cs="TH SarabunPSK" w:hint="cs"/>
+          <w:color w:val="000000"/>
+          <w:kern w:val="0"/>
+          <w:sz w:val="32"/>
+          <w:szCs w:val="32"/>
+          <w:cs/>
+          <w14:ligatures w14:val="none"/>
+        </w:rPr>
+        <w:t>พอใช้</w:t>
+      </w:r>
+    </w:p>
+    <w:p>
+      <w:pPr>
+        <w:spacing w:after="0"/>
+        <w:rPr>
+          <w:rFonts w:ascii="TH SarabunPSK" w:eastAsia="Times New Roman" w:hAnsi="TH SarabunPSK" w:cs="TH SarabunPSK"/>
+          <w:kern w:val="0"/>
+          <w:szCs w:val="24"/>
+          <w14:ligatures w14:val="none"/>
+        </w:rPr>
+      </w:pPr>
+      <w:r>
+        <w:rPr>
+          <w:rFonts w:ascii="TH SarabunPSK" w:eastAsia="Times New Roman" w:hAnsi="TH SarabunPSK" w:cs="TH SarabunPSK" w:hint="cs"/>
+          <w:b/>
+          <w:bCs/>
+          <w:color w:val="000000"/>
+          <w:kern w:val="0"/>
+          <w:sz w:val="32"/>
+          <w:szCs w:val="32"/>
+          <w14:ligatures w14:val="none"/>
+        </w:rPr>
+        <w:t>1.4</w:t>
+      </w:r>
+      <w:r>
+        <w:rPr>
+          <w:rFonts w:ascii="TH SarabunPSK" w:eastAsia="Times New Roman" w:hAnsi="TH SarabunPSK" w:cs="TH SarabunPSK"/>
+          <w:b/>
+          <w:bCs/>
+          <w:color w:val="FFFFFF" w:themeColor="background1"/>
+          <w:kern w:val="0"/>
+          <w:sz w:val="32"/>
+          <w:szCs w:val="32"/>
+          <w14:ligatures w14:val="none"/>
+        </w:rPr>
+        <w:t>**</w:t>
+      </w:r>
+      <w:r>
+        <w:rPr>
+          <w:rFonts w:ascii="TH SarabunPSK" w:eastAsia="Times New Roman" w:hAnsi="TH SarabunPSK" w:cs="TH SarabunPSK" w:hint="cs"/>
+          <w:b/>
+          <w:bCs/>
+          <w:color w:val="000000"/>
+          <w:kern w:val="0"/>
+          <w:sz w:val="32"/>
+          <w:szCs w:val="32"/>
+          <w:cs/>
+          <w14:ligatures w14:val="none"/>
+        </w:rPr>
+        <w:t>ขอบเขต</w:t>
       </w:r>
     </w:p>
     <w:p>
@@ -1143,547 +1380,6 @@
         <w:spacing w:after="0"/>
         <w:ind w:firstLine="709"/>
         <w:rPr>
-          <w:rFonts w:ascii="TH SarabunPSK" w:hAnsi="TH SarabunPSK" w:cs="TH SarabunPSK"/>
-          <w:sz w:val="32"/>
-          <w:szCs w:val="32"/>
-        </w:rPr>
-      </w:pPr>
-      <w:r>
-        <w:rPr>
-          <w:rFonts w:ascii="TH SarabunPSK" w:hAnsi="TH SarabunPSK" w:cs="TH SarabunPSK"/>
-          <w:sz w:val="32"/>
-          <w:szCs w:val="32"/>
-          <w:cs/>
-        </w:rPr>
-        <w:t>1.2.3</w:t>
-      </w:r>
-      <w:r>
-        <w:rPr>
-          <w:rFonts w:ascii="TH SarabunPSK" w:hAnsi="TH SarabunPSK" w:cs="TH SarabunPSK"/>
-          <w:color w:val="FFFFFF" w:themeColor="background1"/>
-          <w:sz w:val="32"/>
-          <w:szCs w:val="32"/>
-        </w:rPr>
-        <w:t>**</w:t>
-      </w:r>
-      <w:r>
-        <w:rPr>
-          <w:rFonts w:ascii="TH SarabunPSK" w:hAnsi="TH SarabunPSK" w:cs="TH SarabunPSK"/>
-          <w:sz w:val="32"/>
-          <w:szCs w:val="32"/>
-          <w:cs/>
-        </w:rPr>
-        <w:t>เพื่อหาความพึงพอใจของผู้ใช้ระบบ</w:t>
-      </w:r>
-      <w:r>
-        <w:rPr>
-          <w:rFonts w:ascii="TH SarabunPSK" w:hAnsi="TH SarabunPSK" w:cs="TH SarabunPSK"/>
-          <w:sz w:val="32"/>
-          <w:szCs w:val="32"/>
-          <w:cs/>
-        </w:rPr>
-        <w:t xml:space="preserve">ผู้ช่วยอัตโนมัติ </w:t>
-      </w:r>
-      <w:r>
-        <w:rPr>
-          <w:rFonts w:ascii="TH SarabunPSK" w:hAnsi="TH SarabunPSK" w:cs="TH SarabunPSK"/>
-          <w:sz w:val="32"/>
-          <w:szCs w:val="32"/>
-        </w:rPr>
-        <w:t>n</w:t>
-      </w:r>
-      <w:r>
-        <w:rPr>
-          <w:rFonts w:ascii="TH SarabunPSK" w:hAnsi="TH SarabunPSK" w:cs="TH SarabunPSK"/>
-          <w:sz w:val="32"/>
-          <w:szCs w:val="32"/>
-          <w:cs/>
-        </w:rPr>
-        <w:t>8</w:t>
-      </w:r>
-      <w:r>
-        <w:rPr>
-          <w:rFonts w:ascii="TH SarabunPSK" w:hAnsi="TH SarabunPSK" w:cs="TH SarabunPSK"/>
-          <w:sz w:val="32"/>
-          <w:szCs w:val="32"/>
-        </w:rPr>
-        <w:t xml:space="preserve">n </w:t>
-      </w:r>
-      <w:r>
-        <w:rPr>
-          <w:rFonts w:ascii="TH SarabunPSK" w:hAnsi="TH SarabunPSK" w:cs="TH SarabunPSK"/>
-          <w:sz w:val="32"/>
-          <w:szCs w:val="32"/>
-          <w:cs/>
-        </w:rPr>
-        <w:t xml:space="preserve">ผ่าน </w:t>
-      </w:r>
-      <w:r>
-        <w:rPr>
-          <w:rFonts w:ascii="TH SarabunPSK" w:hAnsi="TH SarabunPSK" w:cs="TH SarabunPSK"/>
-          <w:sz w:val="32"/>
-          <w:szCs w:val="32"/>
-        </w:rPr>
-        <w:t>LINE OA</w:t>
-      </w:r>
-      <w:r>
-        <w:rPr>
-          <w:rFonts w:ascii="TH SarabunPSK" w:hAnsi="TH SarabunPSK" w:cs="TH SarabunPSK" w:hint="cs"/>
-          <w:sz w:val="32"/>
-          <w:szCs w:val="32"/>
-          <w:cs/>
-        </w:rPr>
-        <w:t xml:space="preserve"> </w:t>
-      </w:r>
-      <w:r>
-        <w:rPr>
-          <w:rFonts w:ascii="TH SarabunPSK" w:hAnsi="TH SarabunPSK" w:cs="TH SarabunPSK"/>
-          <w:sz w:val="32"/>
-          <w:szCs w:val="32"/>
-          <w:cs/>
-        </w:rPr>
-        <w:t>สำหรับองค์กร</w:t>
-      </w:r>
-      <w:r>
-        <w:rPr>
-          <w:rFonts w:ascii="TH SarabunPSK" w:hAnsi="TH SarabunPSK" w:cs="TH SarabunPSK" w:hint="cs"/>
-          <w:sz w:val="32"/>
-          <w:szCs w:val="32"/>
-          <w:cs/>
-        </w:rPr>
-        <w:t xml:space="preserve"> </w:t>
-      </w:r>
-      <w:r>
-        <w:rPr>
-          <w:rFonts w:ascii="TH SarabunPSK" w:hAnsi="TH SarabunPSK" w:cs="TH SarabunPSK"/>
-          <w:sz w:val="32"/>
-          <w:szCs w:val="32"/>
-          <w:cs/>
-        </w:rPr>
-        <w:t>ภายหลังการทดลองใช้ระบบที่พัฒนาขึ้น</w:t>
-      </w:r>
-    </w:p>
-    <w:p>
-      <w:pPr>
-        <w:spacing w:after="0"/>
-        <w:rPr>
-          <w:rFonts w:ascii="TH SarabunPSK" w:eastAsia="Times New Roman" w:hAnsi="TH SarabunPSK" w:cs="TH SarabunPSK"/>
-          <w:kern w:val="0"/>
-          <w:szCs w:val="24"/>
-          <w14:ligatures w14:val="none"/>
-        </w:rPr>
-      </w:pPr>
-      <w:r>
-        <w:rPr>
-          <w:rFonts w:ascii="TH SarabunPSK" w:eastAsia="Times New Roman" w:hAnsi="TH SarabunPSK" w:cs="TH SarabunPSK" w:hint="cs"/>
-          <w:b/>
-          <w:bCs/>
-          <w:color w:val="000000"/>
-          <w:kern w:val="0"/>
-          <w:sz w:val="32"/>
-          <w:szCs w:val="32"/>
-          <w14:ligatures w14:val="none"/>
-        </w:rPr>
-        <w:t>1.3</w:t>
-      </w:r>
-      <w:r>
-        <w:rPr>
-          <w:rFonts w:ascii="TH SarabunPSK" w:eastAsia="Times New Roman" w:hAnsi="TH SarabunPSK" w:cs="TH SarabunPSK"/>
-          <w:b/>
-          <w:bCs/>
-          <w:color w:val="FFFFFF" w:themeColor="background1"/>
-          <w:kern w:val="0"/>
-          <w:sz w:val="32"/>
-          <w:szCs w:val="32"/>
-          <w14:ligatures w14:val="none"/>
-        </w:rPr>
-        <w:t>**</w:t>
-      </w:r>
-      <w:r>
-        <w:rPr>
-          <w:rFonts w:ascii="TH SarabunPSK" w:eastAsia="Times New Roman" w:hAnsi="TH SarabunPSK" w:cs="TH SarabunPSK" w:hint="cs"/>
-          <w:b/>
-          <w:bCs/>
-          <w:color w:val="000000"/>
-          <w:kern w:val="0"/>
-          <w:sz w:val="32"/>
-          <w:szCs w:val="32"/>
-          <w:cs/>
-          <w14:ligatures w14:val="none"/>
-        </w:rPr>
-        <w:t>สมมติฐาน</w:t>
-      </w:r>
-    </w:p>
-    <w:p>
-      <w:pPr>
-        <w:spacing w:after="0"/>
-        <w:jc w:val="both"/>
-        <w:rPr>
-          <w:rFonts w:ascii="TH SarabunPSK" w:eastAsia="Times New Roman" w:hAnsi="TH SarabunPSK" w:cs="TH SarabunPSK"/>
-          <w:kern w:val="0"/>
-          <w:szCs w:val="24"/>
-          <w14:ligatures w14:val="none"/>
-        </w:rPr>
-      </w:pPr>
-      <w:r>
-        <w:rPr>
-          <w:rFonts w:ascii="TH SarabunPSK" w:eastAsia="Times New Roman" w:hAnsi="TH SarabunPSK" w:cs="TH SarabunPSK" w:hint="cs"/>
-          <w:color w:val="000000"/>
-          <w:kern w:val="0"/>
-          <w:sz w:val="32"/>
-          <w:szCs w:val="32"/>
-          <w14:ligatures w14:val="none"/>
-        </w:rPr>
-        <w:tab/>
-        <w:t>1.3.1</w:t>
-      </w:r>
-      <w:r>
-        <w:rPr>
-          <w:rFonts w:ascii="TH SarabunPSK" w:eastAsia="Times New Roman" w:hAnsi="TH SarabunPSK" w:cs="TH SarabunPSK"/>
-          <w:color w:val="FFFFFF" w:themeColor="background1"/>
-          <w:kern w:val="0"/>
-          <w:sz w:val="32"/>
-          <w:szCs w:val="32"/>
-          <w14:ligatures w14:val="none"/>
-        </w:rPr>
-        <w:t>**</w:t>
-      </w:r>
-      <w:r>
-        <w:rPr>
-          <w:rFonts w:ascii="TH SarabunPSK" w:eastAsia="Times New Roman" w:hAnsi="TH SarabunPSK" w:cs="TH SarabunPSK" w:hint="cs"/>
-          <w:color w:val="000000"/>
-          <w:kern w:val="0"/>
-          <w:sz w:val="32"/>
-          <w:szCs w:val="32"/>
-          <w:cs/>
-          <w14:ligatures w14:val="none"/>
-        </w:rPr>
-        <w:t>ความคิดเห็นของผู้เชี่ยวชาญที่มีต่อประสิทธิภาพของระบบ</w:t>
-      </w:r>
-      <w:r>
-        <w:rPr>
-          <w:rFonts w:ascii="TH SarabunPSK" w:hAnsi="TH SarabunPSK" w:cs="TH SarabunPSK"/>
-          <w:sz w:val="32"/>
-          <w:szCs w:val="32"/>
-          <w:cs/>
-        </w:rPr>
-        <w:t xml:space="preserve">ผู้ช่วยอัตโนมัติ </w:t>
-      </w:r>
-      <w:r>
-        <w:rPr>
-          <w:rFonts w:ascii="TH SarabunPSK" w:hAnsi="TH SarabunPSK" w:cs="TH SarabunPSK"/>
-          <w:sz w:val="32"/>
-          <w:szCs w:val="32"/>
-        </w:rPr>
-        <w:t>n</w:t>
-      </w:r>
-      <w:r>
-        <w:rPr>
-          <w:rFonts w:ascii="TH SarabunPSK" w:hAnsi="TH SarabunPSK" w:cs="TH SarabunPSK"/>
-          <w:sz w:val="32"/>
-          <w:szCs w:val="32"/>
-          <w:cs/>
-        </w:rPr>
-        <w:t>8</w:t>
-      </w:r>
-      <w:r>
-        <w:rPr>
-          <w:rFonts w:ascii="TH SarabunPSK" w:hAnsi="TH SarabunPSK" w:cs="TH SarabunPSK"/>
-          <w:sz w:val="32"/>
-          <w:szCs w:val="32"/>
-        </w:rPr>
-        <w:t xml:space="preserve">n </w:t>
-      </w:r>
-      <w:r>
-        <w:rPr>
-          <w:rFonts w:ascii="TH SarabunPSK" w:hAnsi="TH SarabunPSK" w:cs="TH SarabunPSK"/>
-          <w:sz w:val="32"/>
-          <w:szCs w:val="32"/>
-          <w:cs/>
-        </w:rPr>
-        <w:t xml:space="preserve">ผ่าน </w:t>
-      </w:r>
-      <w:r>
-        <w:rPr>
-          <w:rFonts w:ascii="TH SarabunPSK" w:hAnsi="TH SarabunPSK" w:cs="TH SarabunPSK"/>
-          <w:sz w:val="32"/>
-          <w:szCs w:val="32"/>
-        </w:rPr>
-        <w:t>LINE OA</w:t>
-      </w:r>
-      <w:r>
-        <w:rPr>
-          <w:rFonts w:ascii="TH SarabunPSK" w:hAnsi="TH SarabunPSK" w:cs="TH SarabunPSK" w:hint="cs"/>
-          <w:sz w:val="32"/>
-          <w:szCs w:val="32"/>
-          <w:cs/>
-        </w:rPr>
-        <w:t xml:space="preserve"> </w:t>
-      </w:r>
-      <w:r>
-        <w:rPr>
-          <w:rFonts w:ascii="TH SarabunPSK" w:hAnsi="TH SarabunPSK" w:cs="TH SarabunPSK"/>
-          <w:sz w:val="32"/>
-          <w:szCs w:val="32"/>
-          <w:cs/>
-        </w:rPr>
-        <w:t>สำหรับองค์กร</w:t>
-      </w:r>
-      <w:r>
-        <w:rPr>
-          <w:rFonts w:ascii="TH SarabunPSK" w:eastAsia="Times New Roman" w:hAnsi="TH SarabunPSK" w:cs="TH SarabunPSK" w:hint="cs"/>
-          <w:color w:val="000000"/>
-          <w:kern w:val="0"/>
-          <w:sz w:val="32"/>
-          <w:szCs w:val="32"/>
-          <w:cs/>
-          <w14:ligatures w14:val="none"/>
-        </w:rPr>
-        <w:t xml:space="preserve"> </w:t>
-      </w:r>
-      <w:r>
-        <w:rPr>
-          <w:rFonts w:ascii="TH SarabunPSK" w:eastAsia="Times New Roman" w:hAnsi="TH SarabunPSK" w:cs="TH SarabunPSK" w:hint="cs"/>
-          <w:color w:val="000000"/>
-          <w:kern w:val="0"/>
-          <w:sz w:val="32"/>
-          <w:szCs w:val="32"/>
-          <w:cs/>
-          <w14:ligatures w14:val="none"/>
-        </w:rPr>
-        <w:t>ที่พัฒนาขึ้</w:t>
-      </w:r>
-      <w:r>
-        <w:rPr>
-          <w:rFonts w:ascii="TH SarabunPSK" w:eastAsia="Times New Roman" w:hAnsi="TH SarabunPSK" w:cs="TH SarabunPSK" w:hint="cs"/>
-          <w:color w:val="000000"/>
-          <w:kern w:val="0"/>
-          <w:sz w:val="32"/>
-          <w:szCs w:val="32"/>
-          <w:cs/>
-          <w14:ligatures w14:val="none"/>
-        </w:rPr>
-        <w:t>น อยู่ในระดับ</w:t>
-      </w:r>
-      <w:r>
-        <w:rPr>
-          <w:rFonts w:ascii="TH SarabunPSK" w:eastAsia="Times New Roman" w:hAnsi="TH SarabunPSK" w:cs="TH SarabunPSK" w:hint="cs"/>
-          <w:color w:val="000000"/>
-          <w:kern w:val="0"/>
-          <w:sz w:val="32"/>
-          <w:szCs w:val="32"/>
-          <w:cs/>
-          <w14:ligatures w14:val="none"/>
-        </w:rPr>
-        <w:t>พอใช้</w:t>
-      </w:r>
-    </w:p>
-    <w:p>
-      <w:pPr>
-        <w:spacing w:after="0"/>
-        <w:ind w:firstLine="720"/>
-        <w:rPr>
-          <w:rFonts w:ascii="TH SarabunPSK" w:hAnsi="TH SarabunPSK" w:cs="TH SarabunPSK"/>
-          <w:sz w:val="32"/>
-          <w:szCs w:val="32"/>
-        </w:rPr>
-      </w:pPr>
-      <w:r>
-        <w:rPr>
-          <w:rFonts w:ascii="TH SarabunPSK" w:eastAsia="Times New Roman" w:hAnsi="TH SarabunPSK" w:cs="TH SarabunPSK" w:hint="cs"/>
-          <w:color w:val="000000"/>
-          <w:kern w:val="0"/>
-          <w:sz w:val="32"/>
-          <w:szCs w:val="32"/>
-          <w14:ligatures w14:val="none"/>
-        </w:rPr>
-        <w:t>1.3.2</w:t>
-      </w:r>
-      <w:r>
-        <w:rPr>
-          <w:rFonts w:ascii="TH SarabunPSK" w:eastAsia="Times New Roman" w:hAnsi="TH SarabunPSK" w:cs="TH SarabunPSK"/>
-          <w:color w:val="FFFFFF" w:themeColor="background1"/>
-          <w:kern w:val="0"/>
-          <w:sz w:val="32"/>
-          <w:szCs w:val="32"/>
-          <w14:ligatures w14:val="none"/>
-        </w:rPr>
-        <w:t>**</w:t>
-      </w:r>
-      <w:r>
-        <w:rPr>
-          <w:rFonts w:ascii="TH SarabunPSK" w:eastAsia="Times New Roman" w:hAnsi="TH SarabunPSK" w:cs="TH SarabunPSK" w:hint="cs"/>
-          <w:color w:val="000000"/>
-          <w:kern w:val="0"/>
-          <w:sz w:val="32"/>
-          <w:szCs w:val="32"/>
-          <w:cs/>
-          <w14:ligatures w14:val="none"/>
-        </w:rPr>
-        <w:t>ความพึงพอใจของผู้ใช้ระบบ</w:t>
-      </w:r>
-      <w:r>
-        <w:rPr>
-          <w:rFonts w:ascii="TH SarabunPSK" w:hAnsi="TH SarabunPSK" w:cs="TH SarabunPSK"/>
-          <w:sz w:val="32"/>
-          <w:szCs w:val="32"/>
-          <w:cs/>
-        </w:rPr>
-        <w:t xml:space="preserve">ผู้ช่วยอัตโนมัติ </w:t>
-      </w:r>
-      <w:r>
-        <w:rPr>
-          <w:rFonts w:ascii="TH SarabunPSK" w:hAnsi="TH SarabunPSK" w:cs="TH SarabunPSK"/>
-          <w:sz w:val="32"/>
-          <w:szCs w:val="32"/>
-        </w:rPr>
-        <w:t>n</w:t>
-      </w:r>
-      <w:r>
-        <w:rPr>
-          <w:rFonts w:ascii="TH SarabunPSK" w:hAnsi="TH SarabunPSK" w:cs="TH SarabunPSK"/>
-          <w:sz w:val="32"/>
-          <w:szCs w:val="32"/>
-          <w:cs/>
-        </w:rPr>
-        <w:t>8</w:t>
-      </w:r>
-      <w:r>
-        <w:rPr>
-          <w:rFonts w:ascii="TH SarabunPSK" w:hAnsi="TH SarabunPSK" w:cs="TH SarabunPSK"/>
-          <w:sz w:val="32"/>
-          <w:szCs w:val="32"/>
-        </w:rPr>
-        <w:t xml:space="preserve">n </w:t>
-      </w:r>
-      <w:r>
-        <w:rPr>
-          <w:rFonts w:ascii="TH SarabunPSK" w:hAnsi="TH SarabunPSK" w:cs="TH SarabunPSK"/>
-          <w:sz w:val="32"/>
-          <w:szCs w:val="32"/>
-          <w:cs/>
-        </w:rPr>
-        <w:t xml:space="preserve">ผ่าน </w:t>
-      </w:r>
-      <w:r>
-        <w:rPr>
-          <w:rFonts w:ascii="TH SarabunPSK" w:hAnsi="TH SarabunPSK" w:cs="TH SarabunPSK"/>
-          <w:sz w:val="32"/>
-          <w:szCs w:val="32"/>
-        </w:rPr>
-        <w:t>LINE OA</w:t>
-      </w:r>
-      <w:r>
-        <w:rPr>
-          <w:rFonts w:ascii="TH SarabunPSK" w:hAnsi="TH SarabunPSK" w:cs="TH SarabunPSK" w:hint="cs"/>
-          <w:sz w:val="32"/>
-          <w:szCs w:val="32"/>
-          <w:cs/>
-        </w:rPr>
-        <w:t xml:space="preserve"> </w:t>
-      </w:r>
-      <w:r>
-        <w:rPr>
-          <w:rFonts w:ascii="TH SarabunPSK" w:hAnsi="TH SarabunPSK" w:cs="TH SarabunPSK"/>
-          <w:sz w:val="32"/>
-          <w:szCs w:val="32"/>
-          <w:cs/>
-        </w:rPr>
-        <w:t>สำหรับองค์กร</w:t>
-      </w:r>
-      <w:r>
-        <w:rPr>
-          <w:rFonts w:ascii="TH SarabunPSK" w:eastAsia="Times New Roman" w:hAnsi="TH SarabunPSK" w:cs="TH SarabunPSK" w:hint="cs"/>
-          <w:color w:val="000000"/>
-          <w:kern w:val="0"/>
-          <w:sz w:val="32"/>
-          <w:szCs w:val="32"/>
-          <w:cs/>
-          <w14:ligatures w14:val="none"/>
-        </w:rPr>
-        <w:t xml:space="preserve">ภายหลังการทดลองใช้ระบบที่พัฒนาขึ้น </w:t>
-      </w:r>
-      <w:r>
-        <w:rPr>
-          <w:rFonts w:ascii="TH SarabunPSK" w:eastAsia="Times New Roman" w:hAnsi="TH SarabunPSK" w:cs="TH SarabunPSK" w:hint="cs"/>
-          <w:color w:val="000000"/>
-          <w:kern w:val="0"/>
-          <w:sz w:val="32"/>
-          <w:szCs w:val="32"/>
-          <w:cs/>
-          <w14:ligatures w14:val="none"/>
-        </w:rPr>
-        <w:t>อยู่ในระดับ</w:t>
-      </w:r>
-      <w:r>
-        <w:rPr>
-          <w:rFonts w:ascii="TH SarabunPSK" w:eastAsia="Times New Roman" w:hAnsi="TH SarabunPSK" w:cs="TH SarabunPSK" w:hint="cs"/>
-          <w:color w:val="000000"/>
-          <w:kern w:val="0"/>
-          <w:sz w:val="32"/>
-          <w:szCs w:val="32"/>
-          <w:cs/>
-          <w14:ligatures w14:val="none"/>
-        </w:rPr>
-        <w:t>พอใช้</w:t>
-      </w:r>
-    </w:p>
-    <w:p>
-      <w:pPr>
-        <w:spacing w:after="0"/>
-        <w:rPr>
-          <w:rFonts w:ascii="TH SarabunPSK" w:eastAsia="Times New Roman" w:hAnsi="TH SarabunPSK" w:cs="TH SarabunPSK"/>
-          <w:kern w:val="0"/>
-          <w:szCs w:val="24"/>
-          <w14:ligatures w14:val="none"/>
-        </w:rPr>
-      </w:pPr>
-      <w:r>
-        <w:rPr>
-          <w:rFonts w:ascii="TH SarabunPSK" w:eastAsia="Times New Roman" w:hAnsi="TH SarabunPSK" w:cs="TH SarabunPSK" w:hint="cs"/>
-          <w:b/>
-          <w:bCs/>
-          <w:color w:val="000000"/>
-          <w:kern w:val="0"/>
-          <w:sz w:val="32"/>
-          <w:szCs w:val="32"/>
-          <w14:ligatures w14:val="none"/>
-        </w:rPr>
-        <w:t>1.4</w:t>
-      </w:r>
-      <w:r>
-        <w:rPr>
-          <w:rFonts w:ascii="TH SarabunPSK" w:eastAsia="Times New Roman" w:hAnsi="TH SarabunPSK" w:cs="TH SarabunPSK"/>
-          <w:b/>
-          <w:bCs/>
-          <w:color w:val="FFFFFF" w:themeColor="background1"/>
-          <w:kern w:val="0"/>
-          <w:sz w:val="32"/>
-          <w:szCs w:val="32"/>
-          <w14:ligatures w14:val="none"/>
-        </w:rPr>
-        <w:t>**</w:t>
-      </w:r>
-      <w:r>
-        <w:rPr>
-          <w:rFonts w:ascii="TH SarabunPSK" w:eastAsia="Times New Roman" w:hAnsi="TH SarabunPSK" w:cs="TH SarabunPSK" w:hint="cs"/>
-          <w:b/>
-          <w:bCs/>
-          <w:color w:val="000000"/>
-          <w:kern w:val="0"/>
-          <w:sz w:val="32"/>
-          <w:szCs w:val="32"/>
-          <w:cs/>
-          <w14:ligatures w14:val="none"/>
-        </w:rPr>
-        <w:t>ขอบเขต</w:t>
-      </w:r>
-    </w:p>
-    <w:p>
-      <w:pPr>
-        <w:spacing w:after="0"/>
-        <w:ind w:firstLine="709"/>
-        <w:rPr>
           <w:rFonts w:ascii="TH SarabunPSK" w:eastAsia="Times New Roman" w:hAnsi="TH SarabunPSK" w:cs="TH SarabunPSK"/>
           <w:kern w:val="0"/>
           <w:szCs w:val="24"/>
@@ -1768,64 +1464,27 @@
           <w:szCs w:val="32"/>
           <w:cs/>
         </w:rPr>
-        <w:t xml:space="preserve">ออกแบบระบบระบบผู้ช่วยอัตโนมัติ </w:t>
-      </w:r>
-      <w:r>
-        <w:rPr>
-          <w:rFonts w:ascii="TH SarabunPSK" w:hAnsi="TH SarabunPSK" w:cs="TH SarabunPSK" w:hint="cs"/>
-          <w:kern w:val="0"/>
-          <w:sz w:val="32"/>
-          <w:szCs w:val="32"/>
-        </w:rPr>
-        <w:t>n</w:t>
-      </w:r>
-      <w:r>
-        <w:rPr>
-          <w:rFonts w:ascii="TH SarabunPSK" w:hAnsi="TH SarabunPSK" w:cs="TH SarabunPSK" w:hint="cs"/>
-          <w:kern w:val="0"/>
-          <w:sz w:val="32"/>
-          <w:szCs w:val="32"/>
-          <w:cs/>
-        </w:rPr>
-        <w:t>8</w:t>
-      </w:r>
-      <w:r>
-        <w:rPr>
-          <w:rFonts w:ascii="TH SarabunPSK" w:hAnsi="TH SarabunPSK" w:cs="TH SarabunPSK" w:hint="cs"/>
-          <w:kern w:val="0"/>
-          <w:sz w:val="32"/>
-          <w:szCs w:val="32"/>
-        </w:rPr>
-        <w:t xml:space="preserve">n </w:t>
-      </w:r>
-      <w:r>
-        <w:rPr>
-          <w:rFonts w:ascii="TH SarabunPSK" w:hAnsi="TH SarabunPSK" w:cs="TH SarabunPSK" w:hint="cs"/>
-          <w:kern w:val="0"/>
-          <w:sz w:val="32"/>
-          <w:szCs w:val="32"/>
-          <w:cs/>
-        </w:rPr>
-        <w:t xml:space="preserve">ผ่าน </w:t>
-      </w:r>
-      <w:r>
-        <w:rPr>
-          <w:rFonts w:ascii="TH SarabunPSK" w:hAnsi="TH SarabunPSK" w:cs="TH SarabunPSK" w:hint="cs"/>
-          <w:kern w:val="0"/>
-          <w:sz w:val="32"/>
-          <w:szCs w:val="32"/>
-        </w:rPr>
-        <w:t xml:space="preserve">LINE OA </w:t>
-      </w:r>
-      <w:r>
-        <w:rPr>
-          <w:rFonts w:ascii="TH SarabunPSK" w:hAnsi="TH SarabunPSK" w:cs="TH SarabunPSK" w:hint="cs"/>
-          <w:kern w:val="0"/>
-          <w:sz w:val="32"/>
-          <w:szCs w:val="32"/>
-          <w:cs/>
-        </w:rPr>
-        <w:t>สำหรับองค์กร เพื่อใช้เป็นผู้ช่วยในการยืนยันตัวตน สื่อสาร แจ้งเตือนข่าวสารต่างๆ</w:t>
+        <w:t>ออกแบบระบบ</w:t>
+      </w:r>
+      <w:r>
+        <w:rPr>
+          <w:rFonts w:ascii="TH SarabunPSK" w:hAnsi="TH SarabunPSK" w:cs="TH SarabunPSK"/>
+          <w:kern w:val="0"/>
+          <w:sz w:val="32"/>
+          <w:szCs w:val="32"/>
+          <w:cs/>
+        </w:rPr>
+        <w:t>ระบบผู้ช่วยแบบตัวแทนเชิงปัญญาประดิษฐ์สำหรับองค์กร</w:t>
+      </w:r>
+      <w:r>
+        <w:rPr>
+          <w:rFonts w:ascii="TH SarabunPSK" w:hAnsi="TH SarabunPSK" w:cs="TH SarabunPSK" w:hint="cs"/>
+          <w:kern w:val="0"/>
+          <w:sz w:val="32"/>
+          <w:szCs w:val="32"/>
+          <w:cs/>
+        </w:rPr>
+        <w:t xml:space="preserve"> เพื่อใช้เป็นผู้ช่วยในการยืนยันตัวตน สื่อสาร แจ้งเตือนข่าวสารต่างๆ</w:t>
       </w:r>
       <w:r>
         <w:rPr>

</xml_diff>